<commit_message>
Update DAC paper and ignore Word temporary files
</commit_message>
<xml_diff>
--- a/DAC/paper/CHAMP_v1.docx
+++ b/DAC/paper/CHAMP_v1.docx
@@ -1,88 +1,36 @@
 
 <file path=word/document.xml><?xml version="1.0" encoding="utf-8"?>
-<w:document xmlns:cx="http://schemas.microsoft.com/office/drawing/2014/chartex" xmlns:cx1="http://schemas.microsoft.com/office/drawing/2015/9/8/chartex" xmlns:cx2="http://schemas.microsoft.com/office/drawing/2015/10/21/chartex" xmlns:cx3="http://schemas.microsoft.com/office/drawing/2016/5/9/chartex" xmlns:cx4="http://schemas.microsoft.com/office/drawing/2016/5/10/chartex" xmlns:cx5="http://schemas.microsoft.com/office/drawing/2016/5/11/chartex" xmlns:cx6="http://schemas.microsoft.com/office/drawing/2016/5/12/chartex" xmlns:cx7="http://schemas.microsoft.com/office/drawing/2016/5/13/chartex" xmlns:cx8="http://schemas.microsoft.com/office/drawing/2016/5/14/chartex" xmlns:mc="http://schemas.openxmlformats.org/markup-compatibility/2006" xmlns:aink="http://schemas.microsoft.com/office/drawing/2016/ink" xmlns:am3d="http://schemas.microsoft.com/office/drawing/2017/model3d" xmlns:o="urn:schemas-microsoft-com:office:office" xmlns:r="http://purl.oclc.org/ooxml/officeDocument/relationships" xmlns:m="http://purl.oclc.org/ooxml/officeDocument/math" xmlns:v="urn:schemas-microsoft-com:vml" xmlns:wp14="http://schemas.microsoft.com/office/word/2010/wordprocessingDrawing" xmlns:wp="http://purl.oclc.org/ooxml/drawingml/wordprocessingDrawing" xmlns:w10="urn:schemas-microsoft-com:office:word" xmlns:w="http://purl.oclc.org/ooxml/wordprocessingml/main" xmlns:w14="http://schemas.microsoft.com/office/word/2010/wordml" xmlns:w15="http://schemas.microsoft.com/office/word/2012/wordml" xmlns:w16cid="http://schemas.microsoft.com/office/word/2016/wordml/cid" xmlns:w16se="http://schemas.microsoft.com/office/word/2015/wordml/symex" xmlns:wpi="http://schemas.microsoft.com/office/word/2010/wordprocessingInk" xmlns:wne="http://schemas.microsoft.com/office/word/2006/wordml" mc:Ignorable="w14 w15 w16se w16cid wne wp14" w:conformance="strict">
+<w:document xmlns:cx="http://schemas.microsoft.com/office/drawing/2014/chartex" xmlns:cx1="http://schemas.microsoft.com/office/drawing/2015/9/8/chartex" xmlns:cx2="http://schemas.microsoft.com/office/drawing/2015/10/21/chartex" xmlns:cx3="http://schemas.microsoft.com/office/drawing/2016/5/9/chartex" xmlns:cx4="http://schemas.microsoft.com/office/drawing/2016/5/10/chartex" xmlns:cx5="http://schemas.microsoft.com/office/drawing/2016/5/11/chartex" xmlns:cx6="http://schemas.microsoft.com/office/drawing/2016/5/12/chartex" xmlns:cx7="http://schemas.microsoft.com/office/drawing/2016/5/13/chartex" xmlns:cx8="http://schemas.microsoft.com/office/drawing/2016/5/14/chartex" xmlns:mc="http://schemas.openxmlformats.org/markup-compatibility/2006" xmlns:aink="http://schemas.microsoft.com/office/drawing/2016/ink" xmlns:am3d="http://schemas.microsoft.com/office/drawing/2017/model3d" xmlns:o="urn:schemas-microsoft-com:office:office" xmlns:oel="http://schemas.microsoft.com/office/2019/extlst" xmlns:r="http://purl.oclc.org/ooxml/officeDocument/relationships" xmlns:m="http://purl.oclc.org/ooxml/officeDocument/math" xmlns:v="urn:schemas-microsoft-com:vml" xmlns:wp14="http://schemas.microsoft.com/office/word/2010/wordprocessingDrawing" xmlns:wp="http://purl.oclc.org/ooxml/drawingml/wordprocessingDrawing" xmlns:w10="urn:schemas-microsoft-com:office:word" xmlns:w="http://purl.oclc.org/ooxml/wordprocessingml/main" xmlns:w14="http://schemas.microsoft.com/office/word/2010/wordml" xmlns:w15="http://schemas.microsoft.com/office/word/2012/wordml" xmlns:w16cex="http://schemas.microsoft.com/office/word/2018/wordml/cex" xmlns:w16cid="http://schemas.microsoft.com/office/word/2016/wordml/cid" xmlns:w16="http://schemas.microsoft.com/office/word/2018/wordml" xmlns:w16du="http://schemas.microsoft.com/office/word/2023/wordml/word16du" xmlns:w16sdtdh="http://schemas.microsoft.com/office/word/2020/wordml/sdtdatahash" xmlns:w16sdtfl="http://schemas.microsoft.com/office/word/2024/wordml/sdtformatlock" xmlns:w16se="http://schemas.microsoft.com/office/word/2015/wordml/symex" xmlns:wpi="http://schemas.microsoft.com/office/word/2010/wordprocessingInk" xmlns:wne="http://schemas.microsoft.com/office/word/2006/wordml" mc:Ignorable="w14 w15 w16se w16cid w16 w16cex w16sdtdh w16sdtfl w16du wne wp14" w:conformance="strict">
   <w:body>
-    <w:p>
-      <w:pPr>
-        <w:pStyle w:val="papertitle"/>
-        <w:spacing w:before="5pt" w:beforeAutospacing="1" w:after="5pt" w:afterAutospacing="1"/>
-        <w:rPr>
-          <w:kern w:val="48"/>
-        </w:rPr>
-      </w:pPr>
-      <w:r>
-        <w:rPr>
-          <w:kern w:val="48"/>
-        </w:rPr>
-        <w:t>Paper Title</w:t>
-      </w:r>
-      <w:r>
-        <w:rPr>
-          <w:kern w:val="48"/>
-        </w:rPr>
-        <w:t>*</w:t>
-      </w:r>
-      <w:r>
-        <w:rPr>
-          <w:kern w:val="48"/>
-        </w:rPr>
-        <w:t xml:space="preserve"> (use style: </w:t>
-      </w:r>
-      <w:r>
-        <w:rPr>
-          <w:iCs/>
-          <w:kern w:val="48"/>
-        </w:rPr>
-        <w:t>paper title</w:t>
-      </w:r>
-      <w:r>
-        <w:rPr>
-          <w:kern w:val="48"/>
-        </w:rPr>
-        <w:t>)</w:t>
-      </w:r>
-    </w:p>
     <w:p>
       <w:pPr>
         <w:pStyle w:val="Author"/>
         <w:spacing w:before="5pt" w:beforeAutospacing="1" w:after="5pt" w:afterAutospacing="1"/>
         <w:rPr>
+          <w:sz w:val="44"/>
+          <w:szCs w:val="44"/>
+        </w:rPr>
+      </w:pPr>
+      <w:r>
+        <w:rPr>
+          <w:rFonts w:eastAsia="MS Mincho"/>
+          <w:kern w:val="48"/>
+          <w:sz w:val="44"/>
+          <w:szCs w:val="44"/>
+        </w:rPr>
+        <w:t>CHAMP: A Scalable Click-Based Asynchronous NoC with Parallel-Router Hierarchy and Native Multicast</w:t>
+      </w:r>
+    </w:p>
+    <w:p>
+      <w:pPr>
+        <w:pStyle w:val="Author"/>
+        <w:spacing w:before="5pt" w:beforeAutospacing="1" w:after="5pt" w:afterAutospacing="1" w:line="6pt" w:lineRule="auto"/>
+        <w:jc w:val="both"/>
+        <w:rPr>
+          <w:rFonts w:hint="eastAsia"/>
           <w:sz w:val="16"/>
           <w:szCs w:val="16"/>
-        </w:rPr>
-      </w:pPr>
-      <w:r>
-        <w:rPr>
-          <w:sz w:val="16"/>
-          <w:szCs w:val="16"/>
-        </w:rPr>
-        <w:t>*</w:t>
-      </w:r>
-      <w:r>
-        <w:rPr>
-          <w:sz w:val="16"/>
-          <w:szCs w:val="16"/>
-        </w:rPr>
-        <w:t>Note: Sub-titles are not captured in Xplore and should not be used</w:t>
-      </w:r>
-    </w:p>
-    <w:p>
-      <w:pPr>
-        <w:pStyle w:val="Author"/>
-        <w:spacing w:before="5pt" w:beforeAutospacing="1" w:after="5pt" w:afterAutospacing="1" w:line="6pt" w:lineRule="auto"/>
-        <w:rPr>
-          <w:sz w:val="16"/>
-          <w:szCs w:val="16"/>
-        </w:rPr>
-      </w:pPr>
-    </w:p>
-    <w:p>
-      <w:pPr>
-        <w:pStyle w:val="Author"/>
-        <w:spacing w:before="5pt" w:beforeAutospacing="1" w:after="5pt" w:afterAutospacing="1" w:line="6pt" w:lineRule="auto"/>
-        <w:rPr>
-          <w:sz w:val="16"/>
-          <w:szCs w:val="16"/>
+          <w:lang w:eastAsia="zh-CN"/>
         </w:rPr>
         <w:sectPr>
           <w:footerReference w:type="first" r:id="rId8"/>
@@ -96,1031 +44,11 @@
     </w:p>
     <w:p>
       <w:pPr>
-        <w:pStyle w:val="Author"/>
-        <w:spacing w:before="5pt" w:beforeAutospacing="1"/>
-        <w:rPr>
-          <w:sz w:val="18"/>
-          <w:szCs w:val="18"/>
-        </w:rPr>
-      </w:pPr>
-      <w:r>
-        <w:rPr>
-          <w:sz w:val="18"/>
-          <w:szCs w:val="18"/>
-        </w:rPr>
-        <w:t>line 1</w:t>
-      </w:r>
-      <w:r>
-        <w:rPr>
-          <w:sz w:val="18"/>
-          <w:szCs w:val="18"/>
-        </w:rPr>
-        <w:t>: 1</w:t>
-      </w:r>
-      <w:r>
-        <w:rPr>
-          <w:sz w:val="18"/>
-          <w:szCs w:val="18"/>
-          <w:vertAlign w:val="superscript"/>
-        </w:rPr>
-        <w:t>st</w:t>
-      </w:r>
-      <w:r>
-        <w:rPr>
-          <w:sz w:val="18"/>
-          <w:szCs w:val="18"/>
-        </w:rPr>
-        <w:t xml:space="preserve"> </w:t>
-      </w:r>
-      <w:r>
-        <w:rPr>
-          <w:sz w:val="18"/>
-          <w:szCs w:val="18"/>
-        </w:rPr>
-        <w:t>Given Name Surname</w:t>
-      </w:r>
-      <w:r>
-        <w:rPr>
-          <w:sz w:val="18"/>
-          <w:szCs w:val="18"/>
-        </w:rPr>
-        <w:t xml:space="preserve"> </w:t>
-      </w:r>
-      <w:r>
-        <w:rPr>
-          <w:sz w:val="18"/>
-          <w:szCs w:val="18"/>
-        </w:rPr>
-        <w:br/>
-        <w:t>line 2:</w:t>
-      </w:r>
-      <w:r>
-        <w:rPr>
-          <w:sz w:val="18"/>
-          <w:szCs w:val="18"/>
-        </w:rPr>
-        <w:t xml:space="preserve"> </w:t>
-      </w:r>
-      <w:r>
-        <w:rPr>
-          <w:i/>
-          <w:sz w:val="18"/>
-          <w:szCs w:val="18"/>
-        </w:rPr>
-        <w:t>dept. name of organization</w:t>
-      </w:r>
-      <w:r>
-        <w:rPr>
-          <w:i/>
-          <w:sz w:val="18"/>
-          <w:szCs w:val="18"/>
-        </w:rPr>
-        <w:t xml:space="preserve"> </w:t>
-      </w:r>
-      <w:r>
-        <w:rPr>
-          <w:i/>
-          <w:sz w:val="18"/>
-          <w:szCs w:val="18"/>
-        </w:rPr>
-        <w:br/>
-      </w:r>
-      <w:r>
-        <w:rPr>
-          <w:i/>
-          <w:sz w:val="18"/>
-          <w:szCs w:val="18"/>
-        </w:rPr>
-        <w:t xml:space="preserve">(of </w:t>
-      </w:r>
-      <w:r>
-        <w:rPr>
-          <w:i/>
-          <w:iCs/>
-          <w:sz w:val="18"/>
-          <w:szCs w:val="18"/>
-        </w:rPr>
-        <w:t>Affiliation</w:t>
-      </w:r>
-      <w:r>
-        <w:rPr>
-          <w:i/>
-          <w:sz w:val="18"/>
-          <w:szCs w:val="18"/>
-        </w:rPr>
-        <w:t>)</w:t>
-      </w:r>
-      <w:r>
-        <w:rPr>
-          <w:sz w:val="18"/>
-          <w:szCs w:val="18"/>
-        </w:rPr>
-        <w:br/>
-      </w:r>
-      <w:r>
-        <w:rPr>
-          <w:sz w:val="18"/>
-          <w:szCs w:val="18"/>
-        </w:rPr>
-        <w:t>li</w:t>
-      </w:r>
-      <w:r>
-        <w:rPr>
-          <w:sz w:val="18"/>
-          <w:szCs w:val="18"/>
-        </w:rPr>
-        <w:t xml:space="preserve">ne </w:t>
-      </w:r>
-      <w:r>
-        <w:rPr>
-          <w:sz w:val="18"/>
-          <w:szCs w:val="18"/>
-        </w:rPr>
-        <w:t>3</w:t>
-      </w:r>
-      <w:r>
-        <w:rPr>
-          <w:sz w:val="18"/>
-          <w:szCs w:val="18"/>
-        </w:rPr>
-        <w:t xml:space="preserve">: </w:t>
-      </w:r>
-      <w:r>
-        <w:rPr>
-          <w:i/>
-          <w:sz w:val="18"/>
-          <w:szCs w:val="18"/>
-        </w:rPr>
-        <w:t xml:space="preserve">name of organization </w:t>
-      </w:r>
-      <w:r>
-        <w:rPr>
-          <w:i/>
-          <w:sz w:val="18"/>
-          <w:szCs w:val="18"/>
-        </w:rPr>
-        <w:br/>
-      </w:r>
-      <w:r>
-        <w:rPr>
-          <w:i/>
-          <w:sz w:val="18"/>
-          <w:szCs w:val="18"/>
-        </w:rPr>
-        <w:t>(of Affiliation)</w:t>
-      </w:r>
-      <w:r>
-        <w:rPr>
-          <w:i/>
-          <w:sz w:val="18"/>
-          <w:szCs w:val="18"/>
-        </w:rPr>
-        <w:br/>
-      </w:r>
-      <w:r>
-        <w:rPr>
-          <w:sz w:val="18"/>
-          <w:szCs w:val="18"/>
-        </w:rPr>
-        <w:t xml:space="preserve">line </w:t>
-      </w:r>
-      <w:r>
-        <w:rPr>
-          <w:sz w:val="18"/>
-          <w:szCs w:val="18"/>
-        </w:rPr>
-        <w:t>4</w:t>
-      </w:r>
-      <w:r>
-        <w:rPr>
-          <w:sz w:val="18"/>
-          <w:szCs w:val="18"/>
-        </w:rPr>
-        <w:t>: City, Country</w:t>
-      </w:r>
-      <w:r>
-        <w:rPr>
-          <w:sz w:val="18"/>
-          <w:szCs w:val="18"/>
-        </w:rPr>
-        <w:br/>
-      </w:r>
-      <w:r>
-        <w:rPr>
-          <w:sz w:val="18"/>
-          <w:szCs w:val="18"/>
-        </w:rPr>
-        <w:t xml:space="preserve">line </w:t>
-      </w:r>
-      <w:r>
-        <w:rPr>
-          <w:sz w:val="18"/>
-          <w:szCs w:val="18"/>
-        </w:rPr>
-        <w:t>5: e</w:t>
-      </w:r>
-      <w:r>
-        <w:rPr>
-          <w:sz w:val="18"/>
-          <w:szCs w:val="18"/>
-        </w:rPr>
-        <w:t>ma</w:t>
-      </w:r>
-      <w:r>
-        <w:rPr>
-          <w:sz w:val="18"/>
-          <w:szCs w:val="18"/>
-        </w:rPr>
-        <w:t>il address</w:t>
-      </w:r>
-      <w:r>
-        <w:rPr>
-          <w:sz w:val="18"/>
-          <w:szCs w:val="18"/>
-        </w:rPr>
-        <w:t xml:space="preserve"> or ORCID</w:t>
-      </w:r>
-    </w:p>
-    <w:p>
-      <w:pPr>
-        <w:pStyle w:val="Author"/>
-        <w:spacing w:before="5pt" w:beforeAutospacing="1"/>
-        <w:rPr>
-          <w:sz w:val="18"/>
-          <w:szCs w:val="18"/>
-        </w:rPr>
-      </w:pPr>
-      <w:r>
-        <w:rPr>
-          <w:sz w:val="18"/>
-          <w:szCs w:val="18"/>
-        </w:rPr>
-        <w:t>line 1: 4</w:t>
-      </w:r>
-      <w:r>
-        <w:rPr>
-          <w:sz w:val="18"/>
-          <w:szCs w:val="18"/>
-          <w:vertAlign w:val="superscript"/>
-        </w:rPr>
-        <w:t>th</w:t>
-      </w:r>
-      <w:r>
-        <w:rPr>
-          <w:sz w:val="18"/>
-          <w:szCs w:val="18"/>
-        </w:rPr>
-        <w:t xml:space="preserve"> Given Name Surname</w:t>
-      </w:r>
-      <w:r>
-        <w:rPr>
-          <w:sz w:val="18"/>
-          <w:szCs w:val="18"/>
-        </w:rPr>
-        <w:br/>
-      </w:r>
-      <w:r>
-        <w:rPr>
-          <w:sz w:val="18"/>
-          <w:szCs w:val="18"/>
-        </w:rPr>
-        <w:t xml:space="preserve">line 2: </w:t>
-      </w:r>
-      <w:r>
-        <w:rPr>
-          <w:i/>
-          <w:sz w:val="18"/>
-          <w:szCs w:val="18"/>
-        </w:rPr>
-        <w:t>dept. name of organization</w:t>
-      </w:r>
-      <w:r>
-        <w:rPr>
-          <w:sz w:val="18"/>
-          <w:szCs w:val="18"/>
-        </w:rPr>
-        <w:br/>
-      </w:r>
-      <w:r>
-        <w:rPr>
-          <w:i/>
-          <w:sz w:val="18"/>
-          <w:szCs w:val="18"/>
-        </w:rPr>
-        <w:t xml:space="preserve">(of </w:t>
-      </w:r>
-      <w:r>
-        <w:rPr>
-          <w:i/>
-          <w:iCs/>
-          <w:sz w:val="18"/>
-          <w:szCs w:val="18"/>
-        </w:rPr>
-        <w:t>Affiliation</w:t>
-      </w:r>
-      <w:r>
-        <w:rPr>
-          <w:i/>
-          <w:sz w:val="18"/>
-          <w:szCs w:val="18"/>
-        </w:rPr>
-        <w:t>)</w:t>
-      </w:r>
-      <w:r>
-        <w:rPr>
-          <w:sz w:val="18"/>
-          <w:szCs w:val="18"/>
-        </w:rPr>
-        <w:br/>
-        <w:t xml:space="preserve">line 3: </w:t>
-      </w:r>
-      <w:r>
-        <w:rPr>
-          <w:i/>
-          <w:sz w:val="18"/>
-          <w:szCs w:val="18"/>
-        </w:rPr>
-        <w:t xml:space="preserve">name of organization </w:t>
-      </w:r>
-      <w:r>
-        <w:rPr>
-          <w:i/>
-          <w:sz w:val="18"/>
-          <w:szCs w:val="18"/>
-        </w:rPr>
-        <w:br/>
-      </w:r>
-      <w:r>
-        <w:rPr>
-          <w:i/>
-          <w:sz w:val="18"/>
-          <w:szCs w:val="18"/>
-        </w:rPr>
-        <w:t>(of Affiliation)</w:t>
-      </w:r>
-      <w:r>
-        <w:rPr>
-          <w:i/>
-          <w:sz w:val="18"/>
-          <w:szCs w:val="18"/>
-        </w:rPr>
-        <w:br/>
-      </w:r>
-      <w:r>
-        <w:rPr>
-          <w:sz w:val="18"/>
-          <w:szCs w:val="18"/>
-        </w:rPr>
-        <w:t>line 4: City, Country</w:t>
-      </w:r>
-      <w:r>
-        <w:rPr>
-          <w:sz w:val="18"/>
-          <w:szCs w:val="18"/>
-        </w:rPr>
-        <w:br/>
-        <w:t>line 5: email address</w:t>
-      </w:r>
-      <w:r>
-        <w:rPr>
-          <w:sz w:val="18"/>
-          <w:szCs w:val="18"/>
-        </w:rPr>
-        <w:t xml:space="preserve"> </w:t>
-      </w:r>
-      <w:r>
-        <w:rPr>
-          <w:sz w:val="18"/>
-          <w:szCs w:val="18"/>
-        </w:rPr>
-        <w:t xml:space="preserve"> or ORCID</w:t>
-      </w:r>
-      <w:r>
-        <w:rPr>
-          <w:sz w:val="18"/>
-          <w:szCs w:val="18"/>
-        </w:rPr>
-        <w:br w:type="column"/>
-      </w:r>
-      <w:r>
-        <w:rPr>
-          <w:sz w:val="18"/>
-          <w:szCs w:val="18"/>
-        </w:rPr>
-        <w:t>line 1: 2</w:t>
-      </w:r>
-      <w:r>
-        <w:rPr>
-          <w:sz w:val="18"/>
-          <w:szCs w:val="18"/>
-          <w:vertAlign w:val="superscript"/>
-        </w:rPr>
-        <w:t>nd</w:t>
-      </w:r>
-      <w:r>
-        <w:rPr>
-          <w:sz w:val="18"/>
-          <w:szCs w:val="18"/>
-        </w:rPr>
-        <w:t xml:space="preserve"> </w:t>
-      </w:r>
-      <w:r>
-        <w:rPr>
-          <w:sz w:val="18"/>
-          <w:szCs w:val="18"/>
-        </w:rPr>
-        <w:t>Given Name Surname</w:t>
-      </w:r>
-      <w:r>
-        <w:rPr>
-          <w:sz w:val="18"/>
-          <w:szCs w:val="18"/>
-        </w:rPr>
-        <w:br/>
-        <w:t xml:space="preserve">line 2: </w:t>
-      </w:r>
-      <w:r>
-        <w:rPr>
-          <w:i/>
-          <w:sz w:val="18"/>
-          <w:szCs w:val="18"/>
-        </w:rPr>
-        <w:t xml:space="preserve">dept. name of organization </w:t>
-      </w:r>
-      <w:r>
-        <w:rPr>
-          <w:i/>
-          <w:sz w:val="18"/>
-          <w:szCs w:val="18"/>
-        </w:rPr>
-        <w:br/>
-      </w:r>
-      <w:r>
-        <w:rPr>
-          <w:i/>
-          <w:sz w:val="18"/>
-          <w:szCs w:val="18"/>
-        </w:rPr>
-        <w:t xml:space="preserve">(of </w:t>
-      </w:r>
-      <w:r>
-        <w:rPr>
-          <w:i/>
-          <w:iCs/>
-          <w:sz w:val="18"/>
-          <w:szCs w:val="18"/>
-        </w:rPr>
-        <w:t>Affiliation</w:t>
-      </w:r>
-      <w:r>
-        <w:rPr>
-          <w:i/>
-          <w:sz w:val="18"/>
-          <w:szCs w:val="18"/>
-        </w:rPr>
-        <w:t>)</w:t>
-      </w:r>
-      <w:r>
-        <w:rPr>
-          <w:sz w:val="18"/>
-          <w:szCs w:val="18"/>
-        </w:rPr>
-        <w:br/>
-        <w:t xml:space="preserve">line 3: </w:t>
-      </w:r>
-      <w:r>
-        <w:rPr>
-          <w:i/>
-          <w:sz w:val="18"/>
-          <w:szCs w:val="18"/>
-        </w:rPr>
-        <w:t xml:space="preserve">name of organization </w:t>
-      </w:r>
-      <w:r>
-        <w:rPr>
-          <w:i/>
-          <w:sz w:val="18"/>
-          <w:szCs w:val="18"/>
-        </w:rPr>
-        <w:br/>
-      </w:r>
-      <w:r>
-        <w:rPr>
-          <w:i/>
-          <w:sz w:val="18"/>
-          <w:szCs w:val="18"/>
-        </w:rPr>
-        <w:t>(of Affiliation)</w:t>
-      </w:r>
-      <w:r>
-        <w:rPr>
-          <w:i/>
-          <w:sz w:val="18"/>
-          <w:szCs w:val="18"/>
-        </w:rPr>
-        <w:br/>
-      </w:r>
-      <w:r>
-        <w:rPr>
-          <w:sz w:val="18"/>
-          <w:szCs w:val="18"/>
-        </w:rPr>
-        <w:t>line 4: City, Country</w:t>
-      </w:r>
-      <w:r>
-        <w:rPr>
-          <w:sz w:val="18"/>
-          <w:szCs w:val="18"/>
-        </w:rPr>
-        <w:br/>
-        <w:t>line 5: email address</w:t>
-      </w:r>
-      <w:r>
-        <w:rPr>
-          <w:sz w:val="18"/>
-          <w:szCs w:val="18"/>
-        </w:rPr>
-        <w:t xml:space="preserve"> or ORCID</w:t>
-      </w:r>
-    </w:p>
-    <w:p>
-      <w:pPr>
-        <w:pStyle w:val="Author"/>
-        <w:spacing w:before="5pt" w:beforeAutospacing="1"/>
-        <w:rPr>
-          <w:sz w:val="18"/>
-          <w:szCs w:val="18"/>
-        </w:rPr>
-      </w:pPr>
-      <w:r>
-        <w:rPr>
-          <w:sz w:val="18"/>
-          <w:szCs w:val="18"/>
-        </w:rPr>
-        <w:t>li</w:t>
-      </w:r>
-      <w:r>
-        <w:rPr>
-          <w:sz w:val="18"/>
-          <w:szCs w:val="18"/>
-        </w:rPr>
-        <w:t xml:space="preserve">ne 1: </w:t>
-      </w:r>
-      <w:r>
-        <w:rPr>
-          <w:sz w:val="18"/>
-          <w:szCs w:val="18"/>
-        </w:rPr>
-        <w:t>5</w:t>
-      </w:r>
-      <w:r>
-        <w:rPr>
-          <w:sz w:val="18"/>
-          <w:szCs w:val="18"/>
-          <w:vertAlign w:val="superscript"/>
-        </w:rPr>
-        <w:t>th</w:t>
-      </w:r>
-      <w:r>
-        <w:rPr>
-          <w:sz w:val="18"/>
-          <w:szCs w:val="18"/>
-        </w:rPr>
-        <w:t xml:space="preserve"> Given Name Surname</w:t>
-      </w:r>
-      <w:r>
-        <w:rPr>
-          <w:sz w:val="18"/>
-          <w:szCs w:val="18"/>
-        </w:rPr>
-        <w:br/>
-        <w:t xml:space="preserve">line 2: </w:t>
-      </w:r>
-      <w:r>
-        <w:rPr>
-          <w:i/>
-          <w:sz w:val="18"/>
-          <w:szCs w:val="18"/>
-        </w:rPr>
-        <w:t xml:space="preserve">dept. name of organization </w:t>
-      </w:r>
-      <w:r>
-        <w:rPr>
-          <w:i/>
-          <w:sz w:val="18"/>
-          <w:szCs w:val="18"/>
-        </w:rPr>
-        <w:br/>
-      </w:r>
-      <w:r>
-        <w:rPr>
-          <w:i/>
-          <w:sz w:val="18"/>
-          <w:szCs w:val="18"/>
-        </w:rPr>
-        <w:t xml:space="preserve">(of </w:t>
-      </w:r>
-      <w:r>
-        <w:rPr>
-          <w:i/>
-          <w:iCs/>
-          <w:sz w:val="18"/>
-          <w:szCs w:val="18"/>
-        </w:rPr>
-        <w:t>Affiliation</w:t>
-      </w:r>
-      <w:r>
-        <w:rPr>
-          <w:i/>
-          <w:sz w:val="18"/>
-          <w:szCs w:val="18"/>
-        </w:rPr>
-        <w:t>)</w:t>
-      </w:r>
-      <w:r>
-        <w:rPr>
-          <w:sz w:val="18"/>
-          <w:szCs w:val="18"/>
-        </w:rPr>
-        <w:br/>
-        <w:t xml:space="preserve">line 3: </w:t>
-      </w:r>
-      <w:r>
-        <w:rPr>
-          <w:i/>
-          <w:sz w:val="18"/>
-          <w:szCs w:val="18"/>
-        </w:rPr>
-        <w:t xml:space="preserve">name of organization </w:t>
-      </w:r>
-      <w:r>
-        <w:rPr>
-          <w:i/>
-          <w:sz w:val="18"/>
-          <w:szCs w:val="18"/>
-        </w:rPr>
-        <w:br/>
-      </w:r>
-      <w:r>
-        <w:rPr>
-          <w:i/>
-          <w:sz w:val="18"/>
-          <w:szCs w:val="18"/>
-        </w:rPr>
-        <w:t xml:space="preserve">(of </w:t>
-      </w:r>
-      <w:r>
-        <w:rPr>
-          <w:i/>
-          <w:sz w:val="18"/>
-          <w:szCs w:val="18"/>
-        </w:rPr>
-        <w:t>A</w:t>
-      </w:r>
-      <w:r>
-        <w:rPr>
-          <w:i/>
-          <w:sz w:val="18"/>
-          <w:szCs w:val="18"/>
-        </w:rPr>
-        <w:t>ffiliation)</w:t>
-      </w:r>
-      <w:r>
-        <w:rPr>
-          <w:i/>
-          <w:sz w:val="18"/>
-          <w:szCs w:val="18"/>
-        </w:rPr>
-        <w:br/>
-      </w:r>
-      <w:r>
-        <w:rPr>
-          <w:sz w:val="18"/>
-          <w:szCs w:val="18"/>
-        </w:rPr>
-        <w:t>line 4: City, Country</w:t>
-      </w:r>
-      <w:r>
-        <w:rPr>
-          <w:sz w:val="18"/>
-          <w:szCs w:val="18"/>
-        </w:rPr>
-        <w:br/>
-        <w:t>line 5: email address</w:t>
-      </w:r>
-      <w:r>
-        <w:rPr>
-          <w:sz w:val="18"/>
-          <w:szCs w:val="18"/>
-        </w:rPr>
-        <w:t xml:space="preserve"> </w:t>
-      </w:r>
-      <w:r>
-        <w:rPr>
-          <w:sz w:val="18"/>
-          <w:szCs w:val="18"/>
-        </w:rPr>
-        <w:t xml:space="preserve"> or ORCID</w:t>
-      </w:r>
-      <w:r>
-        <w:rPr>
-          <w:sz w:val="18"/>
-          <w:szCs w:val="18"/>
-        </w:rPr>
-        <w:br w:type="column"/>
-      </w:r>
-      <w:r>
-        <w:rPr>
-          <w:sz w:val="18"/>
-          <w:szCs w:val="18"/>
-        </w:rPr>
-        <w:t>line 1: 3</w:t>
-      </w:r>
-      <w:r>
-        <w:rPr>
-          <w:sz w:val="18"/>
-          <w:szCs w:val="18"/>
-          <w:vertAlign w:val="superscript"/>
-        </w:rPr>
-        <w:t>rd</w:t>
-      </w:r>
-      <w:r>
-        <w:rPr>
-          <w:sz w:val="18"/>
-          <w:szCs w:val="18"/>
-        </w:rPr>
-        <w:t xml:space="preserve"> </w:t>
-      </w:r>
-      <w:r>
-        <w:rPr>
-          <w:sz w:val="18"/>
-          <w:szCs w:val="18"/>
-        </w:rPr>
-        <w:t>Given Name Surname</w:t>
-      </w:r>
-      <w:r>
-        <w:rPr>
-          <w:sz w:val="18"/>
-          <w:szCs w:val="18"/>
-        </w:rPr>
-        <w:br/>
-        <w:t xml:space="preserve">line 2: </w:t>
-      </w:r>
-      <w:r>
-        <w:rPr>
-          <w:i/>
-          <w:sz w:val="18"/>
-          <w:szCs w:val="18"/>
-        </w:rPr>
-        <w:t xml:space="preserve">dept. name of organization </w:t>
-      </w:r>
-      <w:r>
-        <w:rPr>
-          <w:i/>
-          <w:sz w:val="18"/>
-          <w:szCs w:val="18"/>
-        </w:rPr>
-        <w:br/>
-      </w:r>
-      <w:r>
-        <w:rPr>
-          <w:i/>
-          <w:sz w:val="18"/>
-          <w:szCs w:val="18"/>
-        </w:rPr>
-        <w:t xml:space="preserve">(of </w:t>
-      </w:r>
-      <w:r>
-        <w:rPr>
-          <w:i/>
-          <w:iCs/>
-          <w:sz w:val="18"/>
-          <w:szCs w:val="18"/>
-        </w:rPr>
-        <w:t>Affiliation</w:t>
-      </w:r>
-      <w:r>
-        <w:rPr>
-          <w:i/>
-          <w:sz w:val="18"/>
-          <w:szCs w:val="18"/>
-        </w:rPr>
-        <w:t>)</w:t>
-      </w:r>
-      <w:r>
-        <w:rPr>
-          <w:sz w:val="18"/>
-          <w:szCs w:val="18"/>
-        </w:rPr>
-        <w:br/>
-        <w:t xml:space="preserve">line 3: </w:t>
-      </w:r>
-      <w:r>
-        <w:rPr>
-          <w:i/>
-          <w:sz w:val="18"/>
-          <w:szCs w:val="18"/>
-        </w:rPr>
-        <w:t xml:space="preserve">name of organization </w:t>
-      </w:r>
-      <w:r>
-        <w:rPr>
-          <w:i/>
-          <w:sz w:val="18"/>
-          <w:szCs w:val="18"/>
-        </w:rPr>
-        <w:br/>
-      </w:r>
-      <w:r>
-        <w:rPr>
-          <w:i/>
-          <w:sz w:val="18"/>
-          <w:szCs w:val="18"/>
-        </w:rPr>
-        <w:t>(of Affiliation)</w:t>
-      </w:r>
-      <w:r>
-        <w:rPr>
-          <w:i/>
-          <w:sz w:val="18"/>
-          <w:szCs w:val="18"/>
-        </w:rPr>
-        <w:br/>
-      </w:r>
-      <w:r>
-        <w:rPr>
-          <w:sz w:val="18"/>
-          <w:szCs w:val="18"/>
-        </w:rPr>
-        <w:t>line 4: City, Country</w:t>
-      </w:r>
-      <w:r>
-        <w:rPr>
-          <w:sz w:val="18"/>
-          <w:szCs w:val="18"/>
-        </w:rPr>
-        <w:br/>
-        <w:t>line 5: email address</w:t>
-      </w:r>
-      <w:r>
-        <w:rPr>
-          <w:sz w:val="18"/>
-          <w:szCs w:val="18"/>
-        </w:rPr>
-        <w:t xml:space="preserve"> or ORCID</w:t>
-      </w:r>
-    </w:p>
-    <w:p>
-      <w:pPr>
-        <w:pStyle w:val="Author"/>
-        <w:spacing w:before="5pt" w:beforeAutospacing="1"/>
-      </w:pPr>
-      <w:r>
-        <w:rPr>
-          <w:sz w:val="18"/>
-          <w:szCs w:val="18"/>
-        </w:rPr>
-        <w:t xml:space="preserve">line 1: </w:t>
-      </w:r>
-      <w:r>
-        <w:rPr>
-          <w:sz w:val="18"/>
-          <w:szCs w:val="18"/>
-        </w:rPr>
-        <w:t>6</w:t>
-      </w:r>
-      <w:r>
-        <w:rPr>
-          <w:sz w:val="18"/>
-          <w:szCs w:val="18"/>
-          <w:vertAlign w:val="superscript"/>
-        </w:rPr>
-        <w:t>th</w:t>
-      </w:r>
-      <w:r>
-        <w:rPr>
-          <w:sz w:val="18"/>
-          <w:szCs w:val="18"/>
-        </w:rPr>
-        <w:t xml:space="preserve"> Given Name Surname</w:t>
-      </w:r>
-      <w:r>
-        <w:rPr>
-          <w:sz w:val="18"/>
-          <w:szCs w:val="18"/>
-        </w:rPr>
-        <w:br/>
-        <w:t xml:space="preserve">line 2: </w:t>
-      </w:r>
-      <w:r>
-        <w:rPr>
-          <w:i/>
-          <w:sz w:val="18"/>
-          <w:szCs w:val="18"/>
-        </w:rPr>
-        <w:t xml:space="preserve">dept. name of organization </w:t>
-      </w:r>
-      <w:r>
-        <w:rPr>
-          <w:i/>
-          <w:sz w:val="18"/>
-          <w:szCs w:val="18"/>
-        </w:rPr>
-        <w:br/>
-      </w:r>
-      <w:r>
-        <w:rPr>
-          <w:i/>
-          <w:sz w:val="18"/>
-          <w:szCs w:val="18"/>
-        </w:rPr>
-        <w:t xml:space="preserve">(of </w:t>
-      </w:r>
-      <w:r>
-        <w:rPr>
-          <w:i/>
-          <w:iCs/>
-          <w:sz w:val="18"/>
-          <w:szCs w:val="18"/>
-        </w:rPr>
-        <w:t>Affiliation</w:t>
-      </w:r>
-      <w:r>
-        <w:rPr>
-          <w:i/>
-          <w:sz w:val="18"/>
-          <w:szCs w:val="18"/>
-        </w:rPr>
-        <w:t>)</w:t>
-      </w:r>
-      <w:r>
-        <w:rPr>
-          <w:sz w:val="18"/>
-          <w:szCs w:val="18"/>
-        </w:rPr>
-        <w:br/>
-        <w:t xml:space="preserve">line 3: </w:t>
-      </w:r>
-      <w:r>
-        <w:rPr>
-          <w:i/>
-          <w:sz w:val="18"/>
-          <w:szCs w:val="18"/>
-        </w:rPr>
-        <w:t xml:space="preserve">name of organization </w:t>
-      </w:r>
-      <w:r>
-        <w:rPr>
-          <w:i/>
-          <w:sz w:val="18"/>
-          <w:szCs w:val="18"/>
-        </w:rPr>
-        <w:br/>
-      </w:r>
-      <w:r>
-        <w:rPr>
-          <w:i/>
-          <w:sz w:val="18"/>
-          <w:szCs w:val="18"/>
-        </w:rPr>
-        <w:t>(of Affiliation)</w:t>
-      </w:r>
-      <w:r>
-        <w:rPr>
-          <w:i/>
-          <w:sz w:val="18"/>
-          <w:szCs w:val="18"/>
-        </w:rPr>
-        <w:br/>
-      </w:r>
-      <w:r>
-        <w:rPr>
-          <w:sz w:val="18"/>
-          <w:szCs w:val="18"/>
-        </w:rPr>
-        <w:t>line 4: City, Country</w:t>
-      </w:r>
-      <w:r>
-        <w:rPr>
-          <w:sz w:val="18"/>
-          <w:szCs w:val="18"/>
-        </w:rPr>
-        <w:br/>
-        <w:t>line 5: email address</w:t>
-      </w:r>
-      <w:r>
-        <w:rPr>
-          <w:sz w:val="18"/>
-          <w:szCs w:val="18"/>
-        </w:rPr>
-        <w:t xml:space="preserve"> or ORCID</w:t>
-      </w:r>
-      <w:r>
-        <w:t xml:space="preserve"> </w:t>
-      </w:r>
-    </w:p>
-    <w:p>
-      <w:pPr>
+        <w:jc w:val="both"/>
+        <w:rPr>
+          <w:rFonts w:hint="eastAsia"/>
+          <w:lang w:eastAsia="zh-CN"/>
+        </w:rPr>
         <w:sectPr>
           <w:type w:val="continuous"/>
           <w:pgSz w:w="595.30pt" w:h="841.90pt" w:code="9"/>
@@ -1400,72 +328,101 @@
     </w:p>
     <w:p>
       <w:pPr>
-        <w:pStyle w:val="Heading1"/>
-      </w:pPr>
-      <w:r>
-        <w:t>Introduction (</w:t>
-      </w:r>
-      <w:r>
-        <w:rPr>
-          <w:rFonts w:eastAsia="MS Mincho"/>
-          <w:i/>
-        </w:rPr>
-        <w:t>Heading 1</w:t>
-      </w:r>
-      <w:r>
-        <w:t>)</w:t>
-      </w:r>
-    </w:p>
-    <w:p>
-      <w:pPr>
-        <w:pStyle w:val="BodyText"/>
-      </w:pPr>
-      <w:r>
-        <w:t xml:space="preserve">This template, </w:t>
-      </w:r>
-      <w:r>
-        <w:t>modified</w:t>
-      </w:r>
-      <w:r>
-        <w:t xml:space="preserve"> in MS Word 200</w:t>
-      </w:r>
-      <w:r>
+        <w:pStyle w:val="1"/>
+      </w:pPr>
+      <w:r>
+        <w:t xml:space="preserve">Introduction </w:t>
+      </w:r>
+    </w:p>
+    <w:p>
+      <w:pPr>
+        <w:pStyle w:val="a3"/>
         <w:rPr>
           <w:lang w:val="en-US"/>
         </w:rPr>
-        <w:t>7</w:t>
-      </w:r>
-      <w:r>
-        <w:t xml:space="preserve"> and saved as </w:t>
-      </w:r>
+      </w:pPr>
       <w:r>
         <w:rPr>
           <w:lang w:val="en-US"/>
         </w:rPr>
-        <w:t xml:space="preserve">a </w:t>
-      </w:r>
-      <w:r>
-        <w:t>“Word 97-200</w:t>
-      </w:r>
-      <w:r>
-        <w:t>3</w:t>
-      </w:r>
-      <w:r>
-        <w:t xml:space="preserve"> </w:t>
-      </w:r>
+        <w:t>Modern computing platforms are evolving toward increasingly large-scale and highly parallel architectures, including many-core processors, GPUs, wafer-scale accelerators, and neuromorphic systems. As illustrated in Fig. 1, representative platforms have substantially expanded their computing resources and processing capabilities, alongside rising chip-to-chip bandwidth. These trends place growing demands on data movement and communication among processing elements, making the on-chip interconnect a critical factor in overall system performance. Consequently, networks-on-chip (</w:t>
+      </w:r>
+      <w:proofErr w:type="spellStart"/>
       <w:r>
         <w:rPr>
           <w:lang w:val="en-US"/>
         </w:rPr>
-        <w:t>Document</w:t>
-      </w:r>
-      <w:r>
-        <w:t>” for the PC, provides authors with most of the formatting specifications needed for preparing electronic versions of their papers. All standard paper components have been specified for three reasons: (1) ease of use when formatting individual papers, (2) automatic compliance to electronic requirements that facilitate the concurrent or later production of electronic products, and (3) conformity of style throughout a conference proceedings. Margins, column widths, line spacing, and type styles are built-in; examples of the type styles are provided throughout this document and are identified in italic type, within parentheses, following the example. Some components, such as multi-leveled equations, graphics, and tables are not prescribed, although the various table text styles are provided. The formatter will need to create these components, incorporating the applicable criteria that follow.</w:t>
-      </w:r>
-    </w:p>
-    <w:p>
-      <w:pPr>
-        <w:pStyle w:val="Heading1"/>
+        <w:t>NoCs</w:t>
+      </w:r>
+      <w:proofErr w:type="spellEnd"/>
+      <w:r>
+        <w:rPr>
+          <w:lang w:val="en-US"/>
+        </w:rPr>
+        <w:t>) must provide low-latency, high-throughput, and energy-efficient communication while remaining scalable to larger systems.</w:t>
+      </w:r>
+    </w:p>
+    <w:p>
+      <w:pPr>
+        <w:pStyle w:val="a3"/>
+        <w:ind w:firstLine="0pt"/>
+        <w:rPr>
+          <w:rFonts w:hint="eastAsia"/>
+          <w:lang w:eastAsia="zh-CN"/>
+        </w:rPr>
+      </w:pPr>
+      <w:r>
+        <w:rPr>
+          <w:rFonts w:hint="eastAsia"/>
+          <w:noProof/>
+          <w:lang w:eastAsia="zh-CN"/>
+        </w:rPr>
+        <w:drawing>
+          <wp:inline distT="0" distB="0" distL="0" distR="0" wp14:anchorId="204B11FE" wp14:editId="50094ABE">
+            <wp:extent cx="3089910" cy="1713865"/>
+            <wp:effectExtent l="0" t="0" r="0" b="635"/>
+            <wp:docPr id="113410819" name="图形 2"/>
+            <wp:cNvGraphicFramePr>
+              <a:graphicFrameLocks xmlns:a="http://purl.oclc.org/ooxml/drawingml/main" noChangeAspect="1"/>
+            </wp:cNvGraphicFramePr>
+            <a:graphic xmlns:a="http://purl.oclc.org/ooxml/drawingml/main">
+              <a:graphicData uri="http://purl.oclc.org/ooxml/drawingml/picture">
+                <pic:pic xmlns:pic="http://purl.oclc.org/ooxml/drawingml/picture">
+                  <pic:nvPicPr>
+                    <pic:cNvPr id="113410819" name="图形 113410819"/>
+                    <pic:cNvPicPr/>
+                  </pic:nvPicPr>
+                  <pic:blipFill>
+                    <a:blip r:embed="rId9">
+                      <a:extLst>
+                        <a:ext uri="{96DAC541-7B7A-43D3-8B79-37D633B846F1}">
+                          <asvg:svgBlip xmlns:asvg="http://schemas.microsoft.com/office/drawing/2016/SVG/main" r:embed="rId10"/>
+                        </a:ext>
+                      </a:extLst>
+                    </a:blip>
+                    <a:stretch>
+                      <a:fillRect/>
+                    </a:stretch>
+                  </pic:blipFill>
+                  <pic:spPr>
+                    <a:xfrm>
+                      <a:off x="0" y="0"/>
+                      <a:ext cx="3089910" cy="1713865"/>
+                    </a:xfrm>
+                    <a:prstGeom prst="rect">
+                      <a:avLst/>
+                    </a:prstGeom>
+                  </pic:spPr>
+                </pic:pic>
+              </a:graphicData>
+            </a:graphic>
+          </wp:inline>
+        </w:drawing>
+      </w:r>
+    </w:p>
+    <w:p>
+      <w:pPr>
+        <w:pStyle w:val="1"/>
       </w:pPr>
       <w:r>
         <w:t>Ease of Use</w:t>
@@ -1473,7 +430,7 @@
     </w:p>
     <w:p>
       <w:pPr>
-        <w:pStyle w:val="Heading2"/>
+        <w:pStyle w:val="2"/>
       </w:pPr>
       <w:r>
         <w:t xml:space="preserve">Selecting a </w:t>
@@ -1487,7 +444,7 @@
     </w:p>
     <w:p>
       <w:pPr>
-        <w:pStyle w:val="BodyText"/>
+        <w:pStyle w:val="a3"/>
       </w:pPr>
       <w:r>
         <w:t xml:space="preserve">First, confirm that you have the correct template for your paper size. This template has been tailored for output on the </w:t>
@@ -1504,7 +461,7 @@
     </w:p>
     <w:p>
       <w:pPr>
-        <w:pStyle w:val="Heading2"/>
+        <w:pStyle w:val="2"/>
       </w:pPr>
       <w:r>
         <w:t>Maintaining the Integrity of the Specifications</w:t>
@@ -1512,18 +469,15 @@
     </w:p>
     <w:p>
       <w:pPr>
-        <w:pStyle w:val="BodyText"/>
-      </w:pPr>
-      <w:r>
-        <w:t xml:space="preserve">The template is used to format your paper and style the text. All margins, column widths, line spaces, and text fonts are prescribed; please do not alter them. You may note peculiarities. For example, the head margin in this template measures proportionately more than is customary. This measurement and others are deliberate, using specifications that anticipate your paper as one part of the entire proceedings, </w:t>
-      </w:r>
-      <w:r>
-        <w:t>and not as an independent document. Please do not revise any of the current designations.</w:t>
-      </w:r>
-    </w:p>
-    <w:p>
-      <w:pPr>
-        <w:pStyle w:val="Heading1"/>
+        <w:pStyle w:val="a3"/>
+      </w:pPr>
+      <w:r>
+        <w:t>The template is used to format your paper and style the text. All margins, column widths, line spaces, and text fonts are prescribed; please do not alter them. You may note peculiarities. For example, the head margin in this template measures proportionately more than is customary. This measurement and others are deliberate, using specifications that anticipate your paper as one part of the entire proceedings, and not as an independent document. Please do not revise any of the current designations.</w:t>
+      </w:r>
+    </w:p>
+    <w:p>
+      <w:pPr>
+        <w:pStyle w:val="1"/>
       </w:pPr>
       <w:r>
         <w:t xml:space="preserve">Prepare Your Paper </w:t>
@@ -1537,7 +491,7 @@
     </w:p>
     <w:p>
       <w:pPr>
-        <w:pStyle w:val="BodyText"/>
+        <w:pStyle w:val="a3"/>
         <w:rPr>
           <w:lang w:val="en-US"/>
         </w:rPr>
@@ -1552,12 +506,18 @@
         <w:rPr>
           <w:lang w:val="en-US"/>
         </w:rPr>
-        <w:t>Complete all content and organizational editing before formatting. Please note sections A-D below for more information on proofreading, spelling and grammar.</w:t>
-      </w:r>
-    </w:p>
-    <w:p>
-      <w:pPr>
-        <w:pStyle w:val="BodyText"/>
+        <w:t xml:space="preserve">Complete all content and organizational editing before formatting. Please note sections </w:t>
+      </w:r>
+      <w:r>
+        <w:rPr>
+          <w:lang w:val="en-US"/>
+        </w:rPr>
+        <w:t>A-D below for more information on proofreading, spelling and grammar.</w:t>
+      </w:r>
+    </w:p>
+    <w:p>
+      <w:pPr>
+        <w:pStyle w:val="a3"/>
       </w:pPr>
       <w:r>
         <w:t>Keep your text and graphic files separate until after the text has been formatted and styled. Do not use hard tabs, and limit use of hard returns to only one return at the end of a paragraph. Do not add any kind of pagination anywhere in the paper. Do not number text heads-the template will do that for you.</w:t>
@@ -1565,7 +525,7 @@
     </w:p>
     <w:p>
       <w:pPr>
-        <w:pStyle w:val="Heading2"/>
+        <w:pStyle w:val="2"/>
       </w:pPr>
       <w:r>
         <w:t>Abbreviations</w:t>
@@ -1576,7 +536,7 @@
     </w:p>
     <w:p>
       <w:pPr>
-        <w:pStyle w:val="BodyText"/>
+        <w:pStyle w:val="a3"/>
       </w:pPr>
       <w:r>
         <w:t xml:space="preserve">Define abbreviations and acronyms the first time they are used in the text, even after they have been defined in the abstract. Abbreviations such as IEEE, SI, MKS, CGS, </w:t>
@@ -1587,23 +547,45 @@
       </w:r>
       <w:proofErr w:type="spellEnd"/>
       <w:r>
-        <w:t xml:space="preserve">, dc, and </w:t>
+        <w:t>, dc, and rms do not have to be defined. Do not use abbreviations in the title or heads unless they are unavoidable.</w:t>
+      </w:r>
+    </w:p>
+    <w:p>
+      <w:pPr>
+        <w:pStyle w:val="2"/>
+      </w:pPr>
+      <w:r>
+        <w:t>Units</w:t>
+      </w:r>
+    </w:p>
+    <w:p>
+      <w:pPr>
+        <w:pStyle w:val="bulletlist"/>
+      </w:pPr>
+      <w:r>
+        <w:t xml:space="preserve">Use </w:t>
+      </w:r>
+      <w:r>
+        <w:t>either</w:t>
+      </w:r>
+      <w:r>
+        <w:t xml:space="preserve"> SI (MKS) or CGS as primary units. (SI units are encouraged.) English units may be used as secondary units (in parentheses). An exception would be the use of English units as identifiers in trade, such as “3.5-inch disk drive”.</w:t>
+      </w:r>
+    </w:p>
+    <w:p>
+      <w:pPr>
+        <w:pStyle w:val="bulletlist"/>
+      </w:pPr>
+      <w:r>
+        <w:t xml:space="preserve">Avoid combining SI and CGS units, such as current in amperes and magnetic field in </w:t>
       </w:r>
       <w:proofErr w:type="spellStart"/>
       <w:r>
-        <w:t>rms</w:t>
+        <w:t>oersteds</w:t>
       </w:r>
       <w:proofErr w:type="spellEnd"/>
       <w:r>
-        <w:t xml:space="preserve"> do not have to be defined. Do not use abbreviations in the title or heads unless they are unavoidable.</w:t>
-      </w:r>
-    </w:p>
-    <w:p>
-      <w:pPr>
-        <w:pStyle w:val="Heading2"/>
-      </w:pPr>
-      <w:r>
-        <w:t>Units</w:t>
+        <w:t>. This often leads to confusion because equations do not balance dimensionally. If you must use mixed units, clearly state the units for each quantity that you use in an equation.</w:t>
       </w:r>
     </w:p>
     <w:p>
@@ -1611,61 +593,7 @@
         <w:pStyle w:val="bulletlist"/>
       </w:pPr>
       <w:r>
-        <w:t xml:space="preserve">Use </w:t>
-      </w:r>
-      <w:r>
-        <w:t>either</w:t>
-      </w:r>
-      <w:r>
-        <w:t xml:space="preserve"> SI (MKS) or CGS as primary units. (SI units are encouraged.) English units may be used as secondary units (in parentheses). An exception would be the use of English units as identifiers in trade, such as “3.5-inch disk drive”.</w:t>
-      </w:r>
-    </w:p>
-    <w:p>
-      <w:pPr>
-        <w:pStyle w:val="bulletlist"/>
-      </w:pPr>
-      <w:r>
-        <w:t xml:space="preserve">Avoid combining SI and CGS units, such as current in amperes and magnetic field in </w:t>
-      </w:r>
-      <w:proofErr w:type="spellStart"/>
-      <w:r>
-        <w:t>oersteds</w:t>
-      </w:r>
-      <w:proofErr w:type="spellEnd"/>
-      <w:r>
-        <w:t>. This often leads to confusion because equations do not balance dimensionally. If you must use mixed units, clearly state the units for each quantity that you use in an equation.</w:t>
-      </w:r>
-    </w:p>
-    <w:p>
-      <w:pPr>
-        <w:pStyle w:val="bulletlist"/>
-      </w:pPr>
-      <w:r>
-        <w:t>Do not mix complete spellings and abbreviations of units: “</w:t>
-      </w:r>
-      <w:proofErr w:type="spellStart"/>
-      <w:r>
-        <w:t>Wb</w:t>
-      </w:r>
-      <w:proofErr w:type="spellEnd"/>
-      <w:r>
-        <w:t>/m2” or “</w:t>
-      </w:r>
-      <w:proofErr w:type="spellStart"/>
-      <w:r>
-        <w:t>webers</w:t>
-      </w:r>
-      <w:proofErr w:type="spellEnd"/>
-      <w:r>
-        <w:t xml:space="preserve"> per square meter”, not “</w:t>
-      </w:r>
-      <w:proofErr w:type="spellStart"/>
-      <w:r>
-        <w:t>webers</w:t>
-      </w:r>
-      <w:proofErr w:type="spellEnd"/>
-      <w:r>
-        <w:t xml:space="preserve">/m2”.  Spell out units when they appear in text: “. . . a few </w:t>
+        <w:t xml:space="preserve">Do not mix complete spellings and abbreviations of units: “Wb/m2” or “webers per square meter”, not “webers/m2”.  Spell out units when they appear in text: “. . . a few </w:t>
       </w:r>
       <w:proofErr w:type="spellStart"/>
       <w:r>
@@ -1730,16 +658,15 @@
     </w:p>
     <w:p>
       <w:pPr>
-        <w:pStyle w:val="Heading2"/>
-      </w:pPr>
-      <w:r>
-        <w:lastRenderedPageBreak/>
+        <w:pStyle w:val="2"/>
+      </w:pPr>
+      <w:r>
         <w:t>Equations</w:t>
       </w:r>
     </w:p>
     <w:p>
       <w:pPr>
-        <w:pStyle w:val="BodyText"/>
+        <w:pStyle w:val="a3"/>
       </w:pPr>
       <w:r>
         <w:t>The equations are an exception to the prescribed specifications of this template. You will need to determine whether or not your equation should be typed using either the Times New Roman or the Symbol font (please no other font). To create multileveled equations, it may be necessary to treat the equation as a graphic and insert it into the text after your paper is styled.</w:t>
@@ -1747,21 +674,13 @@
     </w:p>
     <w:p>
       <w:pPr>
-        <w:pStyle w:val="BodyText"/>
+        <w:pStyle w:val="a3"/>
         <w:rPr>
           <w:lang w:val="en-US"/>
         </w:rPr>
       </w:pPr>
       <w:r>
-        <w:t xml:space="preserve">Number equations consecutively. Equation numbers, within parentheses, are to position flush right, as in (1), using a right tab stop. To make your equations more compact, you may use the solidus ( / ), the </w:t>
-      </w:r>
-      <w:proofErr w:type="spellStart"/>
-      <w:r>
-        <w:t>exp</w:t>
-      </w:r>
-      <w:proofErr w:type="spellEnd"/>
-      <w:r>
-        <w:t xml:space="preserve"> function, or appropriate exponents. Italicize Roman symbols for quantities and variables, but not Greek symbols. Use a long dash rather than a hyphen for a minus sign. Punctuate equations with commas or periods when they are part of a sentence, as in</w:t>
+        <w:t>Number equations consecutively. Equation numbers, within parentheses, are to position flush right, as in (1), using a right tab stop. To make your equations more compact, you may use the solidus ( / ), the exp function, or appropriate exponents. Italicize Roman symbols for quantities and variables, but not Greek symbols. Use a long dash rather than a hyphen for a minus sign. Punctuate equations with commas or periods when they are part of a sentence, as in</w:t>
       </w:r>
       <w:r>
         <w:rPr>
@@ -1773,6 +692,9 @@
     <w:p>
       <w:pPr>
         <w:pStyle w:val="equation"/>
+        <w:rPr>
+          <w:rFonts w:hint="eastAsia"/>
+        </w:rPr>
       </w:pPr>
       <w:r>
         <w:tab/>
@@ -1830,15 +752,19 @@
     </w:p>
     <w:p>
       <w:pPr>
-        <w:pStyle w:val="BodyText"/>
-      </w:pPr>
-      <w:r>
-        <w:t>Note that the equation is centered using a center tab stop. Be sure that the symbols in your equation have been defined before or immediately following the equation. Use “(1)”, not “Eq. (1)” or “equation (1)”, except at the beginning of a sentence: “Equation (1) is . . .”</w:t>
-      </w:r>
-    </w:p>
-    <w:p>
-      <w:pPr>
-        <w:pStyle w:val="Heading2"/>
+        <w:pStyle w:val="a3"/>
+      </w:pPr>
+      <w:r>
+        <w:t xml:space="preserve">Note that the equation is centered using a center tab stop. Be sure that the symbols in your equation have been defined before or immediately following the equation. Use “(1)”, not </w:t>
+      </w:r>
+      <w:r>
+        <w:lastRenderedPageBreak/>
+        <w:t>“Eq. (1)” or “equation (1)”, except at the beginning of a sentence: “Equation (1) is . . .”</w:t>
+      </w:r>
+    </w:p>
+    <w:p>
+      <w:pPr>
+        <w:pStyle w:val="2"/>
       </w:pPr>
       <w:r>
         <w:t>Some Common Mistakes</w:t>
@@ -1958,7 +884,7 @@
     </w:p>
     <w:p>
       <w:pPr>
-        <w:pStyle w:val="BodyText"/>
+        <w:pStyle w:val="a3"/>
       </w:pPr>
       <w:r>
         <w:t>An excellent style manual for science writers is [7].</w:t>
@@ -1966,7 +892,7 @@
     </w:p>
     <w:p>
       <w:pPr>
-        <w:pStyle w:val="Heading1"/>
+        <w:pStyle w:val="1"/>
       </w:pPr>
       <w:r>
         <w:t xml:space="preserve">Using the </w:t>
@@ -1977,7 +903,7 @@
     </w:p>
     <w:p>
       <w:pPr>
-        <w:pStyle w:val="BodyText"/>
+        <w:pStyle w:val="a3"/>
       </w:pPr>
       <w:r>
         <w:t>After the text edit has been completed, the paper is ready for the template. Duplicate the template file by using the Save As command, and use the naming convention prescribed by your conference for the name of your paper. In this newly created file, highlight all of the contents and import your prepared text file. You are now ready to style your paper; use the scroll down window on the left of the MS Word Formatting toolbar.</w:t>
@@ -1985,7 +911,7 @@
     </w:p>
     <w:p>
       <w:pPr>
-        <w:pStyle w:val="Heading2"/>
+        <w:pStyle w:val="2"/>
       </w:pPr>
       <w:r>
         <w:t>Authors</w:t>
@@ -1996,7 +922,7 @@
     </w:p>
     <w:p>
       <w:pPr>
-        <w:pStyle w:val="BodyText"/>
+        <w:pStyle w:val="a3"/>
       </w:pPr>
       <w:r>
         <w:rPr>
@@ -2070,7 +996,10 @@
         <w:t xml:space="preserve"> </w:t>
       </w:r>
       <w:r>
-        <w:t>Names should not be listed in columns nor group by affiliation.</w:t>
+        <w:t xml:space="preserve">Names should not be listed in columns </w:t>
+      </w:r>
+      <w:r>
+        <w:t>nor group by affiliation.</w:t>
       </w:r>
       <w:r>
         <w:rPr>
@@ -2084,7 +1013,7 @@
     </w:p>
     <w:p>
       <w:pPr>
-        <w:pStyle w:val="Heading3"/>
+        <w:pStyle w:val="3"/>
       </w:pPr>
       <w:r>
         <w:t xml:space="preserve">For papers with more than six authors: </w:t>
@@ -2098,7 +1027,7 @@
     </w:p>
     <w:p>
       <w:pPr>
-        <w:pStyle w:val="Heading3"/>
+        <w:pStyle w:val="3"/>
       </w:pPr>
       <w:r>
         <w:t xml:space="preserve">For </w:t>
@@ -2124,7 +1053,7 @@
     </w:p>
     <w:p>
       <w:pPr>
-        <w:pStyle w:val="Heading4"/>
+        <w:pStyle w:val="4"/>
       </w:pPr>
       <w:r>
         <w:t>Selection</w:t>
@@ -2141,7 +1070,7 @@
     </w:p>
     <w:p>
       <w:pPr>
-        <w:pStyle w:val="Heading4"/>
+        <w:pStyle w:val="4"/>
       </w:pPr>
       <w:r>
         <w:t>Change number of columns:</w:t>
@@ -2170,7 +1099,7 @@
     </w:p>
     <w:p>
       <w:pPr>
-        <w:pStyle w:val="Heading4"/>
+        <w:pStyle w:val="4"/>
         <w:rPr>
           <w:i w:val="0"/>
         </w:rPr>
@@ -2203,7 +1132,7 @@
     </w:p>
     <w:p>
       <w:pPr>
-        <w:pStyle w:val="Heading2"/>
+        <w:pStyle w:val="2"/>
       </w:pPr>
       <w:r>
         <w:t>Identify</w:t>
@@ -2214,7 +1143,7 @@
     </w:p>
     <w:p>
       <w:pPr>
-        <w:pStyle w:val="BodyText"/>
+        <w:pStyle w:val="a3"/>
       </w:pPr>
       <w:r>
         <w:t>Headings, or heads, are organizational devices that guide the reader through your paper. There are two types: component heads and text heads.</w:t>
@@ -2222,7 +1151,7 @@
     </w:p>
     <w:p>
       <w:pPr>
-        <w:pStyle w:val="BodyText"/>
+        <w:pStyle w:val="a3"/>
       </w:pPr>
       <w:r>
         <w:t>Component heads identify the different components of your paper and are not topically subordinate to each other. Examples include Acknowledgments and References and, for these, the correct style to use is “Heading 5”. Use “figure caption” for your Figure captions, and “table head” for your table title. Run-in heads, such as “Abstract”, will require you to apply a style (in this case, italic) in addition to the style provided by the drop down menu to differentiate the head from the text.</w:t>
@@ -2230,7 +1159,7 @@
     </w:p>
     <w:p>
       <w:pPr>
-        <w:pStyle w:val="BodyText"/>
+        <w:pStyle w:val="a3"/>
       </w:pPr>
       <w:r>
         <w:t>Text heads organize the topics on a relational, hierarchical basis. For example, the paper title is the primary text head because all subsequent material relates and elaborates on this one topic. If there are two or more sub-topics, the next level head (uppercase Roman numerals) should be used and, conversely, if there are not at least two sub-topics, then no subheads should be introduced. Styles named “Heading 1”, “Heading 2”, “Heading 3”, and “Heading 4” are prescribed.</w:t>
@@ -2238,16 +1167,15 @@
     </w:p>
     <w:p>
       <w:pPr>
-        <w:pStyle w:val="Heading2"/>
-      </w:pPr>
-      <w:r>
-        <w:lastRenderedPageBreak/>
+        <w:pStyle w:val="2"/>
+      </w:pPr>
+      <w:r>
         <w:t>Figures and Tables</w:t>
       </w:r>
     </w:p>
     <w:p>
       <w:pPr>
-        <w:pStyle w:val="Heading4"/>
+        <w:pStyle w:val="4"/>
       </w:pPr>
       <w:r>
         <w:t xml:space="preserve"> </w:t>
@@ -2539,10 +1467,14 @@
     </w:p>
     <w:p>
       <w:pPr>
-        <w:pStyle w:val="BodyText"/>
-      </w:pPr>
-      <w:r>
-        <w:t>Figure Labels: Use 8 point Times New Roman for Figure labels. Use words rather than symbols or abbreviations when writing Figure axis labels to avoid confusing the reader. As an example, write the quantity “Magnetization”, or “Magnetization, M”, not just “M”. If including units in the label, present them within parentheses. Do not label axes only with units. In the example, write “Magnetization (A/m)” or “Magnetization {A[m(1)]}”, not just “A/m”. Do not label axes</w:t>
+        <w:pStyle w:val="a3"/>
+      </w:pPr>
+      <w:r>
+        <w:t xml:space="preserve">Figure Labels: Use 8 point Times New Roman for Figure labels. Use words rather than symbols or abbreviations when writing Figure axis labels to avoid confusing the reader. As an example, write the quantity “Magnetization”, or “Magnetization, M”, not just “M”. If including units in the label, present them within parentheses. Do not label axes only </w:t>
+      </w:r>
+      <w:r>
+        <w:lastRenderedPageBreak/>
+        <w:t>with units. In the example, write “Magnetization (A/m)” or “Magnetization {A[m(1)]}”, not just “A/m”. Do not label axes</w:t>
       </w:r>
       <w:r>
         <w:t xml:space="preserve"> </w:t>
@@ -2553,7 +1485,7 @@
     </w:p>
     <w:p>
       <w:pPr>
-        <w:pStyle w:val="Heading5"/>
+        <w:pStyle w:val="5"/>
       </w:pPr>
       <w:r>
         <w:t>Acknowledgment</w:t>
@@ -2586,7 +1518,7 @@
     </w:p>
     <w:p>
       <w:pPr>
-        <w:pStyle w:val="BodyText"/>
+        <w:pStyle w:val="a3"/>
       </w:pPr>
       <w:r>
         <w:t>The preferred spelling of the word “acknowledgment” in America is without an “e” after the “g</w:t>
@@ -2644,7 +1576,7 @@
     </w:p>
     <w:p>
       <w:pPr>
-        <w:pStyle w:val="Heading5"/>
+        <w:pStyle w:val="5"/>
       </w:pPr>
       <w:r>
         <w:t>References</w:t>
@@ -2652,7 +1584,7 @@
     </w:p>
     <w:p>
       <w:pPr>
-        <w:pStyle w:val="BodyText"/>
+        <w:pStyle w:val="a3"/>
       </w:pPr>
       <w:r>
         <w:t>The template will number citations consecutively within brackets [1]. The sentence punctuation follows the bracket [2]. Refer simply to the reference number, as in [3]—do not use “Ref. [3]” or “reference [3]” except at the beginning of a sentence: “Reference [3] was the first</w:t>
@@ -2672,7 +1604,7 @@
     </w:p>
     <w:p>
       <w:pPr>
-        <w:pStyle w:val="BodyText"/>
+        <w:pStyle w:val="a3"/>
       </w:pPr>
       <w:r>
         <w:t>Number footnotes separately in superscripts. Place the actual footnote at the bottom of the column in which it was cited. Do not put footnotes in the</w:t>
@@ -2689,7 +1621,7 @@
     </w:p>
     <w:p>
       <w:pPr>
-        <w:pStyle w:val="BodyText"/>
+        <w:pStyle w:val="a3"/>
       </w:pPr>
       <w:r>
         <w:t>Unless there are six au</w:t>
@@ -2709,7 +1641,7 @@
     </w:p>
     <w:p>
       <w:pPr>
-        <w:pStyle w:val="BodyText"/>
+        <w:pStyle w:val="a3"/>
       </w:pPr>
       <w:r>
         <w:t xml:space="preserve">For </w:t>
@@ -2819,7 +1751,7 @@
         <w:ind w:start="18pt" w:hanging="18pt"/>
         <w:jc w:val="center"/>
         <w:rPr>
-          <w:rFonts w:eastAsia="SimSun"/>
+          <w:rFonts w:eastAsia="宋体"/>
           <w:b/>
           <w:noProof w:val="0"/>
           <w:color w:val="FF0000"/>
@@ -2838,7 +1770,7 @@
       </w:pPr>
       <w:r>
         <w:rPr>
-          <w:rFonts w:eastAsia="SimSun"/>
+          <w:rFonts w:eastAsia="宋体"/>
           <w:b/>
           <w:noProof w:val="0"/>
           <w:color w:val="FF0000"/>
@@ -2851,7 +1783,7 @@
       </w:r>
       <w:r>
         <w:rPr>
-          <w:rFonts w:eastAsia="SimSun"/>
+          <w:rFonts w:eastAsia="宋体"/>
           <w:b/>
           <w:noProof w:val="0"/>
           <w:color w:val="FF0000"/>
@@ -2864,7 +1796,7 @@
       </w:r>
       <w:r>
         <w:rPr>
-          <w:rFonts w:eastAsia="SimSun"/>
+          <w:rFonts w:eastAsia="宋体"/>
           <w:b/>
           <w:noProof w:val="0"/>
           <w:color w:val="FF0000"/>
@@ -2882,7 +1814,7 @@
           <w:noProof/>
         </w:rPr>
         <w:drawing>
-          <wp:anchor distT="0" distB="0" distL="114300" distR="114300" simplePos="0" relativeHeight="251657728" behindDoc="1" locked="0" layoutInCell="1" allowOverlap="1">
+          <wp:anchor distT="0" distB="0" distL="114300" distR="114300" simplePos="0" relativeHeight="251657728" behindDoc="1" locked="0" layoutInCell="1" allowOverlap="1" wp14:anchorId="0FD9E18C" wp14:editId="34AE772D">
             <wp:simplePos x="0" y="0"/>
             <wp:positionH relativeFrom="margin">
               <wp:align>left</wp:align>
@@ -2935,7 +1867,7 @@
                     <wne:txbxContent>
                       <w:p>
                         <w:pPr>
-                          <w:pStyle w:val="BodyText"/>
+                          <w:pStyle w:val="a3"/>
                         </w:pPr>
                         <w:r>
                           <w:t>We suggest that you use a text box to insert a graphic (which is ideally a 300 dpi TIFF or EPS file, with all fonts embedded) because, in an MSW document, this method is somewhat more stable than directly inserting a picture.</w:t>
@@ -2943,7 +1875,7 @@
                       </w:p>
                       <w:p>
                         <w:pPr>
-                          <w:pStyle w:val="BodyText"/>
+                          <w:pStyle w:val="a3"/>
                         </w:pPr>
                         <w:r>
                           <w:t>To have non-visible rules on your frame, use the MSWord “Format” pull-down menu, select Text Box &gt; Colors and Lines to choose No Fill and No Line.</w:t>
@@ -2979,7 +1911,7 @@
 </file>
 
 <file path=word/endnotes.xml><?xml version="1.0" encoding="utf-8"?>
-<w:endnotes xmlns:cx="http://schemas.microsoft.com/office/drawing/2014/chartex" xmlns:cx1="http://schemas.microsoft.com/office/drawing/2015/9/8/chartex" xmlns:cx2="http://schemas.microsoft.com/office/drawing/2015/10/21/chartex" xmlns:cx3="http://schemas.microsoft.com/office/drawing/2016/5/9/chartex" xmlns:cx4="http://schemas.microsoft.com/office/drawing/2016/5/10/chartex" xmlns:cx5="http://schemas.microsoft.com/office/drawing/2016/5/11/chartex" xmlns:cx6="http://schemas.microsoft.com/office/drawing/2016/5/12/chartex" xmlns:cx7="http://schemas.microsoft.com/office/drawing/2016/5/13/chartex" xmlns:cx8="http://schemas.microsoft.com/office/drawing/2016/5/14/chartex" xmlns:mc="http://schemas.openxmlformats.org/markup-compatibility/2006" xmlns:aink="http://schemas.microsoft.com/office/drawing/2016/ink" xmlns:am3d="http://schemas.microsoft.com/office/drawing/2017/model3d" xmlns:o="urn:schemas-microsoft-com:office:office" xmlns:r="http://purl.oclc.org/ooxml/officeDocument/relationships" xmlns:m="http://purl.oclc.org/ooxml/officeDocument/math" xmlns:v="urn:schemas-microsoft-com:vml" xmlns:wp14="http://schemas.microsoft.com/office/word/2010/wordprocessingDrawing" xmlns:wp="http://purl.oclc.org/ooxml/drawingml/wordprocessingDrawing" xmlns:w10="urn:schemas-microsoft-com:office:word" xmlns:w="http://purl.oclc.org/ooxml/wordprocessingml/main" xmlns:w14="http://schemas.microsoft.com/office/word/2010/wordml" xmlns:w15="http://schemas.microsoft.com/office/word/2012/wordml" xmlns:w16cid="http://schemas.microsoft.com/office/word/2016/wordml/cid" xmlns:w16se="http://schemas.microsoft.com/office/word/2015/wordml/symex" xmlns:wpi="http://schemas.microsoft.com/office/word/2010/wordprocessingInk" xmlns:wne="http://schemas.microsoft.com/office/word/2006/wordml" mc:Ignorable="w14 w15 w16se w16cid wne wp14">
+<w:endnotes xmlns:cx="http://schemas.microsoft.com/office/drawing/2014/chartex" xmlns:cx1="http://schemas.microsoft.com/office/drawing/2015/9/8/chartex" xmlns:cx2="http://schemas.microsoft.com/office/drawing/2015/10/21/chartex" xmlns:cx3="http://schemas.microsoft.com/office/drawing/2016/5/9/chartex" xmlns:cx4="http://schemas.microsoft.com/office/drawing/2016/5/10/chartex" xmlns:cx5="http://schemas.microsoft.com/office/drawing/2016/5/11/chartex" xmlns:cx6="http://schemas.microsoft.com/office/drawing/2016/5/12/chartex" xmlns:cx7="http://schemas.microsoft.com/office/drawing/2016/5/13/chartex" xmlns:cx8="http://schemas.microsoft.com/office/drawing/2016/5/14/chartex" xmlns:mc="http://schemas.openxmlformats.org/markup-compatibility/2006" xmlns:aink="http://schemas.microsoft.com/office/drawing/2016/ink" xmlns:am3d="http://schemas.microsoft.com/office/drawing/2017/model3d" xmlns:o="urn:schemas-microsoft-com:office:office" xmlns:oel="http://schemas.microsoft.com/office/2019/extlst" xmlns:r="http://purl.oclc.org/ooxml/officeDocument/relationships" xmlns:m="http://purl.oclc.org/ooxml/officeDocument/math" xmlns:v="urn:schemas-microsoft-com:vml" xmlns:wp14="http://schemas.microsoft.com/office/word/2010/wordprocessingDrawing" xmlns:wp="http://purl.oclc.org/ooxml/drawingml/wordprocessingDrawing" xmlns:w10="urn:schemas-microsoft-com:office:word" xmlns:w="http://purl.oclc.org/ooxml/wordprocessingml/main" xmlns:w14="http://schemas.microsoft.com/office/word/2010/wordml" xmlns:w15="http://schemas.microsoft.com/office/word/2012/wordml" xmlns:w16cex="http://schemas.microsoft.com/office/word/2018/wordml/cex" xmlns:w16cid="http://schemas.microsoft.com/office/word/2016/wordml/cid" xmlns:w16="http://schemas.microsoft.com/office/word/2018/wordml" xmlns:w16du="http://schemas.microsoft.com/office/word/2023/wordml/word16du" xmlns:w16sdtdh="http://schemas.microsoft.com/office/word/2020/wordml/sdtdatahash" xmlns:w16sdtfl="http://schemas.microsoft.com/office/word/2024/wordml/sdtformatlock" xmlns:w16se="http://schemas.microsoft.com/office/word/2015/wordml/symex" xmlns:wpi="http://schemas.microsoft.com/office/word/2010/wordprocessingInk" xmlns:wne="http://schemas.microsoft.com/office/word/2006/wordml" mc:Ignorable="w14 w15 w16se w16cid w16 w16cex w16sdtdh w16sdtfl w16du wne wp14">
   <w:endnote w:type="separator" w:id="-1">
     <w:p>
       <w:r>
@@ -2998,10 +1930,10 @@
 </file>
 
 <file path=word/footer1.xml><?xml version="1.0" encoding="utf-8"?>
-<w:ftr xmlns:cx="http://schemas.microsoft.com/office/drawing/2014/chartex" xmlns:cx1="http://schemas.microsoft.com/office/drawing/2015/9/8/chartex" xmlns:cx2="http://schemas.microsoft.com/office/drawing/2015/10/21/chartex" xmlns:cx3="http://schemas.microsoft.com/office/drawing/2016/5/9/chartex" xmlns:cx4="http://schemas.microsoft.com/office/drawing/2016/5/10/chartex" xmlns:cx5="http://schemas.microsoft.com/office/drawing/2016/5/11/chartex" xmlns:cx6="http://schemas.microsoft.com/office/drawing/2016/5/12/chartex" xmlns:cx7="http://schemas.microsoft.com/office/drawing/2016/5/13/chartex" xmlns:cx8="http://schemas.microsoft.com/office/drawing/2016/5/14/chartex" xmlns:mc="http://schemas.openxmlformats.org/markup-compatibility/2006" xmlns:aink="http://schemas.microsoft.com/office/drawing/2016/ink" xmlns:am3d="http://schemas.microsoft.com/office/drawing/2017/model3d" xmlns:o="urn:schemas-microsoft-com:office:office" xmlns:r="http://purl.oclc.org/ooxml/officeDocument/relationships" xmlns:m="http://purl.oclc.org/ooxml/officeDocument/math" xmlns:v="urn:schemas-microsoft-com:vml" xmlns:wp14="http://schemas.microsoft.com/office/word/2010/wordprocessingDrawing" xmlns:wp="http://purl.oclc.org/ooxml/drawingml/wordprocessingDrawing" xmlns:w10="urn:schemas-microsoft-com:office:word" xmlns:w="http://purl.oclc.org/ooxml/wordprocessingml/main" xmlns:w14="http://schemas.microsoft.com/office/word/2010/wordml" xmlns:w15="http://schemas.microsoft.com/office/word/2012/wordml" xmlns:w16cid="http://schemas.microsoft.com/office/word/2016/wordml/cid" xmlns:w16se="http://schemas.microsoft.com/office/word/2015/wordml/symex" xmlns:wpi="http://schemas.microsoft.com/office/word/2010/wordprocessingInk" xmlns:wne="http://schemas.microsoft.com/office/word/2006/wordml" mc:Ignorable="w14 w15 w16se w16cid wne wp14">
+<w:ftr xmlns:cx="http://schemas.microsoft.com/office/drawing/2014/chartex" xmlns:cx1="http://schemas.microsoft.com/office/drawing/2015/9/8/chartex" xmlns:cx2="http://schemas.microsoft.com/office/drawing/2015/10/21/chartex" xmlns:cx3="http://schemas.microsoft.com/office/drawing/2016/5/9/chartex" xmlns:cx4="http://schemas.microsoft.com/office/drawing/2016/5/10/chartex" xmlns:cx5="http://schemas.microsoft.com/office/drawing/2016/5/11/chartex" xmlns:cx6="http://schemas.microsoft.com/office/drawing/2016/5/12/chartex" xmlns:cx7="http://schemas.microsoft.com/office/drawing/2016/5/13/chartex" xmlns:cx8="http://schemas.microsoft.com/office/drawing/2016/5/14/chartex" xmlns:mc="http://schemas.openxmlformats.org/markup-compatibility/2006" xmlns:aink="http://schemas.microsoft.com/office/drawing/2016/ink" xmlns:am3d="http://schemas.microsoft.com/office/drawing/2017/model3d" xmlns:o="urn:schemas-microsoft-com:office:office" xmlns:oel="http://schemas.microsoft.com/office/2019/extlst" xmlns:r="http://purl.oclc.org/ooxml/officeDocument/relationships" xmlns:m="http://purl.oclc.org/ooxml/officeDocument/math" xmlns:v="urn:schemas-microsoft-com:vml" xmlns:wp14="http://schemas.microsoft.com/office/word/2010/wordprocessingDrawing" xmlns:wp="http://purl.oclc.org/ooxml/drawingml/wordprocessingDrawing" xmlns:w10="urn:schemas-microsoft-com:office:word" xmlns:w="http://purl.oclc.org/ooxml/wordprocessingml/main" xmlns:w14="http://schemas.microsoft.com/office/word/2010/wordml" xmlns:w15="http://schemas.microsoft.com/office/word/2012/wordml" xmlns:w16cex="http://schemas.microsoft.com/office/word/2018/wordml/cex" xmlns:w16cid="http://schemas.microsoft.com/office/word/2016/wordml/cid" xmlns:w16="http://schemas.microsoft.com/office/word/2018/wordml" xmlns:w16du="http://schemas.microsoft.com/office/word/2023/wordml/word16du" xmlns:w16sdtdh="http://schemas.microsoft.com/office/word/2020/wordml/sdtdatahash" xmlns:w16sdtfl="http://schemas.microsoft.com/office/word/2024/wordml/sdtformatlock" xmlns:w16se="http://schemas.microsoft.com/office/word/2015/wordml/symex" xmlns:wpi="http://schemas.microsoft.com/office/word/2010/wordprocessingInk" xmlns:wne="http://schemas.microsoft.com/office/word/2006/wordml" mc:Ignorable="w14 w15 w16se w16cid w16 w16cex w16sdtdh w16sdtfl w16du wne wp14">
   <w:p>
     <w:pPr>
-      <w:pStyle w:val="Footer"/>
+      <w:pStyle w:val="a7"/>
       <w:jc w:val="start"/>
       <w:rPr>
         <w:sz w:val="16"/>
@@ -3013,7 +1945,7 @@
 </file>
 
 <file path=word/footnotes.xml><?xml version="1.0" encoding="utf-8"?>
-<w:footnotes xmlns:cx="http://schemas.microsoft.com/office/drawing/2014/chartex" xmlns:cx1="http://schemas.microsoft.com/office/drawing/2015/9/8/chartex" xmlns:cx2="http://schemas.microsoft.com/office/drawing/2015/10/21/chartex" xmlns:cx3="http://schemas.microsoft.com/office/drawing/2016/5/9/chartex" xmlns:cx4="http://schemas.microsoft.com/office/drawing/2016/5/10/chartex" xmlns:cx5="http://schemas.microsoft.com/office/drawing/2016/5/11/chartex" xmlns:cx6="http://schemas.microsoft.com/office/drawing/2016/5/12/chartex" xmlns:cx7="http://schemas.microsoft.com/office/drawing/2016/5/13/chartex" xmlns:cx8="http://schemas.microsoft.com/office/drawing/2016/5/14/chartex" xmlns:mc="http://schemas.openxmlformats.org/markup-compatibility/2006" xmlns:aink="http://schemas.microsoft.com/office/drawing/2016/ink" xmlns:am3d="http://schemas.microsoft.com/office/drawing/2017/model3d" xmlns:o="urn:schemas-microsoft-com:office:office" xmlns:r="http://purl.oclc.org/ooxml/officeDocument/relationships" xmlns:m="http://purl.oclc.org/ooxml/officeDocument/math" xmlns:v="urn:schemas-microsoft-com:vml" xmlns:wp14="http://schemas.microsoft.com/office/word/2010/wordprocessingDrawing" xmlns:wp="http://purl.oclc.org/ooxml/drawingml/wordprocessingDrawing" xmlns:w10="urn:schemas-microsoft-com:office:word" xmlns:w="http://purl.oclc.org/ooxml/wordprocessingml/main" xmlns:w14="http://schemas.microsoft.com/office/word/2010/wordml" xmlns:w15="http://schemas.microsoft.com/office/word/2012/wordml" xmlns:w16cid="http://schemas.microsoft.com/office/word/2016/wordml/cid" xmlns:w16se="http://schemas.microsoft.com/office/word/2015/wordml/symex" xmlns:wpi="http://schemas.microsoft.com/office/word/2010/wordprocessingInk" xmlns:wne="http://schemas.microsoft.com/office/word/2006/wordml" mc:Ignorable="w14 w15 w16se w16cid wne wp14">
+<w:footnotes xmlns:cx="http://schemas.microsoft.com/office/drawing/2014/chartex" xmlns:cx1="http://schemas.microsoft.com/office/drawing/2015/9/8/chartex" xmlns:cx2="http://schemas.microsoft.com/office/drawing/2015/10/21/chartex" xmlns:cx3="http://schemas.microsoft.com/office/drawing/2016/5/9/chartex" xmlns:cx4="http://schemas.microsoft.com/office/drawing/2016/5/10/chartex" xmlns:cx5="http://schemas.microsoft.com/office/drawing/2016/5/11/chartex" xmlns:cx6="http://schemas.microsoft.com/office/drawing/2016/5/12/chartex" xmlns:cx7="http://schemas.microsoft.com/office/drawing/2016/5/13/chartex" xmlns:cx8="http://schemas.microsoft.com/office/drawing/2016/5/14/chartex" xmlns:mc="http://schemas.openxmlformats.org/markup-compatibility/2006" xmlns:aink="http://schemas.microsoft.com/office/drawing/2016/ink" xmlns:am3d="http://schemas.microsoft.com/office/drawing/2017/model3d" xmlns:o="urn:schemas-microsoft-com:office:office" xmlns:oel="http://schemas.microsoft.com/office/2019/extlst" xmlns:r="http://purl.oclc.org/ooxml/officeDocument/relationships" xmlns:m="http://purl.oclc.org/ooxml/officeDocument/math" xmlns:v="urn:schemas-microsoft-com:vml" xmlns:wp14="http://schemas.microsoft.com/office/word/2010/wordprocessingDrawing" xmlns:wp="http://purl.oclc.org/ooxml/drawingml/wordprocessingDrawing" xmlns:w10="urn:schemas-microsoft-com:office:word" xmlns:w="http://purl.oclc.org/ooxml/wordprocessingml/main" xmlns:w14="http://schemas.microsoft.com/office/word/2010/wordml" xmlns:w15="http://schemas.microsoft.com/office/word/2012/wordml" xmlns:w16cex="http://schemas.microsoft.com/office/word/2018/wordml/cex" xmlns:w16cid="http://schemas.microsoft.com/office/word/2016/wordml/cid" xmlns:w16="http://schemas.microsoft.com/office/word/2018/wordml" xmlns:w16du="http://schemas.microsoft.com/office/word/2023/wordml/word16du" xmlns:w16sdtdh="http://schemas.microsoft.com/office/word/2020/wordml/sdtdatahash" xmlns:w16sdtfl="http://schemas.microsoft.com/office/word/2024/wordml/sdtformatlock" xmlns:w16se="http://schemas.microsoft.com/office/word/2015/wordml/symex" xmlns:wpi="http://schemas.microsoft.com/office/word/2010/wordprocessingInk" xmlns:wne="http://schemas.microsoft.com/office/word/2006/wordml" mc:Ignorable="w14 w15 w16se w16cid w16 w16cex w16sdtdh w16sdtfl w16du wne wp14">
   <w:footnote w:type="separator" w:id="-1">
     <w:p>
       <w:r>
@@ -3032,7 +1964,7 @@
 </file>
 
 <file path=word/numbering.xml><?xml version="1.0" encoding="utf-8"?>
-<w:numbering xmlns:cx="http://schemas.microsoft.com/office/drawing/2014/chartex" xmlns:cx1="http://schemas.microsoft.com/office/drawing/2015/9/8/chartex" xmlns:cx2="http://schemas.microsoft.com/office/drawing/2015/10/21/chartex" xmlns:cx3="http://schemas.microsoft.com/office/drawing/2016/5/9/chartex" xmlns:cx4="http://schemas.microsoft.com/office/drawing/2016/5/10/chartex" xmlns:cx5="http://schemas.microsoft.com/office/drawing/2016/5/11/chartex" xmlns:cx6="http://schemas.microsoft.com/office/drawing/2016/5/12/chartex" xmlns:cx7="http://schemas.microsoft.com/office/drawing/2016/5/13/chartex" xmlns:cx8="http://schemas.microsoft.com/office/drawing/2016/5/14/chartex" xmlns:mc="http://schemas.openxmlformats.org/markup-compatibility/2006" xmlns:aink="http://schemas.microsoft.com/office/drawing/2016/ink" xmlns:am3d="http://schemas.microsoft.com/office/drawing/2017/model3d" xmlns:o="urn:schemas-microsoft-com:office:office" xmlns:r="http://purl.oclc.org/ooxml/officeDocument/relationships" xmlns:m="http://purl.oclc.org/ooxml/officeDocument/math" xmlns:v="urn:schemas-microsoft-com:vml" xmlns:wp14="http://schemas.microsoft.com/office/word/2010/wordprocessingDrawing" xmlns:wp="http://purl.oclc.org/ooxml/drawingml/wordprocessingDrawing" xmlns:w10="urn:schemas-microsoft-com:office:word" xmlns:w="http://purl.oclc.org/ooxml/wordprocessingml/main" xmlns:w14="http://schemas.microsoft.com/office/word/2010/wordml" xmlns:w15="http://schemas.microsoft.com/office/word/2012/wordml" xmlns:w16cid="http://schemas.microsoft.com/office/word/2016/wordml/cid" xmlns:w16se="http://schemas.microsoft.com/office/word/2015/wordml/symex" xmlns:wpi="http://schemas.microsoft.com/office/word/2010/wordprocessingInk" xmlns:wne="http://schemas.microsoft.com/office/word/2006/wordml" mc:Ignorable="w14 w15 w16se w16cid wne wp14">
+<w:numbering xmlns:cx="http://schemas.microsoft.com/office/drawing/2014/chartex" xmlns:cx1="http://schemas.microsoft.com/office/drawing/2015/9/8/chartex" xmlns:cx2="http://schemas.microsoft.com/office/drawing/2015/10/21/chartex" xmlns:cx3="http://schemas.microsoft.com/office/drawing/2016/5/9/chartex" xmlns:cx4="http://schemas.microsoft.com/office/drawing/2016/5/10/chartex" xmlns:cx5="http://schemas.microsoft.com/office/drawing/2016/5/11/chartex" xmlns:cx6="http://schemas.microsoft.com/office/drawing/2016/5/12/chartex" xmlns:cx7="http://schemas.microsoft.com/office/drawing/2016/5/13/chartex" xmlns:cx8="http://schemas.microsoft.com/office/drawing/2016/5/14/chartex" xmlns:mc="http://schemas.openxmlformats.org/markup-compatibility/2006" xmlns:aink="http://schemas.microsoft.com/office/drawing/2016/ink" xmlns:am3d="http://schemas.microsoft.com/office/drawing/2017/model3d" xmlns:o="urn:schemas-microsoft-com:office:office" xmlns:oel="http://schemas.microsoft.com/office/2019/extlst" xmlns:r="http://purl.oclc.org/ooxml/officeDocument/relationships" xmlns:m="http://purl.oclc.org/ooxml/officeDocument/math" xmlns:v="urn:schemas-microsoft-com:vml" xmlns:wp14="http://schemas.microsoft.com/office/word/2010/wordprocessingDrawing" xmlns:wp="http://purl.oclc.org/ooxml/drawingml/wordprocessingDrawing" xmlns:w10="urn:schemas-microsoft-com:office:word" xmlns:w="http://purl.oclc.org/ooxml/wordprocessingml/main" xmlns:w14="http://schemas.microsoft.com/office/word/2010/wordml" xmlns:w15="http://schemas.microsoft.com/office/word/2012/wordml" xmlns:w16cex="http://schemas.microsoft.com/office/word/2018/wordml/cex" xmlns:w16cid="http://schemas.microsoft.com/office/word/2016/wordml/cid" xmlns:w16="http://schemas.microsoft.com/office/word/2018/wordml" xmlns:w16du="http://schemas.microsoft.com/office/word/2023/wordml/word16du" xmlns:w16sdtdh="http://schemas.microsoft.com/office/word/2020/wordml/sdtdatahash" xmlns:w16sdtfl="http://schemas.microsoft.com/office/word/2024/wordml/sdtformatlock" xmlns:w16se="http://schemas.microsoft.com/office/word/2015/wordml/symex" xmlns:wpi="http://schemas.microsoft.com/office/word/2010/wordprocessingInk" xmlns:wne="http://schemas.microsoft.com/office/word/2006/wordml" mc:Ignorable="w14 w15 w16se w16cid w16 w16cex w16sdtdh w16sdtfl w16du wne wp14">
   <w:abstractNum w:abstractNumId="0" w15:restartNumberingAfterBreak="0">
     <w:nsid w:val="FFFFFF1D"/>
     <w:multiLevelType w:val="multilevel"/>
@@ -3915,7 +2847,7 @@
     <w:lvl w:ilvl="0">
       <w:start w:val="1"/>
       <w:numFmt w:val="upperRoman"/>
-      <w:pStyle w:val="Heading1"/>
+      <w:pStyle w:val="1"/>
       <w:lvlText w:val="%1."/>
       <w:lvlJc w:val="center"/>
       <w:pPr>
@@ -3947,7 +2879,7 @@
     <w:lvl w:ilvl="1">
       <w:start w:val="1"/>
       <w:numFmt w:val="upperLetter"/>
-      <w:pStyle w:val="Heading2"/>
+      <w:pStyle w:val="2"/>
       <w:lvlText w:val="%2."/>
       <w:lvlJc w:val="start"/>
       <w:pPr>
@@ -3983,7 +2915,7 @@
     <w:lvl w:ilvl="2">
       <w:start w:val="1"/>
       <w:numFmt w:val="decimal"/>
-      <w:pStyle w:val="Heading3"/>
+      <w:pStyle w:val="3"/>
       <w:lvlText w:val="%3)"/>
       <w:lvlJc w:val="start"/>
       <w:pPr>
@@ -4019,7 +2951,7 @@
     <w:lvl w:ilvl="3">
       <w:start w:val="1"/>
       <w:numFmt w:val="lowerLetter"/>
-      <w:pStyle w:val="Heading4"/>
+      <w:pStyle w:val="4"/>
       <w:lvlText w:val="%4)"/>
       <w:lvlJc w:val="start"/>
       <w:pPr>
@@ -4424,93 +3356,93 @@
       </w:rPr>
     </w:lvl>
   </w:abstractNum>
-  <w:num w:numId="1">
+  <w:num w:numId="1" w16cid:durableId="145820776">
     <w:abstractNumId w:val="14"/>
   </w:num>
-  <w:num w:numId="2">
+  <w:num w:numId="2" w16cid:durableId="49572071">
     <w:abstractNumId w:val="19"/>
   </w:num>
-  <w:num w:numId="3">
+  <w:num w:numId="3" w16cid:durableId="1515224689">
     <w:abstractNumId w:val="13"/>
   </w:num>
-  <w:num w:numId="4">
+  <w:num w:numId="4" w16cid:durableId="1200628829">
     <w:abstractNumId w:val="16"/>
   </w:num>
-  <w:num w:numId="5">
+  <w:num w:numId="5" w16cid:durableId="798842025">
     <w:abstractNumId w:val="16"/>
   </w:num>
-  <w:num w:numId="6">
+  <w:num w:numId="6" w16cid:durableId="2016422118">
     <w:abstractNumId w:val="16"/>
   </w:num>
-  <w:num w:numId="7">
+  <w:num w:numId="7" w16cid:durableId="227956553">
     <w:abstractNumId w:val="16"/>
   </w:num>
-  <w:num w:numId="8">
+  <w:num w:numId="8" w16cid:durableId="164829061">
     <w:abstractNumId w:val="18"/>
   </w:num>
-  <w:num w:numId="9">
+  <w:num w:numId="9" w16cid:durableId="1860271627">
     <w:abstractNumId w:val="20"/>
   </w:num>
-  <w:num w:numId="10">
+  <w:num w:numId="10" w16cid:durableId="1688098601">
     <w:abstractNumId w:val="15"/>
   </w:num>
-  <w:num w:numId="11">
+  <w:num w:numId="11" w16cid:durableId="466628586">
     <w:abstractNumId w:val="12"/>
   </w:num>
-  <w:num w:numId="12">
+  <w:num w:numId="12" w16cid:durableId="1077750273">
     <w:abstractNumId w:val="11"/>
   </w:num>
-  <w:num w:numId="13">
+  <w:num w:numId="13" w16cid:durableId="1040400736">
     <w:abstractNumId w:val="0"/>
   </w:num>
-  <w:num w:numId="14">
+  <w:num w:numId="14" w16cid:durableId="2028016891">
     <w:abstractNumId w:val="10"/>
   </w:num>
-  <w:num w:numId="15">
+  <w:num w:numId="15" w16cid:durableId="1455519226">
     <w:abstractNumId w:val="8"/>
   </w:num>
-  <w:num w:numId="16">
+  <w:num w:numId="16" w16cid:durableId="1149983217">
     <w:abstractNumId w:val="7"/>
   </w:num>
-  <w:num w:numId="17">
+  <w:num w:numId="17" w16cid:durableId="1411653924">
     <w:abstractNumId w:val="6"/>
   </w:num>
-  <w:num w:numId="18">
+  <w:num w:numId="18" w16cid:durableId="693193555">
     <w:abstractNumId w:val="5"/>
   </w:num>
-  <w:num w:numId="19">
+  <w:num w:numId="19" w16cid:durableId="1576931687">
     <w:abstractNumId w:val="9"/>
   </w:num>
-  <w:num w:numId="20">
+  <w:num w:numId="20" w16cid:durableId="1798182330">
     <w:abstractNumId w:val="4"/>
   </w:num>
-  <w:num w:numId="21">
+  <w:num w:numId="21" w16cid:durableId="2053991631">
     <w:abstractNumId w:val="3"/>
   </w:num>
-  <w:num w:numId="22">
+  <w:num w:numId="22" w16cid:durableId="1854341983">
     <w:abstractNumId w:val="2"/>
   </w:num>
-  <w:num w:numId="23">
+  <w:num w:numId="23" w16cid:durableId="1470366540">
     <w:abstractNumId w:val="1"/>
   </w:num>
-  <w:num w:numId="24">
+  <w:num w:numId="24" w16cid:durableId="658459657">
     <w:abstractNumId w:val="17"/>
   </w:num>
 </w:numbering>
 </file>
 
 <file path=word/styles.xml><?xml version="1.0" encoding="utf-8"?>
-<w:styles xmlns:mc="http://schemas.openxmlformats.org/markup-compatibility/2006" xmlns:r="http://purl.oclc.org/ooxml/officeDocument/relationships" xmlns:w="http://purl.oclc.org/ooxml/wordprocessingml/main" xmlns:w14="http://schemas.microsoft.com/office/word/2010/wordml" xmlns:w15="http://schemas.microsoft.com/office/word/2012/wordml" xmlns:w16cid="http://schemas.microsoft.com/office/word/2016/wordml/cid" xmlns:w16se="http://schemas.microsoft.com/office/word/2015/wordml/symex" mc:Ignorable="w14 w15 w16se w16cid">
+<w:styles xmlns:mc="http://schemas.openxmlformats.org/markup-compatibility/2006" xmlns:r="http://purl.oclc.org/ooxml/officeDocument/relationships" xmlns:w="http://purl.oclc.org/ooxml/wordprocessingml/main" xmlns:w14="http://schemas.microsoft.com/office/word/2010/wordml" xmlns:w15="http://schemas.microsoft.com/office/word/2012/wordml" xmlns:w16cex="http://schemas.microsoft.com/office/word/2018/wordml/cex" xmlns:w16cid="http://schemas.microsoft.com/office/word/2016/wordml/cid" xmlns:w16="http://schemas.microsoft.com/office/word/2018/wordml" xmlns:w16du="http://schemas.microsoft.com/office/word/2023/wordml/word16du" xmlns:w16sdtdh="http://schemas.microsoft.com/office/word/2020/wordml/sdtdatahash" xmlns:w16sdtfl="http://schemas.microsoft.com/office/word/2024/wordml/sdtformatlock" xmlns:w16se="http://schemas.microsoft.com/office/word/2015/wordml/symex" mc:Ignorable="w14 w15 w16se w16cid w16 w16cex w16sdtdh w16sdtfl w16du">
   <w:docDefaults>
     <w:rPrDefault>
       <w:rPr>
-        <w:rFonts w:ascii="Times New Roman" w:eastAsia="SimSun" w:hAnsi="Times New Roman" w:cs="Times New Roman"/>
+        <w:rFonts w:ascii="Times New Roman" w:eastAsia="宋体" w:hAnsi="Times New Roman" w:cs="Times New Roman"/>
         <w:lang w:val="en-US" w:eastAsia="en-US" w:bidi="ar-SA"/>
       </w:rPr>
     </w:rPrDefault>
     <w:pPrDefault/>
   </w:docDefaults>
-  <w:latentStyles w:defLockedState="0" w:defUIPriority="0" w:defSemiHidden="0" w:defUnhideWhenUsed="0" w:defQFormat="0" w:count="375">
+  <w:latentStyles w:defLockedState="0" w:defUIPriority="0" w:defSemiHidden="0" w:defUnhideWhenUsed="0" w:defQFormat="0" w:count="376">
     <w:lsdException w:name="Normal" w:qFormat="1"/>
     <w:lsdException w:name="heading 1" w:qFormat="1"/>
     <w:lsdException w:name="heading 2" w:qFormat="1"/>
@@ -4527,6 +3459,7 @@
     <w:lsdException w:name="Strong" w:qFormat="1"/>
     <w:lsdException w:name="Emphasis" w:qFormat="1"/>
     <w:lsdException w:name="HTML Preformatted" w:semiHidden="1" w:unhideWhenUsed="1"/>
+    <w:lsdException w:name="Normal Table" w:semiHidden="1" w:unhideWhenUsed="1"/>
     <w:lsdException w:name="No List" w:semiHidden="1" w:unhideWhenUsed="1"/>
     <w:lsdException w:name="Outline List 1" w:semiHidden="1" w:unhideWhenUsed="1"/>
     <w:lsdException w:name="Outline List 2" w:semiHidden="1" w:unhideWhenUsed="1"/>
@@ -4569,8 +3502,10 @@
     <w:lsdException w:name="Table Elegant" w:semiHidden="1" w:unhideWhenUsed="1"/>
     <w:lsdException w:name="Table Professional" w:semiHidden="1" w:unhideWhenUsed="1"/>
     <w:lsdException w:name="Table Subtle 1" w:semiHidden="1" w:unhideWhenUsed="1"/>
+    <w:lsdException w:name="Table Subtle 2" w:semiHidden="1" w:unhideWhenUsed="1"/>
     <w:lsdException w:name="Table Web 1" w:semiHidden="1" w:unhideWhenUsed="1"/>
     <w:lsdException w:name="Table Web 2" w:semiHidden="1" w:unhideWhenUsed="1"/>
+    <w:lsdException w:name="Table Web 3" w:semiHidden="1" w:unhideWhenUsed="1"/>
     <w:lsdException w:name="Table Theme" w:semiHidden="1" w:unhideWhenUsed="1"/>
     <w:lsdException w:name="Placeholder Text" w:semiHidden="1" w:uiPriority="99"/>
     <w:lsdException w:name="No Spacing" w:uiPriority="1" w:qFormat="1"/>
@@ -4791,18 +3726,19 @@
     <w:lsdException w:name="Smart Hyperlink" w:semiHidden="1" w:uiPriority="99" w:unhideWhenUsed="1"/>
     <w:lsdException w:name="Hashtag" w:semiHidden="1" w:uiPriority="99" w:unhideWhenUsed="1"/>
     <w:lsdException w:name="Unresolved Mention" w:semiHidden="1" w:uiPriority="99" w:unhideWhenUsed="1"/>
+    <w:lsdException w:name="Smart Link" w:semiHidden="1" w:uiPriority="99" w:unhideWhenUsed="1"/>
   </w:latentStyles>
-  <w:style w:type="paragraph" w:default="1" w:styleId="Normal">
+  <w:style w:type="paragraph" w:default="1" w:styleId="a">
     <w:name w:val="Normal"/>
     <w:qFormat/>
     <w:pPr>
       <w:jc w:val="center"/>
     </w:pPr>
   </w:style>
-  <w:style w:type="paragraph" w:styleId="Heading1">
+  <w:style w:type="paragraph" w:styleId="1">
     <w:name w:val="heading 1"/>
-    <w:basedOn w:val="Normal"/>
-    <w:next w:val="Normal"/>
+    <w:basedOn w:val="a"/>
+    <w:next w:val="a"/>
     <w:qFormat/>
     <w:rsid w:val="006B6B66"/>
     <w:pPr>
@@ -4823,10 +3759,10 @@
       <w:noProof/>
     </w:rPr>
   </w:style>
-  <w:style w:type="paragraph" w:styleId="Heading2">
+  <w:style w:type="paragraph" w:styleId="2">
     <w:name w:val="heading 2"/>
-    <w:basedOn w:val="Normal"/>
-    <w:next w:val="Normal"/>
+    <w:basedOn w:val="a"/>
+    <w:next w:val="a"/>
     <w:qFormat/>
     <w:rsid w:val="00ED0149"/>
     <w:pPr>
@@ -4850,10 +3786,10 @@
       <w:noProof/>
     </w:rPr>
   </w:style>
-  <w:style w:type="paragraph" w:styleId="Heading3">
+  <w:style w:type="paragraph" w:styleId="3">
     <w:name w:val="heading 3"/>
-    <w:basedOn w:val="Normal"/>
-    <w:next w:val="Normal"/>
+    <w:basedOn w:val="a"/>
+    <w:next w:val="a"/>
     <w:qFormat/>
     <w:rsid w:val="00794804"/>
     <w:pPr>
@@ -4872,10 +3808,10 @@
       <w:noProof/>
     </w:rPr>
   </w:style>
-  <w:style w:type="paragraph" w:styleId="Heading4">
+  <w:style w:type="paragraph" w:styleId="4">
     <w:name w:val="heading 4"/>
-    <w:basedOn w:val="Normal"/>
-    <w:next w:val="Normal"/>
+    <w:basedOn w:val="a"/>
+    <w:next w:val="a"/>
     <w:qFormat/>
     <w:rsid w:val="00794804"/>
     <w:pPr>
@@ -4898,10 +3834,10 @@
       <w:noProof/>
     </w:rPr>
   </w:style>
-  <w:style w:type="paragraph" w:styleId="Heading5">
+  <w:style w:type="paragraph" w:styleId="5">
     <w:name w:val="heading 5"/>
-    <w:basedOn w:val="Normal"/>
-    <w:next w:val="Normal"/>
+    <w:basedOn w:val="a"/>
+    <w:next w:val="a"/>
     <w:qFormat/>
     <w:pPr>
       <w:tabs>
@@ -4915,13 +3851,12 @@
       <w:noProof/>
     </w:rPr>
   </w:style>
-  <w:style w:type="character" w:default="1" w:styleId="DefaultParagraphFont">
+  <w:style w:type="character" w:default="1" w:styleId="a0">
     <w:name w:val="Default Paragraph Font"/>
     <w:uiPriority w:val="1"/>
-    <w:semiHidden/>
     <w:unhideWhenUsed/>
   </w:style>
-  <w:style w:type="table" w:default="1" w:styleId="TableNormal">
+  <w:style w:type="table" w:default="1" w:styleId="a1">
     <w:name w:val="Normal Table"/>
     <w:uiPriority w:val="99"/>
     <w:semiHidden/>
@@ -4936,7 +3871,7 @@
       </w:tblCellMar>
     </w:tblPr>
   </w:style>
-  <w:style w:type="numbering" w:default="1" w:styleId="NoList">
+  <w:style w:type="numbering" w:default="1" w:styleId="a2">
     <w:name w:val="No List"/>
     <w:uiPriority w:val="99"/>
     <w:semiHidden/>
@@ -4975,10 +3910,10 @@
       <w:szCs w:val="22"/>
     </w:rPr>
   </w:style>
-  <w:style w:type="paragraph" w:styleId="BodyText">
+  <w:style w:type="paragraph" w:styleId="a3">
     <w:name w:val="Body Text"/>
-    <w:basedOn w:val="Normal"/>
-    <w:link w:val="BodyTextChar"/>
+    <w:basedOn w:val="a"/>
+    <w:link w:val="a4"/>
     <w:rsid w:val="00E7596C"/>
     <w:pPr>
       <w:tabs>
@@ -4993,9 +3928,9 @@
       <w:lang w:val="x-none" w:eastAsia="x-none"/>
     </w:rPr>
   </w:style>
-  <w:style w:type="character" w:customStyle="1" w:styleId="BodyTextChar">
-    <w:name w:val="Body Text Char"/>
-    <w:link w:val="BodyText"/>
+  <w:style w:type="character" w:customStyle="1" w:styleId="a4">
+    <w:name w:val="正文文本 字符"/>
+    <w:link w:val="a3"/>
     <w:rsid w:val="00E7596C"/>
     <w:rPr>
       <w:spacing w:val="-1"/>
@@ -5004,7 +3939,7 @@
   </w:style>
   <w:style w:type="paragraph" w:customStyle="1" w:styleId="bulletlist">
     <w:name w:val="bullet list"/>
-    <w:basedOn w:val="BodyText"/>
+    <w:basedOn w:val="a3"/>
     <w:rsid w:val="001B67DC"/>
     <w:pPr>
       <w:numPr>
@@ -5018,7 +3953,7 @@
   </w:style>
   <w:style w:type="paragraph" w:customStyle="1" w:styleId="equation">
     <w:name w:val="equation"/>
-    <w:basedOn w:val="Normal"/>
+    <w:basedOn w:val="a"/>
     <w:rsid w:val="008A2C7D"/>
     <w:pPr>
       <w:tabs>
@@ -5123,7 +4058,7 @@
   </w:style>
   <w:style w:type="paragraph" w:customStyle="1" w:styleId="tablecolhead">
     <w:name w:val="table col head"/>
-    <w:basedOn w:val="Normal"/>
+    <w:basedOn w:val="a"/>
     <w:rPr>
       <w:b/>
       <w:bCs/>
@@ -5197,10 +4132,10 @@
       <w:i/>
     </w:rPr>
   </w:style>
-  <w:style w:type="paragraph" w:styleId="Header">
+  <w:style w:type="paragraph" w:styleId="a5">
     <w:name w:val="header"/>
-    <w:basedOn w:val="Normal"/>
-    <w:link w:val="HeaderChar"/>
+    <w:basedOn w:val="a"/>
+    <w:link w:val="a6"/>
     <w:rsid w:val="001A3B3D"/>
     <w:pPr>
       <w:tabs>
@@ -5209,16 +4144,16 @@
       </w:tabs>
     </w:pPr>
   </w:style>
-  <w:style w:type="character" w:customStyle="1" w:styleId="HeaderChar">
-    <w:name w:val="Header Char"/>
-    <w:basedOn w:val="DefaultParagraphFont"/>
-    <w:link w:val="Header"/>
+  <w:style w:type="character" w:customStyle="1" w:styleId="a6">
+    <w:name w:val="页眉 字符"/>
+    <w:basedOn w:val="a0"/>
+    <w:link w:val="a5"/>
     <w:rsid w:val="001A3B3D"/>
   </w:style>
-  <w:style w:type="paragraph" w:styleId="Footer">
+  <w:style w:type="paragraph" w:styleId="a7">
     <w:name w:val="footer"/>
-    <w:basedOn w:val="Normal"/>
-    <w:link w:val="FooterChar"/>
+    <w:basedOn w:val="a"/>
+    <w:link w:val="a8"/>
     <w:rsid w:val="001A3B3D"/>
     <w:pPr>
       <w:tabs>
@@ -5227,11 +4162,20 @@
       </w:tabs>
     </w:pPr>
   </w:style>
-  <w:style w:type="character" w:customStyle="1" w:styleId="FooterChar">
-    <w:name w:val="Footer Char"/>
-    <w:basedOn w:val="DefaultParagraphFont"/>
-    <w:link w:val="Footer"/>
+  <w:style w:type="character" w:customStyle="1" w:styleId="a8">
+    <w:name w:val="页脚 字符"/>
+    <w:basedOn w:val="a0"/>
+    <w:link w:val="a7"/>
     <w:rsid w:val="001A3B3D"/>
+  </w:style>
+  <w:style w:type="paragraph" w:styleId="a9">
+    <w:name w:val="Normal (Web)"/>
+    <w:basedOn w:val="a"/>
+    <w:rsid w:val="00D429E6"/>
+    <w:rPr>
+      <w:sz w:val="24"/>
+      <w:szCs w:val="24"/>
+    </w:rPr>
   </w:style>
 </w:styles>
 </file>

</xml_diff>

<commit_message>
Save latest DAC manuscript edits
</commit_message>
<xml_diff>
--- a/DAC/paper/CHAMP_v1.docx
+++ b/DAC/paper/CHAMP_v1.docx
@@ -367,7 +367,6 @@
         <w:pStyle w:val="a3"/>
         <w:ind w:firstLine="0pt"/>
         <w:rPr>
-          <w:rFonts w:hint="eastAsia"/>
           <w:lang w:eastAsia="zh-CN"/>
         </w:rPr>
       </w:pPr>
@@ -378,10 +377,10 @@
           <w:lang w:eastAsia="zh-CN"/>
         </w:rPr>
         <w:drawing>
-          <wp:inline distT="0" distB="0" distL="0" distR="0" wp14:anchorId="204B11FE" wp14:editId="50094ABE">
+          <wp:inline distT="0" distB="0" distL="0" distR="0" wp14:anchorId="068C6BC7" wp14:editId="16A13BDE">
             <wp:extent cx="3089910" cy="1713865"/>
             <wp:effectExtent l="0" t="0" r="0" b="635"/>
-            <wp:docPr id="113410819" name="图形 2"/>
+            <wp:docPr id="1412240717" name="图形 3"/>
             <wp:cNvGraphicFramePr>
               <a:graphicFrameLocks xmlns:a="http://purl.oclc.org/ooxml/drawingml/main" noChangeAspect="1"/>
             </wp:cNvGraphicFramePr>
@@ -389,7 +388,7 @@
               <a:graphicData uri="http://purl.oclc.org/ooxml/drawingml/picture">
                 <pic:pic xmlns:pic="http://purl.oclc.org/ooxml/drawingml/picture">
                   <pic:nvPicPr>
-                    <pic:cNvPr id="113410819" name="图形 113410819"/>
+                    <pic:cNvPr id="1412240717" name="图形 1412240717"/>
                     <pic:cNvPicPr/>
                   </pic:nvPicPr>
                   <pic:blipFill>
@@ -422,6 +421,16 @@
     </w:p>
     <w:p>
       <w:pPr>
+        <w:pStyle w:val="a3"/>
+        <w:ind w:firstLine="0pt"/>
+        <w:rPr>
+          <w:rFonts w:hint="eastAsia"/>
+          <w:lang w:eastAsia="zh-CN"/>
+        </w:rPr>
+      </w:pPr>
+    </w:p>
+    <w:p>
+      <w:pPr>
         <w:pStyle w:val="1"/>
       </w:pPr>
       <w:r>
@@ -506,13 +515,7 @@
         <w:rPr>
           <w:lang w:val="en-US"/>
         </w:rPr>
-        <w:t xml:space="preserve">Complete all content and organizational editing before formatting. Please note sections </w:t>
-      </w:r>
-      <w:r>
-        <w:rPr>
-          <w:lang w:val="en-US"/>
-        </w:rPr>
-        <w:t>A-D below for more information on proofreading, spelling and grammar.</w:t>
+        <w:t>Complete all content and organizational editing before formatting. Please note sections A-D below for more information on proofreading, spelling and grammar.</w:t>
       </w:r>
     </w:p>
     <w:p>
@@ -755,11 +758,8 @@
         <w:pStyle w:val="a3"/>
       </w:pPr>
       <w:r>
-        <w:t xml:space="preserve">Note that the equation is centered using a center tab stop. Be sure that the symbols in your equation have been defined before or immediately following the equation. Use “(1)”, not </w:t>
-      </w:r>
-      <w:r>
         <w:lastRenderedPageBreak/>
-        <w:t>“Eq. (1)” or “equation (1)”, except at the beginning of a sentence: “Equation (1) is . . .”</w:t>
+        <w:t>Note that the equation is centered using a center tab stop. Be sure that the symbols in your equation have been defined before or immediately following the equation. Use “(1)”, not “Eq. (1)” or “equation (1)”, except at the beginning of a sentence: “Equation (1) is . . .”</w:t>
       </w:r>
     </w:p>
     <w:p>
@@ -990,16 +990,16 @@
         <w:t xml:space="preserve">A minimum of one author is required for all conference articles. </w:t>
       </w:r>
       <w:r>
-        <w:t>Author names should be listed starting from left to right and then moving down to the next line. This is the author sequence that will be used in future citations and by indexing services.</w:t>
+        <w:t xml:space="preserve">Author names should be listed starting </w:t>
+      </w:r>
+      <w:r>
+        <w:t>from left to right and then moving down to the next line. This is the author sequence that will be used in future citations and by indexing services.</w:t>
       </w:r>
       <w:r>
         <w:t xml:space="preserve"> </w:t>
       </w:r>
       <w:r>
-        <w:t xml:space="preserve">Names should not be listed in columns </w:t>
-      </w:r>
-      <w:r>
-        <w:t>nor group by affiliation.</w:t>
+        <w:t>Names should not be listed in columns nor group by affiliation.</w:t>
       </w:r>
       <w:r>
         <w:rPr>
@@ -1470,11 +1470,11 @@
         <w:pStyle w:val="a3"/>
       </w:pPr>
       <w:r>
-        <w:t xml:space="preserve">Figure Labels: Use 8 point Times New Roman for Figure labels. Use words rather than symbols or abbreviations when writing Figure axis labels to avoid confusing the reader. As an example, write the quantity “Magnetization”, or “Magnetization, M”, not just “M”. If including units in the label, present them within parentheses. Do not label axes only </w:t>
+        <w:t xml:space="preserve">Figure Labels: Use 8 point Times New Roman for Figure labels. Use words rather than symbols or abbreviations when writing Figure axis labels to avoid confusing the reader. As an </w:t>
       </w:r>
       <w:r>
         <w:lastRenderedPageBreak/>
-        <w:t>with units. In the example, write “Magnetization (A/m)” or “Magnetization {A[m(1)]}”, not just “A/m”. Do not label axes</w:t>
+        <w:t>example, write the quantity “Magnetization”, or “Magnetization, M”, not just “M”. If including units in the label, present them within parentheses. Do not label axes only with units. In the example, write “Magnetization (A/m)” or “Magnetization {A[m(1)]}”, not just “A/m”. Do not label axes</w:t>
       </w:r>
       <w:r>
         <w:t xml:space="preserve"> </w:t>
@@ -1636,7 +1636,10 @@
         <w:t xml:space="preserve">’ </w:t>
       </w:r>
       <w:r>
-        <w:t>names; do not use “et al.”. Papers that have not been published, even if they have been submitted for publication, should be cited as “unpublished” [4]. Papers that have been accepted for publication should be cited as “in press” [5]. Capitalize only the first word in a paper title, except for proper nouns and element symbols.</w:t>
+        <w:t xml:space="preserve">names; do not use “et al.”. Papers that have not been published, even if they have been submitted for publication, should be cited as “unpublished” [4]. Papers that have been accepted for publication should be cited as “in press” [5]. Capitalize only </w:t>
+      </w:r>
+      <w:r>
+        <w:t>the first word in a paper title, except for proper nouns and element symbols.</w:t>
       </w:r>
     </w:p>
     <w:p>

</xml_diff>

<commit_message>
Update CHAMP manuscript and challenge overview figures
</commit_message>
<xml_diff>
--- a/DAC/paper/CHAMP_v1.docx
+++ b/DAC/paper/CHAMP_v1.docx
@@ -27,7 +27,6 @@
         <w:spacing w:before="5pt" w:beforeAutospacing="1" w:after="5pt" w:afterAutospacing="1" w:line="6pt" w:lineRule="auto"/>
         <w:jc w:val="both"/>
         <w:rPr>
-          <w:rFonts w:hint="eastAsia"/>
           <w:sz w:val="16"/>
           <w:szCs w:val="16"/>
           <w:lang w:eastAsia="zh-CN"/>
@@ -46,7 +45,6 @@
       <w:pPr>
         <w:jc w:val="both"/>
         <w:rPr>
-          <w:rFonts w:hint="eastAsia"/>
           <w:lang w:eastAsia="zh-CN"/>
         </w:rPr>
         <w:sectPr>
@@ -90,197 +88,6 @@
       <w:r>
         <w:t>—</w:t>
       </w:r>
-      <w:r>
-        <w:t xml:space="preserve">This electronic document is a “live” template and already defines the components of your paper [title, text, heads, etc.] in its style sheet. </w:t>
-      </w:r>
-      <w:r>
-        <w:t xml:space="preserve"> </w:t>
-      </w:r>
-      <w:r>
-        <w:rPr>
-          <w:i/>
-        </w:rPr>
-        <w:t>*</w:t>
-      </w:r>
-      <w:r>
-        <w:rPr>
-          <w:i/>
-        </w:rPr>
-        <w:t>CRITICAL:  Do</w:t>
-      </w:r>
-      <w:r>
-        <w:rPr>
-          <w:rFonts w:eastAsia="Times New Roman"/>
-          <w:i/>
-        </w:rPr>
-        <w:t xml:space="preserve"> </w:t>
-      </w:r>
-      <w:r>
-        <w:rPr>
-          <w:i/>
-        </w:rPr>
-        <w:t>Not</w:t>
-      </w:r>
-      <w:r>
-        <w:rPr>
-          <w:rFonts w:eastAsia="Times New Roman"/>
-          <w:i/>
-        </w:rPr>
-        <w:t xml:space="preserve"> </w:t>
-      </w:r>
-      <w:r>
-        <w:rPr>
-          <w:i/>
-        </w:rPr>
-        <w:t>Use</w:t>
-      </w:r>
-      <w:r>
-        <w:rPr>
-          <w:rFonts w:eastAsia="Times New Roman"/>
-          <w:i/>
-        </w:rPr>
-        <w:t xml:space="preserve"> </w:t>
-      </w:r>
-      <w:r>
-        <w:rPr>
-          <w:i/>
-        </w:rPr>
-        <w:t>Symbols,</w:t>
-      </w:r>
-      <w:r>
-        <w:rPr>
-          <w:rFonts w:eastAsia="Times New Roman"/>
-          <w:i/>
-        </w:rPr>
-        <w:t xml:space="preserve"> </w:t>
-      </w:r>
-      <w:r>
-        <w:rPr>
-          <w:i/>
-        </w:rPr>
-        <w:t>Special</w:t>
-      </w:r>
-      <w:r>
-        <w:rPr>
-          <w:rFonts w:eastAsia="Times New Roman"/>
-          <w:i/>
-        </w:rPr>
-        <w:t xml:space="preserve"> </w:t>
-      </w:r>
-      <w:r>
-        <w:rPr>
-          <w:i/>
-        </w:rPr>
-        <w:t>Characters,</w:t>
-      </w:r>
-      <w:r>
-        <w:rPr>
-          <w:rFonts w:eastAsia="Times New Roman"/>
-          <w:i/>
-        </w:rPr>
-        <w:t xml:space="preserve"> </w:t>
-      </w:r>
-      <w:r>
-        <w:rPr>
-          <w:rFonts w:eastAsia="Times New Roman"/>
-          <w:i/>
-        </w:rPr>
-        <w:t xml:space="preserve">Footnotes, </w:t>
-      </w:r>
-      <w:r>
-        <w:rPr>
-          <w:i/>
-        </w:rPr>
-        <w:t>or</w:t>
-      </w:r>
-      <w:r>
-        <w:rPr>
-          <w:rFonts w:eastAsia="Times New Roman"/>
-          <w:i/>
-        </w:rPr>
-        <w:t xml:space="preserve"> </w:t>
-      </w:r>
-      <w:r>
-        <w:rPr>
-          <w:i/>
-        </w:rPr>
-        <w:t>Math</w:t>
-      </w:r>
-      <w:r>
-        <w:rPr>
-          <w:rFonts w:eastAsia="Times New Roman"/>
-          <w:i/>
-        </w:rPr>
-        <w:t xml:space="preserve"> </w:t>
-      </w:r>
-      <w:r>
-        <w:rPr>
-          <w:i/>
-        </w:rPr>
-        <w:t>in</w:t>
-      </w:r>
-      <w:r>
-        <w:rPr>
-          <w:rFonts w:eastAsia="Times New Roman"/>
-          <w:i/>
-        </w:rPr>
-        <w:t xml:space="preserve"> Paper </w:t>
-      </w:r>
-      <w:r>
-        <w:rPr>
-          <w:i/>
-        </w:rPr>
-        <w:t>Title</w:t>
-      </w:r>
-      <w:r>
-        <w:rPr>
-          <w:rFonts w:eastAsia="Times New Roman"/>
-          <w:i/>
-        </w:rPr>
-        <w:t xml:space="preserve"> o</w:t>
-      </w:r>
-      <w:r>
-        <w:rPr>
-          <w:i/>
-        </w:rPr>
-        <w:t>r</w:t>
-      </w:r>
-      <w:r>
-        <w:rPr>
-          <w:rFonts w:eastAsia="Times New Roman"/>
-          <w:i/>
-        </w:rPr>
-        <w:t xml:space="preserve"> </w:t>
-      </w:r>
-      <w:r>
-        <w:rPr>
-          <w:i/>
-        </w:rPr>
-        <w:t>Abstract</w:t>
-      </w:r>
-      <w:r>
-        <w:t xml:space="preserve">. </w:t>
-      </w:r>
-      <w:r>
-        <w:rPr>
-          <w:iCs/>
-        </w:rPr>
-        <w:t>(</w:t>
-      </w:r>
-      <w:r>
-        <w:rPr>
-          <w:b w:val="0"/>
-          <w:i/>
-          <w:iCs/>
-        </w:rPr>
-        <w:t>Abstract</w:t>
-      </w:r>
-      <w:r>
-        <w:rPr>
-          <w:iCs/>
-        </w:rPr>
-        <w:t>)</w:t>
-      </w:r>
     </w:p>
     <w:p>
       <w:pPr>
@@ -289,42 +96,6 @@
       <w:r>
         <w:t>Keywords—</w:t>
       </w:r>
-      <w:r>
-        <w:t>component</w:t>
-      </w:r>
-      <w:r>
-        <w:t>,</w:t>
-      </w:r>
-      <w:r>
-        <w:t xml:space="preserve"> formatting</w:t>
-      </w:r>
-      <w:r>
-        <w:t>,</w:t>
-      </w:r>
-      <w:r>
-        <w:t xml:space="preserve"> style</w:t>
-      </w:r>
-      <w:r>
-        <w:t>,</w:t>
-      </w:r>
-      <w:r>
-        <w:t xml:space="preserve"> styling</w:t>
-      </w:r>
-      <w:r>
-        <w:t>,</w:t>
-      </w:r>
-      <w:r>
-        <w:t xml:space="preserve"> insert (</w:t>
-      </w:r>
-      <w:r>
-        <w:rPr>
-          <w:b w:val="0"/>
-        </w:rPr>
-        <w:t>key words</w:t>
-      </w:r>
-      <w:r>
-        <w:t>)</w:t>
-      </w:r>
     </w:p>
     <w:p>
       <w:pPr>
@@ -345,7 +116,20 @@
         <w:rPr>
           <w:lang w:val="en-US"/>
         </w:rPr>
-        <w:t>Modern computing platforms are evolving toward increasingly large-scale and highly parallel architectures, including many-core processors, GPUs, wafer-scale accelerators, and neuromorphic systems. As illustrated in Fig. 1, representative platforms have substantially expanded their computing resources and processing capabilities, alongside rising chip-to-chip bandwidth. These trends place growing demands on data movement and communication among processing elements, making the on-chip interconnect a critical factor in overall system performance. Consequently, networks-on-chip (</w:t>
+        <w:t>Modern computing platforms are evolving toward increasingly large-scale and highly parallel architectures, including many-core processors, GPUs, wafer-scale accelerators, and neuromorphic systems. As illustrated in Fig. 1</w:t>
+      </w:r>
+      <w:r>
+        <w:rPr>
+          <w:rFonts w:hint="eastAsia"/>
+          <w:lang w:val="en-US" w:eastAsia="zh-CN"/>
+        </w:rPr>
+        <w:t>a</w:t>
+      </w:r>
+      <w:r>
+        <w:rPr>
+          <w:lang w:val="en-US"/>
+        </w:rPr>
+        <w:t>, representative platforms have substantially expanded their computing resources and processing capabilities, alongside rising chip-to-chip bandwidth. These trends place growing demands on data movement and communication among processing elements, making the on-chip interconnect a critical factor in overall system performance. Consequently, networks-on-chip (</w:t>
       </w:r>
       <w:proofErr w:type="spellStart"/>
       <w:r>
@@ -361,26 +145,750 @@
         </w:rPr>
         <w:t>) must provide low-latency, high-throughput, and energy-efficient communication while remaining scalable to larger systems.</w:t>
       </w:r>
+    </w:p>
+    <w:p>
+      <w:pPr>
+        <w:pStyle w:val="a3"/>
+        <w:rPr>
+          <w:rFonts w:hint="eastAsia"/>
+          <w:lang w:eastAsia="zh-CN"/>
+        </w:rPr>
+      </w:pPr>
+      <w:r>
+        <w:rPr>
+          <w:lang w:val="en-US" w:eastAsia="zh-CN"/>
+        </w:rPr>
+        <w:t>To identify the fundamental bottlenecks of scalable on-chip communication, packet latency can be conceptually decomposed as</w:t>
+      </w:r>
+    </w:p>
+    <w:p>
+      <w:pPr>
+        <w:pStyle w:val="a3"/>
+        <w:rPr>
+          <w:lang w:eastAsia="zh-CN"/>
+        </w:rPr>
+      </w:pPr>
+      <m:oMathPara>
+        <m:oMath>
+          <m:sSub>
+            <m:sSubPr>
+              <m:ctrlPr>
+                <w:rPr>
+                  <w:rFonts w:ascii="Cambria Math" w:hAnsi="Cambria Math"/>
+                </w:rPr>
+              </m:ctrlPr>
+            </m:sSubPr>
+            <m:e>
+              <m:r>
+                <w:rPr>
+                  <w:rFonts w:ascii="Cambria Math" w:hAnsi="Cambria Math"/>
+                </w:rPr>
+                <m:t>T</m:t>
+              </m:r>
+            </m:e>
+            <m:sub>
+              <m:r>
+                <m:rPr>
+                  <m:sty m:val="p"/>
+                </m:rPr>
+                <w:rPr>
+                  <w:rFonts w:ascii="Cambria Math" w:hAnsi="Cambria Math"/>
+                </w:rPr>
+                <m:t>comm</m:t>
+              </m:r>
+            </m:sub>
+          </m:sSub>
+          <m:r>
+            <w:rPr>
+              <w:rFonts w:ascii="Cambria Math" w:hAnsi="Cambria Math"/>
+            </w:rPr>
+            <m:t>≈H</m:t>
+          </m:r>
+          <m:sSub>
+            <m:sSubPr>
+              <m:ctrlPr>
+                <w:rPr>
+                  <w:rFonts w:ascii="Cambria Math" w:hAnsi="Cambria Math"/>
+                </w:rPr>
+              </m:ctrlPr>
+            </m:sSubPr>
+            <m:e>
+              <m:r>
+                <w:rPr>
+                  <w:rFonts w:ascii="Cambria Math" w:hAnsi="Cambria Math"/>
+                </w:rPr>
+                <m:t>T</m:t>
+              </m:r>
+            </m:e>
+            <m:sub>
+              <m:r>
+                <w:rPr>
+                  <w:rFonts w:ascii="Cambria Math" w:hAnsi="Cambria Math"/>
+                </w:rPr>
+                <m:t>r</m:t>
+              </m:r>
+            </m:sub>
+          </m:sSub>
+          <m:r>
+            <w:rPr>
+              <w:rFonts w:ascii="Cambria Math" w:hAnsi="Cambria Math"/>
+            </w:rPr>
+            <m:t>+</m:t>
+          </m:r>
+          <m:sSub>
+            <m:sSubPr>
+              <m:ctrlPr>
+                <w:rPr>
+                  <w:rFonts w:ascii="Cambria Math" w:hAnsi="Cambria Math"/>
+                </w:rPr>
+              </m:ctrlPr>
+            </m:sSubPr>
+            <m:e>
+              <m:r>
+                <w:rPr>
+                  <w:rFonts w:ascii="Cambria Math" w:hAnsi="Cambria Math"/>
+                </w:rPr>
+                <m:t>T</m:t>
+              </m:r>
+            </m:e>
+            <m:sub>
+              <m:r>
+                <w:rPr>
+                  <w:rFonts w:ascii="Cambria Math" w:hAnsi="Cambria Math"/>
+                </w:rPr>
+                <m:t>c</m:t>
+              </m:r>
+            </m:sub>
+          </m:sSub>
+        </m:oMath>
+      </m:oMathPara>
     </w:p>
     <w:p>
       <w:pPr>
         <w:pStyle w:val="a3"/>
         <w:ind w:firstLine="0pt"/>
         <w:rPr>
+          <w:lang w:val="en-US" w:eastAsia="zh-CN"/>
+        </w:rPr>
+      </w:pPr>
+      <w:r>
+        <w:rPr>
+          <w:lang w:val="en-US" w:eastAsia="zh-CN"/>
+        </w:rPr>
+        <w:t xml:space="preserve">where </w:t>
+      </w:r>
+      <m:oMath>
+        <m:r>
+          <w:rPr>
+            <w:rFonts w:ascii="Cambria Math" w:hAnsi="Cambria Math"/>
+          </w:rPr>
+          <m:t>H</m:t>
+        </m:r>
+      </m:oMath>
+      <w:r>
+        <w:rPr>
+          <w:rFonts w:hint="eastAsia"/>
+          <w:lang w:val="en-US" w:eastAsia="zh-CN"/>
+        </w:rPr>
+        <w:t xml:space="preserve"> </w:t>
+      </w:r>
+      <w:r>
+        <w:rPr>
+          <w:lang w:val="en-US" w:eastAsia="zh-CN"/>
+        </w:rPr>
+        <w:t>denotes the number of routing hops,</w:t>
+      </w:r>
+      <w:r>
+        <w:rPr>
+          <w:rFonts w:hint="eastAsia"/>
+          <w:lang w:val="en-US" w:eastAsia="zh-CN"/>
+        </w:rPr>
+        <w:t xml:space="preserve"> </w:t>
+      </w:r>
+      <m:oMath>
+        <m:sSub>
+          <m:sSubPr>
+            <m:ctrlPr>
+              <w:rPr>
+                <w:rFonts w:ascii="Cambria Math" w:hAnsi="Cambria Math"/>
+              </w:rPr>
+            </m:ctrlPr>
+          </m:sSubPr>
+          <m:e>
+            <m:r>
+              <w:rPr>
+                <w:rFonts w:ascii="Cambria Math" w:hAnsi="Cambria Math"/>
+              </w:rPr>
+              <m:t>T</m:t>
+            </m:r>
+          </m:e>
+          <m:sub>
+            <m:r>
+              <w:rPr>
+                <w:rFonts w:ascii="Cambria Math" w:hAnsi="Cambria Math"/>
+              </w:rPr>
+              <m:t>r</m:t>
+            </m:r>
+          </m:sub>
+        </m:sSub>
+      </m:oMath>
+      <w:r>
+        <w:rPr>
+          <w:lang w:val="en-US" w:eastAsia="zh-CN"/>
+        </w:rPr>
+        <w:t xml:space="preserve"> the effective per-hop router-and-link delay, and</w:t>
+      </w:r>
+      <w:r>
+        <w:rPr>
+          <w:rFonts w:hint="eastAsia"/>
+          <w:lang w:val="en-US" w:eastAsia="zh-CN"/>
+        </w:rPr>
+        <w:t xml:space="preserve"> </w:t>
+      </w:r>
+      <m:oMath>
+        <m:sSub>
+          <m:sSubPr>
+            <m:ctrlPr>
+              <w:rPr>
+                <w:rFonts w:ascii="Cambria Math" w:hAnsi="Cambria Math"/>
+              </w:rPr>
+            </m:ctrlPr>
+          </m:sSubPr>
+          <m:e>
+            <m:r>
+              <w:rPr>
+                <w:rFonts w:ascii="Cambria Math" w:hAnsi="Cambria Math"/>
+              </w:rPr>
+              <m:t>T</m:t>
+            </m:r>
+          </m:e>
+          <m:sub>
+            <m:r>
+              <w:rPr>
+                <w:rFonts w:ascii="Cambria Math" w:hAnsi="Cambria Math"/>
+              </w:rPr>
+              <m:t>c</m:t>
+            </m:r>
+          </m:sub>
+        </m:sSub>
+      </m:oMath>
+      <w:r>
+        <w:rPr>
+          <w:rFonts w:hint="eastAsia"/>
+          <w:lang w:val="en-US" w:eastAsia="zh-CN"/>
+        </w:rPr>
+        <w:t xml:space="preserve"> </w:t>
+      </w:r>
+      <w:r>
+        <w:rPr>
+          <w:lang w:val="en-US" w:eastAsia="zh-CN"/>
+        </w:rPr>
+        <w:t>the delay caused by contention and queuing. This simplified model treats packet serialization as a common offset under a fixed packet and channel configuration. It highlights three coupled design factors: network topology determines routing paths and resource distribution; router microarchitecture affects both per-hop delay and contention through arbitration, buffering, and parallel transmission capacity; and traffic patterns further influence resource utilization and queuing. Therefore, optimizing these factors jointly is essential for scalable, low-latency communication.</w:t>
+      </w:r>
+    </w:p>
+    <w:p>
+      <w:pPr>
+        <w:pStyle w:val="a3"/>
+        <w:rPr>
           <w:lang w:eastAsia="zh-CN"/>
         </w:rPr>
       </w:pPr>
       <w:r>
         <w:rPr>
+          <w:lang w:eastAsia="zh-CN"/>
+        </w:rPr>
+        <w:t xml:space="preserve">Prior NoC studies have pursued scalability through network topology, router microarchitecture, and multicast routing. Regular meshes provide simple connectivity but incur increasing hop counts at scale, motivating hierarchical and link-augmented topologies [5], [20]–[23]. These approaches involve distinct tradeoffs: long-range links consume additional wiring resources, while conventional fat-tree scaling increases upper-level router width and arbitration complexity [1], [31]. The resulting per-hop delay can erode the latency savings of reduced hop counts, while increased link capacity does not necessarily translate into higher delivered throughput. At the microarchitectural level, two-phase bundled-data switches, replicated-switch designs, Click-based controllers, and continuous-time replication have improved asynchronous forwarding and multicast buffering [3], [24]–[26]. However, distributing bandwidth across dynamically selected physical lanes requires careful coordination of packet-level arbitration and two-phase handshake states. Meanwhile, existing multicast schemes, including destination bitmaps, subtree broadcasting, and hybrid path/tree routing, enable in-network replication [27]–[30], [34]. These approaches exhibit different tradeoffs among destination-encoding overhead, replication selectivity, and </w:t>
+      </w:r>
+      <w:r>
+        <w:rPr>
+          <w:lang w:eastAsia="zh-CN"/>
+        </w:rPr>
+        <w:t>network traffic [39]. In particular, efficient region-oriented multicast requires compact addressing and selective branching across network levels, while the absence of native replication can amplify traffic through repeated unicast. Together, these considerations motivate the co-design of hierarchical connectivity, parallel-router resources, and region-aware multicast routing.</w:t>
+      </w:r>
+    </w:p>
+    <w:p>
+      <w:pPr>
+        <w:pStyle w:val="a3"/>
+        <w:rPr>
+          <w:lang w:val="en-US" w:eastAsia="zh-CN"/>
+        </w:rPr>
+      </w:pPr>
+      <w:r>
+        <w:rPr>
+          <w:lang w:val="en-US" w:eastAsia="zh-CN"/>
+        </w:rPr>
+        <w:t xml:space="preserve">These observations reveal three key challenges in scaling asynchronous </w:t>
+      </w:r>
+      <w:proofErr w:type="spellStart"/>
+      <w:r>
+        <w:rPr>
+          <w:lang w:val="en-US" w:eastAsia="zh-CN"/>
+        </w:rPr>
+        <w:t>NoCs</w:t>
+      </w:r>
+      <w:proofErr w:type="spellEnd"/>
+      <w:r>
+        <w:rPr>
+          <w:lang w:val="en-US" w:eastAsia="zh-CN"/>
+        </w:rPr>
+        <w:t xml:space="preserve">, as illustrated in Fig. </w:t>
+      </w:r>
+      <w:r>
+        <w:rPr>
           <w:rFonts w:hint="eastAsia"/>
+          <w:lang w:val="en-US" w:eastAsia="zh-CN"/>
+        </w:rPr>
+        <w:t>1b-f</w:t>
+      </w:r>
+      <w:r>
+        <w:rPr>
+          <w:lang w:val="en-US" w:eastAsia="zh-CN"/>
+        </w:rPr>
+        <w:t>:</w:t>
+      </w:r>
+    </w:p>
+    <w:p>
+      <w:pPr>
+        <w:pStyle w:val="a3"/>
+        <w:rPr>
+          <w:lang w:val="en-US" w:eastAsia="zh-CN"/>
+        </w:rPr>
+      </w:pPr>
+      <w:r>
+        <w:rPr>
+          <w:b/>
+          <w:bCs/>
+          <w:lang w:val="en-US" w:eastAsia="zh-CN"/>
+        </w:rPr>
+        <w:t>C1: Increasing traversal latency with network scale.</w:t>
+      </w:r>
+      <w:r>
+        <w:rPr>
+          <w:lang w:val="en-US" w:eastAsia="zh-CN"/>
+        </w:rPr>
+        <w:t xml:space="preserve"> In a regular 2-D mesh, the average hop count grows proportionally to the square root of the network size, following</w:t>
+      </w:r>
+      <w:r>
+        <w:rPr>
+          <w:rFonts w:hint="eastAsia"/>
+          <w:lang w:val="en-US" w:eastAsia="zh-CN"/>
+        </w:rPr>
+        <w:t xml:space="preserve"> </w:t>
+      </w:r>
+      <m:oMath>
+        <m:sSub>
+          <m:sSubPr>
+            <m:ctrlPr>
+              <w:rPr>
+                <w:rFonts w:ascii="Cambria Math" w:hAnsi="Cambria Math"/>
+              </w:rPr>
+            </m:ctrlPr>
+          </m:sSubPr>
+          <m:e>
+            <m:acc>
+              <m:accPr>
+                <m:chr m:val="̅"/>
+                <m:ctrlPr>
+                  <w:rPr>
+                    <w:rFonts w:ascii="Cambria Math" w:hAnsi="Cambria Math"/>
+                  </w:rPr>
+                </m:ctrlPr>
+              </m:accPr>
+              <m:e>
+                <m:r>
+                  <w:rPr>
+                    <w:rFonts w:ascii="Cambria Math" w:hAnsi="Cambria Math"/>
+                  </w:rPr>
+                  <m:t>H</m:t>
+                </m:r>
+              </m:e>
+            </m:acc>
+          </m:e>
+          <m:sub>
+            <m:r>
+              <m:rPr>
+                <m:sty m:val="p"/>
+              </m:rPr>
+              <w:rPr>
+                <w:rFonts w:ascii="Cambria Math" w:hAnsi="Cambria Math"/>
+              </w:rPr>
+              <m:t>Mesh</m:t>
+            </m:r>
+          </m:sub>
+        </m:sSub>
+        <m:d>
+          <m:dPr>
+            <m:ctrlPr>
+              <w:rPr>
+                <w:rFonts w:ascii="Cambria Math" w:hAnsi="Cambria Math"/>
+              </w:rPr>
+            </m:ctrlPr>
+          </m:dPr>
+          <m:e>
+            <m:r>
+              <w:rPr>
+                <w:rFonts w:ascii="Cambria Math" w:hAnsi="Cambria Math"/>
+              </w:rPr>
+              <m:t>N</m:t>
+            </m:r>
+          </m:e>
+        </m:d>
+        <m:r>
+          <w:rPr>
+            <w:rFonts w:ascii="Cambria Math" w:hAnsi="Cambria Math"/>
+          </w:rPr>
+          <m:t>=</m:t>
+        </m:r>
+        <m:f>
+          <m:fPr>
+            <m:ctrlPr>
+              <w:rPr>
+                <w:rFonts w:ascii="Cambria Math" w:hAnsi="Cambria Math"/>
+              </w:rPr>
+            </m:ctrlPr>
+          </m:fPr>
+          <m:num>
+            <m:r>
+              <w:rPr>
+                <w:rFonts w:ascii="Cambria Math" w:hAnsi="Cambria Math"/>
+              </w:rPr>
+              <m:t>2</m:t>
+            </m:r>
+          </m:num>
+          <m:den>
+            <m:r>
+              <w:rPr>
+                <w:rFonts w:ascii="Cambria Math" w:hAnsi="Cambria Math"/>
+              </w:rPr>
+              <m:t>3</m:t>
+            </m:r>
+          </m:den>
+        </m:f>
+        <m:rad>
+          <m:radPr>
+            <m:degHide m:val="1"/>
+            <m:ctrlPr>
+              <w:rPr>
+                <w:rFonts w:ascii="Cambria Math" w:hAnsi="Cambria Math"/>
+              </w:rPr>
+            </m:ctrlPr>
+          </m:radPr>
+          <m:deg/>
+          <m:e>
+            <m:r>
+              <w:rPr>
+                <w:rFonts w:ascii="Cambria Math" w:hAnsi="Cambria Math"/>
+              </w:rPr>
+              <m:t>N</m:t>
+            </m:r>
+          </m:e>
+        </m:rad>
+      </m:oMath>
+      <w:r>
+        <w:rPr>
+          <w:lang w:val="en-US" w:eastAsia="zh-CN"/>
+        </w:rPr>
+        <w:t xml:space="preserve">, where </w:t>
+      </w:r>
+      <m:oMath>
+        <m:r>
+          <w:rPr>
+            <w:rFonts w:ascii="Cambria Math" w:hAnsi="Cambria Math"/>
+          </w:rPr>
+          <m:t>N</m:t>
+        </m:r>
+      </m:oMath>
+      <w:r>
+        <w:rPr>
+          <w:lang w:val="en-US" w:eastAsia="zh-CN"/>
+        </w:rPr>
+        <w:t xml:space="preserve"> denotes the number of network nodes. This increasing path length contributes to higher communication latency, even with efficient individual routers.</w:t>
+      </w:r>
+    </w:p>
+    <w:p>
+      <w:pPr>
+        <w:pStyle w:val="a3"/>
+        <w:rPr>
+          <w:lang w:val="en-US" w:eastAsia="zh-CN"/>
+        </w:rPr>
+      </w:pPr>
+      <w:r>
+        <w:rPr>
+          <w:b/>
+          <w:bCs/>
+          <w:lang w:val="en-US" w:eastAsia="zh-CN"/>
+        </w:rPr>
+        <w:t>C2: Inefficient bandwidth scaling in conventional fat-trees.</w:t>
+      </w:r>
+      <w:r>
+        <w:rPr>
+          <w:lang w:val="en-US" w:eastAsia="zh-CN"/>
+        </w:rPr>
+        <w:t xml:space="preserve"> Although tree hierarchies reduce hop counts, fattening upper-level links increases the number of physical ports and competing requests handled by each router, resulting in more complex arbitration and longer per-hop delays. As shown in Fig. 2(</w:t>
+      </w:r>
+      <w:r>
+        <w:rPr>
+          <w:rFonts w:hint="eastAsia"/>
+          <w:lang w:val="en-US" w:eastAsia="zh-CN"/>
+        </w:rPr>
+        <w:t>c</w:t>
+      </w:r>
+      <w:r>
+        <w:rPr>
+          <w:lang w:val="en-US" w:eastAsia="zh-CN"/>
+        </w:rPr>
+        <w:t xml:space="preserve">), router latency nearly doubles from 0.66 to 1.29 ns/flit as the evaluated </w:t>
+      </w:r>
+      <w:r>
+        <w:rPr>
+          <w:rFonts w:hint="eastAsia"/>
+          <w:lang w:val="en-US" w:eastAsia="zh-CN"/>
+        </w:rPr>
+        <w:t>router</w:t>
+      </w:r>
+      <w:r>
+        <w:rPr>
+          <w:lang w:val="en-US" w:eastAsia="zh-CN"/>
+        </w:rPr>
+        <w:t xml:space="preserve"> widen</w:t>
+      </w:r>
+      <w:r>
+        <w:rPr>
+          <w:rFonts w:hint="eastAsia"/>
+          <w:lang w:val="en-US" w:eastAsia="zh-CN"/>
+        </w:rPr>
+        <w:t>s</w:t>
+      </w:r>
+      <w:r>
+        <w:rPr>
+          <w:lang w:val="en-US" w:eastAsia="zh-CN"/>
+        </w:rPr>
+        <w:t xml:space="preserve">, potentially offsetting the latency benefits of shorter paths. Moreover, the conventional fat-tree achieves only 145 </w:t>
+      </w:r>
+      <w:proofErr w:type="spellStart"/>
+      <w:r>
+        <w:rPr>
+          <w:lang w:val="en-US" w:eastAsia="zh-CN"/>
+        </w:rPr>
+        <w:t>Mflit</w:t>
+      </w:r>
+      <w:proofErr w:type="spellEnd"/>
+      <w:r>
+        <w:rPr>
+          <w:lang w:val="en-US" w:eastAsia="zh-CN"/>
+        </w:rPr>
+        <w:t xml:space="preserve">/s/port, compared with 215 </w:t>
+      </w:r>
+      <w:proofErr w:type="spellStart"/>
+      <w:r>
+        <w:rPr>
+          <w:lang w:val="en-US" w:eastAsia="zh-CN"/>
+        </w:rPr>
+        <w:t>Mflit</w:t>
+      </w:r>
+      <w:proofErr w:type="spellEnd"/>
+      <w:r>
+        <w:rPr>
+          <w:lang w:val="en-US" w:eastAsia="zh-CN"/>
+        </w:rPr>
+        <w:t>/s/port for the flat mesh, indicating that additional physical links do not necessarily translate into higher network throughput.</w:t>
+      </w:r>
+    </w:p>
+    <w:p>
+      <w:pPr>
+        <w:pStyle w:val="a3"/>
+        <w:rPr>
+          <w:lang w:val="en-US" w:eastAsia="zh-CN"/>
+        </w:rPr>
+      </w:pPr>
+      <w:r>
+        <w:rPr>
+          <w:b/>
+          <w:bCs/>
+          <w:lang w:val="en-US" w:eastAsia="zh-CN"/>
+        </w:rPr>
+        <w:t>C3: Traffic amplification with increasing multicast fanout.</w:t>
+      </w:r>
+      <w:r>
+        <w:rPr>
+          <w:lang w:val="en-US" w:eastAsia="zh-CN"/>
+        </w:rPr>
+        <w:t xml:space="preserve"> Without in-network replication, repeated unicast requires multiple packet injections for a single multicast message, amplifying redundant traffic, contention, and queuing delays as multicast fanout increases. As illustrated in Fig. 2</w:t>
+      </w:r>
+      <w:r>
+        <w:rPr>
+          <w:rFonts w:hint="eastAsia"/>
+          <w:lang w:val="en-US" w:eastAsia="zh-CN"/>
+        </w:rPr>
+        <w:t>d</w:t>
+      </w:r>
+      <w:r>
+        <w:rPr>
+          <w:lang w:val="en-US" w:eastAsia="zh-CN"/>
+        </w:rPr>
+        <w:t>, repeated-unicast latency rises sharply from 57.2 ns to 573.0 ns</w:t>
+      </w:r>
+      <w:r>
+        <w:rPr>
+          <w:rFonts w:hint="eastAsia"/>
+          <w:lang w:val="en-US" w:eastAsia="zh-CN"/>
+        </w:rPr>
+        <w:t xml:space="preserve"> when multicast increases</w:t>
+      </w:r>
+      <w:r>
+        <w:rPr>
+          <w:lang w:val="en-US" w:eastAsia="zh-CN"/>
+        </w:rPr>
+        <w:t xml:space="preserve"> in our 256-node evaluation. Efficient hierarchical multicast thus requires compact destination representation and selective in-network replication across network levels.</w:t>
+      </w:r>
+    </w:p>
+    <w:p>
+      <w:pPr>
+        <w:pStyle w:val="a3"/>
+        <w:rPr>
+          <w:lang w:val="en-US" w:eastAsia="zh-CN"/>
+        </w:rPr>
+      </w:pPr>
+      <w:r>
+        <w:rPr>
+          <w:lang w:val="en-US" w:eastAsia="zh-CN"/>
+        </w:rPr>
+        <w:t xml:space="preserve">To address these challenges, we propose </w:t>
+      </w:r>
+      <w:r>
+        <w:rPr>
+          <w:b/>
+          <w:bCs/>
+          <w:lang w:val="en-US" w:eastAsia="zh-CN"/>
+        </w:rPr>
+        <w:t>CHAMP (Click-based Hierarchical Asynchronous Multicast with Parallel Routers)</w:t>
+      </w:r>
+      <w:r>
+        <w:rPr>
+          <w:lang w:val="en-US" w:eastAsia="zh-CN"/>
+        </w:rPr>
+        <w:t>, a scalable asynchronous NoC architecture featuring the following three key contributions:</w:t>
+      </w:r>
+    </w:p>
+    <w:p>
+      <w:pPr>
+        <w:pStyle w:val="a3"/>
+        <w:rPr>
+          <w:lang w:val="en-US" w:eastAsia="zh-CN"/>
+        </w:rPr>
+      </w:pPr>
+      <w:r>
+        <w:rPr>
+          <w:b/>
+          <w:bCs/>
+          <w:lang w:val="en-US" w:eastAsia="zh-CN"/>
+        </w:rPr>
+        <w:t>R1:</w:t>
+      </w:r>
+      <w:r>
+        <w:rPr>
+          <w:rFonts w:hint="eastAsia"/>
+          <w:b/>
+          <w:bCs/>
+          <w:lang w:val="en-US" w:eastAsia="zh-CN"/>
+        </w:rPr>
+        <w:t xml:space="preserve"> </w:t>
+      </w:r>
+      <w:r>
+        <w:rPr>
+          <w:b/>
+          <w:bCs/>
+          <w:lang w:val="en-US" w:eastAsia="zh-CN"/>
+        </w:rPr>
+        <w:t>Hierarchical Tree–Mesh Topology.</w:t>
+      </w:r>
+      <w:r>
+        <w:rPr>
+          <w:lang w:val="en-US" w:eastAsia="zh-CN"/>
+        </w:rPr>
+        <w:t xml:space="preserve"> We propose a hierarchical interconnect that combines local quadtrees with a global mesh, enabling local communication to complete within lower tree levels while supporting long-distance communication through the upper mesh. Our analytical hop-count model demonstrates a substantial reduction in average communication distance compared with flat meshes, mitigating the hop-dependent latency penalty as the network scales.</w:t>
+      </w:r>
+    </w:p>
+    <w:p>
+      <w:pPr>
+        <w:pStyle w:val="a3"/>
+        <w:rPr>
+          <w:lang w:val="en-US" w:eastAsia="zh-CN"/>
+        </w:rPr>
+        <w:sectPr>
+          <w:type w:val="continuous"/>
+          <w:pgSz w:w="595.30pt" w:h="841.90pt" w:code="9"/>
+          <w:pgMar w:top="54pt" w:right="45.35pt" w:bottom="72pt" w:left="45.35pt" w:header="36pt" w:footer="36pt" w:gutter="0pt"/>
+          <w:cols w:num="2" w:space="18pt"/>
+          <w:docGrid w:linePitch="360"/>
+        </w:sectPr>
+      </w:pPr>
+      <w:r>
+        <w:rPr>
+          <w:b/>
+          <w:bCs/>
+          <w:lang w:val="en-US" w:eastAsia="zh-CN"/>
+        </w:rPr>
+        <w:t>R2:</w:t>
+      </w:r>
+      <w:r>
+        <w:rPr>
+          <w:rFonts w:hint="eastAsia"/>
+          <w:b/>
+          <w:bCs/>
+          <w:lang w:val="en-US" w:eastAsia="zh-CN"/>
+        </w:rPr>
+        <w:t xml:space="preserve"> </w:t>
+      </w:r>
+      <w:r>
+        <w:rPr>
+          <w:b/>
+          <w:bCs/>
+          <w:lang w:val="en-US" w:eastAsia="zh-CN"/>
+        </w:rPr>
+        <w:t>Parallel-Router Architecture.</w:t>
+      </w:r>
+      <w:r>
+        <w:rPr>
+          <w:lang w:val="en-US" w:eastAsia="zh-CN"/>
+        </w:rPr>
+        <w:t xml:space="preserve"> Rather than concentrating expanded link capacity in increasingly wide routers, CHAMP distributes physical paths across multiple lightweight asynchronous routers. Dynamic lane allocation, </w:t>
+      </w:r>
+    </w:p>
+    <w:p>
+      <w:pPr>
+        <w:pStyle w:val="a3"/>
+        <w:ind w:firstLine="0pt"/>
+        <w:rPr>
+          <w:lang w:val="en-US" w:eastAsia="zh-CN"/>
+        </w:rPr>
+        <w:sectPr>
+          <w:type w:val="continuous"/>
+          <w:pgSz w:w="595.30pt" w:h="841.90pt" w:code="9"/>
+          <w:pgMar w:top="54pt" w:right="45.35pt" w:bottom="72pt" w:left="45.35pt" w:header="36pt" w:footer="36pt" w:gutter="0pt"/>
+          <w:cols w:space="18pt"/>
+          <w:docGrid w:linePitch="360"/>
+        </w:sectPr>
+      </w:pPr>
+      <w:r>
+        <w:rPr>
           <w:noProof/>
-          <w:lang w:eastAsia="zh-CN"/>
-        </w:rPr>
+          <w:lang w:val="en-US" w:eastAsia="zh-CN"/>
+        </w:rPr>
+        <w:lastRenderedPageBreak/>
         <w:drawing>
-          <wp:inline distT="0" distB="0" distL="0" distR="0" wp14:anchorId="068C6BC7" wp14:editId="16A13BDE">
-            <wp:extent cx="3089910" cy="1713865"/>
-            <wp:effectExtent l="0" t="0" r="0" b="635"/>
-            <wp:docPr id="1412240717" name="图形 3"/>
+          <wp:anchor distT="0" distB="0" distL="114300" distR="114300" simplePos="0" relativeHeight="251658240" behindDoc="0" locked="0" layoutInCell="1" allowOverlap="1" wp14:anchorId="542ADE40" wp14:editId="1B9A55CD">
+            <wp:simplePos x="0" y="0"/>
+            <wp:positionH relativeFrom="column">
+              <wp:posOffset>180</wp:posOffset>
+            </wp:positionH>
+            <wp:positionV relativeFrom="page">
+              <wp:posOffset>687121</wp:posOffset>
+            </wp:positionV>
+            <wp:extent cx="6408420" cy="2921000"/>
+            <wp:effectExtent l="0" t="0" r="0" b="0"/>
+            <wp:wrapTopAndBottom/>
+            <wp:docPr id="1411342489" name="图形 2"/>
             <wp:cNvGraphicFramePr>
               <a:graphicFrameLocks xmlns:a="http://purl.oclc.org/ooxml/drawingml/main" noChangeAspect="1"/>
             </wp:cNvGraphicFramePr>
@@ -388,7 +896,7 @@
               <a:graphicData uri="http://purl.oclc.org/ooxml/drawingml/picture">
                 <pic:pic xmlns:pic="http://purl.oclc.org/ooxml/drawingml/picture">
                   <pic:nvPicPr>
-                    <pic:cNvPr id="1412240717" name="图形 1412240717"/>
+                    <pic:cNvPr id="1411342489" name="图形 1411342489"/>
                     <pic:cNvPicPr/>
                   </pic:nvPicPr>
                   <pic:blipFill>
@@ -406,7 +914,7 @@
                   <pic:spPr>
                     <a:xfrm>
                       <a:off x="0" y="0"/>
-                      <a:ext cx="3089910" cy="1713865"/>
+                      <a:ext cx="6408420" cy="2921000"/>
                     </a:xfrm>
                     <a:prstGeom prst="rect">
                       <a:avLst/>
@@ -415,7 +923,7 @@
                 </pic:pic>
               </a:graphicData>
             </a:graphic>
-          </wp:inline>
+          </wp:anchor>
         </w:drawing>
       </w:r>
     </w:p>
@@ -424,10 +932,77 @@
         <w:pStyle w:val="a3"/>
         <w:ind w:firstLine="0pt"/>
         <w:rPr>
+          <w:lang w:val="en-US" w:eastAsia="zh-CN"/>
+        </w:rPr>
+      </w:pPr>
+      <w:r>
+        <w:rPr>
+          <w:lang w:val="en-US" w:eastAsia="zh-CN"/>
+        </w:rPr>
+        <w:t>packet-level path holding, and phase-safe two-phase handshake adaptation enable parallel communication while limiting local arbitration complexity.</w:t>
+      </w:r>
+    </w:p>
+    <w:p>
+      <w:pPr>
+        <w:pStyle w:val="a3"/>
+        <w:rPr>
+          <w:lang w:val="en-US" w:eastAsia="zh-CN"/>
+        </w:rPr>
+      </w:pPr>
+      <w:r>
+        <w:rPr>
+          <w:b/>
+          <w:bCs/>
+          <w:lang w:val="en-US" w:eastAsia="zh-CN"/>
+        </w:rPr>
+        <w:t>R3: Native Region-Aware Multicast.</w:t>
+      </w:r>
+      <w:r>
+        <w:rPr>
+          <w:lang w:val="en-US" w:eastAsia="zh-CN"/>
+        </w:rPr>
+        <w:t xml:space="preserve"> CHAMP employs compact rectangular destination encoding and hierarchical routing decisions to selectively replicate multi-flit packets across tree and mesh levels. Native in-network replication reduces redundant source injections and enables efficient one-to-many communication.</w:t>
+      </w:r>
+    </w:p>
+    <w:p>
+      <w:pPr>
+        <w:pStyle w:val="a3"/>
+        <w:rPr>
           <w:rFonts w:hint="eastAsia"/>
-          <w:lang w:eastAsia="zh-CN"/>
-        </w:rPr>
-      </w:pPr>
+          <w:lang w:val="en-US" w:eastAsia="zh-CN"/>
+        </w:rPr>
+      </w:pPr>
+      <w:r>
+        <w:rPr>
+          <w:lang w:val="en-US" w:eastAsia="zh-CN"/>
+        </w:rPr>
+        <w:t xml:space="preserve">Across 64- and 256-node networks, CHAMP achieves 61.2% and 51.7% higher peak delivered throughput than flat meshes under uniform-random traffic, respectively, sustaining its performance advantage as network size grows. </w:t>
+      </w:r>
+      <w:r>
+        <w:rPr>
+          <w:lang w:val="en-US" w:eastAsia="zh-CN"/>
+        </w:rPr>
+        <w:t>CHAMP also reduces power consumption by 21.8% compared with the flat mesh under the evaluated 64-node uniform-random workload</w:t>
+      </w:r>
+      <w:r>
+        <w:rPr>
+          <w:lang w:val="en-US" w:eastAsia="zh-CN"/>
+        </w:rPr>
+        <w:t>.</w:t>
+      </w:r>
+      <w:r>
+        <w:rPr>
+          <w:rFonts w:hint="eastAsia"/>
+          <w:lang w:val="en-US" w:eastAsia="zh-CN"/>
+        </w:rPr>
+        <w:t xml:space="preserve"> </w:t>
+      </w:r>
+      <w:r>
+        <w:rPr>
+          <w:lang w:val="en-US" w:eastAsia="zh-CN"/>
+        </w:rPr>
+        <w:t>Furthermore, across the evaluated multicast workloads, native multicast maintains nearly constant mean offer-to-tail latency, whereas repeated-unicast latency reaches 59.3 ns and 573.0 ns under All-Multicast, respectively.</w:t>
+      </w:r>
     </w:p>
     <w:p>
       <w:pPr>
@@ -683,6 +1258,7 @@
         </w:rPr>
       </w:pPr>
       <w:r>
+        <w:lastRenderedPageBreak/>
         <w:t>Number equations consecutively. Equation numbers, within parentheses, are to position flush right, as in (1), using a right tab stop. To make your equations more compact, you may use the solidus ( / ), the exp function, or appropriate exponents. Italicize Roman symbols for quantities and variables, but not Greek symbols. Use a long dash rather than a hyphen for a minus sign. Punctuate equations with commas or periods when they are part of a sentence, as in</w:t>
       </w:r>
       <w:r>
@@ -758,7 +1334,6 @@
         <w:pStyle w:val="a3"/>
       </w:pPr>
       <w:r>
-        <w:lastRenderedPageBreak/>
         <w:t>Note that the equation is centered using a center tab stop. Be sure that the symbols in your equation have been defined before or immediately following the equation. Use “(1)”, not “Eq. (1)” or “equation (1)”, except at the beginning of a sentence: “Equation (1) is . . .”</w:t>
       </w:r>
     </w:p>
@@ -906,7 +1481,10 @@
         <w:pStyle w:val="a3"/>
       </w:pPr>
       <w:r>
-        <w:t>After the text edit has been completed, the paper is ready for the template. Duplicate the template file by using the Save As command, and use the naming convention prescribed by your conference for the name of your paper. In this newly created file, highlight all of the contents and import your prepared text file. You are now ready to style your paper; use the scroll down window on the left of the MS Word Formatting toolbar.</w:t>
+        <w:t xml:space="preserve">After the text edit has been completed, the paper is ready for the template. Duplicate the template file by using the Save </w:t>
+      </w:r>
+      <w:r>
+        <w:t>As command, and use the naming convention prescribed by your conference for the name of your paper. In this newly created file, highlight all of the contents and import your prepared text file. You are now ready to style your paper; use the scroll down window on the left of the MS Word Formatting toolbar.</w:t>
       </w:r>
     </w:p>
     <w:p>
@@ -990,10 +1568,7 @@
         <w:t xml:space="preserve">A minimum of one author is required for all conference articles. </w:t>
       </w:r>
       <w:r>
-        <w:t xml:space="preserve">Author names should be listed starting </w:t>
-      </w:r>
-      <w:r>
-        <w:t>from left to right and then moving down to the next line. This is the author sequence that will be used in future citations and by indexing services.</w:t>
+        <w:t>Author names should be listed starting from left to right and then moving down to the next line. This is the author sequence that will be used in future citations and by indexing services.</w:t>
       </w:r>
       <w:r>
         <w:t xml:space="preserve"> </w:t>
@@ -1237,6 +1812,7 @@
               <w:pStyle w:val="tablecolhead"/>
             </w:pPr>
             <w:r>
+              <w:lastRenderedPageBreak/>
               <w:t>Table Head</w:t>
             </w:r>
           </w:p>
@@ -1470,11 +2046,7 @@
         <w:pStyle w:val="a3"/>
       </w:pPr>
       <w:r>
-        <w:t xml:space="preserve">Figure Labels: Use 8 point Times New Roman for Figure labels. Use words rather than symbols or abbreviations when writing Figure axis labels to avoid confusing the reader. As an </w:t>
-      </w:r>
-      <w:r>
-        <w:lastRenderedPageBreak/>
-        <w:t>example, write the quantity “Magnetization”, or “Magnetization, M”, not just “M”. If including units in the label, present them within parentheses. Do not label axes only with units. In the example, write “Magnetization (A/m)” or “Magnetization {A[m(1)]}”, not just “A/m”. Do not label axes</w:t>
+        <w:t>Figure Labels: Use 8 point Times New Roman for Figure labels. Use words rather than symbols or abbreviations when writing Figure axis labels to avoid confusing the reader. As an example, write the quantity “Magnetization”, or “Magnetization, M”, not just “M”. If including units in the label, present them within parentheses. Do not label axes only with units. In the example, write “Magnetization (A/m)” or “Magnetization {A[m(1)]}”, not just “A/m”. Do not label axes</w:t>
       </w:r>
       <w:r>
         <w:t xml:space="preserve"> </w:t>
@@ -1587,73 +2159,7 @@
         <w:pStyle w:val="a3"/>
       </w:pPr>
       <w:r>
-        <w:t>The template will number citations consecutively within brackets [1]. The sentence punctuation follows the bracket [2]. Refer simply to the reference number, as in [3]—do not use “Ref. [3]” or “reference [3]” except at the beginning of a sentence: “Reference [3] was the first</w:t>
-      </w:r>
-      <w:r>
-        <w:rPr>
-          <w:lang w:val="en-US"/>
-        </w:rPr>
-        <w:t xml:space="preserve"> </w:t>
-      </w:r>
-      <w:r>
-        <w:t>...</w:t>
-      </w:r>
-      <w:r>
-        <w:t>”</w:t>
-      </w:r>
-    </w:p>
-    <w:p>
-      <w:pPr>
-        <w:pStyle w:val="a3"/>
-      </w:pPr>
-      <w:r>
-        <w:t>Number footnotes separately in superscripts. Place the actual footnote at the bottom of the column in which it was cited. Do not put footnotes in the</w:t>
-      </w:r>
-      <w:r>
-        <w:rPr>
-          <w:lang w:val="en-US"/>
-        </w:rPr>
-        <w:t xml:space="preserve"> abstract or</w:t>
-      </w:r>
-      <w:r>
-        <w:t xml:space="preserve"> reference list. Use letters for table footnotes.</w:t>
-      </w:r>
-    </w:p>
-    <w:p>
-      <w:pPr>
-        <w:pStyle w:val="a3"/>
-      </w:pPr>
-      <w:r>
-        <w:t>Unless there are six au</w:t>
-      </w:r>
-      <w:r>
-        <w:t>thors or more give all authors</w:t>
-      </w:r>
-      <w:r>
-        <w:rPr>
-          <w:lang w:val="en-US"/>
-        </w:rPr>
-        <w:t xml:space="preserve">’ </w:t>
-      </w:r>
-      <w:r>
-        <w:t xml:space="preserve">names; do not use “et al.”. Papers that have not been published, even if they have been submitted for publication, should be cited as “unpublished” [4]. Papers that have been accepted for publication should be cited as “in press” [5]. Capitalize only </w:t>
-      </w:r>
-      <w:r>
-        <w:t>the first word in a paper title, except for proper nouns and element symbols.</w:t>
-      </w:r>
-    </w:p>
-    <w:p>
-      <w:pPr>
-        <w:pStyle w:val="a3"/>
-      </w:pPr>
-      <w:r>
-        <w:t xml:space="preserve">For </w:t>
-      </w:r>
-      <w:r>
-        <w:t>papers</w:t>
-      </w:r>
-      <w:r>
-        <w:t xml:space="preserve"> published in translation journals, please give the English citation first, followed by the original foreign-language citation [6].</w:t>
+        <w:t>The template will number citations consecutively within brackets [1]. The sentence punctuation follows the bracket [2]. Refer simply to the reference number, as in [3]—do not use “</w:t>
       </w:r>
     </w:p>
     <w:p/>
@@ -1812,95 +2318,12 @@
       </w:r>
     </w:p>
     <w:p>
-      <w:r>
-        <w:rPr>
-          <w:noProof/>
-        </w:rPr>
-        <w:drawing>
-          <wp:anchor distT="0" distB="0" distL="114300" distR="114300" simplePos="0" relativeHeight="251657728" behindDoc="1" locked="0" layoutInCell="1" allowOverlap="1" wp14:anchorId="0FD9E18C" wp14:editId="34AE772D">
-            <wp:simplePos x="0" y="0"/>
-            <wp:positionH relativeFrom="margin">
-              <wp:align>left</wp:align>
-            </wp:positionH>
-            <wp:positionV relativeFrom="paragraph">
-              <wp:posOffset>251460</wp:posOffset>
-            </wp:positionV>
-            <wp:extent cx="3200400" cy="1143000"/>
-            <wp:effectExtent l="10795" t="5080" r="8255" b="13970"/>
-            <wp:wrapTight wrapText="bothSides">
-              <wp:wrapPolygon edited="0">
-                <wp:start x="-64" y="0"/>
-                <wp:lineTo x="-64" y="21600"/>
-                <wp:lineTo x="21664" y="21600"/>
-                <wp:lineTo x="21664" y="0"/>
-                <wp:lineTo x="-64" y="0"/>
-              </wp:wrapPolygon>
-            </wp:wrapTight>
-            <wp:docPr id="1" name="Text Box 8"/>
-            <wp:cNvGraphicFramePr>
-              <a:graphicFrameLocks xmlns:a="http://purl.oclc.org/ooxml/drawingml/main"/>
-            </wp:cNvGraphicFramePr>
-            <a:graphic xmlns:a="http://purl.oclc.org/ooxml/drawingml/main">
-              <a:graphicData uri="http://schemas.microsoft.com/office/word/2010/wordprocessingShape">
-                <wp:wsp>
-                  <wp:cNvSpPr txBox="1">
-                    <a:spLocks noChangeArrowheads="1"/>
-                  </wp:cNvSpPr>
-                  <wp:spPr bwMode="auto">
-                    <a:xfrm>
-                      <a:off x="0" y="0"/>
-                      <a:ext cx="3200400" cy="1143000"/>
-                    </a:xfrm>
-                    <a:prstGeom prst="rect">
-                      <a:avLst/>
-                    </a:prstGeom>
-                    <a:solidFill>
-                      <a:srgbClr val="FFFFFF"/>
-                    </a:solidFill>
-                    <a:ln w="9525">
-                      <a:solidFill>
-                        <a:srgbClr val="000000"/>
-                      </a:solidFill>
-                      <a:miter lim="800%"/>
-                      <a:headEnd/>
-                      <a:tailEnd/>
-                    </a:ln>
-                  </wp:spPr>
-                  <wp:txbx>
-                    <wne:txbxContent>
-                      <w:p>
-                        <w:pPr>
-                          <w:pStyle w:val="a3"/>
-                        </w:pPr>
-                        <w:r>
-                          <w:t>We suggest that you use a text box to insert a graphic (which is ideally a 300 dpi TIFF or EPS file, with all fonts embedded) because, in an MSW document, this method is somewhat more stable than directly inserting a picture.</w:t>
-                        </w:r>
-                      </w:p>
-                      <w:p>
-                        <w:pPr>
-                          <w:pStyle w:val="a3"/>
-                        </w:pPr>
-                        <w:r>
-                          <w:t>To have non-visible rules on your frame, use the MSWord “Format” pull-down menu, select Text Box &gt; Colors and Lines to choose No Fill and No Line.</w:t>
-                        </w:r>
-                      </w:p>
-                    </wne:txbxContent>
-                  </wp:txbx>
-                  <wp:bodyPr rot="0" vert="horz" wrap="square" lIns="91440" tIns="45720" rIns="91440" bIns="45720" anchor="t" anchorCtr="0" upright="1">
-                    <a:noAutofit/>
-                  </wp:bodyPr>
-                </wp:wsp>
-              </a:graphicData>
-            </a:graphic>
-            <wp14:sizeRelH relativeFrom="page">
-              <wp14:pctWidth>0%</wp14:pctWidth>
-            </wp14:sizeRelH>
-            <wp14:sizeRelV relativeFrom="page">
-              <wp14:pctHeight>0%</wp14:pctHeight>
-            </wp14:sizeRelV>
-          </wp:anchor>
-        </w:drawing>
-      </w:r>
+      <w:pPr>
+        <w:rPr>
+          <w:rFonts w:hint="eastAsia"/>
+          <w:lang w:eastAsia="zh-CN"/>
+        </w:rPr>
+      </w:pPr>
     </w:p>
     <w:sectPr>
       <w:type w:val="continuous"/>
@@ -2294,6 +2717,155 @@
     </w:lvl>
   </w:abstractNum>
   <w:abstractNum w:abstractNumId="11" w15:restartNumberingAfterBreak="0">
+    <w:nsid w:val="07EA52F8"/>
+    <w:multiLevelType w:val="multilevel"/>
+    <w:tmpl w:val="9C62CE48"/>
+    <w:lvl w:ilvl="0">
+      <w:start w:val="1"/>
+      <w:numFmt w:val="bullet"/>
+      <w:lvlText w:val=""/>
+      <w:lvlJc w:val="start"/>
+      <w:pPr>
+        <w:tabs>
+          <w:tab w:val="num" w:pos="36pt"/>
+        </w:tabs>
+        <w:ind w:start="36pt" w:hanging="18pt"/>
+      </w:pPr>
+      <w:rPr>
+        <w:rFonts w:ascii="Symbol" w:hAnsi="Symbol" w:hint="default"/>
+        <w:sz w:val="20"/>
+      </w:rPr>
+    </w:lvl>
+    <w:lvl w:ilvl="1" w:tentative="1">
+      <w:start w:val="1"/>
+      <w:numFmt w:val="bullet"/>
+      <w:lvlText w:val="o"/>
+      <w:lvlJc w:val="start"/>
+      <w:pPr>
+        <w:tabs>
+          <w:tab w:val="num" w:pos="72pt"/>
+        </w:tabs>
+        <w:ind w:start="72pt" w:hanging="18pt"/>
+      </w:pPr>
+      <w:rPr>
+        <w:rFonts w:ascii="Courier New" w:hAnsi="Courier New" w:hint="default"/>
+        <w:sz w:val="20"/>
+      </w:rPr>
+    </w:lvl>
+    <w:lvl w:ilvl="2" w:tentative="1">
+      <w:start w:val="1"/>
+      <w:numFmt w:val="bullet"/>
+      <w:lvlText w:val=""/>
+      <w:lvlJc w:val="start"/>
+      <w:pPr>
+        <w:tabs>
+          <w:tab w:val="num" w:pos="108pt"/>
+        </w:tabs>
+        <w:ind w:start="108pt" w:hanging="18pt"/>
+      </w:pPr>
+      <w:rPr>
+        <w:rFonts w:ascii="Wingdings" w:hAnsi="Wingdings" w:hint="default"/>
+        <w:sz w:val="20"/>
+      </w:rPr>
+    </w:lvl>
+    <w:lvl w:ilvl="3" w:tentative="1">
+      <w:start w:val="1"/>
+      <w:numFmt w:val="bullet"/>
+      <w:lvlText w:val=""/>
+      <w:lvlJc w:val="start"/>
+      <w:pPr>
+        <w:tabs>
+          <w:tab w:val="num" w:pos="144pt"/>
+        </w:tabs>
+        <w:ind w:start="144pt" w:hanging="18pt"/>
+      </w:pPr>
+      <w:rPr>
+        <w:rFonts w:ascii="Wingdings" w:hAnsi="Wingdings" w:hint="default"/>
+        <w:sz w:val="20"/>
+      </w:rPr>
+    </w:lvl>
+    <w:lvl w:ilvl="4" w:tentative="1">
+      <w:start w:val="1"/>
+      <w:numFmt w:val="bullet"/>
+      <w:lvlText w:val=""/>
+      <w:lvlJc w:val="start"/>
+      <w:pPr>
+        <w:tabs>
+          <w:tab w:val="num" w:pos="180pt"/>
+        </w:tabs>
+        <w:ind w:start="180pt" w:hanging="18pt"/>
+      </w:pPr>
+      <w:rPr>
+        <w:rFonts w:ascii="Wingdings" w:hAnsi="Wingdings" w:hint="default"/>
+        <w:sz w:val="20"/>
+      </w:rPr>
+    </w:lvl>
+    <w:lvl w:ilvl="5" w:tentative="1">
+      <w:start w:val="1"/>
+      <w:numFmt w:val="bullet"/>
+      <w:lvlText w:val=""/>
+      <w:lvlJc w:val="start"/>
+      <w:pPr>
+        <w:tabs>
+          <w:tab w:val="num" w:pos="216pt"/>
+        </w:tabs>
+        <w:ind w:start="216pt" w:hanging="18pt"/>
+      </w:pPr>
+      <w:rPr>
+        <w:rFonts w:ascii="Wingdings" w:hAnsi="Wingdings" w:hint="default"/>
+        <w:sz w:val="20"/>
+      </w:rPr>
+    </w:lvl>
+    <w:lvl w:ilvl="6" w:tentative="1">
+      <w:start w:val="1"/>
+      <w:numFmt w:val="bullet"/>
+      <w:lvlText w:val=""/>
+      <w:lvlJc w:val="start"/>
+      <w:pPr>
+        <w:tabs>
+          <w:tab w:val="num" w:pos="252pt"/>
+        </w:tabs>
+        <w:ind w:start="252pt" w:hanging="18pt"/>
+      </w:pPr>
+      <w:rPr>
+        <w:rFonts w:ascii="Wingdings" w:hAnsi="Wingdings" w:hint="default"/>
+        <w:sz w:val="20"/>
+      </w:rPr>
+    </w:lvl>
+    <w:lvl w:ilvl="7" w:tentative="1">
+      <w:start w:val="1"/>
+      <w:numFmt w:val="bullet"/>
+      <w:lvlText w:val=""/>
+      <w:lvlJc w:val="start"/>
+      <w:pPr>
+        <w:tabs>
+          <w:tab w:val="num" w:pos="288pt"/>
+        </w:tabs>
+        <w:ind w:start="288pt" w:hanging="18pt"/>
+      </w:pPr>
+      <w:rPr>
+        <w:rFonts w:ascii="Wingdings" w:hAnsi="Wingdings" w:hint="default"/>
+        <w:sz w:val="20"/>
+      </w:rPr>
+    </w:lvl>
+    <w:lvl w:ilvl="8" w:tentative="1">
+      <w:start w:val="1"/>
+      <w:numFmt w:val="bullet"/>
+      <w:lvlText w:val=""/>
+      <w:lvlJc w:val="start"/>
+      <w:pPr>
+        <w:tabs>
+          <w:tab w:val="num" w:pos="324pt"/>
+        </w:tabs>
+        <w:ind w:start="324pt" w:hanging="18pt"/>
+      </w:pPr>
+      <w:rPr>
+        <w:rFonts w:ascii="Wingdings" w:hAnsi="Wingdings" w:hint="default"/>
+        <w:sz w:val="20"/>
+      </w:rPr>
+    </w:lvl>
+  </w:abstractNum>
+  <w:abstractNum w:abstractNumId="12" w15:restartNumberingAfterBreak="0">
     <w:nsid w:val="1E177E97"/>
     <w:multiLevelType w:val="hybridMultilevel"/>
     <w:tmpl w:val="A6463BCE"/>
@@ -2379,7 +2951,7 @@
       </w:pPr>
     </w:lvl>
   </w:abstractNum>
-  <w:abstractNum w:abstractNumId="12" w15:restartNumberingAfterBreak="0">
+  <w:abstractNum w:abstractNumId="13" w15:restartNumberingAfterBreak="0">
     <w:nsid w:val="20AF0333"/>
     <w:multiLevelType w:val="hybridMultilevel"/>
     <w:tmpl w:val="CB0E7F4E"/>
@@ -2521,7 +3093,156 @@
       </w:rPr>
     </w:lvl>
   </w:abstractNum>
-  <w:abstractNum w:abstractNumId="13" w15:restartNumberingAfterBreak="0">
+  <w:abstractNum w:abstractNumId="14" w15:restartNumberingAfterBreak="0">
+    <w:nsid w:val="22721D50"/>
+    <w:multiLevelType w:val="multilevel"/>
+    <w:tmpl w:val="861662A4"/>
+    <w:lvl w:ilvl="0">
+      <w:start w:val="1"/>
+      <w:numFmt w:val="bullet"/>
+      <w:lvlText w:val=""/>
+      <w:lvlJc w:val="start"/>
+      <w:pPr>
+        <w:tabs>
+          <w:tab w:val="num" w:pos="36pt"/>
+        </w:tabs>
+        <w:ind w:start="36pt" w:hanging="18pt"/>
+      </w:pPr>
+      <w:rPr>
+        <w:rFonts w:ascii="Symbol" w:hAnsi="Symbol" w:hint="default"/>
+        <w:sz w:val="20"/>
+      </w:rPr>
+    </w:lvl>
+    <w:lvl w:ilvl="1" w:tentative="1">
+      <w:start w:val="1"/>
+      <w:numFmt w:val="bullet"/>
+      <w:lvlText w:val="o"/>
+      <w:lvlJc w:val="start"/>
+      <w:pPr>
+        <w:tabs>
+          <w:tab w:val="num" w:pos="72pt"/>
+        </w:tabs>
+        <w:ind w:start="72pt" w:hanging="18pt"/>
+      </w:pPr>
+      <w:rPr>
+        <w:rFonts w:ascii="Courier New" w:hAnsi="Courier New" w:hint="default"/>
+        <w:sz w:val="20"/>
+      </w:rPr>
+    </w:lvl>
+    <w:lvl w:ilvl="2" w:tentative="1">
+      <w:start w:val="1"/>
+      <w:numFmt w:val="bullet"/>
+      <w:lvlText w:val=""/>
+      <w:lvlJc w:val="start"/>
+      <w:pPr>
+        <w:tabs>
+          <w:tab w:val="num" w:pos="108pt"/>
+        </w:tabs>
+        <w:ind w:start="108pt" w:hanging="18pt"/>
+      </w:pPr>
+      <w:rPr>
+        <w:rFonts w:ascii="Wingdings" w:hAnsi="Wingdings" w:hint="default"/>
+        <w:sz w:val="20"/>
+      </w:rPr>
+    </w:lvl>
+    <w:lvl w:ilvl="3" w:tentative="1">
+      <w:start w:val="1"/>
+      <w:numFmt w:val="bullet"/>
+      <w:lvlText w:val=""/>
+      <w:lvlJc w:val="start"/>
+      <w:pPr>
+        <w:tabs>
+          <w:tab w:val="num" w:pos="144pt"/>
+        </w:tabs>
+        <w:ind w:start="144pt" w:hanging="18pt"/>
+      </w:pPr>
+      <w:rPr>
+        <w:rFonts w:ascii="Wingdings" w:hAnsi="Wingdings" w:hint="default"/>
+        <w:sz w:val="20"/>
+      </w:rPr>
+    </w:lvl>
+    <w:lvl w:ilvl="4" w:tentative="1">
+      <w:start w:val="1"/>
+      <w:numFmt w:val="bullet"/>
+      <w:lvlText w:val=""/>
+      <w:lvlJc w:val="start"/>
+      <w:pPr>
+        <w:tabs>
+          <w:tab w:val="num" w:pos="180pt"/>
+        </w:tabs>
+        <w:ind w:start="180pt" w:hanging="18pt"/>
+      </w:pPr>
+      <w:rPr>
+        <w:rFonts w:ascii="Wingdings" w:hAnsi="Wingdings" w:hint="default"/>
+        <w:sz w:val="20"/>
+      </w:rPr>
+    </w:lvl>
+    <w:lvl w:ilvl="5" w:tentative="1">
+      <w:start w:val="1"/>
+      <w:numFmt w:val="bullet"/>
+      <w:lvlText w:val=""/>
+      <w:lvlJc w:val="start"/>
+      <w:pPr>
+        <w:tabs>
+          <w:tab w:val="num" w:pos="216pt"/>
+        </w:tabs>
+        <w:ind w:start="216pt" w:hanging="18pt"/>
+      </w:pPr>
+      <w:rPr>
+        <w:rFonts w:ascii="Wingdings" w:hAnsi="Wingdings" w:hint="default"/>
+        <w:sz w:val="20"/>
+      </w:rPr>
+    </w:lvl>
+    <w:lvl w:ilvl="6" w:tentative="1">
+      <w:start w:val="1"/>
+      <w:numFmt w:val="bullet"/>
+      <w:lvlText w:val=""/>
+      <w:lvlJc w:val="start"/>
+      <w:pPr>
+        <w:tabs>
+          <w:tab w:val="num" w:pos="252pt"/>
+        </w:tabs>
+        <w:ind w:start="252pt" w:hanging="18pt"/>
+      </w:pPr>
+      <w:rPr>
+        <w:rFonts w:ascii="Wingdings" w:hAnsi="Wingdings" w:hint="default"/>
+        <w:sz w:val="20"/>
+      </w:rPr>
+    </w:lvl>
+    <w:lvl w:ilvl="7" w:tentative="1">
+      <w:start w:val="1"/>
+      <w:numFmt w:val="bullet"/>
+      <w:lvlText w:val=""/>
+      <w:lvlJc w:val="start"/>
+      <w:pPr>
+        <w:tabs>
+          <w:tab w:val="num" w:pos="288pt"/>
+        </w:tabs>
+        <w:ind w:start="288pt" w:hanging="18pt"/>
+      </w:pPr>
+      <w:rPr>
+        <w:rFonts w:ascii="Wingdings" w:hAnsi="Wingdings" w:hint="default"/>
+        <w:sz w:val="20"/>
+      </w:rPr>
+    </w:lvl>
+    <w:lvl w:ilvl="8" w:tentative="1">
+      <w:start w:val="1"/>
+      <w:numFmt w:val="bullet"/>
+      <w:lvlText w:val=""/>
+      <w:lvlJc w:val="start"/>
+      <w:pPr>
+        <w:tabs>
+          <w:tab w:val="num" w:pos="324pt"/>
+        </w:tabs>
+        <w:ind w:start="324pt" w:hanging="18pt"/>
+      </w:pPr>
+      <w:rPr>
+        <w:rFonts w:ascii="Wingdings" w:hAnsi="Wingdings" w:hint="default"/>
+        <w:sz w:val="20"/>
+      </w:rPr>
+    </w:lvl>
+  </w:abstractNum>
+  <w:abstractNum w:abstractNumId="15" w15:restartNumberingAfterBreak="0">
     <w:nsid w:val="26FE1FCF"/>
     <w:multiLevelType w:val="hybridMultilevel"/>
     <w:tmpl w:val="33826962"/>
@@ -2682,7 +3403,7 @@
       </w:rPr>
     </w:lvl>
   </w:abstractNum>
-  <w:abstractNum w:abstractNumId="14" w15:restartNumberingAfterBreak="0">
+  <w:abstractNum w:abstractNumId="16" w15:restartNumberingAfterBreak="0">
     <w:nsid w:val="37660336"/>
     <w:multiLevelType w:val="hybridMultilevel"/>
     <w:tmpl w:val="754EAC84"/>
@@ -2823,7 +3544,7 @@
       </w:rPr>
     </w:lvl>
   </w:abstractNum>
-  <w:abstractNum w:abstractNumId="15" w15:restartNumberingAfterBreak="0">
+  <w:abstractNum w:abstractNumId="17" w15:restartNumberingAfterBreak="0">
     <w:nsid w:val="39E54FC6"/>
     <w:multiLevelType w:val="singleLevel"/>
     <w:tmpl w:val="5B7288D4"/>
@@ -2843,7 +3564,7 @@
       </w:rPr>
     </w:lvl>
   </w:abstractNum>
-  <w:abstractNum w:abstractNumId="16" w15:restartNumberingAfterBreak="0">
+  <w:abstractNum w:abstractNumId="18" w15:restartNumberingAfterBreak="0">
     <w:nsid w:val="4189603E"/>
     <w:multiLevelType w:val="multilevel"/>
     <w:tmpl w:val="0AB06E12"/>
@@ -3050,7 +3771,7 @@
       </w:rPr>
     </w:lvl>
   </w:abstractNum>
-  <w:abstractNum w:abstractNumId="17" w15:restartNumberingAfterBreak="0">
+  <w:abstractNum w:abstractNumId="19" w15:restartNumberingAfterBreak="0">
     <w:nsid w:val="493C3F76"/>
     <w:multiLevelType w:val="hybridMultilevel"/>
     <w:tmpl w:val="9A9E418C"/>
@@ -3161,7 +3882,7 @@
       </w:pPr>
     </w:lvl>
   </w:abstractNum>
-  <w:abstractNum w:abstractNumId="18" w15:restartNumberingAfterBreak="0">
+  <w:abstractNum w:abstractNumId="20" w15:restartNumberingAfterBreak="0">
     <w:nsid w:val="52CA544A"/>
     <w:multiLevelType w:val="singleLevel"/>
     <w:tmpl w:val="AED6D67E"/>
@@ -3188,7 +3909,7 @@
       </w:rPr>
     </w:lvl>
   </w:abstractNum>
-  <w:abstractNum w:abstractNumId="19" w15:restartNumberingAfterBreak="0">
+  <w:abstractNum w:abstractNumId="21" w15:restartNumberingAfterBreak="0">
     <w:nsid w:val="6C402C58"/>
     <w:multiLevelType w:val="hybridMultilevel"/>
     <w:tmpl w:val="9A1CA078"/>
@@ -3333,7 +4054,7 @@
       </w:rPr>
     </w:lvl>
   </w:abstractNum>
-  <w:abstractNum w:abstractNumId="20" w15:restartNumberingAfterBreak="0">
+  <w:abstractNum w:abstractNumId="22" w15:restartNumberingAfterBreak="0">
     <w:nsid w:val="6CD32DA8"/>
     <w:multiLevelType w:val="singleLevel"/>
     <w:tmpl w:val="166470C2"/>
@@ -3360,40 +4081,40 @@
     </w:lvl>
   </w:abstractNum>
   <w:num w:numId="1" w16cid:durableId="145820776">
-    <w:abstractNumId w:val="14"/>
+    <w:abstractNumId w:val="16"/>
   </w:num>
   <w:num w:numId="2" w16cid:durableId="49572071">
-    <w:abstractNumId w:val="19"/>
+    <w:abstractNumId w:val="21"/>
   </w:num>
   <w:num w:numId="3" w16cid:durableId="1515224689">
+    <w:abstractNumId w:val="15"/>
+  </w:num>
+  <w:num w:numId="4" w16cid:durableId="1200628829">
+    <w:abstractNumId w:val="18"/>
+  </w:num>
+  <w:num w:numId="5" w16cid:durableId="798842025">
+    <w:abstractNumId w:val="18"/>
+  </w:num>
+  <w:num w:numId="6" w16cid:durableId="2016422118">
+    <w:abstractNumId w:val="18"/>
+  </w:num>
+  <w:num w:numId="7" w16cid:durableId="227956553">
+    <w:abstractNumId w:val="18"/>
+  </w:num>
+  <w:num w:numId="8" w16cid:durableId="164829061">
+    <w:abstractNumId w:val="20"/>
+  </w:num>
+  <w:num w:numId="9" w16cid:durableId="1860271627">
+    <w:abstractNumId w:val="22"/>
+  </w:num>
+  <w:num w:numId="10" w16cid:durableId="1688098601">
+    <w:abstractNumId w:val="17"/>
+  </w:num>
+  <w:num w:numId="11" w16cid:durableId="466628586">
     <w:abstractNumId w:val="13"/>
   </w:num>
-  <w:num w:numId="4" w16cid:durableId="1200628829">
-    <w:abstractNumId w:val="16"/>
-  </w:num>
-  <w:num w:numId="5" w16cid:durableId="798842025">
-    <w:abstractNumId w:val="16"/>
-  </w:num>
-  <w:num w:numId="6" w16cid:durableId="2016422118">
-    <w:abstractNumId w:val="16"/>
-  </w:num>
-  <w:num w:numId="7" w16cid:durableId="227956553">
-    <w:abstractNumId w:val="16"/>
-  </w:num>
-  <w:num w:numId="8" w16cid:durableId="164829061">
-    <w:abstractNumId w:val="18"/>
-  </w:num>
-  <w:num w:numId="9" w16cid:durableId="1860271627">
-    <w:abstractNumId w:val="20"/>
-  </w:num>
-  <w:num w:numId="10" w16cid:durableId="1688098601">
-    <w:abstractNumId w:val="15"/>
-  </w:num>
-  <w:num w:numId="11" w16cid:durableId="466628586">
+  <w:num w:numId="12" w16cid:durableId="1077750273">
     <w:abstractNumId w:val="12"/>
-  </w:num>
-  <w:num w:numId="12" w16cid:durableId="1077750273">
-    <w:abstractNumId w:val="11"/>
   </w:num>
   <w:num w:numId="13" w16cid:durableId="1040400736">
     <w:abstractNumId w:val="0"/>
@@ -3429,7 +4150,13 @@
     <w:abstractNumId w:val="1"/>
   </w:num>
   <w:num w:numId="24" w16cid:durableId="658459657">
-    <w:abstractNumId w:val="17"/>
+    <w:abstractNumId w:val="19"/>
+  </w:num>
+  <w:num w:numId="25" w16cid:durableId="654184062">
+    <w:abstractNumId w:val="11"/>
+  </w:num>
+  <w:num w:numId="26" w16cid:durableId="1225793015">
+    <w:abstractNumId w:val="14"/>
   </w:num>
 </w:numbering>
 </file>
@@ -4180,6 +4907,16 @@
       <w:szCs w:val="24"/>
     </w:rPr>
   </w:style>
+  <w:style w:type="character" w:styleId="aa">
+    <w:name w:val="Placeholder Text"/>
+    <w:basedOn w:val="a0"/>
+    <w:uiPriority w:val="99"/>
+    <w:semiHidden/>
+    <w:rsid w:val="007B6269"/>
+    <w:rPr>
+      <w:color w:val="666666"/>
+    </w:rPr>
+  </w:style>
 </w:styles>
 </file>
 

</xml_diff>

<commit_message>
Update CHAMP manuscript and challenge solution figure
</commit_message>
<xml_diff>
--- a/DAC/paper/CHAMP_v1.docx
+++ b/DAC/paper/CHAMP_v1.docx
@@ -123,7 +123,21 @@
           <w:rFonts w:hint="eastAsia"/>
           <w:lang w:val="en-US" w:eastAsia="zh-CN"/>
         </w:rPr>
+        <w:t>(</w:t>
+      </w:r>
+      <w:r>
+        <w:rPr>
+          <w:rFonts w:hint="eastAsia"/>
+          <w:lang w:val="en-US" w:eastAsia="zh-CN"/>
+        </w:rPr>
         <w:t>a</w:t>
+      </w:r>
+      <w:r>
+        <w:rPr>
+          <w:rFonts w:hint="eastAsia"/>
+          <w:lang w:val="en-US" w:eastAsia="zh-CN"/>
+        </w:rPr>
+        <w:t>)</w:t>
       </w:r>
       <w:r>
         <w:rPr>
@@ -150,127 +164,187 @@
       <w:pPr>
         <w:pStyle w:val="a3"/>
         <w:rPr>
+          <w:lang w:eastAsia="zh-CN"/>
+        </w:rPr>
+      </w:pPr>
+      <w:r>
+        <w:rPr>
+          <w:lang w:val="en-US" w:eastAsia="zh-CN"/>
+        </w:rPr>
+        <w:t>To identify the fundamental bottlenecks of scalable on-chip communication, packet latency can be conceptually decomposed as</w:t>
+      </w:r>
+    </w:p>
+    <w:p>
+      <w:pPr>
+        <w:pStyle w:val="a3"/>
+        <w:ind w:firstLineChars="950" w:firstLine="95pt"/>
+        <w:rPr>
+          <w:lang w:eastAsia="zh-CN"/>
+        </w:rPr>
+      </w:pPr>
+      <m:oMath>
+        <m:sSub>
+          <m:sSubPr>
+            <m:ctrlPr>
+              <w:rPr>
+                <w:rFonts w:ascii="Cambria Math" w:hAnsi="Cambria Math"/>
+              </w:rPr>
+            </m:ctrlPr>
+          </m:sSubPr>
+          <m:e>
+            <m:r>
+              <w:rPr>
+                <w:rFonts w:ascii="Cambria Math" w:hAnsi="Cambria Math"/>
+              </w:rPr>
+              <m:t>T</m:t>
+            </m:r>
+          </m:e>
+          <m:sub>
+            <m:r>
+              <m:rPr>
+                <m:sty m:val="p"/>
+              </m:rPr>
+              <w:rPr>
+                <w:rFonts w:ascii="Cambria Math" w:hAnsi="Cambria Math"/>
+              </w:rPr>
+              <m:t>comm</m:t>
+            </m:r>
+          </m:sub>
+        </m:sSub>
+        <m:r>
+          <w:rPr>
+            <w:rFonts w:ascii="Cambria Math" w:hAnsi="Cambria Math"/>
+          </w:rPr>
+          <m:t>≈H</m:t>
+        </m:r>
+        <m:sSub>
+          <m:sSubPr>
+            <m:ctrlPr>
+              <w:rPr>
+                <w:rFonts w:ascii="Cambria Math" w:hAnsi="Cambria Math"/>
+              </w:rPr>
+            </m:ctrlPr>
+          </m:sSubPr>
+          <m:e>
+            <m:r>
+              <w:rPr>
+                <w:rFonts w:ascii="Cambria Math" w:hAnsi="Cambria Math"/>
+              </w:rPr>
+              <m:t>T</m:t>
+            </m:r>
+          </m:e>
+          <m:sub>
+            <m:r>
+              <w:rPr>
+                <w:rFonts w:ascii="Cambria Math" w:hAnsi="Cambria Math"/>
+              </w:rPr>
+              <m:t>r</m:t>
+            </m:r>
+          </m:sub>
+        </m:sSub>
+        <m:r>
+          <w:rPr>
+            <w:rFonts w:ascii="Cambria Math" w:hAnsi="Cambria Math"/>
+          </w:rPr>
+          <m:t>+</m:t>
+        </m:r>
+        <m:sSub>
+          <m:sSubPr>
+            <m:ctrlPr>
+              <w:rPr>
+                <w:rFonts w:ascii="Cambria Math" w:hAnsi="Cambria Math"/>
+              </w:rPr>
+            </m:ctrlPr>
+          </m:sSubPr>
+          <m:e>
+            <m:r>
+              <w:rPr>
+                <w:rFonts w:ascii="Cambria Math" w:hAnsi="Cambria Math"/>
+              </w:rPr>
+              <m:t>T</m:t>
+            </m:r>
+          </m:e>
+          <m:sub>
+            <m:r>
+              <w:rPr>
+                <w:rFonts w:ascii="Cambria Math" w:hAnsi="Cambria Math"/>
+              </w:rPr>
+              <m:t>c</m:t>
+            </m:r>
+          </m:sub>
+        </m:sSub>
+      </m:oMath>
+      <w:r>
+        <w:rPr>
           <w:rFonts w:hint="eastAsia"/>
           <w:lang w:eastAsia="zh-CN"/>
         </w:rPr>
-      </w:pPr>
-      <w:r>
-        <w:rPr>
-          <w:lang w:val="en-US" w:eastAsia="zh-CN"/>
-        </w:rPr>
-        <w:t>To identify the fundamental bottlenecks of scalable on-chip communication, packet latency can be conceptually decomposed as</w:t>
+        <w:t xml:space="preserve">                                (1)</w:t>
       </w:r>
     </w:p>
     <w:p>
       <w:pPr>
         <w:pStyle w:val="a3"/>
-        <w:rPr>
-          <w:lang w:eastAsia="zh-CN"/>
-        </w:rPr>
-      </w:pPr>
-      <m:oMathPara>
-        <m:oMath>
-          <m:sSub>
-            <m:sSubPr>
-              <m:ctrlPr>
-                <w:rPr>
-                  <w:rFonts w:ascii="Cambria Math" w:hAnsi="Cambria Math"/>
-                </w:rPr>
-              </m:ctrlPr>
-            </m:sSubPr>
-            <m:e>
-              <m:r>
-                <w:rPr>
-                  <w:rFonts w:ascii="Cambria Math" w:hAnsi="Cambria Math"/>
-                </w:rPr>
-                <m:t>T</m:t>
-              </m:r>
-            </m:e>
-            <m:sub>
-              <m:r>
-                <m:rPr>
-                  <m:sty m:val="p"/>
-                </m:rPr>
-                <w:rPr>
-                  <w:rFonts w:ascii="Cambria Math" w:hAnsi="Cambria Math"/>
-                </w:rPr>
-                <m:t>comm</m:t>
-              </m:r>
-            </m:sub>
-          </m:sSub>
-          <m:r>
-            <w:rPr>
-              <w:rFonts w:ascii="Cambria Math" w:hAnsi="Cambria Math"/>
-            </w:rPr>
-            <m:t>≈H</m:t>
-          </m:r>
-          <m:sSub>
-            <m:sSubPr>
-              <m:ctrlPr>
-                <w:rPr>
-                  <w:rFonts w:ascii="Cambria Math" w:hAnsi="Cambria Math"/>
-                </w:rPr>
-              </m:ctrlPr>
-            </m:sSubPr>
-            <m:e>
-              <m:r>
-                <w:rPr>
-                  <w:rFonts w:ascii="Cambria Math" w:hAnsi="Cambria Math"/>
-                </w:rPr>
-                <m:t>T</m:t>
-              </m:r>
-            </m:e>
-            <m:sub>
-              <m:r>
-                <w:rPr>
-                  <w:rFonts w:ascii="Cambria Math" w:hAnsi="Cambria Math"/>
-                </w:rPr>
-                <m:t>r</m:t>
-              </m:r>
-            </m:sub>
-          </m:sSub>
-          <m:r>
-            <w:rPr>
-              <w:rFonts w:ascii="Cambria Math" w:hAnsi="Cambria Math"/>
-            </w:rPr>
-            <m:t>+</m:t>
-          </m:r>
-          <m:sSub>
-            <m:sSubPr>
-              <m:ctrlPr>
-                <w:rPr>
-                  <w:rFonts w:ascii="Cambria Math" w:hAnsi="Cambria Math"/>
-                </w:rPr>
-              </m:ctrlPr>
-            </m:sSubPr>
-            <m:e>
-              <m:r>
-                <w:rPr>
-                  <w:rFonts w:ascii="Cambria Math" w:hAnsi="Cambria Math"/>
-                </w:rPr>
-                <m:t>T</m:t>
-              </m:r>
-            </m:e>
-            <m:sub>
-              <m:r>
-                <w:rPr>
-                  <w:rFonts w:ascii="Cambria Math" w:hAnsi="Cambria Math"/>
-                </w:rPr>
-                <m:t>c</m:t>
-              </m:r>
-            </m:sub>
-          </m:sSub>
-        </m:oMath>
-      </m:oMathPara>
-    </w:p>
-    <w:p>
-      <w:pPr>
-        <w:pStyle w:val="a3"/>
         <w:ind w:firstLine="0pt"/>
         <w:rPr>
           <w:lang w:val="en-US" w:eastAsia="zh-CN"/>
         </w:rPr>
       </w:pPr>
+      <w:r>
+        <w:rPr>
+          <w:noProof/>
+          <w:lang w:val="en-US" w:eastAsia="zh-CN"/>
+        </w:rPr>
+        <w:drawing>
+          <wp:anchor distT="0" distB="0" distL="114300" distR="114300" simplePos="0" relativeHeight="251658240" behindDoc="0" locked="0" layoutInCell="1" allowOverlap="1" wp14:anchorId="06DEE1B7" wp14:editId="10D2292B">
+            <wp:simplePos x="0" y="0"/>
+            <wp:positionH relativeFrom="column">
+              <wp:posOffset>-21428</wp:posOffset>
+            </wp:positionH>
+            <wp:positionV relativeFrom="page">
+              <wp:posOffset>5723092</wp:posOffset>
+            </wp:positionV>
+            <wp:extent cx="6426200" cy="4024630"/>
+            <wp:effectExtent l="0" t="0" r="0" b="0"/>
+            <wp:wrapSquare wrapText="bothSides"/>
+            <wp:docPr id="2094450892" name="图形 2"/>
+            <wp:cNvGraphicFramePr>
+              <a:graphicFrameLocks xmlns:a="http://purl.oclc.org/ooxml/drawingml/main" noChangeAspect="1"/>
+            </wp:cNvGraphicFramePr>
+            <a:graphic xmlns:a="http://purl.oclc.org/ooxml/drawingml/main">
+              <a:graphicData uri="http://purl.oclc.org/ooxml/drawingml/picture">
+                <pic:pic xmlns:pic="http://purl.oclc.org/ooxml/drawingml/picture">
+                  <pic:nvPicPr>
+                    <pic:cNvPr id="2094450892" name="图形 2094450892"/>
+                    <pic:cNvPicPr/>
+                  </pic:nvPicPr>
+                  <pic:blipFill>
+                    <a:blip r:embed="rId9">
+                      <a:extLst>
+                        <a:ext uri="{96DAC541-7B7A-43D3-8B79-37D633B846F1}">
+                          <asvg:svgBlip xmlns:asvg="http://schemas.microsoft.com/office/drawing/2016/SVG/main" r:embed="rId10"/>
+                        </a:ext>
+                      </a:extLst>
+                    </a:blip>
+                    <a:stretch>
+                      <a:fillRect/>
+                    </a:stretch>
+                  </pic:blipFill>
+                  <pic:spPr>
+                    <a:xfrm>
+                      <a:off x="0" y="0"/>
+                      <a:ext cx="6426200" cy="4024630"/>
+                    </a:xfrm>
+                    <a:prstGeom prst="rect">
+                      <a:avLst/>
+                    </a:prstGeom>
+                  </pic:spPr>
+                </pic:pic>
+              </a:graphicData>
+            </a:graphic>
+          </wp:anchor>
+        </w:drawing>
+      </w:r>
       <w:r>
         <w:rPr>
           <w:lang w:val="en-US" w:eastAsia="zh-CN"/>
@@ -383,7 +457,13 @@
         <w:rPr>
           <w:lang w:val="en-US" w:eastAsia="zh-CN"/>
         </w:rPr>
-        <w:t>the delay caused by contention and queuing. This simplified model treats packet serialization as a common offset under a fixed packet and channel configuration. It highlights three coupled design factors: network topology determines routing paths and resource distribution; router microarchitecture affects both per-hop delay and contention through arbitration, buffering, and parallel transmission capacity; and traffic patterns further influence resource utilization and queuing. Therefore, optimizing these factors jointly is essential for scalable, low-latency communication.</w:t>
+        <w:t xml:space="preserve">the delay caused by contention and queuing. This simplified model treats packet serialization as a common offset under a fixed packet and channel configuration. It highlights three coupled design factors: network topology determines routing paths and resource distribution; router microarchitecture affects both per-hop delay and </w:t>
+      </w:r>
+      <w:r>
+        <w:rPr>
+          <w:lang w:val="en-US" w:eastAsia="zh-CN"/>
+        </w:rPr>
+        <w:t>contention through arbitration, buffering, and parallel transmission capacity; and traffic patterns further influence resource utilization and queuing. Therefore, optimizing these factors jointly is essential for scalable, low-latency communication.</w:t>
       </w:r>
     </w:p>
     <w:p>
@@ -397,13 +477,14 @@
         <w:rPr>
           <w:lang w:eastAsia="zh-CN"/>
         </w:rPr>
-        <w:t xml:space="preserve">Prior NoC studies have pursued scalability through network topology, router microarchitecture, and multicast routing. Regular meshes provide simple connectivity but incur increasing hop counts at scale, motivating hierarchical and link-augmented topologies [5], [20]–[23]. These approaches involve distinct tradeoffs: long-range links consume additional wiring resources, while conventional fat-tree scaling increases upper-level router width and arbitration complexity [1], [31]. The resulting per-hop delay can erode the latency savings of reduced hop counts, while increased link capacity does not necessarily translate into higher delivered throughput. At the microarchitectural level, two-phase bundled-data switches, replicated-switch designs, Click-based controllers, and continuous-time replication have improved asynchronous forwarding and multicast buffering [3], [24]–[26]. However, distributing bandwidth across dynamically selected physical lanes requires careful coordination of packet-level arbitration and two-phase handshake states. Meanwhile, existing multicast schemes, including destination bitmaps, subtree broadcasting, and hybrid path/tree routing, enable in-network replication [27]–[30], [34]. These approaches exhibit different tradeoffs among destination-encoding overhead, replication selectivity, and </w:t>
+        <w:t xml:space="preserve">Prior NoC studies have pursued scalability through network topology, router microarchitecture, and multicast routing. Regular meshes provide simple connectivity but incur increasing hop counts at scale, motivating hierarchical and link-augmented topologies [5], [20]–[23]. These approaches involve distinct tradeoffs: long-range links consume additional wiring resources, while conventional fat-tree scaling increases upper-level router width and arbitration complexity [1], [31]. The resulting per-hop delay can erode the latency savings of reduced hop counts, while increased link capacity does not necessarily translate into higher delivered throughput. At the microarchitectural level, two-phase bundled-data switches, replicated-switch designs, Click-based controllers, and continuous-time replication have improved asynchronous forwarding and multicast buffering [3], [24]–[26]. However, distributing bandwidth across dynamically selected physical lanes requires careful coordination of packet-level arbitration and two-phase handshake states. Meanwhile, existing multicast schemes, including destination bitmaps, subtree broadcasting, and hybrid path/tree routing, enable in-network replication [27]–[30], [34]. These approaches exhibit different tradeoffs among destination-encoding overhead, replication selectivity, and network traffic [39]. In particular, efficient region-oriented multicast requires compact addressing and selective branching across network levels, while the absence </w:t>
       </w:r>
       <w:r>
         <w:rPr>
           <w:lang w:eastAsia="zh-CN"/>
         </w:rPr>
-        <w:t>network traffic [39]. In particular, efficient region-oriented multicast requires compact addressing and selective branching across network levels, while the absence of native replication can amplify traffic through repeated unicast. Together, these considerations motivate the co-design of hierarchical connectivity, parallel-router resources, and region-aware multicast routing.</w:t>
+        <w:lastRenderedPageBreak/>
+        <w:t>of native replication can amplify traffic through repeated unicast. Together, these considerations motivate the co-design of hierarchical connectivity, parallel-router resources, and region-aware multicast routing.</w:t>
       </w:r>
     </w:p>
     <w:p>
@@ -438,7 +519,56 @@
           <w:rFonts w:hint="eastAsia"/>
           <w:lang w:val="en-US" w:eastAsia="zh-CN"/>
         </w:rPr>
-        <w:t>1b-f</w:t>
+        <w:t>1</w:t>
+      </w:r>
+      <w:r>
+        <w:rPr>
+          <w:rFonts w:hint="eastAsia"/>
+          <w:lang w:val="en-US" w:eastAsia="zh-CN"/>
+        </w:rPr>
+        <w:t>(</w:t>
+      </w:r>
+      <w:r>
+        <w:rPr>
+          <w:rFonts w:hint="eastAsia"/>
+          <w:lang w:val="en-US" w:eastAsia="zh-CN"/>
+        </w:rPr>
+        <w:t>b</w:t>
+      </w:r>
+      <w:r>
+        <w:rPr>
+          <w:rFonts w:hint="eastAsia"/>
+          <w:lang w:val="en-US" w:eastAsia="zh-CN"/>
+        </w:rPr>
+        <w:t>)</w:t>
+      </w:r>
+      <w:r>
+        <w:rPr>
+          <w:rFonts w:hint="eastAsia"/>
+          <w:lang w:val="en-US" w:eastAsia="zh-CN"/>
+        </w:rPr>
+        <w:t>-</w:t>
+      </w:r>
+      <w:r>
+        <w:rPr>
+          <w:rFonts w:hint="eastAsia"/>
+          <w:lang w:val="en-US" w:eastAsia="zh-CN"/>
+        </w:rPr>
+        <w:t>(</w:t>
+      </w:r>
+      <w:r>
+        <w:rPr>
+          <w:rFonts w:hint="eastAsia"/>
+          <w:lang w:val="en-US" w:eastAsia="zh-CN"/>
+        </w:rPr>
+        <w:t>f</w:t>
+      </w:r>
+      <w:r>
+        <w:rPr>
+          <w:rFonts w:hint="eastAsia"/>
+          <w:lang w:val="en-US" w:eastAsia="zh-CN"/>
+        </w:rPr>
+        <w:t>)</w:t>
       </w:r>
       <w:r>
         <w:rPr>
@@ -451,330 +581,118 @@
       <w:pPr>
         <w:pStyle w:val="a3"/>
         <w:rPr>
-          <w:lang w:val="en-US" w:eastAsia="zh-CN"/>
-        </w:rPr>
-      </w:pPr>
+          <w:rFonts w:hint="eastAsia"/>
+          <w:lang w:val="en-US" w:eastAsia="zh-CN"/>
+        </w:rPr>
+      </w:pPr>
+      <w:r>
+        <w:rPr>
+          <w:lang w:val="en-US" w:eastAsia="zh-CN"/>
+        </w:rPr>
+        <w:t>Despite these advances, existing NoC architectures face three key challenges</w:t>
+      </w:r>
+      <w:r>
+        <w:rPr>
+          <w:rFonts w:hint="eastAsia"/>
+          <w:lang w:val="en-US" w:eastAsia="zh-CN"/>
+        </w:rPr>
+        <w:t>, as illustrated in Fig.1(b)-(f)</w:t>
+      </w:r>
+      <w:r>
+        <w:rPr>
+          <w:lang w:val="en-US" w:eastAsia="zh-CN"/>
+        </w:rPr>
+        <w:t xml:space="preserve">. First, flat 2-D meshes incur increasing communication distances as the network scales: the analytical average hop count grows from 5.3 at 64 nodes to 10.7 at 256 nodes. Second, fat-tree architectures widen upper-level routers to increase bisection bandwidth, but the resulting router complexity and arbitration overhead limit the benefits of link fattening. In the evaluated 64-node unicast benchmark, the fat-tree achieves a peak delivered-copy throughput of 145 </w:t>
+      </w:r>
+      <w:proofErr w:type="spellStart"/>
+      <w:r>
+        <w:rPr>
+          <w:lang w:val="en-US" w:eastAsia="zh-CN"/>
+        </w:rPr>
+        <w:t>Mflit</w:t>
+      </w:r>
+      <w:proofErr w:type="spellEnd"/>
+      <w:r>
+        <w:rPr>
+          <w:lang w:val="en-US" w:eastAsia="zh-CN"/>
+        </w:rPr>
+        <w:t xml:space="preserve">/s/port, 33% lower than the mesh's 215 </w:t>
+      </w:r>
+      <w:proofErr w:type="spellStart"/>
+      <w:r>
+        <w:rPr>
+          <w:lang w:val="en-US" w:eastAsia="zh-CN"/>
+        </w:rPr>
+        <w:t>Mflit</w:t>
+      </w:r>
+      <w:proofErr w:type="spellEnd"/>
+      <w:r>
+        <w:rPr>
+          <w:lang w:val="en-US" w:eastAsia="zh-CN"/>
+        </w:rPr>
+        <w:t xml:space="preserve">/s/port. Third, without native multicast support, repeated unicast generates separate packets for individual destinations, amplifying network traffic and contention. Under the evaluated All-Multicast workloads, </w:t>
+      </w:r>
+      <w:r>
+        <w:rPr>
+          <w:rFonts w:hint="eastAsia"/>
+          <w:lang w:val="en-US" w:eastAsia="zh-CN"/>
+        </w:rPr>
+        <w:t>average</w:t>
+      </w:r>
+      <w:r>
+        <w:rPr>
+          <w:lang w:val="en-US" w:eastAsia="zh-CN"/>
+        </w:rPr>
+        <w:t xml:space="preserve"> </w:t>
+      </w:r>
+      <w:r>
+        <w:rPr>
+          <w:rFonts w:hint="eastAsia"/>
+          <w:lang w:val="en-US" w:eastAsia="zh-CN"/>
+        </w:rPr>
+        <w:t>packet</w:t>
+      </w:r>
+      <w:r>
+        <w:rPr>
+          <w:lang w:val="en-US" w:eastAsia="zh-CN"/>
+        </w:rPr>
+        <w:t xml:space="preserve"> latency increases from 11.0 to 59.3 ns at 64 nodes and from 19.6 to 573.0 ns at 256 nodes when repeated unicast replaces native multicast. These challenges motivate an architecture that reduces communication distance, scales bandwidth without excessively widening routers, and supports efficient in-network multicast.</w:t>
+      </w:r>
+    </w:p>
+    <w:p>
+      <w:pPr>
+        <w:pStyle w:val="a3"/>
+        <w:rPr>
+          <w:lang w:val="en-US" w:eastAsia="zh-CN"/>
+        </w:rPr>
+      </w:pPr>
+      <w:r>
+        <w:rPr>
+          <w:lang w:val="en-US" w:eastAsia="zh-CN"/>
+        </w:rPr>
+        <w:t xml:space="preserve">To address these challenges, we propose </w:t>
+      </w:r>
       <w:r>
         <w:rPr>
           <w:b/>
           <w:bCs/>
           <w:lang w:val="en-US" w:eastAsia="zh-CN"/>
         </w:rPr>
-        <w:t>C1: Increasing traversal latency with network scale.</w:t>
-      </w:r>
-      <w:r>
-        <w:rPr>
-          <w:lang w:val="en-US" w:eastAsia="zh-CN"/>
-        </w:rPr>
-        <w:t xml:space="preserve"> In a regular 2-D mesh, the average hop count grows proportionally to the square root of the network size, following</w:t>
-      </w:r>
-      <w:r>
-        <w:rPr>
-          <w:rFonts w:hint="eastAsia"/>
-          <w:lang w:val="en-US" w:eastAsia="zh-CN"/>
-        </w:rPr>
-        <w:t xml:space="preserve"> </w:t>
-      </w:r>
-      <m:oMath>
-        <m:sSub>
-          <m:sSubPr>
-            <m:ctrlPr>
-              <w:rPr>
-                <w:rFonts w:ascii="Cambria Math" w:hAnsi="Cambria Math"/>
-              </w:rPr>
-            </m:ctrlPr>
-          </m:sSubPr>
-          <m:e>
-            <m:acc>
-              <m:accPr>
-                <m:chr m:val="̅"/>
-                <m:ctrlPr>
-                  <w:rPr>
-                    <w:rFonts w:ascii="Cambria Math" w:hAnsi="Cambria Math"/>
-                  </w:rPr>
-                </m:ctrlPr>
-              </m:accPr>
-              <m:e>
-                <m:r>
-                  <w:rPr>
-                    <w:rFonts w:ascii="Cambria Math" w:hAnsi="Cambria Math"/>
-                  </w:rPr>
-                  <m:t>H</m:t>
-                </m:r>
-              </m:e>
-            </m:acc>
-          </m:e>
-          <m:sub>
-            <m:r>
-              <m:rPr>
-                <m:sty m:val="p"/>
-              </m:rPr>
-              <w:rPr>
-                <w:rFonts w:ascii="Cambria Math" w:hAnsi="Cambria Math"/>
-              </w:rPr>
-              <m:t>Mesh</m:t>
-            </m:r>
-          </m:sub>
-        </m:sSub>
-        <m:d>
-          <m:dPr>
-            <m:ctrlPr>
-              <w:rPr>
-                <w:rFonts w:ascii="Cambria Math" w:hAnsi="Cambria Math"/>
-              </w:rPr>
-            </m:ctrlPr>
-          </m:dPr>
-          <m:e>
-            <m:r>
-              <w:rPr>
-                <w:rFonts w:ascii="Cambria Math" w:hAnsi="Cambria Math"/>
-              </w:rPr>
-              <m:t>N</m:t>
-            </m:r>
-          </m:e>
-        </m:d>
-        <m:r>
-          <w:rPr>
-            <w:rFonts w:ascii="Cambria Math" w:hAnsi="Cambria Math"/>
-          </w:rPr>
-          <m:t>=</m:t>
-        </m:r>
-        <m:f>
-          <m:fPr>
-            <m:ctrlPr>
-              <w:rPr>
-                <w:rFonts w:ascii="Cambria Math" w:hAnsi="Cambria Math"/>
-              </w:rPr>
-            </m:ctrlPr>
-          </m:fPr>
-          <m:num>
-            <m:r>
-              <w:rPr>
-                <w:rFonts w:ascii="Cambria Math" w:hAnsi="Cambria Math"/>
-              </w:rPr>
-              <m:t>2</m:t>
-            </m:r>
-          </m:num>
-          <m:den>
-            <m:r>
-              <w:rPr>
-                <w:rFonts w:ascii="Cambria Math" w:hAnsi="Cambria Math"/>
-              </w:rPr>
-              <m:t>3</m:t>
-            </m:r>
-          </m:den>
-        </m:f>
-        <m:rad>
-          <m:radPr>
-            <m:degHide m:val="1"/>
-            <m:ctrlPr>
-              <w:rPr>
-                <w:rFonts w:ascii="Cambria Math" w:hAnsi="Cambria Math"/>
-              </w:rPr>
-            </m:ctrlPr>
-          </m:radPr>
-          <m:deg/>
-          <m:e>
-            <m:r>
-              <w:rPr>
-                <w:rFonts w:ascii="Cambria Math" w:hAnsi="Cambria Math"/>
-              </w:rPr>
-              <m:t>N</m:t>
-            </m:r>
-          </m:e>
-        </m:rad>
-      </m:oMath>
-      <w:r>
-        <w:rPr>
-          <w:lang w:val="en-US" w:eastAsia="zh-CN"/>
-        </w:rPr>
-        <w:t xml:space="preserve">, where </w:t>
-      </w:r>
-      <m:oMath>
-        <m:r>
-          <w:rPr>
-            <w:rFonts w:ascii="Cambria Math" w:hAnsi="Cambria Math"/>
-          </w:rPr>
-          <m:t>N</m:t>
-        </m:r>
-      </m:oMath>
-      <w:r>
-        <w:rPr>
-          <w:lang w:val="en-US" w:eastAsia="zh-CN"/>
-        </w:rPr>
-        <w:t xml:space="preserve"> denotes the number of network nodes. This increasing path length contributes to higher communication latency, even with efficient individual routers.</w:t>
+        <w:t>CHAMP (Click-based Hierarchical Asynchronous Multicast with Parallel Routers)</w:t>
+      </w:r>
+      <w:r>
+        <w:rPr>
+          <w:lang w:val="en-US" w:eastAsia="zh-CN"/>
+        </w:rPr>
+        <w:t>, a scalable asynchronous NoC architecture featuring the following three key contributions:</w:t>
       </w:r>
     </w:p>
     <w:p>
       <w:pPr>
         <w:pStyle w:val="a3"/>
         <w:rPr>
-          <w:lang w:val="en-US" w:eastAsia="zh-CN"/>
-        </w:rPr>
-      </w:pPr>
-      <w:r>
-        <w:rPr>
-          <w:b/>
-          <w:bCs/>
-          <w:lang w:val="en-US" w:eastAsia="zh-CN"/>
-        </w:rPr>
-        <w:t>C2: Inefficient bandwidth scaling in conventional fat-trees.</w:t>
-      </w:r>
-      <w:r>
-        <w:rPr>
-          <w:lang w:val="en-US" w:eastAsia="zh-CN"/>
-        </w:rPr>
-        <w:t xml:space="preserve"> Although tree hierarchies reduce hop counts, fattening upper-level links increases the number of physical ports and competing requests handled by each router, resulting in more complex arbitration and longer per-hop delays. As shown in Fig. 2(</w:t>
-      </w:r>
-      <w:r>
-        <w:rPr>
           <w:rFonts w:hint="eastAsia"/>
-          <w:lang w:val="en-US" w:eastAsia="zh-CN"/>
-        </w:rPr>
-        <w:t>c</w:t>
-      </w:r>
-      <w:r>
-        <w:rPr>
-          <w:lang w:val="en-US" w:eastAsia="zh-CN"/>
-        </w:rPr>
-        <w:t xml:space="preserve">), router latency nearly doubles from 0.66 to 1.29 ns/flit as the evaluated </w:t>
-      </w:r>
-      <w:r>
-        <w:rPr>
-          <w:rFonts w:hint="eastAsia"/>
-          <w:lang w:val="en-US" w:eastAsia="zh-CN"/>
-        </w:rPr>
-        <w:t>router</w:t>
-      </w:r>
-      <w:r>
-        <w:rPr>
-          <w:lang w:val="en-US" w:eastAsia="zh-CN"/>
-        </w:rPr>
-        <w:t xml:space="preserve"> widen</w:t>
-      </w:r>
-      <w:r>
-        <w:rPr>
-          <w:rFonts w:hint="eastAsia"/>
-          <w:lang w:val="en-US" w:eastAsia="zh-CN"/>
-        </w:rPr>
-        <w:t>s</w:t>
-      </w:r>
-      <w:r>
-        <w:rPr>
-          <w:lang w:val="en-US" w:eastAsia="zh-CN"/>
-        </w:rPr>
-        <w:t xml:space="preserve">, potentially offsetting the latency benefits of shorter paths. Moreover, the conventional fat-tree achieves only 145 </w:t>
-      </w:r>
-      <w:proofErr w:type="spellStart"/>
-      <w:r>
-        <w:rPr>
-          <w:lang w:val="en-US" w:eastAsia="zh-CN"/>
-        </w:rPr>
-        <w:t>Mflit</w:t>
-      </w:r>
-      <w:proofErr w:type="spellEnd"/>
-      <w:r>
-        <w:rPr>
-          <w:lang w:val="en-US" w:eastAsia="zh-CN"/>
-        </w:rPr>
-        <w:t xml:space="preserve">/s/port, compared with 215 </w:t>
-      </w:r>
-      <w:proofErr w:type="spellStart"/>
-      <w:r>
-        <w:rPr>
-          <w:lang w:val="en-US" w:eastAsia="zh-CN"/>
-        </w:rPr>
-        <w:t>Mflit</w:t>
-      </w:r>
-      <w:proofErr w:type="spellEnd"/>
-      <w:r>
-        <w:rPr>
-          <w:lang w:val="en-US" w:eastAsia="zh-CN"/>
-        </w:rPr>
-        <w:t>/s/port for the flat mesh, indicating that additional physical links do not necessarily translate into higher network throughput.</w:t>
-      </w:r>
-    </w:p>
-    <w:p>
-      <w:pPr>
-        <w:pStyle w:val="a3"/>
-        <w:rPr>
-          <w:lang w:val="en-US" w:eastAsia="zh-CN"/>
-        </w:rPr>
-      </w:pPr>
-      <w:r>
-        <w:rPr>
-          <w:b/>
-          <w:bCs/>
-          <w:lang w:val="en-US" w:eastAsia="zh-CN"/>
-        </w:rPr>
-        <w:t>C3: Traffic amplification with increasing multicast fanout.</w:t>
-      </w:r>
-      <w:r>
-        <w:rPr>
-          <w:lang w:val="en-US" w:eastAsia="zh-CN"/>
-        </w:rPr>
-        <w:t xml:space="preserve"> Without in-network replication, repeated unicast requires multiple packet injections for a single multicast message, amplifying redundant traffic, contention, and queuing delays as multicast fanout increases. As illustrated in Fig. 2</w:t>
-      </w:r>
-      <w:r>
-        <w:rPr>
-          <w:rFonts w:hint="eastAsia"/>
-          <w:lang w:val="en-US" w:eastAsia="zh-CN"/>
-        </w:rPr>
-        <w:t>d</w:t>
-      </w:r>
-      <w:r>
-        <w:rPr>
-          <w:lang w:val="en-US" w:eastAsia="zh-CN"/>
-        </w:rPr>
-        <w:t>, repeated-unicast latency rises sharply from 57.2 ns to 573.0 ns</w:t>
-      </w:r>
-      <w:r>
-        <w:rPr>
-          <w:rFonts w:hint="eastAsia"/>
-          <w:lang w:val="en-US" w:eastAsia="zh-CN"/>
-        </w:rPr>
-        <w:t xml:space="preserve"> when multicast increases</w:t>
-      </w:r>
-      <w:r>
-        <w:rPr>
-          <w:lang w:val="en-US" w:eastAsia="zh-CN"/>
-        </w:rPr>
-        <w:t xml:space="preserve"> in our 256-node evaluation. Efficient hierarchical multicast thus requires compact destination representation and selective in-network replication across network levels.</w:t>
-      </w:r>
-    </w:p>
-    <w:p>
-      <w:pPr>
-        <w:pStyle w:val="a3"/>
-        <w:rPr>
-          <w:lang w:val="en-US" w:eastAsia="zh-CN"/>
-        </w:rPr>
-      </w:pPr>
-      <w:r>
-        <w:rPr>
-          <w:lang w:val="en-US" w:eastAsia="zh-CN"/>
-        </w:rPr>
-        <w:t xml:space="preserve">To address these challenges, we propose </w:t>
-      </w:r>
-      <w:r>
-        <w:rPr>
-          <w:b/>
-          <w:bCs/>
-          <w:lang w:val="en-US" w:eastAsia="zh-CN"/>
-        </w:rPr>
-        <w:t>CHAMP (Click-based Hierarchical Asynchronous Multicast with Parallel Routers)</w:t>
-      </w:r>
-      <w:r>
-        <w:rPr>
-          <w:lang w:val="en-US" w:eastAsia="zh-CN"/>
-        </w:rPr>
-        <w:t>, a scalable asynchronous NoC architecture featuring the following three key contributions:</w:t>
-      </w:r>
-    </w:p>
-    <w:p>
-      <w:pPr>
-        <w:pStyle w:val="a3"/>
-        <w:rPr>
-          <w:lang w:val="en-US" w:eastAsia="zh-CN"/>
+          <w:lang w:eastAsia="zh-CN"/>
         </w:rPr>
       </w:pPr>
       <w:r>
@@ -806,23 +724,31 @@
         <w:rPr>
           <w:lang w:val="en-US" w:eastAsia="zh-CN"/>
         </w:rPr>
-        <w:t xml:space="preserve"> We propose a hierarchical interconnect that combines local quadtrees with a global mesh, enabling local communication to complete within lower tree levels while supporting long-distance communication through the upper mesh. Our analytical hop-count model demonstrates a substantial reduction in average communication distance compared with flat meshes, mitigating the hop-dependent latency penalty as the network scales.</w:t>
+        <w:t xml:space="preserve"> </w:t>
+      </w:r>
+      <w:r>
+        <w:rPr>
+          <w:lang w:eastAsia="zh-CN"/>
+        </w:rPr>
+        <w:t>We propose a hierarchical interconnect that combines local quadtrees with a global mesh, allowing local communication to remain within lower tree levels while supporting long-distance communication through the upper mesh. Compared with a flat mesh, the analytical average hop count decreases from 5.3 to 3.4 at 64 nodes (35.8%) and from 10.7 to 6.4 at 256 nodes (40.2%), reducing the hop-dependent component of communication latency as the network scales.</w:t>
       </w:r>
     </w:p>
     <w:p>
       <w:pPr>
         <w:pStyle w:val="a3"/>
-        <w:rPr>
-          <w:lang w:val="en-US" w:eastAsia="zh-CN"/>
-        </w:rPr>
-        <w:sectPr>
-          <w:type w:val="continuous"/>
-          <w:pgSz w:w="595.30pt" w:h="841.90pt" w:code="9"/>
-          <w:pgMar w:top="54pt" w:right="45.35pt" w:bottom="72pt" w:left="45.35pt" w:header="36pt" w:footer="36pt" w:gutter="0pt"/>
-          <w:cols w:num="2" w:space="18pt"/>
-          <w:docGrid w:linePitch="360"/>
-        </w:sectPr>
-      </w:pPr>
+        <w:ind w:firstLine="0pt"/>
+        <w:rPr>
+          <w:lang w:val="en-US" w:eastAsia="zh-CN"/>
+        </w:rPr>
+      </w:pPr>
+      <w:r>
+        <w:rPr>
+          <w:b/>
+          <w:bCs/>
+          <w:lang w:val="en-US" w:eastAsia="zh-CN"/>
+        </w:rPr>
+        <w:tab/>
+      </w:r>
       <w:r>
         <w:rPr>
           <w:b/>
@@ -850,1394 +776,97 @@
       </w:r>
       <w:r>
         <w:rPr>
-          <w:lang w:val="en-US" w:eastAsia="zh-CN"/>
-        </w:rPr>
-        <w:t xml:space="preserve"> Rather than concentrating expanded link capacity in increasingly wide routers, CHAMP distributes physical paths across multiple lightweight asynchronous routers. Dynamic lane allocation, </w:t>
+          <w:lang w:eastAsia="zh-CN"/>
+        </w:rPr>
+        <w:t xml:space="preserve"> </w:t>
+      </w:r>
+      <w:r>
+        <w:rPr>
+          <w:lang w:val="en-US" w:eastAsia="zh-CN"/>
+        </w:rPr>
+        <w:t xml:space="preserve">Instead of concentrating bandwidth in increasingly wide routers, CHAMP distributes physical paths across multiple lightweight asynchronous routers and employs dynamic lane allocation to scale aggregate bandwidth. In the evaluated 64-node unicast scan, CHAMP achieves a peak delivered-copy throughput of 346 </w:t>
+      </w:r>
+      <w:proofErr w:type="spellStart"/>
+      <w:r>
+        <w:rPr>
+          <w:lang w:val="en-US" w:eastAsia="zh-CN"/>
+        </w:rPr>
+        <w:t>Mflit</w:t>
+      </w:r>
+      <w:proofErr w:type="spellEnd"/>
+      <w:r>
+        <w:rPr>
+          <w:lang w:val="en-US" w:eastAsia="zh-CN"/>
+        </w:rPr>
+        <w:t xml:space="preserve">/s/port, compared with 215 </w:t>
+      </w:r>
+      <w:proofErr w:type="spellStart"/>
+      <w:r>
+        <w:rPr>
+          <w:lang w:val="en-US" w:eastAsia="zh-CN"/>
+        </w:rPr>
+        <w:t>Mflit</w:t>
+      </w:r>
+      <w:proofErr w:type="spellEnd"/>
+      <w:r>
+        <w:rPr>
+          <w:lang w:val="en-US" w:eastAsia="zh-CN"/>
+        </w:rPr>
+        <w:t>/s/port for the mesh, representing a 1.61× increase.</w:t>
       </w:r>
     </w:p>
     <w:p>
       <w:pPr>
         <w:pStyle w:val="a3"/>
-        <w:ind w:firstLine="0pt"/>
-        <w:rPr>
-          <w:lang w:val="en-US" w:eastAsia="zh-CN"/>
-        </w:rPr>
-        <w:sectPr>
-          <w:type w:val="continuous"/>
-          <w:pgSz w:w="595.30pt" w:h="841.90pt" w:code="9"/>
-          <w:pgMar w:top="54pt" w:right="45.35pt" w:bottom="72pt" w:left="45.35pt" w:header="36pt" w:footer="36pt" w:gutter="0pt"/>
-          <w:cols w:space="18pt"/>
-          <w:docGrid w:linePitch="360"/>
-        </w:sectPr>
-      </w:pPr>
-      <w:r>
-        <w:rPr>
-          <w:noProof/>
-          <w:lang w:val="en-US" w:eastAsia="zh-CN"/>
-        </w:rPr>
-        <w:lastRenderedPageBreak/>
-        <w:drawing>
-          <wp:anchor distT="0" distB="0" distL="114300" distR="114300" simplePos="0" relativeHeight="251658240" behindDoc="0" locked="0" layoutInCell="1" allowOverlap="1" wp14:anchorId="542ADE40" wp14:editId="1B9A55CD">
-            <wp:simplePos x="0" y="0"/>
-            <wp:positionH relativeFrom="column">
-              <wp:posOffset>180</wp:posOffset>
-            </wp:positionH>
-            <wp:positionV relativeFrom="page">
-              <wp:posOffset>687121</wp:posOffset>
-            </wp:positionV>
-            <wp:extent cx="6408420" cy="2921000"/>
-            <wp:effectExtent l="0" t="0" r="0" b="0"/>
-            <wp:wrapTopAndBottom/>
-            <wp:docPr id="1411342489" name="图形 2"/>
-            <wp:cNvGraphicFramePr>
-              <a:graphicFrameLocks xmlns:a="http://purl.oclc.org/ooxml/drawingml/main" noChangeAspect="1"/>
-            </wp:cNvGraphicFramePr>
-            <a:graphic xmlns:a="http://purl.oclc.org/ooxml/drawingml/main">
-              <a:graphicData uri="http://purl.oclc.org/ooxml/drawingml/picture">
-                <pic:pic xmlns:pic="http://purl.oclc.org/ooxml/drawingml/picture">
-                  <pic:nvPicPr>
-                    <pic:cNvPr id="1411342489" name="图形 1411342489"/>
-                    <pic:cNvPicPr/>
-                  </pic:nvPicPr>
-                  <pic:blipFill>
-                    <a:blip r:embed="rId9">
-                      <a:extLst>
-                        <a:ext uri="{96DAC541-7B7A-43D3-8B79-37D633B846F1}">
-                          <asvg:svgBlip xmlns:asvg="http://schemas.microsoft.com/office/drawing/2016/SVG/main" r:embed="rId10"/>
-                        </a:ext>
-                      </a:extLst>
-                    </a:blip>
-                    <a:stretch>
-                      <a:fillRect/>
-                    </a:stretch>
-                  </pic:blipFill>
-                  <pic:spPr>
-                    <a:xfrm>
-                      <a:off x="0" y="0"/>
-                      <a:ext cx="6408420" cy="2921000"/>
-                    </a:xfrm>
-                    <a:prstGeom prst="rect">
-                      <a:avLst/>
-                    </a:prstGeom>
-                  </pic:spPr>
-                </pic:pic>
-              </a:graphicData>
-            </a:graphic>
-          </wp:anchor>
-        </w:drawing>
+        <w:rPr>
+          <w:rFonts w:hint="eastAsia"/>
+          <w:lang w:eastAsia="zh-CN"/>
+        </w:rPr>
+      </w:pPr>
+      <w:r>
+        <w:rPr>
+          <w:b/>
+          <w:bCs/>
+          <w:lang w:val="en-US" w:eastAsia="zh-CN"/>
+        </w:rPr>
+        <w:t>R3: Native Region-Aware Multicast.</w:t>
+      </w:r>
+      <w:r>
+        <w:rPr>
+          <w:lang w:val="en-US" w:eastAsia="zh-CN"/>
+        </w:rPr>
+        <w:t xml:space="preserve"> </w:t>
+      </w:r>
+      <w:r>
+        <w:rPr>
+          <w:lang w:eastAsia="zh-CN"/>
+        </w:rPr>
+        <w:t>CHAMP supports native multicast through region-aware destination encoding and selective in-network replication, avoiding the repeated source injection required by unicast emulation. Under the evaluated All-Multicast workloads, CHAMP reduces mean offer-to-tail latency from 59.3 to 11.0 ns at 64 nodes (5.4× lower) and from 573.0 to 19.6 ns at 256 nodes (29.2× lower) compared with repeated unicast</w:t>
       </w:r>
     </w:p>
     <w:p>
       <w:pPr>
-        <w:pStyle w:val="a3"/>
-        <w:ind w:firstLine="0pt"/>
-        <w:rPr>
-          <w:lang w:val="en-US" w:eastAsia="zh-CN"/>
-        </w:rPr>
-      </w:pPr>
-      <w:r>
-        <w:rPr>
-          <w:lang w:val="en-US" w:eastAsia="zh-CN"/>
-        </w:rPr>
-        <w:t>packet-level path holding, and phase-safe two-phase handshake adaptation enable parallel communication while limiting local arbitration complexity.</w:t>
+        <w:pStyle w:val="1"/>
+        <w:rPr>
+          <w:lang w:eastAsia="zh-CN"/>
+        </w:rPr>
+      </w:pPr>
+      <w:r>
+        <w:rPr>
+          <w:rFonts w:hint="eastAsia"/>
+          <w:lang w:eastAsia="zh-CN"/>
+        </w:rPr>
+        <w:t>Background</w:t>
       </w:r>
     </w:p>
     <w:p>
       <w:pPr>
-        <w:pStyle w:val="a3"/>
-        <w:rPr>
-          <w:lang w:val="en-US" w:eastAsia="zh-CN"/>
-        </w:rPr>
-      </w:pPr>
-      <w:r>
-        <w:rPr>
-          <w:b/>
-          <w:bCs/>
-          <w:lang w:val="en-US" w:eastAsia="zh-CN"/>
-        </w:rPr>
-        <w:t>R3: Native Region-Aware Multicast.</w:t>
-      </w:r>
-      <w:r>
-        <w:rPr>
-          <w:lang w:val="en-US" w:eastAsia="zh-CN"/>
-        </w:rPr>
-        <w:t xml:space="preserve"> CHAMP employs compact rectangular destination encoding and hierarchical routing decisions to selectively replicate multi-flit packets across tree and mesh levels. Native in-network replication reduces redundant source injections and enables efficient one-to-many communication.</w:t>
-      </w:r>
-    </w:p>
-    <w:p>
-      <w:pPr>
-        <w:pStyle w:val="a3"/>
+        <w:jc w:val="both"/>
         <w:rPr>
           <w:rFonts w:hint="eastAsia"/>
-          <w:lang w:val="en-US" w:eastAsia="zh-CN"/>
-        </w:rPr>
-      </w:pPr>
-      <w:r>
-        <w:rPr>
-          <w:lang w:val="en-US" w:eastAsia="zh-CN"/>
-        </w:rPr>
-        <w:t xml:space="preserve">Across 64- and 256-node networks, CHAMP achieves 61.2% and 51.7% higher peak delivered throughput than flat meshes under uniform-random traffic, respectively, sustaining its performance advantage as network size grows. </w:t>
-      </w:r>
-      <w:r>
-        <w:rPr>
-          <w:lang w:val="en-US" w:eastAsia="zh-CN"/>
-        </w:rPr>
-        <w:t>CHAMP also reduces power consumption by 21.8% compared with the flat mesh under the evaluated 64-node uniform-random workload</w:t>
-      </w:r>
-      <w:r>
-        <w:rPr>
-          <w:lang w:val="en-US" w:eastAsia="zh-CN"/>
-        </w:rPr>
-        <w:t>.</w:t>
-      </w:r>
-      <w:r>
-        <w:rPr>
-          <w:rFonts w:hint="eastAsia"/>
-          <w:lang w:val="en-US" w:eastAsia="zh-CN"/>
-        </w:rPr>
-        <w:t xml:space="preserve"> </w:t>
-      </w:r>
-      <w:r>
-        <w:rPr>
-          <w:lang w:val="en-US" w:eastAsia="zh-CN"/>
-        </w:rPr>
-        <w:t>Furthermore, across the evaluated multicast workloads, native multicast maintains nearly constant mean offer-to-tail latency, whereas repeated-unicast latency reaches 59.3 ns and 573.0 ns under All-Multicast, respectively.</w:t>
-      </w:r>
-    </w:p>
-    <w:p>
-      <w:pPr>
-        <w:pStyle w:val="1"/>
-      </w:pPr>
-      <w:r>
-        <w:t>Ease of Use</w:t>
-      </w:r>
-    </w:p>
-    <w:p>
-      <w:pPr>
-        <w:pStyle w:val="2"/>
-      </w:pPr>
-      <w:r>
-        <w:t xml:space="preserve">Selecting a </w:t>
-      </w:r>
-      <w:r>
-        <w:t>Template</w:t>
-      </w:r>
-      <w:r>
-        <w:t xml:space="preserve"> (Heading 2)</w:t>
-      </w:r>
-    </w:p>
-    <w:p>
-      <w:pPr>
-        <w:pStyle w:val="a3"/>
-      </w:pPr>
-      <w:r>
-        <w:t xml:space="preserve">First, confirm that you have the correct template for your paper size. This template has been tailored for output on the </w:t>
-      </w:r>
-      <w:r>
-        <w:rPr>
-          <w:lang w:val="en-US"/>
-        </w:rPr>
-        <w:t>A4</w:t>
-      </w:r>
-      <w:r>
-        <w:t xml:space="preserve"> paper size. </w:t>
-      </w:r>
-    </w:p>
-    <w:p>
-      <w:pPr>
-        <w:pStyle w:val="2"/>
-      </w:pPr>
-      <w:r>
-        <w:t>Maintaining the Integrity of the Specifications</w:t>
-      </w:r>
-    </w:p>
-    <w:p>
-      <w:pPr>
-        <w:pStyle w:val="a3"/>
-      </w:pPr>
-      <w:r>
-        <w:t>The template is used to format your paper and style the text. All margins, column widths, line spaces, and text fonts are prescribed; please do not alter them. You may note peculiarities. For example, the head margin in this template measures proportionately more than is customary. This measurement and others are deliberate, using specifications that anticipate your paper as one part of the entire proceedings, and not as an independent document. Please do not revise any of the current designations.</w:t>
-      </w:r>
-    </w:p>
-    <w:p>
-      <w:pPr>
-        <w:pStyle w:val="1"/>
-      </w:pPr>
-      <w:r>
-        <w:t xml:space="preserve">Prepare Your Paper </w:t>
-      </w:r>
-      <w:r>
-        <w:t>Before</w:t>
-      </w:r>
-      <w:r>
-        <w:t xml:space="preserve"> Styling</w:t>
-      </w:r>
-    </w:p>
-    <w:p>
-      <w:pPr>
-        <w:pStyle w:val="a3"/>
-        <w:rPr>
-          <w:lang w:val="en-US"/>
-        </w:rPr>
-      </w:pPr>
-      <w:r>
-        <w:t>Before</w:t>
-      </w:r>
-      <w:r>
-        <w:t xml:space="preserve"> you begin to format your paper, first write and save the content as a separate text file. </w:t>
-      </w:r>
-      <w:r>
-        <w:rPr>
-          <w:lang w:val="en-US"/>
-        </w:rPr>
-        <w:t>Complete all content and organizational editing before formatting. Please note sections A-D below for more information on proofreading, spelling and grammar.</w:t>
-      </w:r>
-    </w:p>
-    <w:p>
-      <w:pPr>
-        <w:pStyle w:val="a3"/>
-      </w:pPr>
-      <w:r>
-        <w:t>Keep your text and graphic files separate until after the text has been formatted and styled. Do not use hard tabs, and limit use of hard returns to only one return at the end of a paragraph. Do not add any kind of pagination anywhere in the paper. Do not number text heads-the template will do that for you.</w:t>
-      </w:r>
-    </w:p>
-    <w:p>
-      <w:pPr>
-        <w:pStyle w:val="2"/>
-      </w:pPr>
-      <w:r>
-        <w:t>Abbreviations</w:t>
-      </w:r>
-      <w:r>
-        <w:t xml:space="preserve"> and Acronyms</w:t>
-      </w:r>
-    </w:p>
-    <w:p>
-      <w:pPr>
-        <w:pStyle w:val="a3"/>
-      </w:pPr>
-      <w:r>
-        <w:t xml:space="preserve">Define abbreviations and acronyms the first time they are used in the text, even after they have been defined in the abstract. Abbreviations such as IEEE, SI, MKS, CGS, </w:t>
-      </w:r>
-      <w:proofErr w:type="spellStart"/>
-      <w:r>
-        <w:t>sc</w:t>
-      </w:r>
-      <w:proofErr w:type="spellEnd"/>
-      <w:r>
-        <w:t>, dc, and rms do not have to be defined. Do not use abbreviations in the title or heads unless they are unavoidable.</w:t>
-      </w:r>
-    </w:p>
-    <w:p>
-      <w:pPr>
-        <w:pStyle w:val="2"/>
-      </w:pPr>
-      <w:r>
-        <w:t>Units</w:t>
-      </w:r>
-    </w:p>
-    <w:p>
-      <w:pPr>
-        <w:pStyle w:val="bulletlist"/>
-      </w:pPr>
-      <w:r>
-        <w:t xml:space="preserve">Use </w:t>
-      </w:r>
-      <w:r>
-        <w:t>either</w:t>
-      </w:r>
-      <w:r>
-        <w:t xml:space="preserve"> SI (MKS) or CGS as primary units. (SI units are encouraged.) English units may be used as secondary units (in parentheses). An exception would be the use of English units as identifiers in trade, such as “3.5-inch disk drive”.</w:t>
-      </w:r>
-    </w:p>
-    <w:p>
-      <w:pPr>
-        <w:pStyle w:val="bulletlist"/>
-      </w:pPr>
-      <w:r>
-        <w:t xml:space="preserve">Avoid combining SI and CGS units, such as current in amperes and magnetic field in </w:t>
-      </w:r>
-      <w:proofErr w:type="spellStart"/>
-      <w:r>
-        <w:t>oersteds</w:t>
-      </w:r>
-      <w:proofErr w:type="spellEnd"/>
-      <w:r>
-        <w:t>. This often leads to confusion because equations do not balance dimensionally. If you must use mixed units, clearly state the units for each quantity that you use in an equation.</w:t>
-      </w:r>
-    </w:p>
-    <w:p>
-      <w:pPr>
-        <w:pStyle w:val="bulletlist"/>
-      </w:pPr>
-      <w:r>
-        <w:t xml:space="preserve">Do not mix complete spellings and abbreviations of units: “Wb/m2” or “webers per square meter”, not “webers/m2”.  Spell out units when they appear in text: “. . . a few </w:t>
-      </w:r>
-      <w:proofErr w:type="spellStart"/>
-      <w:r>
-        <w:t>henries</w:t>
-      </w:r>
-      <w:proofErr w:type="spellEnd"/>
-      <w:r>
-        <w:t>”, not “. . . a few H”.</w:t>
-      </w:r>
-    </w:p>
-    <w:p>
-      <w:pPr>
-        <w:pStyle w:val="sponsors"/>
-        <w:framePr w:wrap="auto" w:vAnchor="page" w:hAnchor="page" w:x="45.90pt" w:y="756.05pt"/>
-        <w:ind w:firstLine="14.45pt"/>
-      </w:pPr>
-      <w:r>
-        <w:t>Identif</w:t>
-      </w:r>
-      <w:r>
-        <w:t xml:space="preserve">y applicable </w:t>
-      </w:r>
-      <w:r>
-        <w:t>funding agency</w:t>
-      </w:r>
-      <w:r>
-        <w:t xml:space="preserve"> here. </w:t>
-      </w:r>
-      <w:r>
-        <w:rPr>
-          <w:iCs/>
-        </w:rPr>
-        <w:t>If none, delete this text box</w:t>
-      </w:r>
-      <w:r>
-        <w:rPr>
-          <w:iCs/>
-        </w:rPr>
-        <w:t>.</w:t>
-      </w:r>
-    </w:p>
-    <w:p>
-      <w:pPr>
-        <w:pStyle w:val="bulletlist"/>
-      </w:pPr>
-      <w:r>
-        <w:t xml:space="preserve">Use a zero before decimal points: “0.25”, not “.25”. Use “cm3”, not “cc”. </w:t>
-      </w:r>
-      <w:r>
-        <w:t>(</w:t>
-      </w:r>
-      <w:r>
-        <w:rPr>
-          <w:i/>
-          <w:iCs/>
-        </w:rPr>
-        <w:t>bullet list</w:t>
-      </w:r>
-      <w:r>
-        <w:t>)</w:t>
-      </w:r>
-    </w:p>
-    <w:p>
-      <w:pPr>
-        <w:pStyle w:val="2"/>
-      </w:pPr>
-      <w:r>
-        <w:t>Equations</w:t>
-      </w:r>
-    </w:p>
-    <w:p>
-      <w:pPr>
-        <w:pStyle w:val="a3"/>
-      </w:pPr>
-      <w:r>
-        <w:t>The equations are an exception to the prescribed specifications of this template. You will need to determine whether or not your equation should be typed using either the Times New Roman or the Symbol font (please no other font). To create multileveled equations, it may be necessary to treat the equation as a graphic and insert it into the text after your paper is styled.</w:t>
-      </w:r>
-    </w:p>
-    <w:p>
-      <w:pPr>
-        <w:pStyle w:val="a3"/>
-        <w:rPr>
-          <w:lang w:val="en-US"/>
-        </w:rPr>
-      </w:pPr>
-      <w:r>
-        <w:lastRenderedPageBreak/>
-        <w:t>Number equations consecutively. Equation numbers, within parentheses, are to position flush right, as in (1), using a right tab stop. To make your equations more compact, you may use the solidus ( / ), the exp function, or appropriate exponents. Italicize Roman symbols for quantities and variables, but not Greek symbols. Use a long dash rather than a hyphen for a minus sign. Punctuate equations with commas or periods when they are part of a sentence, as in</w:t>
-      </w:r>
-      <w:r>
-        <w:rPr>
-          <w:lang w:val="en-US"/>
-        </w:rPr>
-        <w:t>:</w:t>
-      </w:r>
-    </w:p>
-    <w:p>
-      <w:pPr>
-        <w:pStyle w:val="equation"/>
-        <w:rPr>
-          <w:rFonts w:hint="eastAsia"/>
-        </w:rPr>
-      </w:pPr>
-      <w:r>
-        <w:tab/>
-      </w:r>
-      <w:r>
-        <w:rPr>
-          <w:rFonts w:ascii="Times New Roman" w:hAnsi="Times New Roman" w:cs="Times New Roman"/>
-          <w:i/>
-        </w:rPr>
-        <w:t>a</w:t>
-      </w:r>
-      <w:r>
-        <w:t></w:t>
-      </w:r>
-      <w:r>
-        <w:t></w:t>
-      </w:r>
-      <w:r>
-        <w:t></w:t>
-      </w:r>
-      <w:r>
-        <w:rPr>
-          <w:rFonts w:ascii="Times New Roman" w:hAnsi="Times New Roman" w:cs="Times New Roman"/>
-          <w:i/>
-        </w:rPr>
-        <w:t>b</w:t>
-      </w:r>
-      <w:r>
-        <w:t></w:t>
-      </w:r>
-      <w:r>
-        <w:t></w:t>
-      </w:r>
-      <w:r>
-        <w:t></w:t>
-      </w:r>
-      <w:r>
-        <w:t></w:t>
-      </w:r>
-      <w:r>
-        <w:t></w:t>
-      </w:r>
-      <w:r>
-        <w:tab/>
-      </w:r>
-      <w:r>
-        <w:t></w:t>
-      </w:r>
-      <w:r>
-        <w:t></w:t>
-      </w:r>
-      <w:r>
-        <w:t></w:t>
-      </w:r>
-    </w:p>
-    <w:p>
-      <w:pPr>
-        <w:pStyle w:val="a3"/>
-      </w:pPr>
-      <w:r>
-        <w:t>Note that the equation is centered using a center tab stop. Be sure that the symbols in your equation have been defined before or immediately following the equation. Use “(1)”, not “Eq. (1)” or “equation (1)”, except at the beginning of a sentence: “Equation (1) is . . .”</w:t>
-      </w:r>
-    </w:p>
-    <w:p>
-      <w:pPr>
-        <w:pStyle w:val="2"/>
-      </w:pPr>
-      <w:r>
-        <w:t>Some Common Mistakes</w:t>
-      </w:r>
-    </w:p>
-    <w:p>
-      <w:pPr>
-        <w:pStyle w:val="bulletlist"/>
-      </w:pPr>
-      <w:r>
-        <w:t>The word “data” is plural, not singular.</w:t>
-      </w:r>
-    </w:p>
-    <w:p>
-      <w:pPr>
-        <w:pStyle w:val="bulletlist"/>
-      </w:pPr>
-      <w:r>
-        <w:t xml:space="preserve">The subscript for the permeability of vacuum </w:t>
-      </w:r>
-      <w:r>
-        <w:rPr>
-          <w:rFonts w:ascii="Symbol" w:hAnsi="Symbol" w:cs="Symbol"/>
-          <w:i/>
-          <w:iCs/>
-          <w:snapToGrid w:val="0"/>
-        </w:rPr>
-        <w:t></w:t>
-      </w:r>
-      <w:r>
-        <w:rPr>
-          <w:vertAlign w:val="subscript"/>
-        </w:rPr>
-        <w:t>0</w:t>
-      </w:r>
-      <w:r>
-        <w:t>, and other common scientific constants, is zero with subscript formatting, not a lowercase letter “o”.</w:t>
-      </w:r>
-    </w:p>
-    <w:p>
-      <w:pPr>
-        <w:pStyle w:val="bulletlist"/>
-      </w:pPr>
-      <w:r>
-        <w:t xml:space="preserve">In American </w:t>
-      </w:r>
-      <w:r>
-        <w:t>English, commas, semi</w:t>
-      </w:r>
-      <w:r>
-        <w:t>colons, periods, question and exclamation marks are located within quotation marks only when a complete thought or name is cited, such as a title or full quotation. When quotation marks are used, instead of a bold or italic typeface, to highlight a word or phrase, punctuation should appear outside of the quotation marks. A parenthetical phrase or statement at the end of a sentence is punctuated outside of the closing parenthesis (like this). (A parenthetical sentence is punctuated within the parentheses.)</w:t>
-      </w:r>
-    </w:p>
-    <w:p>
-      <w:pPr>
-        <w:pStyle w:val="bulletlist"/>
-      </w:pPr>
-      <w:r>
-        <w:t>A graph within a graph is an “inset”, not an “insert”. The word alternatively is preferred to the word “alternately” (unless you really mean something that alternates).</w:t>
-      </w:r>
-    </w:p>
-    <w:p>
-      <w:pPr>
-        <w:pStyle w:val="bulletlist"/>
-      </w:pPr>
-      <w:r>
-        <w:t>Do not use the word “essentially” to mean “approximately” or “effectively”.</w:t>
-      </w:r>
-    </w:p>
-    <w:p>
-      <w:pPr>
-        <w:pStyle w:val="bulletlist"/>
-      </w:pPr>
-      <w:r>
-        <w:t>In your paper title, if the words “that uses” can accurately replace the word “using”, capitalize the “u”; if not, keep using lower-cased.</w:t>
-      </w:r>
-    </w:p>
-    <w:p>
-      <w:pPr>
-        <w:pStyle w:val="bulletlist"/>
-      </w:pPr>
-      <w:r>
-        <w:t>Be aware of the different meanings of the homophones “affect” and “effect”, “complement” and “compliment”, “discreet” and “discrete”, “principal” and “principle”.</w:t>
-      </w:r>
-    </w:p>
-    <w:p>
-      <w:pPr>
-        <w:pStyle w:val="bulletlist"/>
-      </w:pPr>
-      <w:r>
-        <w:t>Do not confuse “imply” and “infer”.</w:t>
-      </w:r>
-    </w:p>
-    <w:p>
-      <w:pPr>
-        <w:pStyle w:val="bulletlist"/>
-      </w:pPr>
-      <w:r>
-        <w:t>The prefix “non” is not a word; it should be joined to the word it modifies, usually without a hyphen.</w:t>
-      </w:r>
-    </w:p>
-    <w:p>
-      <w:pPr>
-        <w:pStyle w:val="bulletlist"/>
-      </w:pPr>
-      <w:r>
-        <w:t>There is no period after the “et” in the Latin abbreviation “et al.”.</w:t>
-      </w:r>
-    </w:p>
-    <w:p>
-      <w:pPr>
-        <w:pStyle w:val="bulletlist"/>
-      </w:pPr>
-      <w:r>
-        <w:t>The abbreviation “i.e.” means “that is”, and the abbreviation “e.g.” means “for example”.</w:t>
-      </w:r>
-    </w:p>
-    <w:p>
-      <w:pPr>
-        <w:pStyle w:val="a3"/>
-      </w:pPr>
-      <w:r>
-        <w:t>An excellent style manual for science writers is [7].</w:t>
-      </w:r>
-    </w:p>
-    <w:p>
-      <w:pPr>
-        <w:pStyle w:val="1"/>
-      </w:pPr>
-      <w:r>
-        <w:t xml:space="preserve">Using the </w:t>
-      </w:r>
-      <w:r>
-        <w:t>Template</w:t>
-      </w:r>
-    </w:p>
-    <w:p>
-      <w:pPr>
-        <w:pStyle w:val="a3"/>
-      </w:pPr>
-      <w:r>
-        <w:t xml:space="preserve">After the text edit has been completed, the paper is ready for the template. Duplicate the template file by using the Save </w:t>
-      </w:r>
-      <w:r>
-        <w:t>As command, and use the naming convention prescribed by your conference for the name of your paper. In this newly created file, highlight all of the contents and import your prepared text file. You are now ready to style your paper; use the scroll down window on the left of the MS Word Formatting toolbar.</w:t>
-      </w:r>
-    </w:p>
-    <w:p>
-      <w:pPr>
-        <w:pStyle w:val="2"/>
-      </w:pPr>
-      <w:r>
-        <w:t>Authors</w:t>
-      </w:r>
-      <w:r>
-        <w:t xml:space="preserve"> and Affiliations</w:t>
-      </w:r>
-    </w:p>
-    <w:p>
-      <w:pPr>
-        <w:pStyle w:val="a3"/>
-      </w:pPr>
-      <w:r>
-        <w:rPr>
-          <w:b/>
-        </w:rPr>
-        <w:t xml:space="preserve">The template is </w:t>
-      </w:r>
-      <w:r>
-        <w:rPr>
-          <w:b/>
-        </w:rPr>
-        <w:t>designed</w:t>
-      </w:r>
-      <w:r>
-        <w:rPr>
-          <w:b/>
-          <w:lang w:val="en-US"/>
-        </w:rPr>
-        <w:t xml:space="preserve"> for,</w:t>
-      </w:r>
-      <w:r>
-        <w:rPr>
-          <w:b/>
-        </w:rPr>
-        <w:t xml:space="preserve"> but not limited to</w:t>
-      </w:r>
-      <w:r>
-        <w:rPr>
-          <w:b/>
-          <w:lang w:val="en-US"/>
-        </w:rPr>
-        <w:t>,</w:t>
-      </w:r>
-      <w:r>
-        <w:rPr>
-          <w:b/>
-          <w:lang w:val="en-US"/>
-        </w:rPr>
-        <w:t xml:space="preserve"> </w:t>
-      </w:r>
-      <w:r>
-        <w:rPr>
-          <w:b/>
-          <w:lang w:val="en-US"/>
-        </w:rPr>
-        <w:t>six</w:t>
-      </w:r>
-      <w:r>
-        <w:rPr>
-          <w:b/>
-          <w:lang w:val="en-US"/>
-        </w:rPr>
-        <w:t xml:space="preserve"> authors.</w:t>
-      </w:r>
-      <w:r>
-        <w:rPr>
-          <w:lang w:val="en-US"/>
-        </w:rPr>
-        <w:t xml:space="preserve"> </w:t>
-      </w:r>
-      <w:r>
-        <w:rPr>
-          <w:lang w:val="en-US"/>
-        </w:rPr>
-        <w:t xml:space="preserve">A minimum of one author is required for all conference articles. </w:t>
-      </w:r>
-      <w:r>
-        <w:t>Author names should be listed starting from left to right and then moving down to the next line. This is the author sequence that will be used in future citations and by indexing services.</w:t>
-      </w:r>
-      <w:r>
-        <w:t xml:space="preserve"> </w:t>
-      </w:r>
-      <w:r>
-        <w:t>Names should not be listed in columns nor group by affiliation.</w:t>
-      </w:r>
-      <w:r>
-        <w:rPr>
-          <w:lang w:val="en-US"/>
-        </w:rPr>
-        <w:t xml:space="preserve"> </w:t>
-      </w:r>
-      <w:r>
-        <w:t>Please keep your affiliations as succinct as possible (for example, do not differentiate among departments of the same organization).</w:t>
-      </w:r>
-    </w:p>
-    <w:p>
-      <w:pPr>
-        <w:pStyle w:val="3"/>
-      </w:pPr>
-      <w:r>
-        <w:t xml:space="preserve">For papers with more than six authors: </w:t>
-      </w:r>
-      <w:r>
-        <w:rPr>
-          <w:i w:val="0"/>
-        </w:rPr>
-        <w:t>Add author names horizontally, moving to a third row if needed for more than 8 authors.</w:t>
-      </w:r>
-    </w:p>
-    <w:p>
-      <w:pPr>
-        <w:pStyle w:val="3"/>
-      </w:pPr>
-      <w:r>
-        <w:t xml:space="preserve">For </w:t>
-      </w:r>
-      <w:r>
-        <w:t xml:space="preserve">papers with less than </w:t>
-      </w:r>
-      <w:r>
-        <w:t>six</w:t>
-      </w:r>
-      <w:r>
-        <w:t xml:space="preserve"> authors</w:t>
-      </w:r>
-      <w:r>
-        <w:t xml:space="preserve">: </w:t>
-      </w:r>
-      <w:r>
-        <w:rPr>
-          <w:i w:val="0"/>
-        </w:rPr>
-        <w:t>To change the default, adjust the template as follows.</w:t>
-      </w:r>
-    </w:p>
-    <w:p>
-      <w:pPr>
-        <w:pStyle w:val="4"/>
-      </w:pPr>
-      <w:r>
-        <w:t>Selection</w:t>
-      </w:r>
-      <w:r>
-        <w:t xml:space="preserve">: </w:t>
-      </w:r>
-      <w:r>
-        <w:rPr>
-          <w:i w:val="0"/>
-        </w:rPr>
-        <w:t>Highlight all author and affiliation lines.</w:t>
-      </w:r>
-    </w:p>
-    <w:p>
-      <w:pPr>
-        <w:pStyle w:val="4"/>
-      </w:pPr>
-      <w:r>
-        <w:t>Change number of columns:</w:t>
-      </w:r>
-      <w:r>
-        <w:t xml:space="preserve"> </w:t>
-      </w:r>
-      <w:r>
-        <w:rPr>
-          <w:i w:val="0"/>
-        </w:rPr>
-        <w:t xml:space="preserve">Select the Columns icon from the MS Word Standard toolbar and then select </w:t>
-      </w:r>
-      <w:r>
-        <w:rPr>
-          <w:i w:val="0"/>
-        </w:rPr>
-        <w:t>the correct number of columns</w:t>
-      </w:r>
-      <w:r>
-        <w:rPr>
-          <w:i w:val="0"/>
-        </w:rPr>
-        <w:t xml:space="preserve"> from the selection palette.</w:t>
-      </w:r>
-    </w:p>
-    <w:p>
-      <w:pPr>
-        <w:pStyle w:val="4"/>
-        <w:rPr>
-          <w:i w:val="0"/>
-        </w:rPr>
-      </w:pPr>
-      <w:r>
-        <w:t xml:space="preserve">Deletion: </w:t>
-      </w:r>
-      <w:r>
-        <w:rPr>
-          <w:i w:val="0"/>
-        </w:rPr>
-        <w:t xml:space="preserve">Delete the author and affiliation lines for the </w:t>
-      </w:r>
-      <w:r>
-        <w:rPr>
-          <w:i w:val="0"/>
-        </w:rPr>
-        <w:t>extra authors.</w:t>
-      </w:r>
-    </w:p>
-    <w:p>
-      <w:pPr>
-        <w:jc w:val="start"/>
-        <w:rPr>
-          <w:i/>
-          <w:iCs/>
-          <w:noProof/>
-        </w:rPr>
-      </w:pPr>
-    </w:p>
-    <w:p>
-      <w:pPr>
-        <w:pStyle w:val="2"/>
-      </w:pPr>
-      <w:r>
-        <w:t>Identify</w:t>
-      </w:r>
-      <w:r>
-        <w:t xml:space="preserve"> the Headings</w:t>
-      </w:r>
-    </w:p>
-    <w:p>
-      <w:pPr>
-        <w:pStyle w:val="a3"/>
-      </w:pPr>
-      <w:r>
-        <w:t>Headings, or heads, are organizational devices that guide the reader through your paper. There are two types: component heads and text heads.</w:t>
-      </w:r>
-    </w:p>
-    <w:p>
-      <w:pPr>
-        <w:pStyle w:val="a3"/>
-      </w:pPr>
-      <w:r>
-        <w:t>Component heads identify the different components of your paper and are not topically subordinate to each other. Examples include Acknowledgments and References and, for these, the correct style to use is “Heading 5”. Use “figure caption” for your Figure captions, and “table head” for your table title. Run-in heads, such as “Abstract”, will require you to apply a style (in this case, italic) in addition to the style provided by the drop down menu to differentiate the head from the text.</w:t>
-      </w:r>
-    </w:p>
-    <w:p>
-      <w:pPr>
-        <w:pStyle w:val="a3"/>
-      </w:pPr>
-      <w:r>
-        <w:t>Text heads organize the topics on a relational, hierarchical basis. For example, the paper title is the primary text head because all subsequent material relates and elaborates on this one topic. If there are two or more sub-topics, the next level head (uppercase Roman numerals) should be used and, conversely, if there are not at least two sub-topics, then no subheads should be introduced. Styles named “Heading 1”, “Heading 2”, “Heading 3”, and “Heading 4” are prescribed.</w:t>
-      </w:r>
-    </w:p>
-    <w:p>
-      <w:pPr>
-        <w:pStyle w:val="2"/>
-      </w:pPr>
-      <w:r>
-        <w:t>Figures and Tables</w:t>
-      </w:r>
-    </w:p>
-    <w:p>
-      <w:pPr>
-        <w:pStyle w:val="4"/>
-      </w:pPr>
-      <w:r>
-        <w:t xml:space="preserve"> </w:t>
-      </w:r>
-      <w:r>
-        <w:t xml:space="preserve">Positioning Figures and Tables: </w:t>
-      </w:r>
-      <w:r>
-        <w:rPr>
-          <w:i w:val="0"/>
-        </w:rPr>
-        <w:t>Place figures and tables at the top and bottom of columns. Avoid placing them in the middle of columns. Large figures and tables may span across both columns. Figure captions should be below the figures; table heads should appear above the tables. Insert figures and tables after they are cited in the text. Use the abbreviation “Fig. 1”, even at the beginning of a sentence.</w:t>
-      </w:r>
-    </w:p>
-    <w:p>
-      <w:pPr>
-        <w:pStyle w:val="tablehead"/>
-      </w:pPr>
-      <w:r>
-        <w:t>Table Type Styles</w:t>
-      </w:r>
-    </w:p>
-    <w:tbl>
-      <w:tblPr>
-        <w:tblW w:w="0pt" w:type="dxa"/>
-        <w:jc w:val="center"/>
-        <w:tblBorders>
-          <w:top w:val="single" w:sz="2" w:space="0" w:color="auto"/>
-          <w:start w:val="single" w:sz="2" w:space="0" w:color="auto"/>
-          <w:bottom w:val="single" w:sz="2" w:space="0" w:color="auto"/>
-          <w:end w:val="single" w:sz="2" w:space="0" w:color="auto"/>
-          <w:insideH w:val="single" w:sz="2" w:space="0" w:color="auto"/>
-          <w:insideV w:val="single" w:sz="2" w:space="0" w:color="auto"/>
-        </w:tblBorders>
-        <w:tblLayout w:type="fixed"/>
-        <w:tblLook w:firstRow="0" w:lastRow="0" w:firstColumn="0" w:lastColumn="0" w:noHBand="0" w:noVBand="0"/>
-      </w:tblPr>
-      <w:tblGrid>
-        <w:gridCol w:w="720"/>
-        <w:gridCol w:w="2340"/>
-        <w:gridCol w:w="900"/>
-        <w:gridCol w:w="900"/>
-      </w:tblGrid>
-      <w:tr>
-        <w:trPr>
-          <w:cantSplit/>
-          <w:trHeight w:val="240"/>
-          <w:tblHeader/>
-          <w:jc w:val="center"/>
-        </w:trPr>
-        <w:tc>
-          <w:tcPr>
-            <w:tcW w:w="36pt" w:type="dxa"/>
-            <w:vMerge w:val="restart"/>
-            <w:vAlign w:val="center"/>
-          </w:tcPr>
-          <w:p>
-            <w:pPr>
-              <w:pStyle w:val="tablecolhead"/>
-            </w:pPr>
-            <w:r>
-              <w:lastRenderedPageBreak/>
-              <w:t>Table Head</w:t>
-            </w:r>
-          </w:p>
-        </w:tc>
-        <w:tc>
-          <w:tcPr>
-            <w:tcW w:w="207pt" w:type="dxa"/>
-            <w:gridSpan w:val="3"/>
-            <w:vAlign w:val="center"/>
-          </w:tcPr>
-          <w:p>
-            <w:pPr>
-              <w:pStyle w:val="tablecolhead"/>
-            </w:pPr>
-            <w:r>
-              <w:t>Table Column Head</w:t>
-            </w:r>
-          </w:p>
-        </w:tc>
-      </w:tr>
-      <w:tr>
-        <w:trPr>
-          <w:cantSplit/>
-          <w:trHeight w:val="240"/>
-          <w:tblHeader/>
-          <w:jc w:val="center"/>
-        </w:trPr>
-        <w:tc>
-          <w:tcPr>
-            <w:tcW w:w="36pt" w:type="dxa"/>
-            <w:vMerge/>
-          </w:tcPr>
-          <w:p>
-            <w:pPr>
-              <w:rPr>
-                <w:sz w:val="16"/>
-                <w:szCs w:val="16"/>
-              </w:rPr>
-            </w:pPr>
-          </w:p>
-        </w:tc>
-        <w:tc>
-          <w:tcPr>
-            <w:tcW w:w="117pt" w:type="dxa"/>
-            <w:vAlign w:val="center"/>
-          </w:tcPr>
-          <w:p>
-            <w:pPr>
-              <w:pStyle w:val="tablecolsubhead"/>
-            </w:pPr>
-            <w:r>
-              <w:t>Table column subhead</w:t>
-            </w:r>
-          </w:p>
-        </w:tc>
-        <w:tc>
-          <w:tcPr>
-            <w:tcW w:w="45pt" w:type="dxa"/>
-            <w:vAlign w:val="center"/>
-          </w:tcPr>
-          <w:p>
-            <w:pPr>
-              <w:pStyle w:val="tablecolsubhead"/>
-            </w:pPr>
-            <w:r>
-              <w:t>Subhead</w:t>
-            </w:r>
-          </w:p>
-        </w:tc>
-        <w:tc>
-          <w:tcPr>
-            <w:tcW w:w="45pt" w:type="dxa"/>
-            <w:vAlign w:val="center"/>
-          </w:tcPr>
-          <w:p>
-            <w:pPr>
-              <w:pStyle w:val="tablecolsubhead"/>
-            </w:pPr>
-            <w:r>
-              <w:t>Subhead</w:t>
-            </w:r>
-          </w:p>
-        </w:tc>
-      </w:tr>
-      <w:tr>
-        <w:trPr>
-          <w:trHeight w:val="320"/>
-          <w:jc w:val="center"/>
-        </w:trPr>
-        <w:tc>
-          <w:tcPr>
-            <w:tcW w:w="36pt" w:type="dxa"/>
-            <w:vAlign w:val="center"/>
-          </w:tcPr>
-          <w:p>
-            <w:pPr>
-              <w:pStyle w:val="tablecopy"/>
-              <w:rPr>
-                <w:sz w:val="8"/>
-                <w:szCs w:val="8"/>
-              </w:rPr>
-            </w:pPr>
-            <w:r>
-              <w:t>copy</w:t>
-            </w:r>
-          </w:p>
-        </w:tc>
-        <w:tc>
-          <w:tcPr>
-            <w:tcW w:w="117pt" w:type="dxa"/>
-            <w:vAlign w:val="center"/>
-          </w:tcPr>
-          <w:p>
-            <w:pPr>
-              <w:pStyle w:val="tablecopy"/>
-            </w:pPr>
-            <w:r>
-              <w:t>More table copy</w:t>
-            </w:r>
-            <w:r>
-              <w:rPr>
-                <w:vertAlign w:val="superscript"/>
-              </w:rPr>
-              <w:t>a</w:t>
-            </w:r>
-          </w:p>
-        </w:tc>
-        <w:tc>
-          <w:tcPr>
-            <w:tcW w:w="45pt" w:type="dxa"/>
-            <w:vAlign w:val="center"/>
-          </w:tcPr>
-          <w:p>
-            <w:pPr>
-              <w:rPr>
-                <w:sz w:val="16"/>
-                <w:szCs w:val="16"/>
-              </w:rPr>
-            </w:pPr>
-          </w:p>
-        </w:tc>
-        <w:tc>
-          <w:tcPr>
-            <w:tcW w:w="45pt" w:type="dxa"/>
-            <w:vAlign w:val="center"/>
-          </w:tcPr>
-          <w:p>
-            <w:pPr>
-              <w:rPr>
-                <w:sz w:val="16"/>
-                <w:szCs w:val="16"/>
-              </w:rPr>
-            </w:pPr>
-          </w:p>
-        </w:tc>
-      </w:tr>
-    </w:tbl>
-    <w:p>
-      <w:pPr>
-        <w:pStyle w:val="tablefootnote"/>
-      </w:pPr>
-      <w:r>
-        <w:t xml:space="preserve">Sample </w:t>
-      </w:r>
-      <w:r>
-        <w:t>of</w:t>
-      </w:r>
-      <w:r>
-        <w:t xml:space="preserve"> a </w:t>
-      </w:r>
-      <w:r>
-        <w:t>Table</w:t>
-      </w:r>
-      <w:r>
-        <w:t xml:space="preserve"> </w:t>
-      </w:r>
-      <w:r>
-        <w:t>footnote</w:t>
-      </w:r>
-      <w:r>
-        <w:t xml:space="preserve">. </w:t>
-      </w:r>
-      <w:r>
-        <w:t>(</w:t>
-      </w:r>
-      <w:r>
-        <w:rPr>
-          <w:i/>
-        </w:rPr>
-        <w:t>Table footnote</w:t>
-      </w:r>
-      <w:r>
-        <w:t>)</w:t>
-      </w:r>
-    </w:p>
-    <w:p>
-      <w:pPr>
-        <w:pStyle w:val="figurecaption"/>
-      </w:pPr>
-      <w:r>
-        <w:t xml:space="preserve">Example of a figure </w:t>
-      </w:r>
-      <w:r>
-        <w:t>caption</w:t>
-      </w:r>
-      <w:r>
-        <w:t xml:space="preserve">. </w:t>
-      </w:r>
-      <w:r>
-        <w:rPr>
-          <w:iCs/>
-        </w:rPr>
-        <w:t>(</w:t>
-      </w:r>
-      <w:r>
-        <w:rPr>
-          <w:i/>
-          <w:iCs/>
-        </w:rPr>
-        <w:t>figure caption</w:t>
-      </w:r>
-      <w:r>
-        <w:rPr>
-          <w:iCs/>
-        </w:rPr>
-        <w:t>)</w:t>
-      </w:r>
-    </w:p>
-    <w:p>
-      <w:pPr>
-        <w:pStyle w:val="a3"/>
-      </w:pPr>
-      <w:r>
-        <w:t>Figure Labels: Use 8 point Times New Roman for Figure labels. Use words rather than symbols or abbreviations when writing Figure axis labels to avoid confusing the reader. As an example, write the quantity “Magnetization”, or “Magnetization, M”, not just “M”. If including units in the label, present them within parentheses. Do not label axes only with units. In the example, write “Magnetization (A/m)” or “Magnetization {A[m(1)]}”, not just “A/m”. Do not label axes</w:t>
-      </w:r>
-      <w:r>
-        <w:t xml:space="preserve"> </w:t>
-      </w:r>
-      <w:r>
-        <w:t>with a ratio of quantities and units. For example, write “Temperature (K)”, not “Temperature/K”.</w:t>
-      </w:r>
-    </w:p>
-    <w:p>
-      <w:pPr>
-        <w:pStyle w:val="5"/>
-      </w:pPr>
-      <w:r>
-        <w:t>Acknowledgment</w:t>
-      </w:r>
-      <w:r>
-        <w:t xml:space="preserve"> </w:t>
-      </w:r>
-      <w:r>
-        <w:rPr>
-          <w:i/>
-          <w:iCs/>
-        </w:rPr>
-        <w:t>(</w:t>
-      </w:r>
-      <w:r>
-        <w:rPr>
-          <w:i/>
-          <w:iCs/>
-          <w:smallCaps w:val="0"/>
-        </w:rPr>
-        <w:t>Heading 5</w:t>
-      </w:r>
-      <w:r>
-        <w:rPr>
-          <w:i/>
-          <w:iCs/>
-        </w:rPr>
-        <w:t>)</w:t>
-      </w:r>
-    </w:p>
-    <w:p>
-      <w:pPr>
-        <w:pStyle w:val="a3"/>
-      </w:pPr>
-      <w:r>
-        <w:t>The preferred spelling of the word “acknowledgment” in America is without an “e” after the “g</w:t>
-      </w:r>
-      <w:r>
-        <w:t>”. Avoid the stilted expression “</w:t>
-      </w:r>
-      <w:proofErr w:type="spellStart"/>
-      <w:r>
-        <w:rPr>
-          <w:lang w:val="en-US"/>
-        </w:rPr>
-        <w:t>o</w:t>
-      </w:r>
-      <w:r>
-        <w:t>ne</w:t>
-      </w:r>
-      <w:proofErr w:type="spellEnd"/>
-      <w:r>
-        <w:t xml:space="preserve"> of us (R. B. G.) thanks </w:t>
-      </w:r>
-      <w:r>
-        <w:t>...</w:t>
-      </w:r>
-      <w:r>
-        <w:rPr>
-          <w:lang w:val="en-US"/>
-        </w:rPr>
-        <w:t xml:space="preserve">”.  </w:t>
-      </w:r>
-      <w:r>
-        <w:t>Instead, try “R. B. G. thanks</w:t>
-      </w:r>
-      <w:r>
-        <w:t>...</w:t>
-      </w:r>
-      <w:r>
-        <w:t>”.</w:t>
-      </w:r>
-      <w:r>
-        <w:rPr>
-          <w:lang w:val="en-US"/>
-        </w:rPr>
-        <w:t xml:space="preserve"> </w:t>
-      </w:r>
-      <w:r>
-        <w:t>Put spons</w:t>
-      </w:r>
-      <w:r>
-        <w:t>or acknowledgments in the unnum</w:t>
-      </w:r>
-      <w:r>
-        <w:t>bered footnote on the first page.</w:t>
-      </w:r>
-    </w:p>
-    <w:p>
-      <w:pPr>
-        <w:pStyle w:val="5"/>
-      </w:pPr>
-      <w:r>
-        <w:t>References</w:t>
-      </w:r>
-    </w:p>
-    <w:p>
-      <w:pPr>
-        <w:pStyle w:val="a3"/>
-      </w:pPr>
-      <w:r>
-        <w:t>The template will number citations consecutively within brackets [1]. The sentence punctuation follows the bracket [2]. Refer simply to the reference number, as in [3]—do not use “</w:t>
-      </w:r>
-    </w:p>
-    <w:p/>
-    <w:p>
-      <w:pPr>
-        <w:pStyle w:val="references"/>
-        <w:ind w:start="17.70pt" w:hanging="17.70pt"/>
-      </w:pPr>
-      <w:r>
-        <w:t xml:space="preserve">G. Eason, B. Noble, and I. N. Sneddon, “On certain integrals of Lipschitz-Hankel type involving products of Bessel functions,” Phil. Trans. Roy. Soc. London, vol. A247, pp. 529–551, April 1955. </w:t>
-      </w:r>
-      <w:r>
-        <w:rPr>
-          <w:i/>
-          <w:iCs/>
-        </w:rPr>
-        <w:t>(references)</w:t>
-      </w:r>
-    </w:p>
-    <w:p>
-      <w:pPr>
-        <w:pStyle w:val="references"/>
-        <w:ind w:start="17.70pt" w:hanging="17.70pt"/>
-      </w:pPr>
-      <w:r>
-        <w:t>J. Clerk Maxwell, A Treatise on Electricity and Magnetism, 3rd ed., vol. 2. Oxford: Clarendon, 1892, pp.68–73.</w:t>
-      </w:r>
-    </w:p>
-    <w:p>
-      <w:pPr>
-        <w:pStyle w:val="references"/>
-        <w:ind w:start="17.70pt" w:hanging="17.70pt"/>
-      </w:pPr>
-      <w:r>
-        <w:t>I. S. Jacobs and C. P. Bean, “Fine particles, thin films and exchange anisotropy,” in Magnetism, vol. III, G. T. Rado and H. Suhl, Eds. New York: Academic, 1963, pp. 271–350.</w:t>
-      </w:r>
-    </w:p>
-    <w:p>
-      <w:pPr>
-        <w:pStyle w:val="references"/>
-        <w:ind w:start="17.70pt" w:hanging="17.70pt"/>
-      </w:pPr>
-      <w:r>
-        <w:t>K. Elissa, “Title of paper if known,” unpublished.</w:t>
-      </w:r>
-    </w:p>
-    <w:p>
-      <w:pPr>
-        <w:pStyle w:val="references"/>
-        <w:ind w:start="17.70pt" w:hanging="17.70pt"/>
-      </w:pPr>
-      <w:r>
-        <w:t>R. Nicole, “Title of paper with only first word capitalized,” J. Name Stand. Abbrev., in press.</w:t>
-      </w:r>
-    </w:p>
-    <w:p>
-      <w:pPr>
-        <w:pStyle w:val="references"/>
-        <w:ind w:start="17.70pt" w:hanging="17.70pt"/>
-      </w:pPr>
-      <w:r>
-        <w:t>Y. Yorozu, M. Hirano, K. Oka, and Y. Tagawa, “Electron spectroscopy studies on magneto-optical media and plastic substrate interface,” IEEE Transl. J. Magn. Japan, vol. 2, pp. 740–741, August 1987 [Digests 9th Annual Conf. Magnetics Japan, p. 301, 1982].</w:t>
-      </w:r>
-    </w:p>
-    <w:p>
-      <w:pPr>
-        <w:pStyle w:val="references"/>
-        <w:ind w:start="17.70pt" w:hanging="17.70pt"/>
-      </w:pPr>
-      <w:r>
-        <w:t>M. Young, The Technical Writer</w:t>
-      </w:r>
-      <w:r>
-        <w:t>’</w:t>
-      </w:r>
-      <w:r>
-        <w:t>s Handbook. Mill Valley, CA: University Science, 1989.</w:t>
-      </w:r>
+          <w:lang w:eastAsia="zh-CN"/>
+        </w:rPr>
+      </w:pPr>
     </w:p>
     <w:p>
       <w:pPr>
@@ -2246,90 +875,13 @@
           <w:ilvl w:val="0"/>
           <w:numId w:val="0"/>
         </w:numPr>
-        <w:ind w:start="18pt" w:hanging="18pt"/>
-      </w:pPr>
-    </w:p>
-    <w:p>
-      <w:pPr>
-        <w:pStyle w:val="references"/>
-        <w:numPr>
-          <w:ilvl w:val="0"/>
-          <w:numId w:val="0"/>
-        </w:numPr>
-        <w:spacing w:line="12pt" w:lineRule="auto"/>
-        <w:ind w:start="18pt" w:hanging="18pt"/>
-        <w:jc w:val="center"/>
-        <w:rPr>
-          <w:rFonts w:eastAsia="宋体"/>
-          <w:b/>
-          <w:noProof w:val="0"/>
-          <w:color w:val="FF0000"/>
-          <w:spacing w:val="-1"/>
-          <w:sz w:val="20"/>
-          <w:szCs w:val="20"/>
-          <w:lang w:val="x-none" w:eastAsia="x-none"/>
-        </w:rPr>
-        <w:sectPr>
-          <w:type w:val="continuous"/>
-          <w:pgSz w:w="595.30pt" w:h="841.90pt" w:code="9"/>
-          <w:pgMar w:top="54pt" w:right="45.35pt" w:bottom="72pt" w:left="45.35pt" w:header="36pt" w:footer="36pt" w:gutter="0pt"/>
-          <w:cols w:num="2" w:space="18pt"/>
-          <w:docGrid w:linePitch="360"/>
-        </w:sectPr>
-      </w:pPr>
-      <w:r>
-        <w:rPr>
-          <w:rFonts w:eastAsia="宋体"/>
-          <w:b/>
-          <w:noProof w:val="0"/>
-          <w:color w:val="FF0000"/>
-          <w:spacing w:val="-1"/>
-          <w:sz w:val="20"/>
-          <w:szCs w:val="20"/>
-          <w:lang w:val="x-none" w:eastAsia="x-none"/>
-        </w:rPr>
-        <w:t xml:space="preserve">IEEE conference templates contain guidance text for composing and formatting conference papers. Please ensure that all template text is removed from your conference paper prior to submission to the conference. Failure to remove template text from your paper </w:t>
-      </w:r>
-      <w:r>
-        <w:rPr>
-          <w:rFonts w:eastAsia="宋体"/>
-          <w:b/>
-          <w:noProof w:val="0"/>
-          <w:color w:val="FF0000"/>
-          <w:spacing w:val="-1"/>
-          <w:sz w:val="20"/>
-          <w:szCs w:val="20"/>
-          <w:lang w:eastAsia="x-none"/>
-        </w:rPr>
-        <w:t>may</w:t>
-      </w:r>
-      <w:r>
-        <w:rPr>
-          <w:rFonts w:eastAsia="宋体"/>
-          <w:b/>
-          <w:noProof w:val="0"/>
-          <w:color w:val="FF0000"/>
-          <w:spacing w:val="-1"/>
-          <w:sz w:val="20"/>
-          <w:szCs w:val="20"/>
-          <w:lang w:val="x-none" w:eastAsia="x-none"/>
-        </w:rPr>
-        <w:t xml:space="preserve"> result in your paper not being published.</w:t>
-      </w:r>
-    </w:p>
-    <w:p>
-      <w:pPr>
-        <w:rPr>
-          <w:rFonts w:hint="eastAsia"/>
-          <w:lang w:eastAsia="zh-CN"/>
-        </w:rPr>
       </w:pPr>
     </w:p>
     <w:sectPr>
       <w:type w:val="continuous"/>
       <w:pgSz w:w="595.30pt" w:h="841.90pt" w:code="9"/>
       <w:pgMar w:top="54pt" w:right="44.65pt" w:bottom="72pt" w:left="44.65pt" w:header="36pt" w:footer="36pt" w:gutter="0pt"/>
-      <w:cols w:space="36pt"/>
+      <w:cols w:num="2" w:space="16pt"/>
       <w:docGrid w:linePitch="360"/>
     </w:sectPr>
   </w:body>
@@ -3680,7 +2232,7 @@
       <w:lvlJc w:val="start"/>
       <w:pPr>
         <w:tabs>
-          <w:tab w:val="num" w:pos="31.50pt"/>
+          <w:tab w:val="num" w:pos="41.90pt"/>
         </w:tabs>
         <w:ind w:firstLine="18pt"/>
       </w:pPr>
@@ -4469,6 +3021,7 @@
     <w:name w:val="heading 1"/>
     <w:basedOn w:val="a"/>
     <w:next w:val="a"/>
+    <w:link w:val="10"/>
     <w:qFormat/>
     <w:rsid w:val="006B6B66"/>
     <w:pPr>
@@ -4550,7 +3103,7 @@
         <w:numId w:val="4"/>
       </w:numPr>
       <w:tabs>
-        <w:tab w:val="clear" w:pos="31.50pt"/>
+        <w:tab w:val="clear" w:pos="41.90pt"/>
         <w:tab w:val="start" w:pos="36pt"/>
       </w:tabs>
       <w:spacing w:before="2pt" w:after="2pt"/>
@@ -4917,6 +3470,27 @@
       <w:color w:val="666666"/>
     </w:rPr>
   </w:style>
+  <w:style w:type="paragraph" w:styleId="ab">
+    <w:name w:val="caption"/>
+    <w:basedOn w:val="a"/>
+    <w:next w:val="a"/>
+    <w:unhideWhenUsed/>
+    <w:qFormat/>
+    <w:rsid w:val="002238CD"/>
+    <w:rPr>
+      <w:rFonts w:asciiTheme="majorHAnsi" w:eastAsia="黑体" w:hAnsiTheme="majorHAnsi" w:cstheme="majorBidi"/>
+    </w:rPr>
+  </w:style>
+  <w:style w:type="character" w:customStyle="1" w:styleId="10">
+    <w:name w:val="标题 1 字符"/>
+    <w:basedOn w:val="a0"/>
+    <w:link w:val="1"/>
+    <w:rsid w:val="002238CD"/>
+    <w:rPr>
+      <w:smallCaps/>
+      <w:noProof/>
+    </w:rPr>
+  </w:style>
 </w:styles>
 </file>
 

</xml_diff>

<commit_message>
Update CHAMP manuscript and architecture figures
</commit_message>
<xml_diff>
--- a/DAC/paper/CHAMP_v1.docx
+++ b/DAC/paper/CHAMP_v1.docx
@@ -109,41 +109,19 @@
       <w:pPr>
         <w:pStyle w:val="a3"/>
         <w:rPr>
-          <w:lang w:val="en-US"/>
-        </w:rPr>
-      </w:pPr>
-      <w:r>
-        <w:rPr>
-          <w:lang w:val="en-US"/>
-        </w:rPr>
-        <w:t>Modern computing platforms are evolving toward increasingly large-scale and highly parallel architectures, including many-core processors, GPUs, wafer-scale accelerators, and neuromorphic systems. As illustrated in Fig. 1</w:t>
-      </w:r>
-      <w:r>
-        <w:rPr>
-          <w:rFonts w:hint="eastAsia"/>
-          <w:lang w:val="en-US" w:eastAsia="zh-CN"/>
-        </w:rPr>
-        <w:t>(</w:t>
-      </w:r>
-      <w:r>
-        <w:rPr>
-          <w:rFonts w:hint="eastAsia"/>
-          <w:lang w:val="en-US" w:eastAsia="zh-CN"/>
-        </w:rPr>
-        <w:t>a</w:t>
-      </w:r>
-      <w:r>
-        <w:rPr>
-          <w:rFonts w:hint="eastAsia"/>
-          <w:lang w:val="en-US" w:eastAsia="zh-CN"/>
-        </w:rPr>
-        <w:t>)</w:t>
-      </w:r>
-      <w:r>
-        <w:rPr>
-          <w:lang w:val="en-US"/>
-        </w:rPr>
-        <w:t>, representative platforms have substantially expanded their computing resources and processing capabilities, alongside rising chip-to-chip bandwidth. These trends place growing demands on data movement and communication among processing elements, making the on-chip interconnect a critical factor in overall system performance. Consequently, networks-on-chip (NoCs) must provide low-latency, high-throughput, and energy-efficient communication while remaining scalable to larger systems.</w:t>
+          <w:lang w:eastAsia="zh-CN"/>
+        </w:rPr>
+      </w:pPr>
+      <w:r>
+        <w:t>Modern computing platforms are evolving toward increasingly large-scale and highly parallel architectures, including many-core processors [6], [7], GPUs [8], [9], wafer-scale accelerators [12], [13], and neuromorphic systems [14], [15]. As illustrated in Fig. 1(a), representative platforms have substantially expanded their computing resources and processing capabilities [6]–[9], [14]–[17], alongside rising chip-to-chip bandwidth [10], [11]. These trends place growing demands on data movement and communication among processing elements, making the on-chip interconnect a critical factor in overall system performance [3]–[5]. Consequently, networks-on-chip (</w:t>
+      </w:r>
+      <w:proofErr w:type="spellStart"/>
+      <w:r>
+        <w:t>NoCs</w:t>
+      </w:r>
+      <w:proofErr w:type="spellEnd"/>
+      <w:r>
+        <w:t>) must provide low-latency, high-throughput, and energy-efficient communication while remaining scalable to larger systems.</w:t>
       </w:r>
     </w:p>
     <w:p>
@@ -278,62 +256,6 @@
       </w:pPr>
       <w:r>
         <w:rPr>
-          <w:rFonts w:hint="eastAsia"/>
-          <w:noProof/>
-          <w:lang w:eastAsia="zh-CN"/>
-        </w:rPr>
-        <w:drawing>
-          <wp:anchor distT="0" distB="0" distL="114300" distR="114300" simplePos="0" relativeHeight="251658240" behindDoc="0" locked="0" layoutInCell="1" allowOverlap="1" wp14:anchorId="2A218742" wp14:editId="489E02F2">
-            <wp:simplePos x="0" y="0"/>
-            <wp:positionH relativeFrom="margin">
-              <wp:align>left</wp:align>
-            </wp:positionH>
-            <wp:positionV relativeFrom="margin">
-              <wp:posOffset>5074595</wp:posOffset>
-            </wp:positionV>
-            <wp:extent cx="6426200" cy="4037330"/>
-            <wp:effectExtent l="0" t="0" r="0" b="1270"/>
-            <wp:wrapTopAndBottom/>
-            <wp:docPr id="149972028" name="图形 2"/>
-            <wp:cNvGraphicFramePr>
-              <a:graphicFrameLocks xmlns:a="http://purl.oclc.org/ooxml/drawingml/main" noChangeAspect="1"/>
-            </wp:cNvGraphicFramePr>
-            <a:graphic xmlns:a="http://purl.oclc.org/ooxml/drawingml/main">
-              <a:graphicData uri="http://purl.oclc.org/ooxml/drawingml/picture">
-                <pic:pic xmlns:pic="http://purl.oclc.org/ooxml/drawingml/picture">
-                  <pic:nvPicPr>
-                    <pic:cNvPr id="149972028" name="图形 149972028"/>
-                    <pic:cNvPicPr/>
-                  </pic:nvPicPr>
-                  <pic:blipFill>
-                    <a:blip r:embed="rId9">
-                      <a:extLst>
-                        <a:ext uri="{96DAC541-7B7A-43D3-8B79-37D633B846F1}">
-                          <asvg:svgBlip xmlns:asvg="http://schemas.microsoft.com/office/drawing/2016/SVG/main" r:embed="rId10"/>
-                        </a:ext>
-                      </a:extLst>
-                    </a:blip>
-                    <a:stretch>
-                      <a:fillRect/>
-                    </a:stretch>
-                  </pic:blipFill>
-                  <pic:spPr>
-                    <a:xfrm>
-                      <a:off x="0" y="0"/>
-                      <a:ext cx="6426200" cy="4037330"/>
-                    </a:xfrm>
-                    <a:prstGeom prst="rect">
-                      <a:avLst/>
-                    </a:prstGeom>
-                  </pic:spPr>
-                </pic:pic>
-              </a:graphicData>
-            </a:graphic>
-          </wp:anchor>
-        </w:drawing>
-      </w:r>
-      <w:r>
-        <w:rPr>
           <w:lang w:val="en-US" w:eastAsia="zh-CN"/>
         </w:rPr>
         <w:t xml:space="preserve">where </w:t>
@@ -444,108 +366,7 @@
         <w:rPr>
           <w:lang w:val="en-US" w:eastAsia="zh-CN"/>
         </w:rPr>
-        <w:t xml:space="preserve">the delay caused by contention and queuing. This simplified model treats packet serialization as a common offset under a fixed packet and channel configuration. It highlights three coupled design factors: network topology determines routing paths and resource distribution; router microarchitecture affects both per-hop delay and </w:t>
-      </w:r>
-      <w:r>
-        <w:rPr>
-          <w:lang w:val="en-US" w:eastAsia="zh-CN"/>
-        </w:rPr>
-        <w:t>contention through arbitration, buffering, and parallel transmission capacity; and traffic patterns further influence resource utilization and queuing. Therefore, optimizing these factors jointly is essential for scalable, low-latency communication.</w:t>
-      </w:r>
-    </w:p>
-    <w:p>
-      <w:pPr>
-        <w:pStyle w:val="a3"/>
-        <w:rPr>
-          <w:lang w:eastAsia="zh-CN"/>
-        </w:rPr>
-      </w:pPr>
-      <w:r>
-        <w:rPr>
-          <w:lang w:eastAsia="zh-CN"/>
-        </w:rPr>
-        <w:t xml:space="preserve">Prior NoC studies have pursued scalability through network topology, router microarchitecture, and multicast routing. Regular meshes provide simple connectivity but incur increasing hop counts at scale, motivating hierarchical and link-augmented topologies [5], [20]–[23]. These approaches involve distinct tradeoffs: long-range links consume additional wiring resources, while conventional fat-tree scaling increases upper-level router width and arbitration complexity [1], [31]. The resulting per-hop delay can erode the latency savings of reduced hop counts, while increased link capacity does not necessarily translate into higher delivered throughput. At the microarchitectural level, two-phase bundled-data switches, replicated-switch designs, Click-based controllers, and continuous-time replication have improved asynchronous forwarding and multicast buffering [3], [24]–[26]. However, distributing bandwidth across dynamically selected physical lanes requires careful coordination of packet-level arbitration and two-phase handshake states. Meanwhile, existing multicast schemes, including destination bitmaps, subtree broadcasting, and hybrid path/tree routing, enable in-network replication [27]–[30], [34]. These approaches exhibit different tradeoffs among destination-encoding overhead, replication selectivity, and network traffic [39]. In particular, efficient region-oriented multicast requires compact addressing and selective branching across network levels, while the absence </w:t>
-      </w:r>
-      <w:r>
-        <w:rPr>
-          <w:lang w:eastAsia="zh-CN"/>
-        </w:rPr>
-        <w:lastRenderedPageBreak/>
-        <w:t>of native replication can amplify traffic through repeated unicast. Together, these considerations motivate the co-design of hierarchical connectivity, parallel-router resources, and region-aware multicast routing.</w:t>
-      </w:r>
-    </w:p>
-    <w:p>
-      <w:pPr>
-        <w:pStyle w:val="a3"/>
-        <w:ind w:firstLine="0pt"/>
-        <w:rPr>
-          <w:lang w:val="en-US" w:eastAsia="zh-CN"/>
-        </w:rPr>
-      </w:pPr>
-      <w:r>
-        <w:rPr>
-          <w:lang w:eastAsia="zh-CN"/>
-        </w:rPr>
-        <w:tab/>
-      </w:r>
-      <w:r>
-        <w:rPr>
-          <w:lang w:val="en-US" w:eastAsia="zh-CN"/>
-        </w:rPr>
-        <w:t>Despite these advances, existing NoC architectures face three key challenges</w:t>
-      </w:r>
-      <w:r>
-        <w:rPr>
-          <w:rFonts w:hint="eastAsia"/>
-          <w:lang w:val="en-US" w:eastAsia="zh-CN"/>
-        </w:rPr>
-        <w:t>, as illustrated in Fig.1(b)-(f)</w:t>
-      </w:r>
-      <w:r>
-        <w:rPr>
-          <w:lang w:val="en-US" w:eastAsia="zh-CN"/>
-        </w:rPr>
-        <w:t xml:space="preserve">. First, flat 2-D meshes incur increasing communication distances as the network scales: the analytical average hop count grows from 5.3 at 64 nodes to 10.7 at 256 nodes. Second, fat-tree architectures widen upper-level routers to increase bisection bandwidth, but the resulting router complexity and arbitration overhead limit the benefits of link fattening. In the evaluated 64-node unicast benchmark, the fat-tree achieves a peak delivered-copy throughput of 145 Mflit/s/port, 33% lower than the mesh's 215 Mflit/s/port. Third, without native multicast support, repeated unicast generates separate packets for individual destinations, amplifying network traffic and contention. Under the evaluated All-Multicast workloads, </w:t>
-      </w:r>
-      <w:r>
-        <w:rPr>
-          <w:rFonts w:hint="eastAsia"/>
-          <w:lang w:val="en-US" w:eastAsia="zh-CN"/>
-        </w:rPr>
-        <w:t>average</w:t>
-      </w:r>
-      <w:r>
-        <w:rPr>
-          <w:lang w:val="en-US" w:eastAsia="zh-CN"/>
-        </w:rPr>
-        <w:t xml:space="preserve"> </w:t>
-      </w:r>
-      <w:r>
-        <w:rPr>
-          <w:rFonts w:hint="eastAsia"/>
-          <w:lang w:val="en-US" w:eastAsia="zh-CN"/>
-        </w:rPr>
-        <w:t>packet</w:t>
-      </w:r>
-      <w:r>
-        <w:rPr>
-          <w:lang w:val="en-US" w:eastAsia="zh-CN"/>
-        </w:rPr>
-        <w:t xml:space="preserve"> latency increases from 11.0 to 59.3 ns at 64 nodes and from 19.6 to 573.0 ns at 256 nodes when repeated unicast replaces native multicast. These challenges motivate an architecture that reduces communication distance, scales bandwidth without excessively widening routers, and supports efficient in-network multicast.</w:t>
-      </w:r>
-    </w:p>
-    <w:p>
-      <w:pPr>
-        <w:pStyle w:val="a3"/>
-        <w:rPr>
-          <w:lang w:val="en-US" w:eastAsia="zh-CN"/>
-        </w:rPr>
-      </w:pPr>
-      <w:r>
-        <w:rPr>
-          <w:lang w:val="en-US" w:eastAsia="zh-CN"/>
-        </w:rPr>
-        <w:t xml:space="preserve">To address these challenges, we propose </w:t>
+        <w:t xml:space="preserve">the delay caused by contention and queuing. It highlights three coupled design factors: </w:t>
       </w:r>
       <w:r>
         <w:rPr>
@@ -553,30 +374,468 @@
           <w:bCs/>
           <w:lang w:val="en-US" w:eastAsia="zh-CN"/>
         </w:rPr>
-        <w:t>CHAMP (Click-based Hierarchical Asynchronous Multicast with Parallel Routers)</w:t>
+        <w:t>network topology</w:t>
       </w:r>
       <w:r>
         <w:rPr>
           <w:lang w:val="en-US" w:eastAsia="zh-CN"/>
         </w:rPr>
-        <w:t>, a scalable asynchronous NoC architecture featuring the following three key contributions:</w:t>
-      </w:r>
-    </w:p>
-    <w:p>
-      <w:pPr>
-        <w:pStyle w:val="a3"/>
+        <w:t xml:space="preserve"> </w:t>
+      </w:r>
+      <w:r>
+        <w:rPr>
+          <w:lang w:eastAsia="zh-CN"/>
+        </w:rPr>
+        <w:t>Network topology determines both the number of hops and how traffic is distributed across network resources, affecting communication distance and potential bottlenecks</w:t>
+      </w:r>
+      <w:r>
         <w:rPr>
           <w:lang w:val="en-US" w:eastAsia="zh-CN"/>
         </w:rPr>
-      </w:pPr>
+        <w:t xml:space="preserve">; </w:t>
+      </w:r>
       <w:r>
         <w:rPr>
           <w:b/>
           <w:bCs/>
           <w:lang w:val="en-US" w:eastAsia="zh-CN"/>
         </w:rPr>
-        <w:t>R1:</w:t>
-      </w:r>
+        <w:t>router microarchitecture</w:t>
+      </w:r>
+      <w:r>
+        <w:rPr>
+          <w:lang w:val="en-US" w:eastAsia="zh-CN"/>
+        </w:rPr>
+        <w:t xml:space="preserve"> affects both per-hop delay and contention through arbitration, buffering, and parallel transmission capacity; and </w:t>
+      </w:r>
+      <w:r>
+        <w:rPr>
+          <w:b/>
+          <w:bCs/>
+          <w:lang w:val="en-US" w:eastAsia="zh-CN"/>
+        </w:rPr>
+        <w:t>traffic patterns</w:t>
+      </w:r>
+      <w:r>
+        <w:rPr>
+          <w:rFonts w:ascii="宋体" w:hAnsi="宋体" w:cs="宋体" w:hint="eastAsia"/>
+          <w:b/>
+          <w:bCs/>
+          <w:sz w:val="24"/>
+          <w:szCs w:val="24"/>
+          <w:lang w:val="en-US" w:eastAsia="zh-CN"/>
+        </w:rPr>
+        <w:t xml:space="preserve"> </w:t>
+      </w:r>
+      <w:r>
+        <w:rPr>
+          <w:lang w:eastAsia="zh-CN"/>
+        </w:rPr>
+        <w:t>determine how communication flows share network resources and compete for service, thereby influencing contention and queuing delay</w:t>
+      </w:r>
+      <w:r>
+        <w:rPr>
+          <w:rFonts w:hint="eastAsia"/>
+          <w:lang w:eastAsia="zh-CN"/>
+        </w:rPr>
+        <w:t>.</w:t>
+      </w:r>
+      <w:r>
+        <w:rPr>
+          <w:spacing w:val="0"/>
+          <w:lang w:val="en-US" w:eastAsia="en-US"/>
+        </w:rPr>
+        <w:t xml:space="preserve"> </w:t>
+      </w:r>
+      <w:r>
+        <w:rPr>
+          <w:lang w:val="en-US" w:eastAsia="zh-CN"/>
+        </w:rPr>
+        <w:t>These factors are closely coupled: reducing hop count alone may not improve end-to-end latency if the resulting architecture incurs excessive per-hop delay or resource contention. Scalable NoC design therefore requires coordinated optimization of communication paths, router resources, and traffic handling.</w:t>
+      </w:r>
+      <w:r>
+        <w:rPr>
+          <w:lang w:val="en-US" w:eastAsia="zh-CN"/>
+        </w:rPr>
+        <w:t xml:space="preserve"> </w:t>
+      </w:r>
+    </w:p>
+    <w:p>
+      <w:pPr>
+        <w:pStyle w:val="a3"/>
+        <w:rPr>
+          <w:lang w:val="en-US" w:eastAsia="zh-CN"/>
+        </w:rPr>
+      </w:pPr>
+      <w:r>
+        <w:rPr>
+          <w:lang w:val="en-US" w:eastAsia="zh-CN"/>
+        </w:rPr>
+        <w:t xml:space="preserve">Despite the need for scalable on-chip communication, existing </w:t>
+      </w:r>
+      <w:proofErr w:type="spellStart"/>
+      <w:r>
+        <w:rPr>
+          <w:lang w:val="en-US" w:eastAsia="zh-CN"/>
+        </w:rPr>
+        <w:t>NoCs</w:t>
+      </w:r>
+      <w:proofErr w:type="spellEnd"/>
+      <w:r>
+        <w:rPr>
+          <w:lang w:val="en-US" w:eastAsia="zh-CN"/>
+        </w:rPr>
+        <w:t xml:space="preserve"> face three key challenges, as illustrated in Fig. 1(b)–(d). </w:t>
+      </w:r>
+    </w:p>
+    <w:p>
+      <w:pPr>
+        <w:pStyle w:val="a3"/>
+        <w:rPr>
+          <w:lang w:val="en-US" w:eastAsia="zh-CN"/>
+        </w:rPr>
+      </w:pPr>
+      <w:r>
+        <w:rPr>
+          <w:b/>
+          <w:bCs/>
+          <w:lang w:val="en-US" w:eastAsia="zh-CN"/>
+        </w:rPr>
+        <w:t>First,</w:t>
+      </w:r>
+      <w:r>
+        <w:rPr>
+          <w:lang w:val="en-US" w:eastAsia="zh-CN"/>
+        </w:rPr>
+        <w:t xml:space="preserve"> </w:t>
+      </w:r>
+      <w:r>
+        <w:rPr>
+          <w:lang w:val="en-US" w:eastAsia="zh-CN"/>
+        </w:rPr>
+        <w:t>a regular 2-D mesh, the average hop count grows proportionally to the square root of the network size, following</w:t>
+      </w:r>
+      <w:r>
+        <w:rPr>
+          <w:rFonts w:hint="eastAsia"/>
+          <w:lang w:val="en-US" w:eastAsia="zh-CN"/>
+        </w:rPr>
+        <w:t xml:space="preserve"> </w:t>
+      </w:r>
+      <m:oMath>
+        <m:sSub>
+          <m:sSubPr>
+            <m:ctrlPr>
+              <w:rPr>
+                <w:rFonts w:ascii="Cambria Math" w:hAnsi="Cambria Math"/>
+              </w:rPr>
+            </m:ctrlPr>
+          </m:sSubPr>
+          <m:e>
+            <m:acc>
+              <m:accPr>
+                <m:chr m:val="̅"/>
+                <m:ctrlPr>
+                  <w:rPr>
+                    <w:rFonts w:ascii="Cambria Math" w:hAnsi="Cambria Math"/>
+                  </w:rPr>
+                </m:ctrlPr>
+              </m:accPr>
+              <m:e>
+                <m:r>
+                  <w:rPr>
+                    <w:rFonts w:ascii="Cambria Math" w:hAnsi="Cambria Math"/>
+                  </w:rPr>
+                  <m:t>H</m:t>
+                </m:r>
+              </m:e>
+            </m:acc>
+          </m:e>
+          <m:sub>
+            <m:r>
+              <m:rPr>
+                <m:sty m:val="p"/>
+              </m:rPr>
+              <w:rPr>
+                <w:rFonts w:ascii="Cambria Math" w:hAnsi="Cambria Math"/>
+              </w:rPr>
+              <m:t>Mesh</m:t>
+            </m:r>
+          </m:sub>
+        </m:sSub>
+        <m:d>
+          <m:dPr>
+            <m:ctrlPr>
+              <w:rPr>
+                <w:rFonts w:ascii="Cambria Math" w:hAnsi="Cambria Math"/>
+              </w:rPr>
+            </m:ctrlPr>
+          </m:dPr>
+          <m:e>
+            <m:r>
+              <w:rPr>
+                <w:rFonts w:ascii="Cambria Math" w:hAnsi="Cambria Math"/>
+              </w:rPr>
+              <m:t>N</m:t>
+            </m:r>
+          </m:e>
+        </m:d>
+        <m:r>
+          <w:rPr>
+            <w:rFonts w:ascii="Cambria Math" w:hAnsi="Cambria Math"/>
+          </w:rPr>
+          <m:t>=</m:t>
+        </m:r>
+        <m:f>
+          <m:fPr>
+            <m:ctrlPr>
+              <w:rPr>
+                <w:rFonts w:ascii="Cambria Math" w:hAnsi="Cambria Math"/>
+              </w:rPr>
+            </m:ctrlPr>
+          </m:fPr>
+          <m:num>
+            <m:r>
+              <w:rPr>
+                <w:rFonts w:ascii="Cambria Math" w:hAnsi="Cambria Math"/>
+              </w:rPr>
+              <m:t>2</m:t>
+            </m:r>
+          </m:num>
+          <m:den>
+            <m:r>
+              <w:rPr>
+                <w:rFonts w:ascii="Cambria Math" w:hAnsi="Cambria Math"/>
+              </w:rPr>
+              <m:t>3</m:t>
+            </m:r>
+          </m:den>
+        </m:f>
+        <m:rad>
+          <m:radPr>
+            <m:degHide m:val="1"/>
+            <m:ctrlPr>
+              <w:rPr>
+                <w:rFonts w:ascii="Cambria Math" w:hAnsi="Cambria Math"/>
+              </w:rPr>
+            </m:ctrlPr>
+          </m:radPr>
+          <m:deg/>
+          <m:e>
+            <m:r>
+              <w:rPr>
+                <w:rFonts w:ascii="Cambria Math" w:hAnsi="Cambria Math"/>
+              </w:rPr>
+              <m:t>N</m:t>
+            </m:r>
+          </m:e>
+        </m:rad>
+      </m:oMath>
+      <w:r>
+        <w:rPr>
+          <w:lang w:val="en-US" w:eastAsia="zh-CN"/>
+        </w:rPr>
+        <w:t xml:space="preserve">, where </w:t>
+      </w:r>
+      <m:oMath>
+        <m:r>
+          <w:rPr>
+            <w:rFonts w:ascii="Cambria Math" w:hAnsi="Cambria Math"/>
+          </w:rPr>
+          <m:t>N</m:t>
+        </m:r>
+      </m:oMath>
+      <w:r>
+        <w:rPr>
+          <w:lang w:val="en-US" w:eastAsia="zh-CN"/>
+        </w:rPr>
+        <w:t xml:space="preserve"> denotes the number of network nodes. This increasing path length contributes to higher communication latency, even with efficient individual routers.</w:t>
+      </w:r>
+    </w:p>
+    <w:p>
+      <w:pPr>
+        <w:pStyle w:val="a3"/>
+        <w:rPr>
+          <w:lang w:val="en-US" w:eastAsia="zh-CN"/>
+        </w:rPr>
+      </w:pPr>
+      <w:r>
+        <w:rPr>
+          <w:lang w:val="en-US" w:eastAsia="zh-CN"/>
+        </w:rPr>
+        <w:t xml:space="preserve"> </w:t>
+      </w:r>
+      <w:r>
+        <w:rPr>
+          <w:b/>
+          <w:bCs/>
+          <w:lang w:val="en-US" w:eastAsia="zh-CN"/>
+        </w:rPr>
+        <w:t>Second,</w:t>
+      </w:r>
+      <w:r>
+        <w:rPr>
+          <w:lang w:val="en-US" w:eastAsia="zh-CN"/>
+        </w:rPr>
+        <w:t xml:space="preserve"> </w:t>
+      </w:r>
+      <w:proofErr w:type="gramStart"/>
+      <w:r>
+        <w:rPr>
+          <w:lang w:val="en-US" w:eastAsia="zh-CN"/>
+        </w:rPr>
+        <w:t>Although</w:t>
+      </w:r>
+      <w:proofErr w:type="gramEnd"/>
+      <w:r>
+        <w:rPr>
+          <w:lang w:val="en-US" w:eastAsia="zh-CN"/>
+        </w:rPr>
+        <w:t xml:space="preserve"> tree hierarchies reduce hop counts, fattening upper-level links increases the number of physical ports and competing requests handled by each router, resulting in more complex arbitration and longer per-hop delays. As shown in Fig. 2(</w:t>
+      </w:r>
+      <w:r>
+        <w:rPr>
+          <w:rFonts w:hint="eastAsia"/>
+          <w:lang w:val="en-US" w:eastAsia="zh-CN"/>
+        </w:rPr>
+        <w:t>c</w:t>
+      </w:r>
+      <w:r>
+        <w:rPr>
+          <w:lang w:val="en-US" w:eastAsia="zh-CN"/>
+        </w:rPr>
+        <w:t xml:space="preserve">), router latency nearly doubles from 0.66 to 1.29 ns/flit as the evaluated </w:t>
+      </w:r>
+      <w:r>
+        <w:rPr>
+          <w:rFonts w:hint="eastAsia"/>
+          <w:lang w:val="en-US" w:eastAsia="zh-CN"/>
+        </w:rPr>
+        <w:t>router</w:t>
+      </w:r>
+      <w:r>
+        <w:rPr>
+          <w:lang w:val="en-US" w:eastAsia="zh-CN"/>
+        </w:rPr>
+        <w:t xml:space="preserve"> widen</w:t>
+      </w:r>
+      <w:r>
+        <w:rPr>
+          <w:rFonts w:hint="eastAsia"/>
+          <w:lang w:val="en-US" w:eastAsia="zh-CN"/>
+        </w:rPr>
+        <w:t>s</w:t>
+      </w:r>
+      <w:r>
+        <w:rPr>
+          <w:lang w:val="en-US" w:eastAsia="zh-CN"/>
+        </w:rPr>
+        <w:t xml:space="preserve">, potentially offsetting the latency benefits of shorter paths. Moreover, the conventional fat-tree achieves only 145 </w:t>
+      </w:r>
+      <w:proofErr w:type="spellStart"/>
+      <w:r>
+        <w:rPr>
+          <w:lang w:val="en-US" w:eastAsia="zh-CN"/>
+        </w:rPr>
+        <w:t>Mflit</w:t>
+      </w:r>
+      <w:proofErr w:type="spellEnd"/>
+      <w:r>
+        <w:rPr>
+          <w:lang w:val="en-US" w:eastAsia="zh-CN"/>
+        </w:rPr>
+        <w:t xml:space="preserve">/s/port, compared </w:t>
+      </w:r>
+      <w:r>
+        <w:rPr>
+          <w:lang w:val="en-US" w:eastAsia="zh-CN"/>
+        </w:rPr>
+        <w:t xml:space="preserve">with 215 </w:t>
+      </w:r>
+      <w:proofErr w:type="spellStart"/>
+      <w:r>
+        <w:rPr>
+          <w:lang w:val="en-US" w:eastAsia="zh-CN"/>
+        </w:rPr>
+        <w:t>Mflit</w:t>
+      </w:r>
+      <w:proofErr w:type="spellEnd"/>
+      <w:r>
+        <w:rPr>
+          <w:lang w:val="en-US" w:eastAsia="zh-CN"/>
+        </w:rPr>
+        <w:t>/s/port for the flat mesh, indicating that additional physical links do not necessarily translate into higher network throughput.</w:t>
+      </w:r>
+    </w:p>
+    <w:p>
+      <w:pPr>
+        <w:pStyle w:val="a3"/>
+        <w:rPr>
+          <w:lang w:val="en-US" w:eastAsia="zh-CN"/>
+        </w:rPr>
+      </w:pPr>
+      <w:r>
+        <w:rPr>
+          <w:lang w:val="en-US" w:eastAsia="zh-CN"/>
+        </w:rPr>
+        <w:t xml:space="preserve"> </w:t>
+      </w:r>
+      <w:r>
+        <w:rPr>
+          <w:b/>
+          <w:bCs/>
+          <w:lang w:val="en-US" w:eastAsia="zh-CN"/>
+        </w:rPr>
+        <w:t>Third,</w:t>
+      </w:r>
+      <w:r>
+        <w:rPr>
+          <w:lang w:val="en-US" w:eastAsia="zh-CN"/>
+        </w:rPr>
+        <w:t xml:space="preserve"> repeated unicast amplifies traffic by sending separate packets to individual destinations. At 256 nodes, average packet latency increases from 57.2 to 573.0 ns as the workload changes from Multicast10 to All-Multicast. </w:t>
+      </w:r>
+    </w:p>
+    <w:p>
+      <w:pPr>
+        <w:pStyle w:val="a3"/>
+        <w:rPr>
+          <w:lang w:val="en-US" w:eastAsia="zh-CN"/>
+        </w:rPr>
+      </w:pPr>
+      <w:r>
+        <w:rPr>
+          <w:lang w:val="en-US" w:eastAsia="zh-CN"/>
+        </w:rPr>
+        <w:t xml:space="preserve">To address these challenges, we propose </w:t>
+      </w:r>
+      <w:r>
+        <w:rPr>
+          <w:b/>
+          <w:bCs/>
+          <w:lang w:val="en-US" w:eastAsia="zh-CN"/>
+        </w:rPr>
+        <w:t>CHAMP</w:t>
+      </w:r>
+      <w:r>
+        <w:rPr>
+          <w:lang w:val="en-US" w:eastAsia="zh-CN"/>
+        </w:rPr>
+        <w:t xml:space="preserve"> (Click-based Hierarchical Asynchronous Multicast with Parallel Routers)</w:t>
+      </w:r>
+      <w:r>
+        <w:rPr>
+          <w:lang w:val="en-US" w:eastAsia="zh-CN"/>
+        </w:rPr>
+        <w:t>, a scalable asynchronous NoC architecture featuring the following three key contributions:</w:t>
+      </w:r>
+    </w:p>
+    <w:p>
+      <w:pPr>
+        <w:pStyle w:val="a3"/>
+        <w:rPr>
+          <w:lang w:eastAsia="zh-CN"/>
+        </w:rPr>
+      </w:pPr>
       <w:r>
         <w:rPr>
           <w:rFonts w:hint="eastAsia"/>
@@ -584,7 +843,7 @@
           <w:bCs/>
           <w:lang w:val="en-US" w:eastAsia="zh-CN"/>
         </w:rPr>
-        <w:t xml:space="preserve"> </w:t>
+        <w:t>R</w:t>
       </w:r>
       <w:r>
         <w:rPr>
@@ -592,50 +851,7 @@
           <w:bCs/>
           <w:lang w:val="en-US" w:eastAsia="zh-CN"/>
         </w:rPr>
-        <w:t>Hierarchical Tree–Mesh Topology.</w:t>
-      </w:r>
-      <w:r>
-        <w:rPr>
-          <w:lang w:val="en-US" w:eastAsia="zh-CN"/>
-        </w:rPr>
-        <w:t xml:space="preserve"> </w:t>
-      </w:r>
-      <w:r>
-        <w:rPr>
-          <w:lang w:val="en-US" w:eastAsia="zh-CN"/>
-        </w:rPr>
-        <w:t>We propose a hierarchical Tree–Mesh interconnect that combines local quadtrees with a global mesh, integrating parallel-router connectivity to reduce communication distance while providing scalable bandwidth through distributed routing resources.</w:t>
-      </w:r>
-      <w:r>
-        <w:rPr>
-          <w:lang w:eastAsia="zh-CN"/>
-        </w:rPr>
-        <w:t xml:space="preserve"> Compared with a flat mesh, the analytical average hop count decreases from 5.3 to 3.4 at 64 nodes (35.8%) and from 10.7 to 6.4 at 256 nodes (40.2%), reducing the hop-dependent component of communication latency as the network scales.</w:t>
-      </w:r>
-    </w:p>
-    <w:p>
-      <w:pPr>
-        <w:pStyle w:val="a3"/>
-        <w:ind w:firstLine="0pt"/>
-        <w:rPr>
-          <w:lang w:val="en-US" w:eastAsia="zh-CN"/>
-        </w:rPr>
-      </w:pPr>
-      <w:r>
-        <w:rPr>
-          <w:b/>
-          <w:bCs/>
-          <w:lang w:val="en-US" w:eastAsia="zh-CN"/>
-        </w:rPr>
-        <w:tab/>
-      </w:r>
-      <w:r>
-        <w:rPr>
-          <w:b/>
-          <w:bCs/>
-          <w:lang w:val="en-US" w:eastAsia="zh-CN"/>
-        </w:rPr>
-        <w:t>R2:</w:t>
+        <w:t>1:</w:t>
       </w:r>
       <w:r>
         <w:rPr>
@@ -652,77 +868,150 @@
           <w:bCs/>
           <w:lang w:val="en-US" w:eastAsia="zh-CN"/>
         </w:rPr>
-        <w:t>Parallel-Router Architecture.</w:t>
-      </w:r>
-      <w:r>
-        <w:rPr>
-          <w:lang w:eastAsia="zh-CN"/>
+        <w:t>Hierarchical Tree–Mesh Topology.</w:t>
+      </w:r>
+      <w:r>
+        <w:rPr>
+          <w:lang w:val="en-US" w:eastAsia="zh-CN"/>
         </w:rPr>
         <w:t xml:space="preserve"> </w:t>
       </w:r>
       <w:r>
         <w:rPr>
-          <w:lang w:val="en-US" w:eastAsia="zh-CN"/>
-        </w:rPr>
-        <w:t>Instead of concentrating bandwidth in increasingly wide routers, CHAMP distributes physical paths across multiple lightweight asynchronous routers and employs dynamic lane allocation to scale aggregate bandwidth. In the evaluated 64-node unicast scan, CHAMP achieves a peak delivered-copy throughput of 346 Mflit/s/port, compared with 215 Mflit/s/port for the mesh, representing a 1.61× increase.</w:t>
+          <w:lang w:eastAsia="zh-CN"/>
+        </w:rPr>
+        <w:t>CHAMP combines local quadtrees with a global mesh and integrates parallel-router connectivity to reduce communication distance. Compared with a flat mesh, the analytical average hop count decreases from 5.3 to 3.4 at 64 nodes (35.8%) and from 10.7 to 6.4 at 256 nodes (40.2%), reducing the hop-dependent component of communication latency as the network scales.</w:t>
       </w:r>
     </w:p>
     <w:p>
       <w:pPr>
         <w:pStyle w:val="a3"/>
         <w:rPr>
+          <w:lang w:eastAsia="zh-CN"/>
+        </w:rPr>
+      </w:pPr>
+      <w:r>
+        <w:rPr>
           <w:rFonts w:hint="eastAsia"/>
-          <w:lang w:eastAsia="zh-CN"/>
-        </w:rPr>
-      </w:pPr>
-      <w:r>
-        <w:rPr>
           <w:b/>
           <w:bCs/>
           <w:lang w:val="en-US" w:eastAsia="zh-CN"/>
         </w:rPr>
-        <w:t>R3: Native Region-Aware Multicast.</w:t>
-      </w:r>
-      <w:r>
-        <w:rPr>
+        <w:t>R</w:t>
+      </w:r>
+      <w:r>
+        <w:rPr>
+          <w:b/>
+          <w:bCs/>
           <w:lang w:val="en-US" w:eastAsia="zh-CN"/>
         </w:rPr>
+        <w:t>2:</w:t>
+      </w:r>
+      <w:r>
+        <w:rPr>
+          <w:rFonts w:hint="eastAsia"/>
+          <w:b/>
+          <w:bCs/>
+          <w:lang w:val="en-US" w:eastAsia="zh-CN"/>
+        </w:rPr>
         <w:t xml:space="preserve"> </w:t>
       </w:r>
       <w:r>
         <w:rPr>
-          <w:lang w:eastAsia="zh-CN"/>
-        </w:rPr>
-        <w:t xml:space="preserve">CHAMP supports native multicast through region-aware destination encoding and selective in-network replication, avoiding the repeated source injection required by unicast emulation. Under the evaluated All-Multicast workloads, CHAMP reduces </w:t>
-      </w:r>
-      <w:r>
-        <w:rPr>
-          <w:rFonts w:hint="eastAsia"/>
-          <w:lang w:eastAsia="zh-CN"/>
-        </w:rPr>
-        <w:t>average packet</w:t>
-      </w:r>
-      <w:r>
-        <w:rPr>
-          <w:lang w:eastAsia="zh-CN"/>
-        </w:rPr>
-        <w:t xml:space="preserve"> latency from 59.3 to 11.0 ns at 64 nodes (5.4× lower) and from 573.0 to 19.6 ns at 256 nodes (29.2× lower) compared with repeated unicast</w:t>
+          <w:b/>
+          <w:bCs/>
+          <w:lang w:val="en-US" w:eastAsia="zh-CN"/>
+        </w:rPr>
+        <w:t>Parallel-Router Architecture.</w:t>
+      </w:r>
+      <w:r>
+        <w:rPr>
+          <w:lang w:eastAsia="zh-CN"/>
+        </w:rPr>
+        <w:t xml:space="preserve"> </w:t>
+      </w:r>
+      <w:r>
+        <w:rPr>
+          <w:lang w:eastAsia="zh-CN"/>
+        </w:rPr>
+        <w:t xml:space="preserve">CHAMP distributes parallel communication resources across multiple lightweight asynchronous routers rather than relying solely on increasing the number of connections handled by a single router. Click-based control and dynamic lane allocation coordinate asynchronous forwarding and access to parallel resources. In the evaluated 64-node unicast benchmark, CHAMP achieves a peak delivered-copy throughput of 346 </w:t>
+      </w:r>
+      <w:proofErr w:type="spellStart"/>
+      <w:r>
+        <w:rPr>
+          <w:lang w:eastAsia="zh-CN"/>
+        </w:rPr>
+        <w:t>Mflit</w:t>
+      </w:r>
+      <w:proofErr w:type="spellEnd"/>
+      <w:r>
+        <w:rPr>
+          <w:lang w:eastAsia="zh-CN"/>
+        </w:rPr>
+        <w:t xml:space="preserve">/s/port, a 1.61× improvement over the mesh baseline of 215 </w:t>
+      </w:r>
+      <w:proofErr w:type="spellStart"/>
+      <w:r>
+        <w:rPr>
+          <w:lang w:eastAsia="zh-CN"/>
+        </w:rPr>
+        <w:t>Mflit</w:t>
+      </w:r>
+      <w:proofErr w:type="spellEnd"/>
+      <w:r>
+        <w:rPr>
+          <w:lang w:eastAsia="zh-CN"/>
+        </w:rPr>
+        <w:t>/s/port.</w:t>
       </w:r>
     </w:p>
     <w:p>
       <w:pPr>
-        <w:pStyle w:val="1"/>
-      </w:pPr>
-      <w:r>
-        <w:rPr>
-          <w:rFonts w:hint="eastAsia"/>
-          <w:lang w:eastAsia="zh-CN"/>
-        </w:rPr>
-        <w:t>Background</w:t>
+        <w:pStyle w:val="a3"/>
+        <w:rPr>
+          <w:lang w:eastAsia="zh-CN"/>
+        </w:rPr>
+      </w:pPr>
+      <w:r>
+        <w:rPr>
+          <w:b/>
+          <w:bCs/>
+          <w:lang w:val="en-US" w:eastAsia="zh-CN"/>
+        </w:rPr>
+        <w:t>R3: Native Region-Aware Multicast.</w:t>
+      </w:r>
+      <w:r>
+        <w:rPr>
+          <w:rFonts w:ascii="宋体" w:hAnsi="宋体" w:cs="宋体"/>
+          <w:b/>
+          <w:bCs/>
+          <w:sz w:val="24"/>
+          <w:szCs w:val="24"/>
+          <w:lang w:eastAsia="zh-CN"/>
+        </w:rPr>
+        <w:t xml:space="preserve"> </w:t>
+      </w:r>
+      <w:r>
+        <w:rPr>
+          <w:lang w:eastAsia="zh-CN"/>
+        </w:rPr>
+        <w:t>CHAMP supports native multicast through region-aware destination encoding and selective in-network replication, avoiding the repeated source injections required by unicast emulation. In the evaluated All-Multicast workloads, CHAMP reduces average packet latency from 59.3 to 11.0 ns at 64 nodes (5.4× lower) and from 573.0 to 19.6 ns at 256 nodes (29.2× lower) compared with repeated unicast.</w:t>
       </w:r>
     </w:p>
     <w:p>
       <w:pPr>
+        <w:pStyle w:val="1"/>
+      </w:pPr>
+      <w:r>
+        <w:rPr>
+          <w:rFonts w:hint="eastAsia"/>
+          <w:lang w:eastAsia="zh-CN"/>
+        </w:rPr>
+        <w:t>Background</w:t>
+      </w:r>
+    </w:p>
+    <w:p>
+      <w:pPr>
         <w:ind w:firstLineChars="142" w:firstLine="14.20pt"/>
         <w:jc w:val="both"/>
         <w:rPr>
@@ -756,13 +1045,21 @@
         <w:rPr>
           <w:lang w:eastAsia="zh-CN"/>
         </w:rPr>
-        <w:t xml:space="preserve">A 2-D Mesh is widely used in NoCs because each router connects only to its neighboring routers, keeping the number </w:t>
-      </w:r>
-      <w:r>
-        <w:rPr>
-          <w:lang w:eastAsia="zh-CN"/>
-        </w:rPr>
-        <w:t>of connections per router small and simplifying physical layout [31].</w:t>
+        <w:t xml:space="preserve">A 2-D Mesh is widely used in </w:t>
+      </w:r>
+      <w:proofErr w:type="spellStart"/>
+      <w:r>
+        <w:rPr>
+          <w:lang w:eastAsia="zh-CN"/>
+        </w:rPr>
+        <w:t>NoCs</w:t>
+      </w:r>
+      <w:proofErr w:type="spellEnd"/>
+      <w:r>
+        <w:rPr>
+          <w:lang w:eastAsia="zh-CN"/>
+        </w:rPr>
+        <w:t xml:space="preserve"> because each router connects only to its neighboring routers, keeping the number of connections per router small and simplifying physical layout [31].</w:t>
       </w:r>
       <w:r>
         <w:rPr>
@@ -1209,7 +1506,270 @@
         <w:rPr>
           <w:lang w:eastAsia="zh-CN"/>
         </w:rPr>
-        <w:t xml:space="preserve">when the per-hop delay remains constant. </w:t>
+        <w:t>when the per-hop delay remains</w:t>
+      </w:r>
+      <w:r>
+        <w:rPr>
+          <w:rFonts w:hint="eastAsia"/>
+          <w:lang w:eastAsia="zh-CN"/>
+        </w:rPr>
+        <w:t xml:space="preserve"> </w:t>
+      </w:r>
+      <w:r>
+        <w:rPr>
+          <w:noProof/>
+          <w:lang w:eastAsia="zh-CN"/>
+        </w:rPr>
+        <w:lastRenderedPageBreak/>
+        <w:drawing>
+          <wp:anchor distT="0" distB="0" distL="114300" distR="114300" simplePos="0" relativeHeight="251661312" behindDoc="0" locked="0" layoutInCell="1" allowOverlap="1" wp14:anchorId="7D913D89" wp14:editId="50AF25C2">
+            <wp:simplePos x="0" y="0"/>
+            <wp:positionH relativeFrom="margin">
+              <wp:align>right</wp:align>
+            </wp:positionH>
+            <wp:positionV relativeFrom="margin">
+              <wp:align>top</wp:align>
+            </wp:positionV>
+            <wp:extent cx="6426200" cy="4037330"/>
+            <wp:effectExtent l="0" t="0" r="0" b="1270"/>
+            <wp:wrapTopAndBottom/>
+            <wp:docPr id="13284158" name="图形 6"/>
+            <wp:cNvGraphicFramePr>
+              <a:graphicFrameLocks xmlns:a="http://purl.oclc.org/ooxml/drawingml/main" noChangeAspect="1"/>
+            </wp:cNvGraphicFramePr>
+            <a:graphic xmlns:a="http://purl.oclc.org/ooxml/drawingml/main">
+              <a:graphicData uri="http://purl.oclc.org/ooxml/drawingml/picture">
+                <pic:pic xmlns:pic="http://purl.oclc.org/ooxml/drawingml/picture">
+                  <pic:nvPicPr>
+                    <pic:cNvPr id="13284158" name="图形 13284158"/>
+                    <pic:cNvPicPr/>
+                  </pic:nvPicPr>
+                  <pic:blipFill>
+                    <a:blip r:embed="rId9">
+                      <a:extLst>
+                        <a:ext uri="{96DAC541-7B7A-43D3-8B79-37D633B846F1}">
+                          <asvg:svgBlip xmlns:asvg="http://schemas.microsoft.com/office/drawing/2016/SVG/main" r:embed="rId10"/>
+                        </a:ext>
+                      </a:extLst>
+                    </a:blip>
+                    <a:stretch>
+                      <a:fillRect/>
+                    </a:stretch>
+                  </pic:blipFill>
+                  <pic:spPr>
+                    <a:xfrm>
+                      <a:off x="0" y="0"/>
+                      <a:ext cx="6426200" cy="4037330"/>
+                    </a:xfrm>
+                    <a:prstGeom prst="rect">
+                      <a:avLst/>
+                    </a:prstGeom>
+                  </pic:spPr>
+                </pic:pic>
+              </a:graphicData>
+            </a:graphic>
+          </wp:anchor>
+        </w:drawing>
+      </w:r>
+      <w:r>
+        <w:rPr>
+          <w:noProof/>
+        </w:rPr>
+        <w:drawing>
+          <wp:anchor distT="0" distB="0" distL="114300" distR="114300" simplePos="0" relativeHeight="251660288" behindDoc="0" locked="0" layoutInCell="1" allowOverlap="1" wp14:anchorId="4B776C48" wp14:editId="2C4961AD">
+            <wp:simplePos x="0" y="0"/>
+            <wp:positionH relativeFrom="margin">
+              <wp:posOffset>-1159</wp:posOffset>
+            </wp:positionH>
+            <wp:positionV relativeFrom="paragraph">
+              <wp:posOffset>4075430</wp:posOffset>
+            </wp:positionV>
+            <wp:extent cx="6426200" cy="934720"/>
+            <wp:effectExtent l="0" t="0" r="0" b="0"/>
+            <wp:wrapTopAndBottom/>
+            <wp:docPr id="219141878" name="文本框 1"/>
+            <wp:cNvGraphicFramePr/>
+            <a:graphic xmlns:a="http://purl.oclc.org/ooxml/drawingml/main">
+              <a:graphicData uri="http://schemas.microsoft.com/office/word/2010/wordprocessingShape">
+                <wp:wsp>
+                  <wp:cNvSpPr txBox="1"/>
+                  <wp:spPr>
+                    <a:xfrm>
+                      <a:off x="0" y="0"/>
+                      <a:ext cx="6426200" cy="934720"/>
+                    </a:xfrm>
+                    <a:prstGeom prst="rect">
+                      <a:avLst/>
+                    </a:prstGeom>
+                    <a:solidFill>
+                      <a:prstClr val="white"/>
+                    </a:solidFill>
+                    <a:ln>
+                      <a:noFill/>
+                    </a:ln>
+                  </wp:spPr>
+                  <wp:txbx>
+                    <wne:txbxContent>
+                      <w:p>
+                        <w:pPr>
+                          <w:pStyle w:val="ab"/>
+                          <w:rPr>
+                            <w:rFonts w:ascii="Times New Roman" w:hAnsi="Times New Roman" w:cs="Times New Roman"/>
+                            <w:sz w:val="16"/>
+                            <w:szCs w:val="16"/>
+                            <w:lang w:eastAsia="zh-CN"/>
+                          </w:rPr>
+                        </w:pPr>
+                        <w:r>
+                          <w:rPr>
+                            <w:rFonts w:ascii="Times New Roman" w:hAnsi="Times New Roman" w:cs="Times New Roman"/>
+                            <w:sz w:val="16"/>
+                            <w:szCs w:val="16"/>
+                          </w:rPr>
+                          <w:t xml:space="preserve">Fig. </w:t>
+                        </w:r>
+                        <w:r>
+                          <w:rPr>
+                            <w:rFonts w:ascii="Times New Roman" w:hAnsi="Times New Roman" w:cs="Times New Roman"/>
+                            <w:sz w:val="16"/>
+                            <w:szCs w:val="16"/>
+                          </w:rPr>
+                          <w:fldChar w:fldCharType="begin"/>
+                        </w:r>
+                        <w:r>
+                          <w:rPr>
+                            <w:rFonts w:ascii="Times New Roman" w:hAnsi="Times New Roman" w:cs="Times New Roman"/>
+                            <w:sz w:val="16"/>
+                            <w:szCs w:val="16"/>
+                          </w:rPr>
+                          <w:instrText xml:space="preserve"> SEQ Fig. \* ARABIC </w:instrText>
+                        </w:r>
+                        <w:r>
+                          <w:rPr>
+                            <w:rFonts w:ascii="Times New Roman" w:hAnsi="Times New Roman" w:cs="Times New Roman"/>
+                            <w:sz w:val="16"/>
+                            <w:szCs w:val="16"/>
+                          </w:rPr>
+                          <w:fldChar w:fldCharType="separate"/>
+                        </w:r>
+                        <w:r>
+                          <w:rPr>
+                            <w:rFonts w:ascii="Times New Roman" w:hAnsi="Times New Roman" w:cs="Times New Roman"/>
+                            <w:noProof/>
+                            <w:sz w:val="16"/>
+                            <w:szCs w:val="16"/>
+                          </w:rPr>
+                          <w:t>1</w:t>
+                        </w:r>
+                        <w:r>
+                          <w:rPr>
+                            <w:rFonts w:ascii="Times New Roman" w:hAnsi="Times New Roman" w:cs="Times New Roman"/>
+                            <w:sz w:val="16"/>
+                            <w:szCs w:val="16"/>
+                          </w:rPr>
+                          <w:fldChar w:fldCharType="end"/>
+                        </w:r>
+                        <w:r>
+                          <w:rPr>
+                            <w:rFonts w:ascii="Times New Roman" w:hAnsi="Times New Roman" w:cs="Times New Roman"/>
+                            <w:sz w:val="16"/>
+                            <w:szCs w:val="16"/>
+                            <w:lang w:eastAsia="zh-CN"/>
+                          </w:rPr>
+                          <w:t xml:space="preserve"> </w:t>
+                        </w:r>
+                        <w:r>
+                          <w:rPr>
+                            <w:rFonts w:ascii="Times New Roman" w:hAnsi="Times New Roman" w:cs="Times New Roman"/>
+                            <w:b/>
+                            <w:bCs/>
+                            <w:sz w:val="16"/>
+                            <w:szCs w:val="16"/>
+                          </w:rPr>
+                          <w:t>Motivation for and overview of CHAMP</w:t>
+                        </w:r>
+                        <w:r>
+                          <w:rPr>
+                            <w:rFonts w:ascii="Times New Roman" w:hAnsi="Times New Roman" w:cs="Times New Roman"/>
+                            <w:sz w:val="16"/>
+                            <w:szCs w:val="16"/>
+                          </w:rPr>
+                          <w:t xml:space="preserve">. (a) Scaling trends across four computing domains: </w:t>
+                        </w:r>
+                        <w:proofErr w:type="spellStart"/>
+                        <w:r>
+                          <w:rPr>
+                            <w:rFonts w:ascii="Times New Roman" w:hAnsi="Times New Roman" w:cs="Times New Roman"/>
+                            <w:sz w:val="16"/>
+                            <w:szCs w:val="16"/>
+                          </w:rPr>
+                          <w:t>SambaNova</w:t>
+                        </w:r>
+                        <w:proofErr w:type="spellEnd"/>
+                        <w:r>
+                          <w:rPr>
+                            <w:rFonts w:ascii="Times New Roman" w:hAnsi="Times New Roman" w:cs="Times New Roman"/>
+                            <w:sz w:val="16"/>
+                            <w:szCs w:val="16"/>
+                          </w:rPr>
+                          <w:t xml:space="preserve"> SN40L (2023) to SN50 (2026) for AI accelerators; Intel Pohoiki Springs (2020) to Hala Point (2024) for neuromorphic systems; NVIDIA A100 (2020) to Rubin (2026) for GPUs; and AMD EPYC 7002 (2019) to EPYC 9006 (2026) for server CPUs. (b) Average hop count increases with network size in a flat 2-D mesh. (c) Fat-Tree bandwidth scaling increases router latency while delivering lower peak throughput than the flat mesh. (d) Repeated unicast amplifies network traffic and average packet latency as multicast intensity increases. (e) CHAMP combines hierarchical Tree–Mesh topology with parallel-router architecture, reducing hop count and network power while increasing peak delivered-copy throughput to 346 </w:t>
+                        </w:r>
+                        <w:proofErr w:type="spellStart"/>
+                        <w:r>
+                          <w:rPr>
+                            <w:rFonts w:ascii="Times New Roman" w:hAnsi="Times New Roman" w:cs="Times New Roman"/>
+                            <w:sz w:val="16"/>
+                            <w:szCs w:val="16"/>
+                          </w:rPr>
+                          <w:t>Mflit</w:t>
+                        </w:r>
+                        <w:proofErr w:type="spellEnd"/>
+                        <w:r>
+                          <w:rPr>
+                            <w:rFonts w:ascii="Times New Roman" w:hAnsi="Times New Roman" w:cs="Times New Roman"/>
+                            <w:sz w:val="16"/>
+                            <w:szCs w:val="16"/>
+                          </w:rPr>
+                          <w:t xml:space="preserve">/s/port, compared with 215 </w:t>
+                        </w:r>
+                        <w:proofErr w:type="spellStart"/>
+                        <w:r>
+                          <w:rPr>
+                            <w:rFonts w:ascii="Times New Roman" w:hAnsi="Times New Roman" w:cs="Times New Roman"/>
+                            <w:sz w:val="16"/>
+                            <w:szCs w:val="16"/>
+                          </w:rPr>
+                          <w:t>Mflit</w:t>
+                        </w:r>
+                        <w:proofErr w:type="spellEnd"/>
+                        <w:r>
+                          <w:rPr>
+                            <w:rFonts w:ascii="Times New Roman" w:hAnsi="Times New Roman" w:cs="Times New Roman"/>
+                            <w:sz w:val="16"/>
+                            <w:szCs w:val="16"/>
+                          </w:rPr>
+                          <w:t>/s/port for the mesh. (f) Native region-aware multicast limits the increase in average packet latency with network size and multicast intensity, achieving 11.0 ns at 64 nodes and 19.6 ns at 256 nodes under All-Multicast workloads.</w:t>
+                        </w:r>
+                      </w:p>
+                    </wne:txbxContent>
+                  </wp:txbx>
+                  <wp:bodyPr rot="0" spcFirstLastPara="0" vertOverflow="overflow" horzOverflow="overflow" vert="horz" wrap="square" lIns="0" tIns="0" rIns="0" bIns="0" numCol="1" spcCol="0" rtlCol="0" fromWordArt="0" anchor="t" anchorCtr="0" forceAA="0" compatLnSpc="1">
+                    <a:prstTxWarp prst="textNoShape">
+                      <a:avLst/>
+                    </a:prstTxWarp>
+                    <a:spAutoFit/>
+                  </wp:bodyPr>
+                </wp:wsp>
+              </a:graphicData>
+            </a:graphic>
+          </wp:anchor>
+        </w:drawing>
+      </w:r>
+      <w:r>
+        <w:rPr>
+          <w:lang w:eastAsia="zh-CN"/>
+        </w:rPr>
+        <w:t xml:space="preserve">constant. </w:t>
       </w:r>
       <w:r>
         <w:rPr>
@@ -1251,14 +1811,27 @@
         <w:rPr>
           <w:lang w:eastAsia="zh-CN"/>
         </w:rPr>
-        <w:t>In hierarchical NoCs, traffic from multiple lower-level routers converges toward upper levels, making these links potential bandwidth bottlenecks. Fat-Tree designs alleviate this bottleneck by adding parallel links at higher levels [33], [34]. However, concentrating these links at a single router increases the number of connections and competing requests that it must handle. The resulting crossbar and arbitration logic can increase area and power, while potentially increasing router latency and limiting the benefits of additional bandwidth [33], [34]. Prior work has explored router concentration and channel slicing to balance hardware cost and resource utilization [35]. Asynchronous channel slicing further allows subchannels to progress independently, although coordination remains necessary at shared routing stages [36]. These studies motivate examining how parallel communication resources can be distributed across routers and network levels, rather than scaling bandwidth solely by increasing the number of connections handled by individual routers.</w:t>
+        <w:t xml:space="preserve">In hierarchical </w:t>
+      </w:r>
+      <w:proofErr w:type="spellStart"/>
+      <w:r>
+        <w:rPr>
+          <w:lang w:eastAsia="zh-CN"/>
+        </w:rPr>
+        <w:t>NoCs</w:t>
+      </w:r>
+      <w:proofErr w:type="spellEnd"/>
+      <w:r>
+        <w:rPr>
+          <w:lang w:eastAsia="zh-CN"/>
+        </w:rPr>
+        <w:t>, traffic from multiple lower-level routers converges toward upper levels, making these links potential bandwidth bottlenecks. Fat-Tree designs alleviate this bottleneck by adding parallel links at higher levels [33], [34]. However, concentrating these links at a single router increases the number of connections and competing requests that it must handle. The resulting crossbar and arbitration logic can increase area and power, while potentially increasing router latency and limiting the benefits of additional bandwidth [33], [34]. Prior work has explored router concentration and channel slicing to balance hardware cost and resource utilization [35]. Asynchronous channel slicing further allows subchannels to progress independently, although coordination remains necessary at shared routing stages [36]. These studies motivate examining how parallel communication resources can be distributed across routers and network levels, rather than scaling bandwidth solely by increasing the number of connections handled by individual routers.</w:t>
       </w:r>
     </w:p>
     <w:p>
       <w:pPr>
         <w:pStyle w:val="2"/>
         <w:rPr>
-          <w:rFonts w:hint="eastAsia"/>
           <w:b/>
           <w:bCs/>
         </w:rPr>
@@ -1279,16 +1852,3268 @@
         <w:rPr>
           <w:lang w:eastAsia="zh-CN"/>
         </w:rPr>
-        <w:t>High-fanout communication makes routing decisions inseparable from destination representation. Without native multicast, repeated unicast duplicates packets along shared paths and consumes source injection bandwidth. Existing approaches reduce this cost through tree-based branching [3], virtual-circuit multicast [5], and continuous-time replication in asynchronous meshes [6]; hierarchical encodings reduce destination-address overhead [2]. PAICORE demonstrates coordinate-based multicast in a fat quadtree [13]. Other work explores two-tier NoCs, Mesh-of-Trees, and hierarchical multicast [14], [15], [25]. These results establish multicast and hierarchical routing as mature techniques, but the design problem considered here is more specific: one rectangular destination region must remain interpretable across a local tree and an upper on-chip mesh. The routing decisions of both tiers must be coordinated so that the same multicast transaction crosses their boundary without being converted into separate unicast transfers for individual clusters.</w:t>
+        <w:t xml:space="preserve">High-fanout communication makes routing decisions inseparable from destination representation. Without native multicast, repeated unicast duplicates packets along shared paths and consumes source injection bandwidth. Existing approaches reduce this cost through tree-based branching [3], virtual-circuit multicast [5], and continuous-time replication in asynchronous meshes [6]; hierarchical encodings reduce destination-address overhead [2]. PAICORE demonstrates coordinate-based multicast in a fat quadtree [13]. Other work explores two-tier </w:t>
+      </w:r>
+      <w:proofErr w:type="spellStart"/>
+      <w:r>
+        <w:rPr>
+          <w:lang w:eastAsia="zh-CN"/>
+        </w:rPr>
+        <w:t>NoCs</w:t>
+      </w:r>
+      <w:proofErr w:type="spellEnd"/>
+      <w:r>
+        <w:rPr>
+          <w:lang w:eastAsia="zh-CN"/>
+        </w:rPr>
+        <w:t>, Mesh-of-Trees, and hierarchical multicast [14], [15], [25]. These results establish multicast and hierarchical routing as mature techniques, but the design problem considered here is more specific: one rectangular destination region must remain interpretable across a local tree and an upper on-chip mesh. The routing decisions of both tiers must be coordinated so that the same multicast transaction crosses their boundary without being converted into separate unicast transfers for individual clusters.</w:t>
       </w:r>
     </w:p>
     <w:p>
       <w:pPr>
+        <w:pStyle w:val="1"/>
+        <w:rPr>
+          <w:lang w:eastAsia="zh-CN"/>
+        </w:rPr>
+      </w:pPr>
+      <w:r>
+        <w:rPr>
+          <w:rFonts w:hint="eastAsia"/>
+          <w:lang w:eastAsia="zh-CN"/>
+        </w:rPr>
+        <w:t>NetWork Topology</w:t>
+      </w:r>
+    </w:p>
+    <w:p>
+      <w:pPr>
+        <w:pStyle w:val="2"/>
+      </w:pPr>
+      <w:r>
+        <w:t>Hierarchical Tree–Mesh Organization</w:t>
+      </w:r>
+    </w:p>
+    <w:p>
+      <w:pPr>
+        <w:ind w:firstLine="14.20pt"/>
         <w:jc w:val="both"/>
         <w:rPr>
           <w:lang w:eastAsia="zh-CN"/>
         </w:rPr>
       </w:pPr>
+      <w:r>
+        <w:rPr>
+          <w:lang w:eastAsia="zh-CN"/>
+        </w:rPr>
+        <w:t>CHAMP employs a hierarchical Tree–Mesh topology to reduce communication distance, as illustrated in Fig. 2(a)–(</w:t>
+      </w:r>
+      <w:r>
+        <w:rPr>
+          <w:rFonts w:hint="eastAsia"/>
+          <w:lang w:eastAsia="zh-CN"/>
+        </w:rPr>
+        <w:t>c</w:t>
+      </w:r>
+      <w:r>
+        <w:rPr>
+          <w:lang w:eastAsia="zh-CN"/>
+        </w:rPr>
+        <w:t>). Each 64-PE cluster forms a three-level quadtree comprising 16 L1</w:t>
+      </w:r>
+      <w:r>
+        <w:rPr>
+          <w:rFonts w:hint="eastAsia"/>
+          <w:lang w:eastAsia="zh-CN"/>
+        </w:rPr>
+        <w:t xml:space="preserve"> groups</w:t>
+      </w:r>
+      <w:r>
+        <w:rPr>
+          <w:lang w:eastAsia="zh-CN"/>
+        </w:rPr>
+        <w:t>, four L2</w:t>
+      </w:r>
+      <w:r>
+        <w:rPr>
+          <w:rFonts w:hint="eastAsia"/>
+          <w:lang w:eastAsia="zh-CN"/>
+        </w:rPr>
+        <w:t xml:space="preserve"> groups</w:t>
+      </w:r>
+      <w:r>
+        <w:rPr>
+          <w:lang w:eastAsia="zh-CN"/>
+        </w:rPr>
+        <w:t>, and one L3 router</w:t>
+      </w:r>
+      <w:r>
+        <w:rPr>
+          <w:rFonts w:hint="eastAsia"/>
+          <w:lang w:eastAsia="zh-CN"/>
+        </w:rPr>
+        <w:t xml:space="preserve"> group</w:t>
+      </w:r>
+      <w:r>
+        <w:rPr>
+          <w:lang w:eastAsia="zh-CN"/>
+        </w:rPr>
+        <w:t xml:space="preserve">. The </w:t>
+      </w:r>
+      <w:r>
+        <w:rPr>
+          <w:lang w:eastAsia="zh-CN"/>
+        </w:rPr>
+        <w:lastRenderedPageBreak/>
+        <w:t xml:space="preserve">L3 routers connect to </w:t>
+      </w:r>
+      <w:r>
+        <w:rPr>
+          <w:noProof/>
+        </w:rPr>
+        <w:drawing>
+          <wp:anchor distT="0" distB="0" distL="114300" distR="114300" simplePos="0" relativeHeight="251664384" behindDoc="0" locked="0" layoutInCell="1" allowOverlap="1" wp14:anchorId="78DF54A4" wp14:editId="348B2534">
+            <wp:simplePos x="0" y="0"/>
+            <wp:positionH relativeFrom="column">
+              <wp:posOffset>2540</wp:posOffset>
+            </wp:positionH>
+            <wp:positionV relativeFrom="paragraph">
+              <wp:posOffset>2783205</wp:posOffset>
+            </wp:positionV>
+            <wp:extent cx="6426200" cy="635"/>
+            <wp:effectExtent l="0" t="0" r="0" b="0"/>
+            <wp:wrapTopAndBottom/>
+            <wp:docPr id="1149432697" name="文本框 1"/>
+            <wp:cNvGraphicFramePr/>
+            <a:graphic xmlns:a="http://purl.oclc.org/ooxml/drawingml/main">
+              <a:graphicData uri="http://schemas.microsoft.com/office/word/2010/wordprocessingShape">
+                <wp:wsp>
+                  <wp:cNvSpPr txBox="1"/>
+                  <wp:spPr>
+                    <a:xfrm>
+                      <a:off x="0" y="0"/>
+                      <a:ext cx="6426200" cy="635"/>
+                    </a:xfrm>
+                    <a:prstGeom prst="rect">
+                      <a:avLst/>
+                    </a:prstGeom>
+                    <a:solidFill>
+                      <a:prstClr val="white"/>
+                    </a:solidFill>
+                    <a:ln>
+                      <a:noFill/>
+                    </a:ln>
+                  </wp:spPr>
+                  <wp:txbx>
+                    <wne:txbxContent>
+                      <w:p>
+                        <w:pPr>
+                          <w:pStyle w:val="ab"/>
+                          <w:rPr>
+                            <w:rFonts w:ascii="Times New Roman" w:eastAsia="宋体" w:hAnsi="Times New Roman" w:cs="Times New Roman"/>
+                            <w:sz w:val="16"/>
+                            <w:szCs w:val="16"/>
+                          </w:rPr>
+                        </w:pPr>
+                        <w:r>
+                          <w:rPr>
+                            <w:rFonts w:ascii="Times New Roman" w:hAnsi="Times New Roman" w:cs="Times New Roman"/>
+                            <w:sz w:val="16"/>
+                            <w:szCs w:val="16"/>
+                          </w:rPr>
+                          <w:t xml:space="preserve">Fig. </w:t>
+                        </w:r>
+                        <w:r>
+                          <w:rPr>
+                            <w:rFonts w:ascii="Times New Roman" w:hAnsi="Times New Roman" w:cs="Times New Roman"/>
+                            <w:sz w:val="16"/>
+                            <w:szCs w:val="16"/>
+                          </w:rPr>
+                          <w:fldChar w:fldCharType="begin"/>
+                        </w:r>
+                        <w:r>
+                          <w:rPr>
+                            <w:rFonts w:ascii="Times New Roman" w:hAnsi="Times New Roman" w:cs="Times New Roman"/>
+                            <w:sz w:val="16"/>
+                            <w:szCs w:val="16"/>
+                          </w:rPr>
+                          <w:instrText xml:space="preserve"> SEQ Fig. \* ARABIC </w:instrText>
+                        </w:r>
+                        <w:r>
+                          <w:rPr>
+                            <w:rFonts w:ascii="Times New Roman" w:hAnsi="Times New Roman" w:cs="Times New Roman"/>
+                            <w:sz w:val="16"/>
+                            <w:szCs w:val="16"/>
+                          </w:rPr>
+                          <w:fldChar w:fldCharType="separate"/>
+                        </w:r>
+                        <w:r>
+                          <w:rPr>
+                            <w:rFonts w:ascii="Times New Roman" w:hAnsi="Times New Roman" w:cs="Times New Roman"/>
+                            <w:noProof/>
+                            <w:sz w:val="16"/>
+                            <w:szCs w:val="16"/>
+                          </w:rPr>
+                          <w:t>2</w:t>
+                        </w:r>
+                        <w:r>
+                          <w:rPr>
+                            <w:rFonts w:ascii="Times New Roman" w:hAnsi="Times New Roman" w:cs="Times New Roman"/>
+                            <w:sz w:val="16"/>
+                            <w:szCs w:val="16"/>
+                          </w:rPr>
+                          <w:fldChar w:fldCharType="end"/>
+                        </w:r>
+                        <w:r>
+                          <w:rPr>
+                            <w:rFonts w:ascii="Times New Roman" w:eastAsia="宋体" w:hAnsi="Times New Roman" w:cs="Times New Roman"/>
+                            <w:b/>
+                            <w:bCs/>
+                            <w:sz w:val="16"/>
+                            <w:szCs w:val="16"/>
+                          </w:rPr>
+                          <w:t xml:space="preserve"> </w:t>
+                        </w:r>
+                        <w:r>
+                          <w:rPr>
+                            <w:rFonts w:ascii="Times New Roman" w:hAnsi="Times New Roman" w:cs="Times New Roman"/>
+                            <w:b/>
+                            <w:bCs/>
+                            <w:sz w:val="16"/>
+                            <w:szCs w:val="16"/>
+                          </w:rPr>
+                          <w:t>Hierarchical Tree–Mesh topology and parallel-router organization of CHAMP.</w:t>
+                        </w:r>
+                        <w:r>
+                          <w:rPr>
+                            <w:rFonts w:ascii="Times New Roman" w:hAnsi="Times New Roman" w:cs="Times New Roman"/>
+                            <w:sz w:val="16"/>
+                            <w:szCs w:val="16"/>
+                          </w:rPr>
+                          <w:t xml:space="preserve"> (a) Top-level 2-D mesh connecting cluster mesh-router groups (MRs). (b) Three-level quadtree within a 64-PE cluster, comprising 16 L1 router groups, four L2 router groups, and one L3 router group. (c) Analytical average router-to-router hop count under uniformly distributed distinct source–destination PE pairs, excluding PE injection and ejection links. (d) PE–L1–L2 connectivity, with four parallel uplink lanes per L1 router and four physical router instances per L2 group. (e) Connectivity between four L2 groups and an L3 group containing 16 physical router instances. (f) Connectivity between the 16 L3 instances and the 16 physical mesh routers in an MR group. (g) Parallel directional connections between neighboring MR groups.</w:t>
+                        </w:r>
+                      </w:p>
+                    </wne:txbxContent>
+                  </wp:txbx>
+                  <wp:bodyPr rot="0" spcFirstLastPara="0" vertOverflow="overflow" horzOverflow="overflow" vert="horz" wrap="square" lIns="0" tIns="0" rIns="0" bIns="0" numCol="1" spcCol="0" rtlCol="0" fromWordArt="0" anchor="t" anchorCtr="0" forceAA="0" compatLnSpc="1">
+                    <a:prstTxWarp prst="textNoShape">
+                      <a:avLst/>
+                    </a:prstTxWarp>
+                    <a:spAutoFit/>
+                  </wp:bodyPr>
+                </wp:wsp>
+              </a:graphicData>
+            </a:graphic>
+          </wp:anchor>
+        </w:drawing>
+      </w:r>
+      <w:r>
+        <w:rPr>
+          <w:noProof/>
+          <w:lang w:eastAsia="zh-CN"/>
+        </w:rPr>
+        <w:drawing>
+          <wp:anchor distT="0" distB="0" distL="114300" distR="114300" simplePos="0" relativeHeight="251662336" behindDoc="0" locked="0" layoutInCell="1" allowOverlap="1" wp14:anchorId="7C3FF83A" wp14:editId="4F6F2EF7">
+            <wp:simplePos x="0" y="0"/>
+            <wp:positionH relativeFrom="column">
+              <wp:posOffset>2687</wp:posOffset>
+            </wp:positionH>
+            <wp:positionV relativeFrom="page">
+              <wp:posOffset>689317</wp:posOffset>
+            </wp:positionV>
+            <wp:extent cx="6426200" cy="2722880"/>
+            <wp:effectExtent l="0" t="0" r="0" b="1270"/>
+            <wp:wrapTopAndBottom/>
+            <wp:docPr id="1979273060" name="图形 7"/>
+            <wp:cNvGraphicFramePr>
+              <a:graphicFrameLocks xmlns:a="http://purl.oclc.org/ooxml/drawingml/main" noChangeAspect="1"/>
+            </wp:cNvGraphicFramePr>
+            <a:graphic xmlns:a="http://purl.oclc.org/ooxml/drawingml/main">
+              <a:graphicData uri="http://purl.oclc.org/ooxml/drawingml/picture">
+                <pic:pic xmlns:pic="http://purl.oclc.org/ooxml/drawingml/picture">
+                  <pic:nvPicPr>
+                    <pic:cNvPr id="1979273060" name="图形 1979273060"/>
+                    <pic:cNvPicPr/>
+                  </pic:nvPicPr>
+                  <pic:blipFill>
+                    <a:blip r:embed="rId11">
+                      <a:extLst>
+                        <a:ext uri="{96DAC541-7B7A-43D3-8B79-37D633B846F1}">
+                          <asvg:svgBlip xmlns:asvg="http://schemas.microsoft.com/office/drawing/2016/SVG/main" r:embed="rId12"/>
+                        </a:ext>
+                      </a:extLst>
+                    </a:blip>
+                    <a:stretch>
+                      <a:fillRect/>
+                    </a:stretch>
+                  </pic:blipFill>
+                  <pic:spPr>
+                    <a:xfrm>
+                      <a:off x="0" y="0"/>
+                      <a:ext cx="6426200" cy="2722880"/>
+                    </a:xfrm>
+                    <a:prstGeom prst="rect">
+                      <a:avLst/>
+                    </a:prstGeom>
+                  </pic:spPr>
+                </pic:pic>
+              </a:graphicData>
+            </a:graphic>
+          </wp:anchor>
+        </w:drawing>
+      </w:r>
+      <w:r>
+        <w:rPr>
+          <w:lang w:eastAsia="zh-CN"/>
+        </w:rPr>
+        <w:t>an upper-level 2-D mesh through mesh routers (MRs), enabling local communication within clusters and long-distance communication across clusters.</w:t>
+      </w:r>
+    </w:p>
+    <w:p>
+      <w:pPr>
+        <w:ind w:firstLine="14.20pt"/>
+        <w:jc w:val="both"/>
+        <w:rPr>
+          <w:lang w:eastAsia="zh-CN"/>
+        </w:rPr>
+      </w:pPr>
+      <w:r>
+        <w:rPr>
+          <w:lang w:eastAsia="zh-CN"/>
+        </w:rPr>
+        <w:t xml:space="preserve">We analytically derive the average router-to-router hop count for uniformly distributed distinct source–destination PE pairs, excluding PE injection and ejection links. Within each cluster, 3, 12, and 48 destinations require 0, 2, and 4 hops, respectively, yielding an average of </w:t>
+      </w:r>
+      <m:oMath>
+        <m:sSub>
+          <m:sSubPr>
+            <m:ctrlPr>
+              <w:rPr>
+                <w:rFonts w:ascii="Cambria Math" w:hAnsi="Cambria Math"/>
+              </w:rPr>
+            </m:ctrlPr>
+          </m:sSubPr>
+          <m:e>
+            <m:acc>
+              <m:accPr>
+                <m:chr m:val="̅"/>
+                <m:ctrlPr>
+                  <w:rPr>
+                    <w:rFonts w:ascii="Cambria Math" w:hAnsi="Cambria Math"/>
+                  </w:rPr>
+                </m:ctrlPr>
+              </m:accPr>
+              <m:e>
+                <m:r>
+                  <w:rPr>
+                    <w:rFonts w:ascii="Cambria Math" w:hAnsi="Cambria Math"/>
+                  </w:rPr>
+                  <m:t>H</m:t>
+                </m:r>
+              </m:e>
+            </m:acc>
+          </m:e>
+          <m:sub>
+            <m:r>
+              <m:rPr>
+                <m:sty m:val="p"/>
+              </m:rPr>
+              <w:rPr>
+                <w:rFonts w:ascii="Cambria Math" w:hAnsi="Cambria Math"/>
+              </w:rPr>
+              <m:t>local</m:t>
+            </m:r>
+          </m:sub>
+        </m:sSub>
+        <m:r>
+          <w:rPr>
+            <w:rFonts w:ascii="Cambria Math" w:hAnsi="Cambria Math"/>
+          </w:rPr>
+          <m:t>=</m:t>
+        </m:r>
+        <m:f>
+          <m:fPr>
+            <m:ctrlPr>
+              <w:rPr>
+                <w:rFonts w:ascii="Cambria Math" w:hAnsi="Cambria Math"/>
+              </w:rPr>
+            </m:ctrlPr>
+          </m:fPr>
+          <m:num>
+            <m:r>
+              <w:rPr>
+                <w:rFonts w:ascii="Cambria Math" w:hAnsi="Cambria Math"/>
+              </w:rPr>
+              <m:t>14</m:t>
+            </m:r>
+          </m:num>
+          <m:den>
+            <m:r>
+              <w:rPr>
+                <w:rFonts w:ascii="Cambria Math" w:hAnsi="Cambria Math"/>
+              </w:rPr>
+              <m:t>7</m:t>
+            </m:r>
+          </m:den>
+        </m:f>
+      </m:oMath>
+      <w:r>
+        <w:rPr>
+          <w:rFonts w:hint="eastAsia"/>
+          <w:lang w:eastAsia="zh-CN"/>
+        </w:rPr>
+        <w:t xml:space="preserve"> </w:t>
+      </w:r>
+      <w:r>
+        <w:rPr>
+          <w:lang w:eastAsia="zh-CN"/>
+        </w:rPr>
+        <w:t xml:space="preserve">hops. </w:t>
+      </w:r>
+      <w:r>
+        <w:rPr>
+          <w:lang w:eastAsia="zh-CN"/>
+        </w:rPr>
+        <w:t>For inter-cluster communication, packets traverse two tree links from the source L1 to L3, one link to the source MR, the upper-level mesh, and three corresponding links toward the destination L1. Assuming N=64M PEs with M MRs arranged in a square mesh, the average inter-cluster hop count is</w:t>
+      </w:r>
+      <w:r>
+        <w:rPr>
+          <w:rFonts w:hint="eastAsia"/>
+          <w:lang w:eastAsia="zh-CN"/>
+        </w:rPr>
+        <w:t>：</w:t>
+      </w:r>
+    </w:p>
+    <w:p>
+      <w:pPr>
+        <w:ind w:firstLineChars="650" w:firstLine="65pt"/>
+        <w:jc w:val="both"/>
+        <w:rPr>
+          <w:lang w:eastAsia="zh-CN"/>
+        </w:rPr>
+      </w:pPr>
+      <m:oMath>
+        <m:sSub>
+          <m:sSubPr>
+            <m:ctrlPr>
+              <w:rPr>
+                <w:rFonts w:ascii="Cambria Math" w:hAnsi="Cambria Math"/>
+              </w:rPr>
+            </m:ctrlPr>
+          </m:sSubPr>
+          <m:e>
+            <m:acc>
+              <m:accPr>
+                <m:chr m:val="̅"/>
+                <m:ctrlPr>
+                  <w:rPr>
+                    <w:rFonts w:ascii="Cambria Math" w:hAnsi="Cambria Math"/>
+                  </w:rPr>
+                </m:ctrlPr>
+              </m:accPr>
+              <m:e>
+                <m:r>
+                  <w:rPr>
+                    <w:rFonts w:ascii="Cambria Math" w:hAnsi="Cambria Math"/>
+                  </w:rPr>
+                  <m:t>H</m:t>
+                </m:r>
+              </m:e>
+            </m:acc>
+          </m:e>
+          <m:sub>
+            <m:r>
+              <m:rPr>
+                <m:sty m:val="p"/>
+              </m:rPr>
+              <w:rPr>
+                <w:rFonts w:ascii="Cambria Math" w:hAnsi="Cambria Math"/>
+              </w:rPr>
+              <m:t>cross</m:t>
+            </m:r>
+          </m:sub>
+        </m:sSub>
+        <m:r>
+          <w:rPr>
+            <w:rFonts w:ascii="Cambria Math" w:hAnsi="Cambria Math"/>
+          </w:rPr>
+          <m:t>=6+</m:t>
+        </m:r>
+        <m:f>
+          <m:fPr>
+            <m:ctrlPr>
+              <w:rPr>
+                <w:rFonts w:ascii="Cambria Math" w:hAnsi="Cambria Math"/>
+              </w:rPr>
+            </m:ctrlPr>
+          </m:fPr>
+          <m:num>
+            <m:r>
+              <w:rPr>
+                <w:rFonts w:ascii="Cambria Math" w:hAnsi="Cambria Math"/>
+              </w:rPr>
+              <m:t>2</m:t>
+            </m:r>
+          </m:num>
+          <m:den>
+            <m:r>
+              <w:rPr>
+                <w:rFonts w:ascii="Cambria Math" w:hAnsi="Cambria Math"/>
+              </w:rPr>
+              <m:t>3</m:t>
+            </m:r>
+          </m:den>
+        </m:f>
+        <m:rad>
+          <m:radPr>
+            <m:degHide m:val="1"/>
+            <m:ctrlPr>
+              <w:rPr>
+                <w:rFonts w:ascii="Cambria Math" w:hAnsi="Cambria Math"/>
+              </w:rPr>
+            </m:ctrlPr>
+          </m:radPr>
+          <m:deg/>
+          <m:e>
+            <m:r>
+              <w:rPr>
+                <w:rFonts w:ascii="Cambria Math" w:hAnsi="Cambria Math"/>
+              </w:rPr>
+              <m:t>M</m:t>
+            </m:r>
+          </m:e>
+        </m:rad>
+        <m:r>
+          <w:rPr>
+            <w:rFonts w:ascii="Cambria Math" w:hAnsi="Cambria Math"/>
+          </w:rPr>
+          <m:t>=6+</m:t>
+        </m:r>
+        <m:f>
+          <m:fPr>
+            <m:ctrlPr>
+              <w:rPr>
+                <w:rFonts w:ascii="Cambria Math" w:hAnsi="Cambria Math"/>
+              </w:rPr>
+            </m:ctrlPr>
+          </m:fPr>
+          <m:num>
+            <m:rad>
+              <m:radPr>
+                <m:degHide m:val="1"/>
+                <m:ctrlPr>
+                  <w:rPr>
+                    <w:rFonts w:ascii="Cambria Math" w:hAnsi="Cambria Math"/>
+                  </w:rPr>
+                </m:ctrlPr>
+              </m:radPr>
+              <m:deg/>
+              <m:e>
+                <m:r>
+                  <w:rPr>
+                    <w:rFonts w:ascii="Cambria Math" w:hAnsi="Cambria Math"/>
+                  </w:rPr>
+                  <m:t>N</m:t>
+                </m:r>
+              </m:e>
+            </m:rad>
+          </m:num>
+          <m:den>
+            <m:r>
+              <w:rPr>
+                <w:rFonts w:ascii="Cambria Math" w:hAnsi="Cambria Math"/>
+              </w:rPr>
+              <m:t>12</m:t>
+            </m:r>
+          </m:den>
+        </m:f>
+      </m:oMath>
+      <w:r>
+        <w:rPr>
+          <w:rFonts w:hint="eastAsia"/>
+          <w:lang w:eastAsia="zh-CN"/>
+        </w:rPr>
+        <w:t xml:space="preserve">                      (3)</w:t>
+      </w:r>
+    </w:p>
+    <w:p>
+      <w:pPr>
+        <w:jc w:val="both"/>
+        <w:rPr>
+          <w:lang w:eastAsia="zh-CN"/>
+        </w:rPr>
+      </w:pPr>
+      <w:r>
+        <w:rPr>
+          <w:lang w:eastAsia="zh-CN"/>
+        </w:rPr>
+        <w:t>Combining intra- and inter-cluster communication yields</w:t>
+      </w:r>
+      <w:r>
+        <w:rPr>
+          <w:rFonts w:hint="eastAsia"/>
+          <w:lang w:eastAsia="zh-CN"/>
+        </w:rPr>
+        <w:t>：</w:t>
+      </w:r>
+    </w:p>
+    <w:p>
+      <w:pPr>
+        <w:jc w:val="both"/>
+      </w:pPr>
+      <m:oMathPara>
+        <m:oMath>
+          <m:sSub>
+            <m:sSubPr>
+              <m:ctrlPr>
+                <w:rPr>
+                  <w:rFonts w:ascii="Cambria Math" w:hAnsi="Cambria Math"/>
+                </w:rPr>
+              </m:ctrlPr>
+            </m:sSubPr>
+            <m:e>
+              <m:acc>
+                <m:accPr>
+                  <m:chr m:val="̅"/>
+                  <m:ctrlPr>
+                    <w:rPr>
+                      <w:rFonts w:ascii="Cambria Math" w:hAnsi="Cambria Math"/>
+                    </w:rPr>
+                  </m:ctrlPr>
+                </m:accPr>
+                <m:e>
+                  <m:r>
+                    <w:rPr>
+                      <w:rFonts w:ascii="Cambria Math" w:hAnsi="Cambria Math"/>
+                    </w:rPr>
+                    <m:t>H</m:t>
+                  </m:r>
+                </m:e>
+              </m:acc>
+            </m:e>
+            <m:sub>
+              <m:r>
+                <m:rPr>
+                  <m:sty m:val="p"/>
+                </m:rPr>
+                <w:rPr>
+                  <w:rFonts w:ascii="Cambria Math" w:hAnsi="Cambria Math"/>
+                </w:rPr>
+                <m:t>CHAMP</m:t>
+              </m:r>
+            </m:sub>
+          </m:sSub>
+          <m:d>
+            <m:dPr>
+              <m:ctrlPr>
+                <w:rPr>
+                  <w:rFonts w:ascii="Cambria Math" w:hAnsi="Cambria Math"/>
+                </w:rPr>
+              </m:ctrlPr>
+            </m:dPr>
+            <m:e>
+              <m:r>
+                <w:rPr>
+                  <w:rFonts w:ascii="Cambria Math" w:hAnsi="Cambria Math"/>
+                </w:rPr>
+                <m:t>N</m:t>
+              </m:r>
+            </m:e>
+          </m:d>
+          <m:r>
+            <w:rPr>
+              <w:rFonts w:ascii="Cambria Math" w:hAnsi="Cambria Math"/>
+            </w:rPr>
+            <m:t>=</m:t>
+          </m:r>
+          <m:sSub>
+            <m:sSubPr>
+              <m:ctrlPr>
+                <w:rPr>
+                  <w:rFonts w:ascii="Cambria Math" w:hAnsi="Cambria Math"/>
+                </w:rPr>
+              </m:ctrlPr>
+            </m:sSubPr>
+            <m:e>
+              <m:r>
+                <w:rPr>
+                  <w:rFonts w:ascii="Cambria Math" w:hAnsi="Cambria Math"/>
+                </w:rPr>
+                <m:t>P</m:t>
+              </m:r>
+            </m:e>
+            <m:sub>
+              <m:r>
+                <m:rPr>
+                  <m:sty m:val="p"/>
+                </m:rPr>
+                <w:rPr>
+                  <w:rFonts w:ascii="Cambria Math" w:hAnsi="Cambria Math"/>
+                </w:rPr>
+                <m:t>local</m:t>
+              </m:r>
+            </m:sub>
+          </m:sSub>
+          <m:sSub>
+            <m:sSubPr>
+              <m:ctrlPr>
+                <w:rPr>
+                  <w:rFonts w:ascii="Cambria Math" w:hAnsi="Cambria Math"/>
+                </w:rPr>
+              </m:ctrlPr>
+            </m:sSubPr>
+            <m:e>
+              <m:acc>
+                <m:accPr>
+                  <m:chr m:val="̅"/>
+                  <m:ctrlPr>
+                    <w:rPr>
+                      <w:rFonts w:ascii="Cambria Math" w:hAnsi="Cambria Math"/>
+                    </w:rPr>
+                  </m:ctrlPr>
+                </m:accPr>
+                <m:e>
+                  <m:r>
+                    <w:rPr>
+                      <w:rFonts w:ascii="Cambria Math" w:hAnsi="Cambria Math"/>
+                    </w:rPr>
+                    <m:t>H</m:t>
+                  </m:r>
+                </m:e>
+              </m:acc>
+            </m:e>
+            <m:sub>
+              <m:r>
+                <m:rPr>
+                  <m:sty m:val="p"/>
+                </m:rPr>
+                <w:rPr>
+                  <w:rFonts w:ascii="Cambria Math" w:hAnsi="Cambria Math"/>
+                </w:rPr>
+                <m:t>local</m:t>
+              </m:r>
+            </m:sub>
+          </m:sSub>
+          <m:r>
+            <w:rPr>
+              <w:rFonts w:ascii="Cambria Math" w:hAnsi="Cambria Math"/>
+            </w:rPr>
+            <m:t>+</m:t>
+          </m:r>
+          <m:sSub>
+            <m:sSubPr>
+              <m:ctrlPr>
+                <w:rPr>
+                  <w:rFonts w:ascii="Cambria Math" w:hAnsi="Cambria Math"/>
+                </w:rPr>
+              </m:ctrlPr>
+            </m:sSubPr>
+            <m:e>
+              <m:r>
+                <w:rPr>
+                  <w:rFonts w:ascii="Cambria Math" w:hAnsi="Cambria Math"/>
+                </w:rPr>
+                <m:t>P</m:t>
+              </m:r>
+            </m:e>
+            <m:sub>
+              <m:r>
+                <m:rPr>
+                  <m:sty m:val="p"/>
+                </m:rPr>
+                <w:rPr>
+                  <w:rFonts w:ascii="Cambria Math" w:hAnsi="Cambria Math"/>
+                </w:rPr>
+                <m:t>cross</m:t>
+              </m:r>
+            </m:sub>
+          </m:sSub>
+          <m:sSub>
+            <m:sSubPr>
+              <m:ctrlPr>
+                <w:rPr>
+                  <w:rFonts w:ascii="Cambria Math" w:hAnsi="Cambria Math"/>
+                </w:rPr>
+              </m:ctrlPr>
+            </m:sSubPr>
+            <m:e>
+              <m:acc>
+                <m:accPr>
+                  <m:chr m:val="̅"/>
+                  <m:ctrlPr>
+                    <w:rPr>
+                      <w:rFonts w:ascii="Cambria Math" w:hAnsi="Cambria Math"/>
+                    </w:rPr>
+                  </m:ctrlPr>
+                </m:accPr>
+                <m:e>
+                  <m:r>
+                    <w:rPr>
+                      <w:rFonts w:ascii="Cambria Math" w:hAnsi="Cambria Math"/>
+                    </w:rPr>
+                    <m:t>H</m:t>
+                  </m:r>
+                </m:e>
+              </m:acc>
+            </m:e>
+            <m:sub>
+              <m:r>
+                <m:rPr>
+                  <m:sty m:val="p"/>
+                </m:rPr>
+                <w:rPr>
+                  <w:rFonts w:ascii="Cambria Math" w:hAnsi="Cambria Math"/>
+                </w:rPr>
+                <m:t>cross</m:t>
+              </m:r>
+            </m:sub>
+          </m:sSub>
+        </m:oMath>
+      </m:oMathPara>
+    </w:p>
+    <w:p>
+      <w:pPr>
+        <w:jc w:val="both"/>
+        <w:rPr>
+          <w:rFonts w:ascii="Cambria Math" w:hAnsi="Cambria Math"/>
+          <w:iCs/>
+          <w:lang w:eastAsia="zh-CN"/>
+        </w:rPr>
+      </w:pPr>
+      <m:oMath>
+        <m:r>
+          <w:rPr>
+            <w:rFonts w:ascii="Cambria Math" w:hAnsi="Cambria Math"/>
+          </w:rPr>
+          <m:t xml:space="preserve">                                         =</m:t>
+        </m:r>
+        <m:f>
+          <m:fPr>
+            <m:ctrlPr>
+              <w:rPr>
+                <w:rFonts w:ascii="Cambria Math" w:hAnsi="Cambria Math"/>
+              </w:rPr>
+            </m:ctrlPr>
+          </m:fPr>
+          <m:num>
+            <m:r>
+              <w:rPr>
+                <w:rFonts w:ascii="Cambria Math" w:hAnsi="Cambria Math"/>
+              </w:rPr>
+              <m:t>63</m:t>
+            </m:r>
+          </m:num>
+          <m:den>
+            <m:r>
+              <w:rPr>
+                <w:rFonts w:ascii="Cambria Math" w:hAnsi="Cambria Math"/>
+              </w:rPr>
+              <m:t>N-1</m:t>
+            </m:r>
+          </m:den>
+        </m:f>
+        <m:r>
+          <w:rPr>
+            <w:rFonts w:ascii="Cambria Math" w:hAnsi="Cambria Math"/>
+          </w:rPr>
+          <m:t>⋅</m:t>
+        </m:r>
+        <m:f>
+          <m:fPr>
+            <m:ctrlPr>
+              <w:rPr>
+                <w:rFonts w:ascii="Cambria Math" w:hAnsi="Cambria Math"/>
+              </w:rPr>
+            </m:ctrlPr>
+          </m:fPr>
+          <m:num>
+            <m:r>
+              <w:rPr>
+                <w:rFonts w:ascii="Cambria Math" w:hAnsi="Cambria Math"/>
+              </w:rPr>
+              <m:t>14</m:t>
+            </m:r>
+          </m:num>
+          <m:den>
+            <m:r>
+              <w:rPr>
+                <w:rFonts w:ascii="Cambria Math" w:hAnsi="Cambria Math"/>
+              </w:rPr>
+              <m:t>7</m:t>
+            </m:r>
+          </m:den>
+        </m:f>
+        <m:r>
+          <w:rPr>
+            <w:rFonts w:ascii="Cambria Math" w:hAnsi="Cambria Math"/>
+          </w:rPr>
+          <m:t>+</m:t>
+        </m:r>
+        <m:f>
+          <m:fPr>
+            <m:ctrlPr>
+              <w:rPr>
+                <w:rFonts w:ascii="Cambria Math" w:hAnsi="Cambria Math"/>
+              </w:rPr>
+            </m:ctrlPr>
+          </m:fPr>
+          <m:num>
+            <m:r>
+              <w:rPr>
+                <w:rFonts w:ascii="Cambria Math" w:hAnsi="Cambria Math"/>
+              </w:rPr>
+              <m:t>N-64</m:t>
+            </m:r>
+          </m:num>
+          <m:den>
+            <m:r>
+              <w:rPr>
+                <w:rFonts w:ascii="Cambria Math" w:hAnsi="Cambria Math"/>
+              </w:rPr>
+              <m:t>N-1</m:t>
+            </m:r>
+          </m:den>
+        </m:f>
+        <m:r>
+          <w:rPr>
+            <w:rFonts w:ascii="Cambria Math" w:hAnsi="Cambria Math"/>
+          </w:rPr>
+          <m:t>⋅</m:t>
+        </m:r>
+        <m:d>
+          <m:dPr>
+            <m:ctrlPr>
+              <w:rPr>
+                <w:rFonts w:ascii="Cambria Math" w:hAnsi="Cambria Math"/>
+              </w:rPr>
+            </m:ctrlPr>
+          </m:dPr>
+          <m:e>
+            <m:r>
+              <w:rPr>
+                <w:rFonts w:ascii="Cambria Math" w:hAnsi="Cambria Math"/>
+              </w:rPr>
+              <m:t>6+</m:t>
+            </m:r>
+            <m:f>
+              <m:fPr>
+                <m:ctrlPr>
+                  <w:rPr>
+                    <w:rFonts w:ascii="Cambria Math" w:hAnsi="Cambria Math"/>
+                  </w:rPr>
+                </m:ctrlPr>
+              </m:fPr>
+              <m:num>
+                <m:rad>
+                  <m:radPr>
+                    <m:degHide m:val="1"/>
+                    <m:ctrlPr>
+                      <w:rPr>
+                        <w:rFonts w:ascii="Cambria Math" w:hAnsi="Cambria Math"/>
+                      </w:rPr>
+                    </m:ctrlPr>
+                  </m:radPr>
+                  <m:deg/>
+                  <m:e>
+                    <m:r>
+                      <w:rPr>
+                        <w:rFonts w:ascii="Cambria Math" w:hAnsi="Cambria Math"/>
+                      </w:rPr>
+                      <m:t>N</m:t>
+                    </m:r>
+                  </m:e>
+                </m:rad>
+              </m:num>
+              <m:den>
+                <m:r>
+                  <w:rPr>
+                    <w:rFonts w:ascii="Cambria Math" w:hAnsi="Cambria Math"/>
+                  </w:rPr>
+                  <m:t>12</m:t>
+                </m:r>
+              </m:den>
+            </m:f>
+          </m:e>
+        </m:d>
+      </m:oMath>
+      <w:r>
+        <w:rPr>
+          <w:rFonts w:ascii="Cambria Math" w:hAnsi="Cambria Math" w:hint="eastAsia"/>
+          <w:iCs/>
+          <w:lang w:eastAsia="zh-CN"/>
+        </w:rPr>
+        <w:t xml:space="preserve">              (4)</w:t>
+      </w:r>
+    </w:p>
+    <w:p>
+      <w:pPr>
+        <w:jc w:val="both"/>
+        <w:rPr>
+          <w:lang w:eastAsia="zh-CN"/>
+        </w:rPr>
+      </w:pPr>
+      <w:r>
+        <w:rPr>
+          <w:lang w:eastAsia="zh-CN"/>
+        </w:rPr>
+        <w:t xml:space="preserve">Here, </w:t>
+      </w:r>
+      <m:oMath>
+        <m:sSub>
+          <m:sSubPr>
+            <m:ctrlPr>
+              <w:rPr>
+                <w:rFonts w:ascii="Cambria Math" w:hAnsi="Cambria Math"/>
+              </w:rPr>
+            </m:ctrlPr>
+          </m:sSubPr>
+          <m:e>
+            <m:r>
+              <w:rPr>
+                <w:rFonts w:ascii="Cambria Math" w:hAnsi="Cambria Math"/>
+              </w:rPr>
+              <m:t>P</m:t>
+            </m:r>
+          </m:e>
+          <m:sub>
+            <m:r>
+              <m:rPr>
+                <m:sty m:val="p"/>
+              </m:rPr>
+              <w:rPr>
+                <w:rFonts w:ascii="Cambria Math" w:hAnsi="Cambria Math"/>
+              </w:rPr>
+              <m:t>local</m:t>
+            </m:r>
+          </m:sub>
+        </m:sSub>
+        <m:r>
+          <w:rPr>
+            <w:rFonts w:ascii="Cambria Math" w:hAnsi="Cambria Math"/>
+          </w:rPr>
+          <m:t>=</m:t>
+        </m:r>
+        <m:f>
+          <m:fPr>
+            <m:ctrlPr>
+              <w:rPr>
+                <w:rFonts w:ascii="Cambria Math" w:hAnsi="Cambria Math"/>
+              </w:rPr>
+            </m:ctrlPr>
+          </m:fPr>
+          <m:num>
+            <m:r>
+              <w:rPr>
+                <w:rFonts w:ascii="Cambria Math" w:hAnsi="Cambria Math"/>
+              </w:rPr>
+              <m:t>63</m:t>
+            </m:r>
+          </m:num>
+          <m:den>
+            <m:r>
+              <w:rPr>
+                <w:rFonts w:ascii="Cambria Math" w:hAnsi="Cambria Math"/>
+              </w:rPr>
+              <m:t>N-1</m:t>
+            </m:r>
+          </m:den>
+        </m:f>
+      </m:oMath>
+      <w:r>
+        <w:rPr>
+          <w:rFonts w:hint="eastAsia"/>
+          <w:lang w:eastAsia="zh-CN"/>
+        </w:rPr>
+        <w:t xml:space="preserve"> </w:t>
+      </w:r>
+      <w:r>
+        <w:rPr>
+          <w:lang w:eastAsia="zh-CN"/>
+        </w:rPr>
+        <w:t xml:space="preserve">and </w:t>
+      </w:r>
+      <m:oMath>
+        <m:sSub>
+          <m:sSubPr>
+            <m:ctrlPr>
+              <w:rPr>
+                <w:rFonts w:ascii="Cambria Math" w:hAnsi="Cambria Math"/>
+              </w:rPr>
+            </m:ctrlPr>
+          </m:sSubPr>
+          <m:e>
+            <m:r>
+              <w:rPr>
+                <w:rFonts w:ascii="Cambria Math" w:hAnsi="Cambria Math"/>
+              </w:rPr>
+              <m:t>P</m:t>
+            </m:r>
+          </m:e>
+          <m:sub>
+            <m:r>
+              <m:rPr>
+                <m:sty m:val="p"/>
+              </m:rPr>
+              <w:rPr>
+                <w:rFonts w:ascii="Cambria Math" w:hAnsi="Cambria Math"/>
+              </w:rPr>
+              <m:t>cross</m:t>
+            </m:r>
+          </m:sub>
+        </m:sSub>
+        <m:r>
+          <w:rPr>
+            <w:rFonts w:ascii="Cambria Math" w:hAnsi="Cambria Math"/>
+          </w:rPr>
+          <m:t>=</m:t>
+        </m:r>
+        <m:f>
+          <m:fPr>
+            <m:ctrlPr>
+              <w:rPr>
+                <w:rFonts w:ascii="Cambria Math" w:hAnsi="Cambria Math"/>
+              </w:rPr>
+            </m:ctrlPr>
+          </m:fPr>
+          <m:num>
+            <m:r>
+              <w:rPr>
+                <w:rFonts w:ascii="Cambria Math" w:hAnsi="Cambria Math"/>
+              </w:rPr>
+              <m:t>N-64</m:t>
+            </m:r>
+          </m:num>
+          <m:den>
+            <m:r>
+              <w:rPr>
+                <w:rFonts w:ascii="Cambria Math" w:hAnsi="Cambria Math"/>
+              </w:rPr>
+              <m:t>N-1</m:t>
+            </m:r>
+          </m:den>
+        </m:f>
+      </m:oMath>
+      <w:r>
+        <w:rPr>
+          <w:rFonts w:hint="eastAsia"/>
+          <w:lang w:eastAsia="zh-CN"/>
+        </w:rPr>
+        <w:t>,</w:t>
+      </w:r>
+      <w:r>
+        <w:rPr>
+          <w:lang w:eastAsia="zh-CN"/>
+        </w:rPr>
+        <w:t xml:space="preserve"> since each source PE has 63 possible destinations within its cluster and </w:t>
+      </w:r>
+      <m:oMath>
+        <m:r>
+          <m:rPr>
+            <m:sty m:val="p"/>
+          </m:rPr>
+          <w:rPr>
+            <w:rFonts w:ascii="Cambria Math" w:hAnsi="Cambria Math"/>
+          </w:rPr>
+          <m:t>N</m:t>
+        </m:r>
+        <m:r>
+          <w:rPr>
+            <w:rFonts w:ascii="Cambria Math" w:hAnsi="Cambria Math"/>
+          </w:rPr>
+          <m:t>-64</m:t>
+        </m:r>
+      </m:oMath>
+      <w:r>
+        <w:rPr>
+          <w:rFonts w:hint="eastAsia"/>
+          <w:lang w:eastAsia="zh-CN"/>
+        </w:rPr>
+        <w:t xml:space="preserve"> </w:t>
+      </w:r>
+      <w:r>
+        <w:rPr>
+          <w:lang w:eastAsia="zh-CN"/>
+        </w:rPr>
+        <w:t>outside it, among</w:t>
+      </w:r>
+      <w:r>
+        <w:rPr>
+          <w:rFonts w:hint="eastAsia"/>
+          <w:lang w:eastAsia="zh-CN"/>
+        </w:rPr>
+        <w:t xml:space="preserve"> </w:t>
+      </w:r>
+      <m:oMath>
+        <m:r>
+          <m:rPr>
+            <m:sty m:val="p"/>
+          </m:rPr>
+          <w:rPr>
+            <w:rFonts w:ascii="Cambria Math" w:hAnsi="Cambria Math"/>
+          </w:rPr>
+          <m:t>N</m:t>
+        </m:r>
+        <m:r>
+          <w:rPr>
+            <w:rFonts w:ascii="Cambria Math" w:hAnsi="Cambria Math"/>
+          </w:rPr>
+          <m:t>-1</m:t>
+        </m:r>
+      </m:oMath>
+      <w:r>
+        <w:rPr>
+          <w:lang w:eastAsia="zh-CN"/>
+        </w:rPr>
+        <w:t xml:space="preserve"> equally likely destinations</w:t>
+      </w:r>
+    </w:p>
+    <w:p>
+      <w:pPr>
+        <w:ind w:firstLine="14.20pt"/>
+        <w:jc w:val="both"/>
+        <w:rPr>
+          <w:lang w:eastAsia="zh-CN"/>
+        </w:rPr>
+      </w:pPr>
+      <w:r>
+        <w:rPr>
+          <w:lang w:eastAsia="zh-CN"/>
+        </w:rPr>
+        <w:t>As shown in Fig. 2(c), CHAMP reduces the analytical average hop count from 5.33 to 3.43 at 64 nodes, from 10.67 to 6.37 at 256 nodes, and from 21.33 to approximately 8.3</w:t>
+      </w:r>
+      <w:r>
+        <w:rPr>
+          <w:rFonts w:hint="eastAsia"/>
+          <w:lang w:eastAsia="zh-CN"/>
+        </w:rPr>
+        <w:t>4</w:t>
+      </w:r>
+      <w:r>
+        <w:rPr>
+          <w:lang w:eastAsia="zh-CN"/>
+        </w:rPr>
+        <w:t xml:space="preserve"> at 1024 nodes, compared with a flat 2-D mesh. These correspond to reductions of approximately 35.7%, 40.3%, and 60.9%, respectively.</w:t>
+      </w:r>
+      <w:r>
+        <w:rPr>
+          <w:rFonts w:ascii="宋体" w:hAnsi="宋体" w:cs="宋体" w:hint="eastAsia"/>
+          <w:b/>
+          <w:bCs/>
+          <w:sz w:val="24"/>
+          <w:szCs w:val="24"/>
+          <w:lang w:eastAsia="zh-CN"/>
+        </w:rPr>
+        <w:t xml:space="preserve"> </w:t>
+      </w:r>
+      <w:r>
+        <w:rPr>
+          <w:lang w:eastAsia="zh-CN"/>
+        </w:rPr>
+        <w:t>Although both exhibit</w:t>
+      </w:r>
+      <w:r>
+        <w:rPr>
+          <w:rFonts w:hint="eastAsia"/>
+          <w:lang w:eastAsia="zh-CN"/>
+        </w:rPr>
+        <w:t xml:space="preserve"> </w:t>
+      </w:r>
+      <m:oMath>
+        <m:r>
+          <m:rPr>
+            <m:sty m:val="p"/>
+          </m:rPr>
+          <w:rPr>
+            <w:rFonts w:ascii="Cambria Math" w:hAnsi="Cambria Math"/>
+          </w:rPr>
+          <m:t>Θ</m:t>
+        </m:r>
+        <m:d>
+          <m:dPr>
+            <m:ctrlPr>
+              <w:rPr>
+                <w:rFonts w:ascii="Cambria Math" w:hAnsi="Cambria Math"/>
+              </w:rPr>
+            </m:ctrlPr>
+          </m:dPr>
+          <m:e>
+            <m:rad>
+              <m:radPr>
+                <m:degHide m:val="1"/>
+                <m:ctrlPr>
+                  <w:rPr>
+                    <w:rFonts w:ascii="Cambria Math" w:hAnsi="Cambria Math"/>
+                  </w:rPr>
+                </m:ctrlPr>
+              </m:radPr>
+              <m:deg/>
+              <m:e>
+                <m:r>
+                  <w:rPr>
+                    <w:rFonts w:ascii="Cambria Math" w:hAnsi="Cambria Math"/>
+                  </w:rPr>
+                  <m:t>N</m:t>
+                </m:r>
+              </m:e>
+            </m:rad>
+          </m:e>
+        </m:d>
+      </m:oMath>
+      <w:r>
+        <w:rPr>
+          <w:rFonts w:hint="eastAsia"/>
+          <w:lang w:eastAsia="zh-CN"/>
+        </w:rPr>
+        <w:t xml:space="preserve"> </w:t>
+      </w:r>
+      <w:r>
+        <w:rPr>
+          <w:lang w:eastAsia="zh-CN"/>
+        </w:rPr>
+        <w:t>growth, CHAMP has an eightfold smaller leading coefficient</w:t>
+      </w:r>
+      <w:r>
+        <w:rPr>
+          <w:rFonts w:hint="eastAsia"/>
+          <w:lang w:eastAsia="zh-CN"/>
+        </w:rPr>
+        <w:t xml:space="preserve"> than that of Mesh.</w:t>
+      </w:r>
+    </w:p>
+    <w:p>
+      <w:pPr>
+        <w:ind w:firstLine="14.20pt"/>
+        <w:jc w:val="both"/>
+        <w:rPr>
+          <w:lang w:eastAsia="zh-CN"/>
+        </w:rPr>
+      </w:pPr>
+      <w:r>
+        <w:rPr>
+          <w:lang w:eastAsia="zh-CN"/>
+        </w:rPr>
+        <w:t xml:space="preserve"> By confining local traffic to short tree paths and routing long-distance traffic through a smaller upper-level mesh, CHAMP substantially reduces the hop-dependent component of communication latency as the network scales.</w:t>
+      </w:r>
+    </w:p>
+    <w:p>
+      <w:pPr>
+        <w:pStyle w:val="2"/>
+      </w:pPr>
+      <w:r>
+        <w:t>Parallel-Router Connectivity</w:t>
+      </w:r>
+    </w:p>
+    <w:p>
+      <w:pPr>
+        <w:ind w:firstLine="14.20pt"/>
+        <w:jc w:val="both"/>
+        <w:rPr>
+          <w:lang w:eastAsia="zh-CN"/>
+        </w:rPr>
+      </w:pPr>
+      <w:r>
+        <w:rPr>
+          <w:lang w:eastAsia="zh-CN"/>
+        </w:rPr>
+        <w:t>CHAMP implements parallel-router connectivity across the hierarchical network to scale physical communication capacity without concentrating all connections in a single wide router. At the PE–L1–L2 level</w:t>
+      </w:r>
+      <w:r>
+        <w:rPr>
+          <w:rFonts w:hint="eastAsia"/>
+          <w:lang w:eastAsia="zh-CN"/>
+        </w:rPr>
+        <w:t xml:space="preserve"> (Fig.2(d))</w:t>
+      </w:r>
+      <w:r>
+        <w:rPr>
+          <w:lang w:eastAsia="zh-CN"/>
+        </w:rPr>
+        <w:t>, each L1 router connects four PEs and communicates with its parent</w:t>
+      </w:r>
+      <w:r>
+        <w:rPr>
+          <w:rFonts w:hint="eastAsia"/>
+          <w:lang w:eastAsia="zh-CN"/>
+        </w:rPr>
+        <w:t xml:space="preserve"> </w:t>
+      </w:r>
+      <w:r>
+        <w:rPr>
+          <w:lang w:eastAsia="zh-CN"/>
+        </w:rPr>
+        <w:t xml:space="preserve">L2 router </w:t>
+      </w:r>
+      <w:r>
+        <w:rPr>
+          <w:lang w:eastAsia="zh-CN"/>
+        </w:rPr>
+        <w:t>group</w:t>
+      </w:r>
+      <w:r>
+        <w:rPr>
+          <w:rFonts w:hint="eastAsia"/>
+          <w:lang w:eastAsia="zh-CN"/>
+        </w:rPr>
+        <w:t xml:space="preserve"> </w:t>
+      </w:r>
+      <w:r>
+        <w:rPr>
+          <w:lang w:eastAsia="zh-CN"/>
+        </w:rPr>
+        <w:t xml:space="preserve">through four parallel lanes. Each L2 router </w:t>
+      </w:r>
+      <w:r>
+        <w:rPr>
+          <w:rFonts w:hint="eastAsia"/>
+          <w:lang w:eastAsia="zh-CN"/>
+        </w:rPr>
+        <w:t xml:space="preserve">group </w:t>
+      </w:r>
+      <w:r>
+        <w:rPr>
+          <w:lang w:eastAsia="zh-CN"/>
+        </w:rPr>
+        <w:t>is implemented using four physical router instances. The four L2 router</w:t>
+      </w:r>
+      <w:r>
+        <w:rPr>
+          <w:rFonts w:hint="eastAsia"/>
+          <w:lang w:eastAsia="zh-CN"/>
+        </w:rPr>
+        <w:t xml:space="preserve"> groups </w:t>
+      </w:r>
+      <w:r>
+        <w:rPr>
+          <w:lang w:eastAsia="zh-CN"/>
+        </w:rPr>
+        <w:t xml:space="preserve">communicate with </w:t>
+      </w:r>
+      <w:r>
+        <w:rPr>
+          <w:rFonts w:hint="eastAsia"/>
+          <w:lang w:eastAsia="zh-CN"/>
+        </w:rPr>
+        <w:t xml:space="preserve">one L3 router group consisting of </w:t>
+      </w:r>
+      <w:r>
+        <w:rPr>
+          <w:lang w:eastAsia="zh-CN"/>
+        </w:rPr>
+        <w:t>16 physical L3 instances</w:t>
+      </w:r>
+      <w:r>
+        <w:rPr>
+          <w:rFonts w:hint="eastAsia"/>
+          <w:lang w:eastAsia="zh-CN"/>
+        </w:rPr>
+        <w:t xml:space="preserve"> (Fig.2(e))</w:t>
+      </w:r>
+      <w:r>
+        <w:rPr>
+          <w:lang w:eastAsia="zh-CN"/>
+        </w:rPr>
+        <w:t xml:space="preserve">. At the L3–mesh interface, these L3 instances connect to 16 physical mesh-router instances within a mesh router </w:t>
+      </w:r>
+      <w:r>
+        <w:rPr>
+          <w:rFonts w:hint="eastAsia"/>
+          <w:lang w:eastAsia="zh-CN"/>
+        </w:rPr>
+        <w:t xml:space="preserve">group </w:t>
+      </w:r>
+      <w:r>
+        <w:rPr>
+          <w:lang w:eastAsia="zh-CN"/>
+        </w:rPr>
+        <w:t>(MR)</w:t>
+      </w:r>
+      <w:r>
+        <w:rPr>
+          <w:rFonts w:hint="eastAsia"/>
+          <w:lang w:eastAsia="zh-CN"/>
+        </w:rPr>
+        <w:t xml:space="preserve"> (Fig.2(f))</w:t>
+      </w:r>
+      <w:r>
+        <w:rPr>
+          <w:lang w:eastAsia="zh-CN"/>
+        </w:rPr>
+        <w:t>. Each MR thus comprises 16 physical mesh routers, whose directional connections provide parallel communication paths to neighboring MRs</w:t>
+      </w:r>
+      <w:r>
+        <w:rPr>
+          <w:rFonts w:hint="eastAsia"/>
+          <w:lang w:eastAsia="zh-CN"/>
+        </w:rPr>
+        <w:t xml:space="preserve"> (Fig.2(</w:t>
+      </w:r>
+      <w:r>
+        <w:rPr>
+          <w:rFonts w:hint="eastAsia"/>
+          <w:lang w:eastAsia="zh-CN"/>
+        </w:rPr>
+        <w:t>g</w:t>
+      </w:r>
+      <w:r>
+        <w:rPr>
+          <w:rFonts w:hint="eastAsia"/>
+          <w:lang w:eastAsia="zh-CN"/>
+        </w:rPr>
+        <w:t>))</w:t>
+      </w:r>
+      <w:r>
+        <w:rPr>
+          <w:lang w:eastAsia="zh-CN"/>
+        </w:rPr>
+        <w:t xml:space="preserve">. </w:t>
+      </w:r>
+    </w:p>
+    <w:p>
+      <w:pPr>
+        <w:ind w:firstLine="14.20pt"/>
+        <w:jc w:val="both"/>
+        <w:rPr>
+          <w:lang w:eastAsia="zh-CN"/>
+        </w:rPr>
+      </w:pPr>
+      <w:r>
+        <w:rPr>
+          <w:lang w:eastAsia="zh-CN"/>
+        </w:rPr>
+        <w:t xml:space="preserve">To quantify the bandwidth scaling capability, we consider uniform-random unicast traffic in an </w:t>
+      </w:r>
+      <w:r>
+        <w:rPr>
+          <w:rFonts w:hint="eastAsia"/>
+          <w:lang w:eastAsia="zh-CN"/>
+        </w:rPr>
+        <w:t>N</w:t>
+      </w:r>
+      <w:r>
+        <w:rPr>
+          <w:lang w:eastAsia="zh-CN"/>
+        </w:rPr>
+        <w:t>-node network, where each PE injects traffic at rate</w:t>
+      </w:r>
+      <w:r>
+        <w:rPr>
+          <w:rFonts w:hint="eastAsia"/>
+          <w:lang w:eastAsia="zh-CN"/>
+        </w:rPr>
+        <w:t xml:space="preserve"> </w:t>
+      </w:r>
+      <m:oMath>
+        <m:r>
+          <w:rPr>
+            <w:rFonts w:ascii="Cambria Math" w:hAnsi="Cambria Math"/>
+          </w:rPr>
+          <m:t>λ</m:t>
+        </m:r>
+      </m:oMath>
+      <w:r>
+        <w:rPr>
+          <w:lang w:eastAsia="zh-CN"/>
+        </w:rPr>
+        <w:t xml:space="preserve"> and independently selects one of the other N-1 PEs as its destination. For a region containing </w:t>
+      </w:r>
+      <w:r>
+        <w:rPr>
+          <w:rFonts w:hint="eastAsia"/>
+          <w:lang w:eastAsia="zh-CN"/>
+        </w:rPr>
+        <w:t>s</w:t>
+      </w:r>
+      <w:r>
+        <w:rPr>
+          <w:lang w:eastAsia="zh-CN"/>
+        </w:rPr>
+        <w:t xml:space="preserve"> PEs, the expected outgoing traffic is</w:t>
+      </w:r>
+      <w:r>
+        <w:rPr>
+          <w:rFonts w:hint="eastAsia"/>
+          <w:lang w:eastAsia="zh-CN"/>
+        </w:rPr>
+        <w:t xml:space="preserve"> </w:t>
+      </w:r>
+      <m:oMath>
+        <m:f>
+          <m:fPr>
+            <m:ctrlPr>
+              <w:rPr>
+                <w:rFonts w:ascii="Cambria Math" w:hAnsi="Cambria Math"/>
+              </w:rPr>
+            </m:ctrlPr>
+          </m:fPr>
+          <m:num>
+            <m:r>
+              <w:rPr>
+                <w:rFonts w:ascii="Cambria Math" w:hAnsi="Cambria Math"/>
+              </w:rPr>
+              <m:t>sλ</m:t>
+            </m:r>
+            <m:d>
+              <m:dPr>
+                <m:ctrlPr>
+                  <w:rPr>
+                    <w:rFonts w:ascii="Cambria Math" w:hAnsi="Cambria Math"/>
+                  </w:rPr>
+                </m:ctrlPr>
+              </m:dPr>
+              <m:e>
+                <m:r>
+                  <w:rPr>
+                    <w:rFonts w:ascii="Cambria Math" w:hAnsi="Cambria Math"/>
+                  </w:rPr>
+                  <m:t>N-s</m:t>
+                </m:r>
+              </m:e>
+            </m:d>
+          </m:num>
+          <m:den>
+            <m:r>
+              <w:rPr>
+                <w:rFonts w:ascii="Cambria Math" w:hAnsi="Cambria Math"/>
+              </w:rPr>
+              <m:t>N-1</m:t>
+            </m:r>
+          </m:den>
+        </m:f>
+      </m:oMath>
+      <w:r>
+        <w:rPr>
+          <w:lang w:eastAsia="zh-CN"/>
+        </w:rPr>
+        <w:t xml:space="preserve">. If the region boundary provides </w:t>
+      </w:r>
+      <w:r>
+        <w:rPr>
+          <w:rFonts w:hint="eastAsia"/>
+          <w:lang w:eastAsia="zh-CN"/>
+        </w:rPr>
+        <w:t>c</w:t>
+      </w:r>
+      <w:r>
+        <w:rPr>
+          <w:lang w:eastAsia="zh-CN"/>
+        </w:rPr>
+        <w:t xml:space="preserve"> independent directed lanes, each with transmission capacity C, the saturation injection rate is bounded by</w:t>
+      </w:r>
+    </w:p>
+    <w:p>
+      <w:pPr>
+        <w:jc w:val="both"/>
+        <w:rPr>
+          <w:lang w:eastAsia="zh-CN"/>
+        </w:rPr>
+      </w:pPr>
+      <m:oMathPara>
+        <m:oMath>
+          <m:sSub>
+            <m:sSubPr>
+              <m:ctrlPr>
+                <w:rPr>
+                  <w:rFonts w:ascii="Cambria Math" w:hAnsi="Cambria Math"/>
+                </w:rPr>
+              </m:ctrlPr>
+            </m:sSubPr>
+            <m:e>
+              <m:r>
+                <w:rPr>
+                  <w:rFonts w:ascii="Cambria Math" w:hAnsi="Cambria Math"/>
+                </w:rPr>
+                <m:t>λ</m:t>
+              </m:r>
+            </m:e>
+            <m:sub>
+              <m:r>
+                <m:rPr>
+                  <m:sty m:val="p"/>
+                </m:rPr>
+                <w:rPr>
+                  <w:rFonts w:ascii="Cambria Math" w:hAnsi="Cambria Math"/>
+                </w:rPr>
+                <m:t>sat</m:t>
+              </m:r>
+            </m:sub>
+          </m:sSub>
+          <m:r>
+            <w:rPr>
+              <w:rFonts w:ascii="Cambria Math" w:hAnsi="Cambria Math"/>
+            </w:rPr>
+            <m:t>≤</m:t>
+          </m:r>
+          <m:f>
+            <m:fPr>
+              <m:ctrlPr>
+                <w:rPr>
+                  <w:rFonts w:ascii="Cambria Math" w:hAnsi="Cambria Math"/>
+                </w:rPr>
+              </m:ctrlPr>
+            </m:fPr>
+            <m:num>
+              <m:r>
+                <w:rPr>
+                  <w:rFonts w:ascii="Cambria Math" w:hAnsi="Cambria Math"/>
+                </w:rPr>
+                <m:t>cC</m:t>
+              </m:r>
+              <m:d>
+                <m:dPr>
+                  <m:ctrlPr>
+                    <w:rPr>
+                      <w:rFonts w:ascii="Cambria Math" w:hAnsi="Cambria Math"/>
+                    </w:rPr>
+                  </m:ctrlPr>
+                </m:dPr>
+                <m:e>
+                  <m:r>
+                    <w:rPr>
+                      <w:rFonts w:ascii="Cambria Math" w:hAnsi="Cambria Math"/>
+                    </w:rPr>
+                    <m:t>N-1</m:t>
+                  </m:r>
+                </m:e>
+              </m:d>
+            </m:num>
+            <m:den>
+              <m:r>
+                <w:rPr>
+                  <w:rFonts w:ascii="Cambria Math" w:hAnsi="Cambria Math"/>
+                </w:rPr>
+                <m:t>s</m:t>
+              </m:r>
+              <m:d>
+                <m:dPr>
+                  <m:ctrlPr>
+                    <w:rPr>
+                      <w:rFonts w:ascii="Cambria Math" w:hAnsi="Cambria Math"/>
+                    </w:rPr>
+                  </m:ctrlPr>
+                </m:dPr>
+                <m:e>
+                  <m:r>
+                    <w:rPr>
+                      <w:rFonts w:ascii="Cambria Math" w:hAnsi="Cambria Math"/>
+                    </w:rPr>
+                    <m:t>N-s</m:t>
+                  </m:r>
+                </m:e>
+              </m:d>
+            </m:den>
+          </m:f>
+        </m:oMath>
+      </m:oMathPara>
+    </w:p>
+    <w:p>
+      <w:pPr>
+        <w:ind w:firstLine="14.20pt"/>
+        <w:jc w:val="both"/>
+        <w:rPr>
+          <w:lang w:eastAsia="zh-CN"/>
+        </w:rPr>
+      </w:pPr>
+      <w:r>
+        <w:rPr>
+          <w:lang w:eastAsia="zh-CN"/>
+        </w:rPr>
+        <w:t>The bound reveals the capacity bottleneck caused by traffic aggregation. For the evaluated 64-PE network, the conventional Fat-Tree’s 16-PE subtree yields an injection-rate bound of</w:t>
+      </w:r>
+      <w:r>
+        <w:rPr>
+          <w:rFonts w:hint="eastAsia"/>
+          <w:lang w:eastAsia="zh-CN"/>
+        </w:rPr>
+        <w:t xml:space="preserve"> </w:t>
+      </w:r>
+      <m:oMath>
+        <m:f>
+          <m:fPr>
+            <m:ctrlPr>
+              <w:rPr>
+                <w:rFonts w:ascii="Cambria Math" w:hAnsi="Cambria Math"/>
+              </w:rPr>
+            </m:ctrlPr>
+          </m:fPr>
+          <m:num>
+            <m:r>
+              <w:rPr>
+                <w:rFonts w:ascii="Cambria Math" w:hAnsi="Cambria Math"/>
+              </w:rPr>
+              <m:t>21C</m:t>
+            </m:r>
+          </m:num>
+          <m:den>
+            <m:r>
+              <w:rPr>
+                <w:rFonts w:ascii="Cambria Math" w:hAnsi="Cambria Math"/>
+              </w:rPr>
+              <m:t>64</m:t>
+            </m:r>
+          </m:den>
+        </m:f>
+      </m:oMath>
+      <w:r>
+        <w:rPr>
+          <w:rFonts w:hint="eastAsia"/>
+          <w:lang w:eastAsia="zh-CN"/>
+        </w:rPr>
+        <w:t>,</w:t>
+      </w:r>
+      <w:r>
+        <w:rPr>
+          <w:lang w:eastAsia="zh-CN"/>
+        </w:rPr>
+        <w:t xml:space="preserve"> below the</w:t>
+      </w:r>
+      <w:r>
+        <w:rPr>
+          <w:lang w:eastAsia="zh-CN"/>
+        </w:rPr>
+        <w:t xml:space="preserve"> </w:t>
+      </w:r>
+      <m:oMath>
+        <m:r>
+          <w:rPr>
+            <w:rFonts w:ascii="Cambria Math" w:hAnsi="Cambria Math"/>
+          </w:rPr>
+          <m:t>8×8</m:t>
+        </m:r>
+      </m:oMath>
+      <w:r>
+        <w:rPr>
+          <w:lang w:eastAsia="zh-CN"/>
+        </w:rPr>
+        <w:t xml:space="preserve"> </w:t>
+      </w:r>
+      <w:r>
+        <w:rPr>
+          <w:lang w:eastAsia="zh-CN"/>
+        </w:rPr>
+        <w:t xml:space="preserve">mesh bisection bound of </w:t>
+      </w:r>
+      <m:oMath>
+        <m:f>
+          <m:fPr>
+            <m:ctrlPr>
+              <w:rPr>
+                <w:rFonts w:ascii="Cambria Math" w:hAnsi="Cambria Math"/>
+              </w:rPr>
+            </m:ctrlPr>
+          </m:fPr>
+          <m:num>
+            <m:r>
+              <w:rPr>
+                <w:rFonts w:ascii="Cambria Math" w:hAnsi="Cambria Math"/>
+              </w:rPr>
+              <m:t>63C</m:t>
+            </m:r>
+          </m:num>
+          <m:den>
+            <m:r>
+              <w:rPr>
+                <w:rFonts w:ascii="Cambria Math" w:hAnsi="Cambria Math"/>
+              </w:rPr>
+              <m:t>128</m:t>
+            </m:r>
+          </m:den>
+        </m:f>
+      </m:oMath>
+      <w:r>
+        <w:rPr>
+          <w:lang w:eastAsia="zh-CN"/>
+        </w:rPr>
+        <w:t xml:space="preserve">. CHAMP increases the outgoing lanes of the corresponding subtree from four to 16, raising its bound fourfold to </w:t>
+      </w:r>
+      <m:oMath>
+        <m:f>
+          <m:fPr>
+            <m:ctrlPr>
+              <w:rPr>
+                <w:rFonts w:ascii="Cambria Math" w:hAnsi="Cambria Math"/>
+              </w:rPr>
+            </m:ctrlPr>
+          </m:fPr>
+          <m:num>
+            <m:r>
+              <w:rPr>
+                <w:rFonts w:ascii="Cambria Math" w:hAnsi="Cambria Math"/>
+              </w:rPr>
+              <m:t>21C</m:t>
+            </m:r>
+          </m:num>
+          <m:den>
+            <m:r>
+              <w:rPr>
+                <w:rFonts w:ascii="Cambria Math" w:hAnsi="Cambria Math"/>
+              </w:rPr>
+              <m:t>16</m:t>
+            </m:r>
+          </m:den>
+        </m:f>
+      </m:oMath>
+      <w:r>
+        <w:rPr>
+          <w:lang w:eastAsia="zh-CN"/>
+        </w:rPr>
+        <w:t>. This capacity is distributed across four fixed-size L2 router instances, relieving the aggregation bottleneck without widening individual routers</w:t>
+      </w:r>
+    </w:p>
+    <w:p>
+      <w:pPr>
+        <w:jc w:val="both"/>
+        <w:rPr>
+          <w:rFonts w:hint="eastAsia"/>
+          <w:lang w:eastAsia="zh-CN"/>
+        </w:rPr>
+      </w:pPr>
+    </w:p>
+    <w:p>
+      <w:pPr>
+        <w:pStyle w:val="1"/>
+        <w:rPr>
+          <w:lang w:eastAsia="zh-CN"/>
+        </w:rPr>
+      </w:pPr>
+      <w:r>
+        <w:lastRenderedPageBreak/>
+        <w:drawing>
+          <wp:anchor distT="0" distB="0" distL="114300" distR="114300" simplePos="0" relativeHeight="251667456" behindDoc="0" locked="0" layoutInCell="1" allowOverlap="1" wp14:anchorId="398A1289" wp14:editId="6A428885">
+            <wp:simplePos x="0" y="0"/>
+            <wp:positionH relativeFrom="column">
+              <wp:posOffset>0</wp:posOffset>
+            </wp:positionH>
+            <wp:positionV relativeFrom="paragraph">
+              <wp:posOffset>2776855</wp:posOffset>
+            </wp:positionV>
+            <wp:extent cx="6426200" cy="635"/>
+            <wp:effectExtent l="0" t="0" r="0" b="0"/>
+            <wp:wrapTopAndBottom/>
+            <wp:docPr id="1192396582" name="文本框 1"/>
+            <wp:cNvGraphicFramePr/>
+            <a:graphic xmlns:a="http://purl.oclc.org/ooxml/drawingml/main">
+              <a:graphicData uri="http://schemas.microsoft.com/office/word/2010/wordprocessingShape">
+                <wp:wsp>
+                  <wp:cNvSpPr txBox="1"/>
+                  <wp:spPr>
+                    <a:xfrm>
+                      <a:off x="0" y="0"/>
+                      <a:ext cx="6426200" cy="635"/>
+                    </a:xfrm>
+                    <a:prstGeom prst="rect">
+                      <a:avLst/>
+                    </a:prstGeom>
+                    <a:solidFill>
+                      <a:prstClr val="white"/>
+                    </a:solidFill>
+                    <a:ln>
+                      <a:noFill/>
+                    </a:ln>
+                  </wp:spPr>
+                  <wp:txbx>
+                    <wne:txbxContent>
+                      <w:p>
+                        <w:pPr>
+                          <w:pStyle w:val="ab"/>
+                          <w:rPr>
+                            <w:rFonts w:ascii="Times New Roman" w:eastAsia="宋体" w:hAnsi="Times New Roman" w:cs="Times New Roman"/>
+                            <w:smallCaps/>
+                            <w:noProof/>
+                            <w:sz w:val="16"/>
+                            <w:szCs w:val="16"/>
+                          </w:rPr>
+                        </w:pPr>
+                        <w:r>
+                          <w:rPr>
+                            <w:rFonts w:ascii="Times New Roman" w:hAnsi="Times New Roman" w:cs="Times New Roman"/>
+                            <w:sz w:val="16"/>
+                            <w:szCs w:val="16"/>
+                          </w:rPr>
+                          <w:t xml:space="preserve">Fig. </w:t>
+                        </w:r>
+                        <w:r>
+                          <w:rPr>
+                            <w:rFonts w:ascii="Times New Roman" w:hAnsi="Times New Roman" w:cs="Times New Roman"/>
+                            <w:sz w:val="16"/>
+                            <w:szCs w:val="16"/>
+                          </w:rPr>
+                          <w:fldChar w:fldCharType="begin"/>
+                        </w:r>
+                        <w:r>
+                          <w:rPr>
+                            <w:rFonts w:ascii="Times New Roman" w:hAnsi="Times New Roman" w:cs="Times New Roman"/>
+                            <w:sz w:val="16"/>
+                            <w:szCs w:val="16"/>
+                          </w:rPr>
+                          <w:instrText xml:space="preserve"> SEQ Fig. \* ARABIC </w:instrText>
+                        </w:r>
+                        <w:r>
+                          <w:rPr>
+                            <w:rFonts w:ascii="Times New Roman" w:hAnsi="Times New Roman" w:cs="Times New Roman"/>
+                            <w:sz w:val="16"/>
+                            <w:szCs w:val="16"/>
+                          </w:rPr>
+                          <w:fldChar w:fldCharType="separate"/>
+                        </w:r>
+                        <w:r>
+                          <w:rPr>
+                            <w:rFonts w:ascii="Times New Roman" w:hAnsi="Times New Roman" w:cs="Times New Roman"/>
+                            <w:noProof/>
+                            <w:sz w:val="16"/>
+                            <w:szCs w:val="16"/>
+                          </w:rPr>
+                          <w:t>3</w:t>
+                        </w:r>
+                        <w:r>
+                          <w:rPr>
+                            <w:rFonts w:ascii="Times New Roman" w:hAnsi="Times New Roman" w:cs="Times New Roman"/>
+                            <w:sz w:val="16"/>
+                            <w:szCs w:val="16"/>
+                          </w:rPr>
+                          <w:fldChar w:fldCharType="end"/>
+                        </w:r>
+                        <w:r>
+                          <w:rPr>
+                            <w:rFonts w:ascii="Times New Roman" w:hAnsi="Times New Roman" w:cs="Times New Roman"/>
+                            <w:b/>
+                            <w:bCs/>
+                            <w:sz w:val="16"/>
+                            <w:szCs w:val="16"/>
+                          </w:rPr>
+                          <w:t xml:space="preserve"> CHAMP router microarchitecture</w:t>
+                        </w:r>
+                        <w:r>
+                          <w:rPr>
+                            <w:rFonts w:ascii="Times New Roman" w:hAnsi="Times New Roman" w:cs="Times New Roman" w:hint="eastAsia"/>
+                            <w:b/>
+                            <w:bCs/>
+                            <w:sz w:val="16"/>
+                            <w:szCs w:val="16"/>
+                            <w:lang w:eastAsia="zh-CN"/>
+                          </w:rPr>
+                          <w:t xml:space="preserve"> for the c1p4 configuration</w:t>
+                        </w:r>
+                        <w:r>
+                          <w:rPr>
+                            <w:rFonts w:ascii="Times New Roman" w:hAnsi="Times New Roman" w:cs="Times New Roman"/>
+                            <w:b/>
+                            <w:bCs/>
+                            <w:sz w:val="16"/>
+                            <w:szCs w:val="16"/>
+                          </w:rPr>
+                          <w:t>.</w:t>
+                        </w:r>
+                        <w:r>
+                          <w:rPr>
+                            <w:rFonts w:ascii="Times New Roman" w:hAnsi="Times New Roman" w:cs="Times New Roman"/>
+                            <w:sz w:val="16"/>
+                            <w:szCs w:val="16"/>
+                          </w:rPr>
+                          <w:t xml:space="preserve"> Each input port module (IPM) combines route computation with packet storage and independent read interfaces for multicast forwarding. Lane selectors and phase adapters connect multi-lane output directions to their physical output port modules (OPMs).</w:t>
+                        </w:r>
+                        <w:r>
+                          <w:rPr>
+                            <w:rFonts w:ascii="Times New Roman" w:eastAsia="宋体" w:hAnsi="Times New Roman" w:cs="Times New Roman"/>
+                          </w:rPr>
+                          <w:t xml:space="preserve"> </w:t>
+                        </w:r>
+                        <w:r>
+                          <w:rPr>
+                            <w:rFonts w:ascii="Times New Roman" w:hAnsi="Times New Roman" w:cs="Times New Roman"/>
+                            <w:sz w:val="16"/>
+                            <w:szCs w:val="16"/>
+                          </w:rPr>
+                          <w:t>Each Dir0–3 OPM uses 7-way arbitration over three inputs from the other single-lane directions and four Dir4 inputs. Each Dir4 OPM uses 4-way arbitration over the four Dir0–3 inputs. Connections within the same direction are excluded. Click-based control governs flit forwarding.</w:t>
+                        </w:r>
+                        <w:r>
+                          <w:rPr>
+                            <w:rFonts w:ascii="Times New Roman" w:hAnsi="Times New Roman" w:cs="Times New Roman"/>
+                            <w:sz w:val="16"/>
+                            <w:szCs w:val="16"/>
+                          </w:rPr>
+                          <w:t xml:space="preserve"> </w:t>
+                        </w:r>
+                      </w:p>
+                    </wne:txbxContent>
+                  </wp:txbx>
+                  <wp:bodyPr rot="0" spcFirstLastPara="0" vertOverflow="overflow" horzOverflow="overflow" vert="horz" wrap="square" lIns="0" tIns="0" rIns="0" bIns="0" numCol="1" spcCol="0" rtlCol="0" fromWordArt="0" anchor="t" anchorCtr="0" forceAA="0" compatLnSpc="1">
+                    <a:prstTxWarp prst="textNoShape">
+                      <a:avLst/>
+                    </a:prstTxWarp>
+                    <a:spAutoFit/>
+                  </wp:bodyPr>
+                </wp:wsp>
+              </a:graphicData>
+            </a:graphic>
+          </wp:anchor>
+        </w:drawing>
+      </w:r>
+      <w:r>
+        <w:rPr>
+          <w:rFonts w:hint="eastAsia"/>
+          <w:lang w:eastAsia="zh-CN"/>
+        </w:rPr>
+        <w:drawing>
+          <wp:anchor distT="0" distB="0" distL="114300" distR="114300" simplePos="0" relativeHeight="251665408" behindDoc="0" locked="0" layoutInCell="1" allowOverlap="1" wp14:anchorId="433245D8" wp14:editId="43BFFF99">
+            <wp:simplePos x="0" y="0"/>
+            <wp:positionH relativeFrom="margin">
+              <wp:align>right</wp:align>
+            </wp:positionH>
+            <wp:positionV relativeFrom="margin">
+              <wp:align>top</wp:align>
+            </wp:positionV>
+            <wp:extent cx="6426200" cy="2719705"/>
+            <wp:effectExtent l="0" t="0" r="0" b="4445"/>
+            <wp:wrapTopAndBottom/>
+            <wp:docPr id="899161886" name="图形 5"/>
+            <wp:cNvGraphicFramePr>
+              <a:graphicFrameLocks xmlns:a="http://purl.oclc.org/ooxml/drawingml/main" noChangeAspect="1"/>
+            </wp:cNvGraphicFramePr>
+            <a:graphic xmlns:a="http://purl.oclc.org/ooxml/drawingml/main">
+              <a:graphicData uri="http://purl.oclc.org/ooxml/drawingml/picture">
+                <pic:pic xmlns:pic="http://purl.oclc.org/ooxml/drawingml/picture">
+                  <pic:nvPicPr>
+                    <pic:cNvPr id="899161886" name="图形 899161886"/>
+                    <pic:cNvPicPr/>
+                  </pic:nvPicPr>
+                  <pic:blipFill>
+                    <a:blip r:embed="rId13">
+                      <a:extLst>
+                        <a:ext uri="{96DAC541-7B7A-43D3-8B79-37D633B846F1}">
+                          <asvg:svgBlip xmlns:asvg="http://schemas.microsoft.com/office/drawing/2016/SVG/main" r:embed="rId14"/>
+                        </a:ext>
+                      </a:extLst>
+                    </a:blip>
+                    <a:stretch>
+                      <a:fillRect/>
+                    </a:stretch>
+                  </pic:blipFill>
+                  <pic:spPr>
+                    <a:xfrm>
+                      <a:off x="0" y="0"/>
+                      <a:ext cx="6426200" cy="2719705"/>
+                    </a:xfrm>
+                    <a:prstGeom prst="rect">
+                      <a:avLst/>
+                    </a:prstGeom>
+                  </pic:spPr>
+                </pic:pic>
+              </a:graphicData>
+            </a:graphic>
+          </wp:anchor>
+        </w:drawing>
+      </w:r>
+      <w:r>
+        <w:rPr>
+          <w:rFonts w:hint="eastAsia"/>
+          <w:lang w:eastAsia="zh-CN"/>
+        </w:rPr>
+        <w:t>Router Microarchitecture</w:t>
+      </w:r>
+    </w:p>
+    <w:p>
+      <w:pPr>
+        <w:ind w:firstLine="14.20pt"/>
+        <w:jc w:val="both"/>
+        <w:rPr>
+          <w:lang w:eastAsia="zh-CN"/>
+        </w:rPr>
+      </w:pPr>
+      <w:r>
+        <w:rPr>
+          <w:lang w:eastAsia="zh-CN"/>
+        </w:rPr>
+        <w:t>CHAMP builds on the input port module (IPM)–output port module (OPM) organization and continuous-time multiway-read buffer of CMR [ref]. It combines Click-based forwarding with dynamic lane allocation and handshake phase adaptation to support multicast over the parallel connections described in Section III.</w:t>
+      </w:r>
+    </w:p>
+    <w:p>
+      <w:pPr>
+        <w:jc w:val="both"/>
+        <w:rPr>
+          <w:rFonts w:hint="eastAsia"/>
+          <w:lang w:eastAsia="zh-CN"/>
+        </w:rPr>
+      </w:pPr>
+    </w:p>
+    <w:p>
+      <w:pPr>
+        <w:keepNext/>
+        <w:jc w:val="both"/>
+      </w:pPr>
+      <w:r>
+        <w:rPr>
+          <w:noProof/>
+        </w:rPr>
+        <w:drawing>
+          <wp:inline distT="0" distB="0" distL="0" distR="0" wp14:anchorId="0D977D77" wp14:editId="43BFCF32">
+            <wp:extent cx="3111500" cy="3459480"/>
+            <wp:effectExtent l="0" t="0" r="0" b="7620"/>
+            <wp:docPr id="564025419" name="图形 7"/>
+            <wp:cNvGraphicFramePr>
+              <a:graphicFrameLocks xmlns:a="http://purl.oclc.org/ooxml/drawingml/main" noChangeAspect="1"/>
+            </wp:cNvGraphicFramePr>
+            <a:graphic xmlns:a="http://purl.oclc.org/ooxml/drawingml/main">
+              <a:graphicData uri="http://purl.oclc.org/ooxml/drawingml/picture">
+                <pic:pic xmlns:pic="http://purl.oclc.org/ooxml/drawingml/picture">
+                  <pic:nvPicPr>
+                    <pic:cNvPr id="564025419" name="图形 564025419"/>
+                    <pic:cNvPicPr/>
+                  </pic:nvPicPr>
+                  <pic:blipFill>
+                    <a:blip r:embed="rId15">
+                      <a:extLst>
+                        <a:ext uri="{96DAC541-7B7A-43D3-8B79-37D633B846F1}">
+                          <asvg:svgBlip xmlns:asvg="http://schemas.microsoft.com/office/drawing/2016/SVG/main" r:embed="rId16"/>
+                        </a:ext>
+                      </a:extLst>
+                    </a:blip>
+                    <a:stretch>
+                      <a:fillRect/>
+                    </a:stretch>
+                  </pic:blipFill>
+                  <pic:spPr>
+                    <a:xfrm>
+                      <a:off x="0" y="0"/>
+                      <a:ext cx="3111500" cy="3459480"/>
+                    </a:xfrm>
+                    <a:prstGeom prst="rect">
+                      <a:avLst/>
+                    </a:prstGeom>
+                  </pic:spPr>
+                </pic:pic>
+              </a:graphicData>
+            </a:graphic>
+          </wp:inline>
+        </w:drawing>
+      </w:r>
+    </w:p>
+    <w:p>
+      <w:pPr>
+        <w:pStyle w:val="ab"/>
+        <w:jc w:val="both"/>
+        <w:rPr>
+          <w:rFonts w:ascii="Times New Roman" w:hAnsi="Times New Roman" w:cs="Times New Roman" w:hint="eastAsia"/>
+          <w:sz w:val="16"/>
+          <w:szCs w:val="16"/>
+          <w:lang w:eastAsia="zh-CN"/>
+        </w:rPr>
+      </w:pPr>
+      <w:r>
+        <w:rPr>
+          <w:rFonts w:ascii="Times New Roman" w:hAnsi="Times New Roman" w:cs="Times New Roman"/>
+          <w:sz w:val="16"/>
+          <w:szCs w:val="16"/>
+        </w:rPr>
+        <w:t xml:space="preserve">Fig. </w:t>
+      </w:r>
+      <w:r>
+        <w:rPr>
+          <w:rFonts w:ascii="Times New Roman" w:hAnsi="Times New Roman" w:cs="Times New Roman"/>
+          <w:sz w:val="16"/>
+          <w:szCs w:val="16"/>
+        </w:rPr>
+        <w:fldChar w:fldCharType="begin"/>
+      </w:r>
+      <w:r>
+        <w:rPr>
+          <w:rFonts w:ascii="Times New Roman" w:hAnsi="Times New Roman" w:cs="Times New Roman"/>
+          <w:sz w:val="16"/>
+          <w:szCs w:val="16"/>
+        </w:rPr>
+        <w:instrText xml:space="preserve"> SEQ Fig. \* ARABIC </w:instrText>
+      </w:r>
+      <w:r>
+        <w:rPr>
+          <w:rFonts w:ascii="Times New Roman" w:hAnsi="Times New Roman" w:cs="Times New Roman"/>
+          <w:sz w:val="16"/>
+          <w:szCs w:val="16"/>
+        </w:rPr>
+        <w:fldChar w:fldCharType="separate"/>
+      </w:r>
+      <w:r>
+        <w:rPr>
+          <w:rFonts w:ascii="Times New Roman" w:hAnsi="Times New Roman" w:cs="Times New Roman"/>
+          <w:noProof/>
+          <w:sz w:val="16"/>
+          <w:szCs w:val="16"/>
+        </w:rPr>
+        <w:t>4</w:t>
+      </w:r>
+      <w:r>
+        <w:rPr>
+          <w:rFonts w:ascii="Times New Roman" w:hAnsi="Times New Roman" w:cs="Times New Roman"/>
+          <w:sz w:val="16"/>
+          <w:szCs w:val="16"/>
+        </w:rPr>
+        <w:fldChar w:fldCharType="end"/>
+      </w:r>
+      <w:r>
+        <w:rPr>
+          <w:rFonts w:ascii="Times New Roman" w:hAnsi="Times New Roman" w:cs="Times New Roman" w:hint="eastAsia"/>
+          <w:sz w:val="16"/>
+          <w:szCs w:val="16"/>
+          <w:lang w:eastAsia="zh-CN"/>
+        </w:rPr>
+        <w:t xml:space="preserve"> </w:t>
+      </w:r>
+      <w:r>
+        <w:rPr>
+          <w:rFonts w:ascii="Times New Roman" w:hAnsi="Times New Roman" w:cs="Times New Roman"/>
+          <w:b/>
+          <w:bCs/>
+          <w:sz w:val="16"/>
+          <w:szCs w:val="16"/>
+        </w:rPr>
+        <w:t>Control circuits for Click-based multicast forwarding and multi-lane operation.</w:t>
+      </w:r>
+      <w:r>
+        <w:rPr>
+          <w:rFonts w:ascii="Times New Roman" w:hAnsi="Times New Roman" w:cs="Times New Roman"/>
+          <w:sz w:val="16"/>
+          <w:szCs w:val="16"/>
+        </w:rPr>
+        <w:t xml:space="preserve"> (a) Read interface control with an independent read pointer and completion feedback. (b) Write interface control for shared storage and tail-flit acknowledgement. (c) Routing computation unit for header capture and branch-enable control. (d) </w:t>
+      </w:r>
+      <w:proofErr w:type="gramStart"/>
+      <w:r>
+        <w:rPr>
+          <w:rFonts w:ascii="Times New Roman" w:hAnsi="Times New Roman" w:cs="Times New Roman"/>
+          <w:sz w:val="16"/>
+          <w:szCs w:val="16"/>
+        </w:rPr>
+        <w:t>Packet-level lane</w:t>
+      </w:r>
+      <w:proofErr w:type="gramEnd"/>
+      <w:r>
+        <w:rPr>
+          <w:rFonts w:ascii="Times New Roman" w:hAnsi="Times New Roman" w:cs="Times New Roman"/>
+          <w:sz w:val="16"/>
+          <w:szCs w:val="16"/>
+        </w:rPr>
+        <w:t xml:space="preserve"> selector. (e) Phase adapter connecting a branch-level handshake to the selected physical lane</w:t>
+      </w:r>
+      <w:r>
+        <w:rPr>
+          <w:rFonts w:ascii="Times New Roman" w:hAnsi="Times New Roman" w:cs="Times New Roman" w:hint="eastAsia"/>
+          <w:sz w:val="16"/>
+          <w:szCs w:val="16"/>
+          <w:lang w:eastAsia="zh-CN"/>
+        </w:rPr>
+        <w:t xml:space="preserve">. </w:t>
+      </w:r>
+      <w:r>
+        <w:rPr>
+          <w:rFonts w:ascii="Times New Roman" w:hAnsi="Times New Roman" w:cs="Times New Roman"/>
+          <w:sz w:val="16"/>
+          <w:szCs w:val="16"/>
+        </w:rPr>
+        <w:t xml:space="preserve">Candidate lanes in (d)–(e) are indexed from 0 to </w:t>
+      </w:r>
+      <w:r>
+        <w:rPr>
+          <w:rFonts w:ascii="Times New Roman" w:hAnsi="Times New Roman" w:cs="Times New Roman" w:hint="eastAsia"/>
+          <w:sz w:val="16"/>
+          <w:szCs w:val="16"/>
+          <w:lang w:eastAsia="zh-CN"/>
+        </w:rPr>
+        <w:t>M</w:t>
+      </w:r>
+      <w:r>
+        <w:rPr>
+          <w:rFonts w:ascii="Times New Roman" w:hAnsi="Times New Roman" w:cs="Times New Roman"/>
+          <w:sz w:val="16"/>
+          <w:szCs w:val="16"/>
+        </w:rPr>
+        <w:t xml:space="preserve">, giving </w:t>
+      </w:r>
+      <m:oMath>
+        <m:r>
+          <m:rPr>
+            <m:sty m:val="p"/>
+          </m:rPr>
+          <w:rPr>
+            <w:rFonts w:ascii="Cambria Math" w:hAnsi="Cambria Math" w:cs="Times New Roman"/>
+            <w:sz w:val="16"/>
+            <w:szCs w:val="16"/>
+          </w:rPr>
+          <m:t>M</m:t>
+        </m:r>
+        <m:r>
+          <w:rPr>
+            <w:rFonts w:ascii="Cambria Math" w:hAnsi="Cambria Math" w:cs="Times New Roman"/>
+            <w:sz w:val="16"/>
+            <w:szCs w:val="16"/>
+          </w:rPr>
+          <m:t>+1</m:t>
+        </m:r>
+      </m:oMath>
+      <w:r>
+        <w:rPr>
+          <w:rFonts w:ascii="Times New Roman" w:hAnsi="Times New Roman" w:cs="Times New Roman"/>
+          <w:sz w:val="16"/>
+          <w:szCs w:val="16"/>
+        </w:rPr>
+        <w:t xml:space="preserve"> lanes; </w:t>
+      </w:r>
+      <m:oMath>
+        <m:r>
+          <w:rPr>
+            <w:rFonts w:ascii="Cambria Math" w:hAnsi="Cambria Math" w:cs="Times New Roman"/>
+            <w:sz w:val="16"/>
+            <w:szCs w:val="16"/>
+          </w:rPr>
+          <m:t>M=3</m:t>
+        </m:r>
+      </m:oMath>
+      <w:r>
+        <w:rPr>
+          <w:rFonts w:ascii="Times New Roman" w:hAnsi="Times New Roman" w:cs="Times New Roman" w:hint="eastAsia"/>
+          <w:sz w:val="16"/>
+          <w:szCs w:val="16"/>
+          <w:lang w:eastAsia="zh-CN"/>
+        </w:rPr>
+        <w:t xml:space="preserve"> </w:t>
+      </w:r>
+      <w:r>
+        <w:rPr>
+          <w:rFonts w:ascii="Times New Roman" w:hAnsi="Times New Roman" w:cs="Times New Roman"/>
+          <w:sz w:val="16"/>
+          <w:szCs w:val="16"/>
+        </w:rPr>
+        <w:t>for the four-lane direction in c1p4</w:t>
+      </w:r>
+      <w:r>
+        <w:rPr>
+          <w:rFonts w:ascii="Times New Roman" w:hAnsi="Times New Roman" w:cs="Times New Roman" w:hint="eastAsia"/>
+          <w:sz w:val="16"/>
+          <w:szCs w:val="16"/>
+          <w:lang w:eastAsia="zh-CN"/>
+        </w:rPr>
+        <w:t>.</w:t>
+      </w:r>
+    </w:p>
+    <w:p>
+      <w:pPr>
+        <w:pStyle w:val="2"/>
+      </w:pPr>
+      <w:r>
+        <w:rPr>
+          <w:lang w:eastAsia="zh-CN"/>
+        </w:rPr>
+        <w:t>Click-Based Multicast Forwarding</w:t>
+      </w:r>
+    </w:p>
+    <w:p>
+      <w:pPr>
+        <w:ind w:firstLine="14.40pt"/>
+        <w:jc w:val="both"/>
+        <w:rPr>
+          <w:lang w:eastAsia="zh-CN"/>
+        </w:rPr>
+      </w:pPr>
+      <w:r>
+        <w:rPr>
+          <w:lang w:eastAsia="zh-CN"/>
+        </w:rPr>
+        <w:t xml:space="preserve">CHAMP uses local Click control to coordinate route establishment, shared-buffer writes, and multicast forwarding. When a header arrives, the routing computation unit captures its destination information and enables the required output branches through packet-path-enable (PPE) signals (Fig. 4(c)). Each branch remains enabled until its </w:t>
+      </w:r>
+      <w:proofErr w:type="spellStart"/>
+      <w:r>
+        <w:rPr>
+          <w:i/>
+          <w:iCs/>
+          <w:lang w:eastAsia="zh-CN"/>
+        </w:rPr>
+        <w:t>TailPass</w:t>
+      </w:r>
+      <w:proofErr w:type="spellEnd"/>
+      <w:r>
+        <w:rPr>
+          <w:lang w:eastAsia="zh-CN"/>
+        </w:rPr>
+        <w:t xml:space="preserve"> feedback indicates completion. In parallel, the write interface selects a storage cell using the write pointer; a local </w:t>
+      </w:r>
+      <w:r>
+        <w:rPr>
+          <w:i/>
+          <w:iCs/>
+          <w:lang w:eastAsia="zh-CN"/>
+        </w:rPr>
+        <w:t>Fire</w:t>
+      </w:r>
+      <w:r>
+        <w:rPr>
+          <w:lang w:eastAsia="zh-CN"/>
+        </w:rPr>
+        <w:t xml:space="preserve"> event captures the incoming flit and updates its </w:t>
+      </w:r>
+      <w:proofErr w:type="spellStart"/>
+      <w:r>
+        <w:rPr>
+          <w:i/>
+          <w:iCs/>
+          <w:lang w:eastAsia="zh-CN"/>
+        </w:rPr>
+        <w:t>CellFull</w:t>
+      </w:r>
+      <w:proofErr w:type="spellEnd"/>
+      <w:r>
+        <w:rPr>
+          <w:lang w:eastAsia="zh-CN"/>
+        </w:rPr>
+        <w:t xml:space="preserve"> state (Fig. 4(b)). These operations use two-phase request–acknowledge signaling without a global clock.</w:t>
+      </w:r>
+    </w:p>
+    <w:p>
+      <w:pPr>
+        <w:ind w:firstLine="14.40pt"/>
+        <w:jc w:val="both"/>
+        <w:rPr>
+          <w:lang w:eastAsia="zh-CN"/>
+        </w:rPr>
+      </w:pPr>
+      <w:r>
+        <w:rPr>
+          <w:lang w:eastAsia="zh-CN"/>
+        </w:rPr>
+        <w:t xml:space="preserve">The stored flits are accessed through four independent read interfaces, corresponding to the legal output directions excluding the ingress direction (Fig. 3). Each interface maintains its own read pointer, generates requests according to data availability and branch enable, and advances upon acknowledgement (Fig. 4(a)). Thus, enabled multicast branches read the same packet at their respective rates. At each OPM, arbitration selects an eligible input, and Click control captures its flit when the output stage can accept another transfer. The output register retains the flit under downstream backpressure. Read-completion states are returned through </w:t>
+      </w:r>
+      <w:proofErr w:type="spellStart"/>
+      <w:r>
+        <w:rPr>
+          <w:i/>
+          <w:iCs/>
+          <w:lang w:eastAsia="zh-CN"/>
+        </w:rPr>
+        <w:t>CellEmpty</w:t>
+      </w:r>
+      <w:proofErr w:type="spellEnd"/>
+      <w:r>
+        <w:rPr>
+          <w:lang w:eastAsia="zh-CN"/>
+        </w:rPr>
+        <w:t xml:space="preserve"> signals, and the write interface withholds the tail-flit acknowledgement until all required reads complete. This completion condition prevents admission of the next packet before the current multicast packet has been consumed by all enabled branches.</w:t>
+      </w:r>
+    </w:p>
+    <w:p>
+      <w:pPr>
+        <w:pStyle w:val="2"/>
+      </w:pPr>
+      <w:r>
+        <w:t>Dynamic Lane Allocation and Phase Adaptation</w:t>
+      </w:r>
+    </w:p>
+    <w:p>
+      <w:pPr>
+        <w:ind w:firstLine="14.40pt"/>
+        <w:jc w:val="both"/>
+        <w:rPr>
+          <w:lang w:eastAsia="zh-CN"/>
+        </w:rPr>
+      </w:pPr>
+      <w:r>
+        <w:rPr>
+          <w:lang w:eastAsia="zh-CN"/>
+        </w:rPr>
+        <w:t xml:space="preserve">CHAMP uses two-level arbitration to allocate parallel output lanes. At the first level, each requesting input independently arbitrates among available lanes within an enabled output direction, producing a one-hot </w:t>
+      </w:r>
+      <w:proofErr w:type="spellStart"/>
+      <w:r>
+        <w:rPr>
+          <w:i/>
+          <w:iCs/>
+          <w:lang w:eastAsia="zh-CN"/>
+        </w:rPr>
+        <w:t>LaneSelect</w:t>
+      </w:r>
+      <w:proofErr w:type="spellEnd"/>
+      <w:r>
+        <w:rPr>
+          <w:lang w:eastAsia="zh-CN"/>
+        </w:rPr>
+        <w:t xml:space="preserve"> (Fig. 4(d)). At the second level, each OPM arbitrates among the inputs that selected its lane and grants access to one winner. If multiple inputs select the same lane concurrently, the losing inputs retain their lane selections and wait for access rather than restarting lane arbitration. Once selected, the lane is held until </w:t>
+      </w:r>
+      <w:r>
+        <w:rPr>
+          <w:lang w:eastAsia="zh-CN"/>
+        </w:rPr>
+        <w:lastRenderedPageBreak/>
+        <w:t>the branch completes its packet transfer. This separates lane selection within a direction from input arbitration at a physical output, while maintaining a stable path for each packet.</w:t>
+      </w:r>
+    </w:p>
+    <w:p>
+      <w:pPr>
+        <w:ind w:firstLine="14.40pt"/>
+        <w:jc w:val="both"/>
+        <w:rPr>
+          <w:lang w:eastAsia="zh-CN"/>
+        </w:rPr>
+      </w:pPr>
+      <w:r>
+        <w:rPr>
+          <w:lang w:eastAsia="zh-CN"/>
+        </w:rPr>
+        <w:t xml:space="preserve">Selecting different lanes across packets requires handshake phase adaptation because each physical lane maintains an independent two-phase state. Directly switching the branch request between lanes could create an unintended transition or suppress a required one. The adapter in Fig. 4(e) maintains a request phase for each candidate lane and updates only the selected lane when a branch transfer is pending. It returns a branch-level acknowledgement only after that lane has entered the pending state and subsequently acknowledged the transfer. This preserves the request–acknowledge sequence across lane changes. The selected lane’s </w:t>
+      </w:r>
+      <w:proofErr w:type="spellStart"/>
+      <w:r>
+        <w:rPr>
+          <w:i/>
+          <w:iCs/>
+          <w:lang w:eastAsia="zh-CN"/>
+        </w:rPr>
+        <w:t>TailPass</w:t>
+      </w:r>
+      <w:proofErr w:type="spellEnd"/>
+      <w:r>
+        <w:rPr>
+          <w:lang w:eastAsia="zh-CN"/>
+        </w:rPr>
+        <w:t xml:space="preserve"> feedback then clears the branch enable and releases the lane selection for the next packet.</w:t>
+      </w:r>
+    </w:p>
+    <w:p>
+      <w:pPr>
+        <w:pStyle w:val="2"/>
+        <w:rPr>
+          <w:rFonts w:hint="eastAsia"/>
+        </w:rPr>
+      </w:pPr>
+      <w:r>
+        <w:rPr>
+          <w:lang w:eastAsia="zh-CN"/>
+        </w:rPr>
+        <w:t>Synthesis and Timing Closur</w:t>
+      </w:r>
+      <w:r>
+        <w:rPr>
+          <w:rFonts w:hint="eastAsia"/>
+          <w:lang w:eastAsia="zh-CN"/>
+        </w:rPr>
+        <w:t>e</w:t>
+      </w:r>
+    </w:p>
+    <w:p>
+      <w:pPr>
+        <w:ind w:firstLine="14.40pt"/>
+        <w:jc w:val="both"/>
+        <w:rPr>
+          <w:rFonts w:hint="eastAsia"/>
+          <w:lang w:eastAsia="zh-CN"/>
+        </w:rPr>
+      </w:pPr>
+      <w:r>
+        <w:rPr>
+          <w:lang w:eastAsia="zh-CN"/>
+        </w:rPr>
+        <w:t xml:space="preserve">Click-based control captures data in standard edge-triggered flip-flops using locally generated Fire signals. These registers provide explicit timing endpoints and avoid </w:t>
+      </w:r>
+      <w:proofErr w:type="spellStart"/>
+      <w:r>
+        <w:rPr>
+          <w:lang w:eastAsia="zh-CN"/>
+        </w:rPr>
+        <w:t>datapath</w:t>
+      </w:r>
+      <w:proofErr w:type="spellEnd"/>
+      <w:r>
+        <w:rPr>
+          <w:lang w:eastAsia="zh-CN"/>
+        </w:rPr>
+        <w:t xml:space="preserve"> transparency, simplifying integration with conventional synthesis and static timing analysis (STA) tools [ref]. As illustrated in Fig. 5, CHAMP uses a semi-automated delay-matching flow. Local Fire signals are defined as clocks for timing analysis, and STA checks the relative timing constraints required for correct data capture and handshake operation. Delay cells are inserted or adjusted on the relevant control paths, followed by re-synthesis and timing checks. This flow combines event-driven operation with standard-cell implementation while explicitly enforcing asynchronous timing requirements</w:t>
+      </w:r>
+      <w:r>
+        <w:rPr>
+          <w:rFonts w:hint="eastAsia"/>
+          <w:lang w:eastAsia="zh-CN"/>
+        </w:rPr>
+        <w:t>.</w:t>
+      </w:r>
+    </w:p>
+    <w:p>
+      <w:pPr>
+        <w:keepNext/>
+        <w:jc w:val="both"/>
+      </w:pPr>
+      <w:r>
+        <w:rPr>
+          <w:rFonts w:hint="eastAsia"/>
+          <w:noProof/>
+          <w:lang w:eastAsia="zh-CN"/>
+        </w:rPr>
+        <w:drawing>
+          <wp:anchor distT="0" distB="0" distL="114300" distR="114300" simplePos="0" relativeHeight="251669504" behindDoc="0" locked="0" layoutInCell="1" allowOverlap="1" wp14:anchorId="0876797C" wp14:editId="50A523DF">
+            <wp:simplePos x="0" y="0"/>
+            <wp:positionH relativeFrom="column">
+              <wp:align>right</wp:align>
+            </wp:positionH>
+            <wp:positionV relativeFrom="page">
+              <wp:posOffset>5511165</wp:posOffset>
+            </wp:positionV>
+            <wp:extent cx="3111500" cy="1410970"/>
+            <wp:effectExtent l="0" t="0" r="0" b="0"/>
+            <wp:wrapTopAndBottom/>
+            <wp:docPr id="1477217430" name="图形 8"/>
+            <wp:cNvGraphicFramePr>
+              <a:graphicFrameLocks xmlns:a="http://purl.oclc.org/ooxml/drawingml/main" noChangeAspect="1"/>
+            </wp:cNvGraphicFramePr>
+            <a:graphic xmlns:a="http://purl.oclc.org/ooxml/drawingml/main">
+              <a:graphicData uri="http://purl.oclc.org/ooxml/drawingml/picture">
+                <pic:pic xmlns:pic="http://purl.oclc.org/ooxml/drawingml/picture">
+                  <pic:nvPicPr>
+                    <pic:cNvPr id="1477217430" name="图形 1477217430"/>
+                    <pic:cNvPicPr/>
+                  </pic:nvPicPr>
+                  <pic:blipFill>
+                    <a:blip r:embed="rId17">
+                      <a:extLst>
+                        <a:ext uri="{96DAC541-7B7A-43D3-8B79-37D633B846F1}">
+                          <asvg:svgBlip xmlns:asvg="http://schemas.microsoft.com/office/drawing/2016/SVG/main" r:embed="rId18"/>
+                        </a:ext>
+                      </a:extLst>
+                    </a:blip>
+                    <a:stretch>
+                      <a:fillRect/>
+                    </a:stretch>
+                  </pic:blipFill>
+                  <pic:spPr>
+                    <a:xfrm>
+                      <a:off x="0" y="0"/>
+                      <a:ext cx="3111500" cy="1410970"/>
+                    </a:xfrm>
+                    <a:prstGeom prst="rect">
+                      <a:avLst/>
+                    </a:prstGeom>
+                  </pic:spPr>
+                </pic:pic>
+              </a:graphicData>
+            </a:graphic>
+          </wp:anchor>
+        </w:drawing>
+      </w:r>
+    </w:p>
+    <w:p>
+      <w:pPr>
+        <w:pStyle w:val="ab"/>
+        <w:jc w:val="both"/>
+        <w:rPr>
+          <w:rFonts w:ascii="Times New Roman" w:hAnsi="Times New Roman" w:cs="Times New Roman"/>
+          <w:sz w:val="16"/>
+          <w:szCs w:val="16"/>
+        </w:rPr>
+      </w:pPr>
+      <w:r>
+        <w:rPr>
+          <w:rFonts w:ascii="Times New Roman" w:hAnsi="Times New Roman" w:cs="Times New Roman"/>
+          <w:sz w:val="16"/>
+          <w:szCs w:val="16"/>
+        </w:rPr>
+        <w:t xml:space="preserve">Fig. </w:t>
+      </w:r>
+      <w:r>
+        <w:rPr>
+          <w:rFonts w:ascii="Times New Roman" w:hAnsi="Times New Roman" w:cs="Times New Roman"/>
+          <w:sz w:val="16"/>
+          <w:szCs w:val="16"/>
+        </w:rPr>
+        <w:fldChar w:fldCharType="begin"/>
+      </w:r>
+      <w:r>
+        <w:rPr>
+          <w:rFonts w:ascii="Times New Roman" w:hAnsi="Times New Roman" w:cs="Times New Roman"/>
+          <w:sz w:val="16"/>
+          <w:szCs w:val="16"/>
+        </w:rPr>
+        <w:instrText xml:space="preserve"> SEQ Fig. \* ARABIC </w:instrText>
+      </w:r>
+      <w:r>
+        <w:rPr>
+          <w:rFonts w:ascii="Times New Roman" w:hAnsi="Times New Roman" w:cs="Times New Roman"/>
+          <w:sz w:val="16"/>
+          <w:szCs w:val="16"/>
+        </w:rPr>
+        <w:fldChar w:fldCharType="separate"/>
+      </w:r>
+      <w:r>
+        <w:rPr>
+          <w:rFonts w:ascii="Times New Roman" w:hAnsi="Times New Roman" w:cs="Times New Roman"/>
+          <w:noProof/>
+          <w:sz w:val="16"/>
+          <w:szCs w:val="16"/>
+        </w:rPr>
+        <w:t>5</w:t>
+      </w:r>
+      <w:r>
+        <w:rPr>
+          <w:rFonts w:ascii="Times New Roman" w:hAnsi="Times New Roman" w:cs="Times New Roman"/>
+          <w:sz w:val="16"/>
+          <w:szCs w:val="16"/>
+        </w:rPr>
+        <w:fldChar w:fldCharType="end"/>
+      </w:r>
+      <w:r>
+        <w:rPr>
+          <w:rFonts w:ascii="Times New Roman" w:hAnsi="Times New Roman" w:cs="Times New Roman"/>
+          <w:sz w:val="16"/>
+          <w:szCs w:val="16"/>
+          <w:lang w:eastAsia="zh-CN"/>
+        </w:rPr>
+        <w:t xml:space="preserve"> </w:t>
+      </w:r>
+      <w:r>
+        <w:rPr>
+          <w:rFonts w:ascii="Times New Roman" w:hAnsi="Times New Roman" w:cs="Times New Roman"/>
+          <w:b/>
+          <w:bCs/>
+          <w:sz w:val="16"/>
+          <w:szCs w:val="16"/>
+        </w:rPr>
+        <w:t>Semi-automated synthesis and delay-matching flow for the Click-based router.</w:t>
+      </w:r>
+    </w:p>
+    <w:p>
+      <w:pPr>
+        <w:pStyle w:val="1"/>
+        <w:rPr>
+          <w:lang w:eastAsia="zh-CN"/>
+        </w:rPr>
+      </w:pPr>
+      <w:r>
+        <w:rPr>
+          <w:rFonts w:hint="eastAsia"/>
+          <w:lang w:eastAsia="zh-CN"/>
+        </w:rPr>
+        <w:t>Region-aware multicast routing</w:t>
+      </w:r>
+    </w:p>
+    <w:p>
+      <w:pPr>
+        <w:ind w:firstLine="14.40pt"/>
+        <w:jc w:val="both"/>
+        <w:rPr>
+          <w:lang w:eastAsia="zh-CN"/>
+        </w:rPr>
+      </w:pPr>
+      <w:r>
+        <w:rPr>
+          <w:lang w:eastAsia="zh-CN"/>
+        </w:rPr>
+        <w:t xml:space="preserve">CHAMP represents a destination region using two opposite corners, </w:t>
+      </w:r>
+      <m:oMath>
+        <m:d>
+          <m:dPr>
+            <m:ctrlPr>
+              <w:rPr>
+                <w:rFonts w:ascii="Cambria Math" w:hAnsi="Cambria Math"/>
+              </w:rPr>
+            </m:ctrlPr>
+          </m:dPr>
+          <m:e>
+            <m:sSub>
+              <m:sSubPr>
+                <m:ctrlPr>
+                  <w:rPr>
+                    <w:rFonts w:ascii="Cambria Math" w:hAnsi="Cambria Math"/>
+                  </w:rPr>
+                </m:ctrlPr>
+              </m:sSubPr>
+              <m:e>
+                <m:r>
+                  <w:rPr>
+                    <w:rFonts w:ascii="Cambria Math" w:hAnsi="Cambria Math"/>
+                  </w:rPr>
+                  <m:t>x</m:t>
+                </m:r>
+              </m:e>
+              <m:sub>
+                <m:r>
+                  <w:rPr>
+                    <w:rFonts w:ascii="Cambria Math" w:hAnsi="Cambria Math"/>
+                  </w:rPr>
+                  <m:t>0</m:t>
+                </m:r>
+              </m:sub>
+            </m:sSub>
+            <m:r>
+              <w:rPr>
+                <w:rFonts w:ascii="Cambria Math" w:hAnsi="Cambria Math"/>
+              </w:rPr>
+              <m:t>,</m:t>
+            </m:r>
+            <m:sSub>
+              <m:sSubPr>
+                <m:ctrlPr>
+                  <w:rPr>
+                    <w:rFonts w:ascii="Cambria Math" w:hAnsi="Cambria Math"/>
+                  </w:rPr>
+                </m:ctrlPr>
+              </m:sSubPr>
+              <m:e>
+                <m:r>
+                  <w:rPr>
+                    <w:rFonts w:ascii="Cambria Math" w:hAnsi="Cambria Math"/>
+                  </w:rPr>
+                  <m:t>y</m:t>
+                </m:r>
+              </m:e>
+              <m:sub>
+                <m:r>
+                  <w:rPr>
+                    <w:rFonts w:ascii="Cambria Math" w:hAnsi="Cambria Math"/>
+                  </w:rPr>
+                  <m:t>0</m:t>
+                </m:r>
+              </m:sub>
+            </m:sSub>
+          </m:e>
+        </m:d>
+        <m:r>
+          <w:rPr>
+            <w:rFonts w:ascii="Cambria Math" w:hAnsi="Cambria Math"/>
+          </w:rPr>
+          <m:t xml:space="preserve"> </m:t>
+        </m:r>
+      </m:oMath>
+      <w:r>
+        <w:rPr>
+          <w:lang w:eastAsia="zh-CN"/>
+        </w:rPr>
+        <w:t>and</w:t>
+      </w:r>
+      <w:r>
+        <w:rPr>
+          <w:rFonts w:hint="eastAsia"/>
+          <w:lang w:eastAsia="zh-CN"/>
+        </w:rPr>
+        <w:t xml:space="preserve"> </w:t>
+      </w:r>
+      <m:oMath>
+        <m:d>
+          <m:dPr>
+            <m:ctrlPr>
+              <w:rPr>
+                <w:rFonts w:ascii="Cambria Math" w:hAnsi="Cambria Math"/>
+              </w:rPr>
+            </m:ctrlPr>
+          </m:dPr>
+          <m:e>
+            <m:sSub>
+              <m:sSubPr>
+                <m:ctrlPr>
+                  <w:rPr>
+                    <w:rFonts w:ascii="Cambria Math" w:hAnsi="Cambria Math"/>
+                  </w:rPr>
+                </m:ctrlPr>
+              </m:sSubPr>
+              <m:e>
+                <m:r>
+                  <w:rPr>
+                    <w:rFonts w:ascii="Cambria Math" w:hAnsi="Cambria Math"/>
+                  </w:rPr>
+                  <m:t>x</m:t>
+                </m:r>
+              </m:e>
+              <m:sub>
+                <m:r>
+                  <w:rPr>
+                    <w:rFonts w:ascii="Cambria Math" w:hAnsi="Cambria Math"/>
+                  </w:rPr>
+                  <m:t>1</m:t>
+                </m:r>
+              </m:sub>
+            </m:sSub>
+            <m:r>
+              <w:rPr>
+                <w:rFonts w:ascii="Cambria Math" w:hAnsi="Cambria Math"/>
+              </w:rPr>
+              <m:t>,</m:t>
+            </m:r>
+            <m:sSub>
+              <m:sSubPr>
+                <m:ctrlPr>
+                  <w:rPr>
+                    <w:rFonts w:ascii="Cambria Math" w:hAnsi="Cambria Math"/>
+                  </w:rPr>
+                </m:ctrlPr>
+              </m:sSubPr>
+              <m:e>
+                <m:r>
+                  <w:rPr>
+                    <w:rFonts w:ascii="Cambria Math" w:hAnsi="Cambria Math"/>
+                  </w:rPr>
+                  <m:t>y</m:t>
+                </m:r>
+              </m:e>
+              <m:sub>
+                <m:r>
+                  <w:rPr>
+                    <w:rFonts w:ascii="Cambria Math" w:hAnsi="Cambria Math"/>
+                  </w:rPr>
+                  <m:t>1</m:t>
+                </m:r>
+              </m:sub>
+            </m:sSub>
+          </m:e>
+        </m:d>
+      </m:oMath>
+      <w:r>
+        <w:rPr>
+          <w:lang w:eastAsia="zh-CN"/>
+        </w:rPr>
+        <w:t>, in global PE coordinates. The same representation is interpreted throughout the tree–mesh hierarchy. A single-point region specifies unicast, while a larger rectangle selects all PEs within its bounds</w:t>
+      </w:r>
+      <w:r>
+        <w:rPr>
+          <w:rFonts w:hint="eastAsia"/>
+          <w:lang w:eastAsia="zh-CN"/>
+        </w:rPr>
+        <w:t xml:space="preserve">. </w:t>
+      </w:r>
+      <w:r>
+        <w:rPr>
+          <w:lang w:eastAsia="zh-CN"/>
+        </w:rPr>
+        <w:t>The architecture allows inter-chip extension at the mesh boundaries, while the current implementation targets intra-chip communication.</w:t>
+      </w:r>
+    </w:p>
+    <w:p>
+      <w:pPr>
+        <w:ind w:firstLine="14.40pt"/>
+        <w:jc w:val="both"/>
+        <w:rPr>
+          <w:rFonts w:hint="eastAsia"/>
+          <w:lang w:eastAsia="zh-CN"/>
+        </w:rPr>
+      </w:pPr>
+      <w:r>
+        <w:rPr>
+          <w:lang w:eastAsia="zh-CN"/>
+        </w:rPr>
+        <w:t xml:space="preserve">At each tree router, routing compares the destination rectangle with the spatial regions covered by its children. A child direction is enabled if its region intersects the destination rectangle, excluding the ingress direction. If the rectangle extends beyond the current subtree, the parent direction is also enabled, provided the packet did not arrive from that direction. These tests produce an output-direction mask, allowing local </w:t>
+      </w:r>
+      <w:r>
+        <w:rPr>
+          <w:lang w:eastAsia="zh-CN"/>
+        </w:rPr>
+        <w:t>delivery and upward forwarding to occur concurrently, as illustrated in Fig. 6(a).</w:t>
+      </w:r>
+      <w:r>
+        <w:t xml:space="preserve"> </w:t>
+      </w:r>
+      <w:r>
+        <w:rPr>
+          <w:lang w:eastAsia="zh-CN"/>
+        </w:rPr>
+        <w:t>The architecture also allows inter-chip extension at the mesh boundaries, as indicated in Fig. 2(a)</w:t>
+      </w:r>
+      <w:r>
+        <w:rPr>
+          <w:rFonts w:hint="eastAsia"/>
+          <w:lang w:eastAsia="zh-CN"/>
+        </w:rPr>
+        <w:t>,</w:t>
+      </w:r>
+      <w:r>
+        <w:t xml:space="preserve"> </w:t>
+      </w:r>
+      <w:r>
+        <w:rPr>
+          <w:lang w:eastAsia="zh-CN"/>
+        </w:rPr>
+        <w:t>while the current</w:t>
+      </w:r>
+      <w:r>
+        <w:rPr>
+          <w:rFonts w:hint="eastAsia"/>
+          <w:lang w:eastAsia="zh-CN"/>
+        </w:rPr>
+        <w:t xml:space="preserve"> study </w:t>
+      </w:r>
+      <w:r>
+        <w:rPr>
+          <w:lang w:eastAsia="zh-CN"/>
+        </w:rPr>
+        <w:t>focus</w:t>
+      </w:r>
+      <w:r>
+        <w:rPr>
+          <w:rFonts w:hint="eastAsia"/>
+          <w:lang w:eastAsia="zh-CN"/>
+        </w:rPr>
+        <w:t>es</w:t>
+      </w:r>
+      <w:r>
+        <w:rPr>
+          <w:lang w:eastAsia="zh-CN"/>
+        </w:rPr>
+        <w:t xml:space="preserve"> on intra-chip communication</w:t>
+      </w:r>
+      <w:r>
+        <w:rPr>
+          <w:rFonts w:hint="eastAsia"/>
+          <w:lang w:eastAsia="zh-CN"/>
+        </w:rPr>
+        <w:t>.</w:t>
+      </w:r>
+    </w:p>
+    <w:p>
+      <w:pPr>
+        <w:keepNext/>
+        <w:jc w:val="both"/>
+        <w:rPr>
+          <w:rFonts w:hint="eastAsia"/>
+          <w:lang w:eastAsia="zh-CN"/>
+        </w:rPr>
+      </w:pPr>
+      <w:r>
+        <w:rPr>
+          <w:rFonts w:hint="eastAsia"/>
+          <w:noProof/>
+          <w:lang w:eastAsia="zh-CN"/>
+        </w:rPr>
+        <w:drawing>
+          <wp:anchor distT="0" distB="0" distL="114300" distR="114300" simplePos="0" relativeHeight="251668480" behindDoc="0" locked="0" layoutInCell="1" allowOverlap="1" wp14:anchorId="7B5F4D72" wp14:editId="514FF269">
+            <wp:simplePos x="0" y="0"/>
+            <wp:positionH relativeFrom="column">
+              <wp:align>right</wp:align>
+            </wp:positionH>
+            <wp:positionV relativeFrom="page">
+              <wp:posOffset>1448988</wp:posOffset>
+            </wp:positionV>
+            <wp:extent cx="3111500" cy="1287145"/>
+            <wp:effectExtent l="0" t="0" r="0" b="8255"/>
+            <wp:wrapTopAndBottom/>
+            <wp:docPr id="765702537" name="图形 10"/>
+            <wp:cNvGraphicFramePr>
+              <a:graphicFrameLocks xmlns:a="http://purl.oclc.org/ooxml/drawingml/main" noChangeAspect="1"/>
+            </wp:cNvGraphicFramePr>
+            <a:graphic xmlns:a="http://purl.oclc.org/ooxml/drawingml/main">
+              <a:graphicData uri="http://purl.oclc.org/ooxml/drawingml/picture">
+                <pic:pic xmlns:pic="http://purl.oclc.org/ooxml/drawingml/picture">
+                  <pic:nvPicPr>
+                    <pic:cNvPr id="765702537" name="图形 765702537"/>
+                    <pic:cNvPicPr/>
+                  </pic:nvPicPr>
+                  <pic:blipFill>
+                    <a:blip r:embed="rId19">
+                      <a:extLst>
+                        <a:ext uri="{96DAC541-7B7A-43D3-8B79-37D633B846F1}">
+                          <asvg:svgBlip xmlns:asvg="http://schemas.microsoft.com/office/drawing/2016/SVG/main" r:embed="rId20"/>
+                        </a:ext>
+                      </a:extLst>
+                    </a:blip>
+                    <a:stretch>
+                      <a:fillRect/>
+                    </a:stretch>
+                  </pic:blipFill>
+                  <pic:spPr>
+                    <a:xfrm>
+                      <a:off x="0" y="0"/>
+                      <a:ext cx="3111500" cy="1287145"/>
+                    </a:xfrm>
+                    <a:prstGeom prst="rect">
+                      <a:avLst/>
+                    </a:prstGeom>
+                  </pic:spPr>
+                </pic:pic>
+              </a:graphicData>
+            </a:graphic>
+          </wp:anchor>
+        </w:drawing>
+      </w:r>
+    </w:p>
+    <w:p>
+      <w:pPr>
+        <w:pStyle w:val="ab"/>
+        <w:jc w:val="both"/>
+        <w:rPr>
+          <w:rFonts w:ascii="Times New Roman" w:hAnsi="Times New Roman" w:cs="Times New Roman"/>
+          <w:sz w:val="16"/>
+          <w:szCs w:val="16"/>
+          <w:lang w:eastAsia="zh-CN"/>
+        </w:rPr>
+      </w:pPr>
+      <w:r>
+        <w:rPr>
+          <w:rFonts w:ascii="Times New Roman" w:hAnsi="Times New Roman" w:cs="Times New Roman"/>
+          <w:sz w:val="16"/>
+          <w:szCs w:val="16"/>
+        </w:rPr>
+        <w:t xml:space="preserve">Fig. </w:t>
+      </w:r>
+      <w:r>
+        <w:rPr>
+          <w:rFonts w:ascii="Times New Roman" w:hAnsi="Times New Roman" w:cs="Times New Roman"/>
+          <w:sz w:val="16"/>
+          <w:szCs w:val="16"/>
+        </w:rPr>
+        <w:fldChar w:fldCharType="begin"/>
+      </w:r>
+      <w:r>
+        <w:rPr>
+          <w:rFonts w:ascii="Times New Roman" w:hAnsi="Times New Roman" w:cs="Times New Roman"/>
+          <w:sz w:val="16"/>
+          <w:szCs w:val="16"/>
+        </w:rPr>
+        <w:instrText xml:space="preserve"> SEQ Fig. \* ARABIC </w:instrText>
+      </w:r>
+      <w:r>
+        <w:rPr>
+          <w:rFonts w:ascii="Times New Roman" w:hAnsi="Times New Roman" w:cs="Times New Roman"/>
+          <w:sz w:val="16"/>
+          <w:szCs w:val="16"/>
+        </w:rPr>
+        <w:fldChar w:fldCharType="separate"/>
+      </w:r>
+      <w:r>
+        <w:rPr>
+          <w:rFonts w:ascii="Times New Roman" w:hAnsi="Times New Roman" w:cs="Times New Roman"/>
+          <w:noProof/>
+          <w:sz w:val="16"/>
+          <w:szCs w:val="16"/>
+        </w:rPr>
+        <w:t>6</w:t>
+      </w:r>
+      <w:r>
+        <w:rPr>
+          <w:rFonts w:ascii="Times New Roman" w:hAnsi="Times New Roman" w:cs="Times New Roman"/>
+          <w:sz w:val="16"/>
+          <w:szCs w:val="16"/>
+        </w:rPr>
+        <w:fldChar w:fldCharType="end"/>
+      </w:r>
+      <w:r>
+        <w:rPr>
+          <w:rFonts w:ascii="Times New Roman" w:hAnsi="Times New Roman" w:cs="Times New Roman"/>
+          <w:sz w:val="16"/>
+          <w:szCs w:val="16"/>
+          <w:lang w:eastAsia="zh-CN"/>
+        </w:rPr>
+        <w:t xml:space="preserve"> </w:t>
+      </w:r>
+      <w:r>
+        <w:rPr>
+          <w:rFonts w:ascii="Times New Roman" w:hAnsi="Times New Roman" w:cs="Times New Roman"/>
+          <w:sz w:val="16"/>
+          <w:szCs w:val="16"/>
+          <w:lang w:eastAsia="zh-CN"/>
+        </w:rPr>
+        <w:t>(a) Tree-level routing: unicast selects one child, selective-child multicast selects a subset, and all-child multicast selects all four. Parent–child multicast enables both selected child outputs and the parent output when the destination region extends beyond the current subtree. At L1, children correspond to individual PEs. (b) Tree-based multicast forwarding across clusters in the upper mesh.</w:t>
+      </w:r>
+    </w:p>
+    <w:p>
+      <w:pPr>
+        <w:pStyle w:val="1"/>
+        <w:rPr>
+          <w:rFonts w:hint="eastAsia"/>
+          <w:lang w:eastAsia="zh-CN"/>
+        </w:rPr>
+      </w:pPr>
+      <w:r>
+        <w:rPr>
+          <w:rFonts w:hint="eastAsia"/>
+          <w:lang w:eastAsia="zh-CN"/>
+        </w:rPr>
+        <w:t>Evaluation</w:t>
+      </w:r>
     </w:p>
     <w:sectPr>
       <w:type w:val="continuous"/>
@@ -3427,6 +7252,7 @@
   <w:style w:type="paragraph" w:default="1" w:styleId="a">
     <w:name w:val="Normal"/>
     <w:qFormat/>
+    <w:rsid w:val="00041879"/>
     <w:pPr>
       <w:jc w:val="center"/>
     </w:pPr>

</xml_diff>

<commit_message>
Update CHAMP manuscript and comparison figures
</commit_message>
<xml_diff>
--- a/DAC/paper/CHAMP_v1.docx
+++ b/DAC/paper/CHAMP_v1.docx
@@ -88,6 +88,16 @@
       <w:r>
         <w:t>—</w:t>
       </w:r>
+      <w:r>
+        <w:rPr>
+          <w:rFonts w:hint="eastAsia"/>
+          <w:lang w:eastAsia="zh-CN"/>
+        </w:rPr>
+        <w:t>S</w:t>
+      </w:r>
+      <w:r>
+        <w:t>calable networks-on-chip must limit routing distance, contention, and multicast traffic amplification. We present CHAMP, a click-based asynchronous NoC combining a hierarchical tree–mesh topology, parallel lightweight routers, dynamic lane allocation, and native region-aware multicast. Post-synthesis evaluation in 28 nm shows 1.61× higher peak throughput than a mesh under 64-PE uniform-random traffic and 2.19× higher throughput under 1024-PE all-multicast traffic. At 256 PEs, native multicast reduces all-multicast latency from 573.0 to 19.6 ns relative to repeated unicast. At 64 PEs, asynchronous CHAMP consumes 60–84% less network power than its clock-gated synchronous counterpart</w:t>
+      </w:r>
     </w:p>
     <w:p>
       <w:pPr>
@@ -96,6 +106,9 @@
       <w:r>
         <w:t>Keywords—</w:t>
       </w:r>
+      <w:r>
+        <w:t>Networks-on-chip, asynchronous circuits, click-based control, hierarchical topology, multicast</w:t>
+      </w:r>
     </w:p>
     <w:p>
       <w:pPr>
@@ -113,15 +126,15 @@
         </w:rPr>
       </w:pPr>
       <w:r>
-        <w:t>Modern computing platforms are evolving toward increasingly large-scale and highly parallel architectures, including many-core processors [6], [7], GPUs [8], [9], wafer-scale accelerators [12], [13], and neuromorphic systems [14], [15]. As illustrated in Fig. 1(a), representative platforms have substantially expanded their computing resources and processing capabilities [6]–[9], [14]–[17], alongside rising chip-to-chip bandwidth [10], [11]. These trends place growing demands on data movement and communication among processing elements, making the on-chip interconnect a critical factor in overall system performance [3]–[5]. Consequently, networks-on-chip (</w:t>
+        <w:t xml:space="preserve">Modern computing platforms are evolving toward increasingly large-scale and highly parallel architectures, including many-core processors [1], [2], GPUs [3], [4], wafer-scale accelerators [5], [6], and neuromorphic systems [7]. As illustrated in Fig. 1(a), representative server, GPU, neuromorphic, and specialized AI-accelerator generations have substantially expanded their computing resources and processing capabilities [1]–[4], [7]–[9]. These trends place growing demands on data movement and communication among processing elements, making the on-chip interconnect a critical factor in overall system performance [10]. Consequently, networks-on-chip (NoCs) must provide low-latency, high-throughput, and energy-efficient communication while remaining scalable to larger systems.</w:t>
       </w:r>
       <w:proofErr w:type="spellStart"/>
       <w:r>
-        <w:t>NoCs</w:t>
+        <w:t/>
       </w:r>
       <w:proofErr w:type="spellEnd"/>
       <w:r>
-        <w:t>) must provide low-latency, high-throughput, and energy-efficient communication while remaining scalable to larger systems.</w:t>
+        <w:t/>
       </w:r>
     </w:p>
     <w:p>
@@ -273,20 +286,20 @@
           <w:rFonts w:hint="eastAsia"/>
           <w:lang w:val="en-US" w:eastAsia="zh-CN"/>
         </w:rPr>
-        <w:t xml:space="preserve"> </w:t>
+        <w:t xml:space="preserve"/>
       </w:r>
       <w:r>
         <w:rPr>
           <w:lang w:val="en-US" w:eastAsia="zh-CN"/>
         </w:rPr>
-        <w:t>denotes the number of routing hops,</w:t>
+        <w:t> is the number of routing hops, </w:t>
       </w:r>
       <w:r>
         <w:rPr>
           <w:rFonts w:hint="eastAsia"/>
           <w:lang w:val="en-US" w:eastAsia="zh-CN"/>
         </w:rPr>
-        <w:t xml:space="preserve"> </w:t>
+        <w:t xml:space="preserve"/>
       </w:r>
       <m:oMath>
         <m:sSub>
@@ -319,14 +332,14 @@
         <w:rPr>
           <w:lang w:val="en-US" w:eastAsia="zh-CN"/>
         </w:rPr>
-        <w:t xml:space="preserve"> the effective per-hop router-and-link delay, and</w:t>
+        <w:t xml:space="preserve"> is the effective router-and-link delay per hop, and </w:t>
       </w:r>
       <w:r>
         <w:rPr>
           <w:rFonts w:hint="eastAsia"/>
           <w:lang w:val="en-US" w:eastAsia="zh-CN"/>
         </w:rPr>
-        <w:t xml:space="preserve"> </w:t>
+        <w:t xml:space="preserve"/>
       </w:r>
       <m:oMath>
         <m:sSub>
@@ -360,13 +373,13 @@
           <w:rFonts w:hint="eastAsia"/>
           <w:lang w:val="en-US" w:eastAsia="zh-CN"/>
         </w:rPr>
-        <w:t xml:space="preserve"> </w:t>
+        <w:t xml:space="preserve"/>
       </w:r>
       <w:r>
         <w:rPr>
           <w:lang w:val="en-US" w:eastAsia="zh-CN"/>
         </w:rPr>
-        <w:t xml:space="preserve">the delay caused by contention and queuing. It highlights three coupled design factors: </w:t>
+        <w:t xml:space="preserve"> is contention and queuing delay. The model exposes three coupled design choices: topology sets path length and traffic distribution; router microarchitecture sets per-hop delay and service capacity; and multicast support determines how one-to-many transfers consume shared network resources. A shorter path alone may therefore fail to reduce packet latency if router delay or contention increases.</w:t>
       </w:r>
       <w:r>
         <w:rPr>
@@ -374,25 +387,25 @@
           <w:bCs/>
           <w:lang w:val="en-US" w:eastAsia="zh-CN"/>
         </w:rPr>
-        <w:t>network topology</w:t>
+        <w:t/>
       </w:r>
       <w:r>
         <w:rPr>
           <w:lang w:val="en-US" w:eastAsia="zh-CN"/>
         </w:rPr>
-        <w:t xml:space="preserve"> </w:t>
-      </w:r>
-      <w:r>
-        <w:rPr>
-          <w:lang w:eastAsia="zh-CN"/>
-        </w:rPr>
-        <w:t>Network topology determines both the number of hops and how traffic is distributed across network resources, affecting communication distance and potential bottlenecks</w:t>
+        <w:t xml:space="preserve"/>
+      </w:r>
+      <w:r>
+        <w:rPr>
+          <w:lang w:eastAsia="zh-CN"/>
+        </w:rPr>
+        <w:t/>
       </w:r>
       <w:r>
         <w:rPr>
           <w:lang w:val="en-US" w:eastAsia="zh-CN"/>
         </w:rPr>
-        <w:t xml:space="preserve">; </w:t>
+        <w:t xml:space="preserve"/>
       </w:r>
       <w:r>
         <w:rPr>
@@ -400,13 +413,13 @@
           <w:bCs/>
           <w:lang w:val="en-US" w:eastAsia="zh-CN"/>
         </w:rPr>
-        <w:t>router microarchitecture</w:t>
+        <w:t/>
       </w:r>
       <w:r>
         <w:rPr>
           <w:lang w:val="en-US" w:eastAsia="zh-CN"/>
         </w:rPr>
-        <w:t xml:space="preserve"> affects both per-hop delay and contention through arbitration, buffering, and parallel transmission capacity; and </w:t>
+        <w:t xml:space="preserve"/>
       </w:r>
       <w:r>
         <w:rPr>
@@ -414,7 +427,7 @@
           <w:bCs/>
           <w:lang w:val="en-US" w:eastAsia="zh-CN"/>
         </w:rPr>
-        <w:t>traffic patterns</w:t>
+        <w:t/>
       </w:r>
       <w:r>
         <w:rPr>
@@ -425,39 +438,39 @@
           <w:szCs w:val="24"/>
           <w:lang w:val="en-US" w:eastAsia="zh-CN"/>
         </w:rPr>
-        <w:t xml:space="preserve"> </w:t>
-      </w:r>
-      <w:r>
-        <w:rPr>
-          <w:lang w:eastAsia="zh-CN"/>
-        </w:rPr>
-        <w:t>determine how communication flows share network resources and compete for service, thereby influencing contention and queuing delay</w:t>
-      </w:r>
-      <w:r>
-        <w:rPr>
-          <w:rFonts w:hint="eastAsia"/>
-          <w:lang w:eastAsia="zh-CN"/>
-        </w:rPr>
-        <w:t>.</w:t>
+        <w:t xml:space="preserve"/>
+      </w:r>
+      <w:r>
+        <w:rPr>
+          <w:lang w:eastAsia="zh-CN"/>
+        </w:rPr>
+        <w:t/>
+      </w:r>
+      <w:r>
+        <w:rPr>
+          <w:rFonts w:hint="eastAsia"/>
+          <w:lang w:eastAsia="zh-CN"/>
+        </w:rPr>
+        <w:t/>
       </w:r>
       <w:r>
         <w:rPr>
           <w:spacing w:val="0"/>
           <w:lang w:val="en-US" w:eastAsia="en-US"/>
         </w:rPr>
-        <w:t xml:space="preserve"> </w:t>
+        <w:t xml:space="preserve"/>
       </w:r>
       <w:r>
         <w:rPr>
           <w:lang w:val="en-US" w:eastAsia="zh-CN"/>
         </w:rPr>
-        <w:t>These factors are closely coupled: reducing hop count alone may not improve end-to-end latency if the resulting architecture incurs excessive per-hop delay or resource contention. Scalable NoC design therefore requires coordinated optimization of communication paths, router resources, and traffic handling.</w:t>
+        <w:t/>
       </w:r>
       <w:r>
         <w:rPr>
           <w:lang w:val="en-US" w:eastAsia="zh-CN"/>
         </w:rPr>
-        <w:t xml:space="preserve"> </w:t>
+        <w:t xml:space="preserve"/>
       </w:r>
     </w:p>
     <w:p>
@@ -471,7 +484,191 @@
         <w:rPr>
           <w:lang w:val="en-US" w:eastAsia="zh-CN"/>
         </w:rPr>
-        <w:t xml:space="preserve">Despite the need for scalable on-chip communication, existing </w:t>
+        <w:t xml:space="preserve">Prior NoC work addresses scalability through topology, router bandwidth, and multicast routing. </w:t>
+      </w:r>
+    </w:p>
+    <w:p>
+      <w:pPr>
+        <w:pStyle w:val="a3"/>
+        <w:rPr>
+          <w:lang w:eastAsia="zh-CN"/>
+        </w:rPr>
+      </w:pPr>
+      <w:r>
+        <w:rPr>
+          <w:b/>
+          <w:bCs/>
+          <w:lang w:eastAsia="zh-CN"/>
+        </w:rPr>
+        <w:t xml:space="preserve">Topology. </w:t>
+      </w:r>
+      <w:r>
+        <w:rPr>
+          <w:lang w:eastAsia="zh-CN"/>
+        </w:rPr>
+        <w:t xml:space="preserve">Regular meshes keep router connectivity local, but their path length grows with network size [10]. Kim et al. reduce distance with longer-range connections in the flattened butterfly [11], and FlooNoC shows the channel capacity available from wide physical links [12]. PAICORE's fat quadtree provides a hierarchical alternative for large neuromorphic systems [13]. These approaches can shorten paths or increase link capacity, but aggregated traffic must still pass through upper network levels.</w:t>
+      </w:r>
+      <w:r>
+        <w:rPr>
+          <w:i/>
+          <w:iCs/>
+          <w:lang w:eastAsia="zh-CN"/>
+        </w:rPr>
+        <w:t/>
+      </w:r>
+      <w:r>
+        <w:rPr>
+          <w:lang w:eastAsia="zh-CN"/>
+        </w:rPr>
+        <w:t xml:space="preserve"/>
+      </w:r>
+      <w:r>
+        <w:rPr>
+          <w:lang w:eastAsia="zh-CN"/>
+        </w:rPr>
+        <w:t xml:space="preserve"/>
+      </w:r>
+      <w:proofErr w:type="spellStart"/>
+      <w:r>
+        <w:rPr>
+          <w:lang w:eastAsia="zh-CN"/>
+        </w:rPr>
+        <w:t/>
+      </w:r>
+      <w:proofErr w:type="spellEnd"/>
+      <w:r>
+        <w:rPr>
+          <w:lang w:eastAsia="zh-CN"/>
+        </w:rPr>
+        <w:t xml:space="preserve"/>
+      </w:r>
+    </w:p>
+    <w:p>
+      <w:pPr>
+        <w:pStyle w:val="a3"/>
+        <w:rPr>
+          <w:lang w:eastAsia="zh-CN"/>
+        </w:rPr>
+      </w:pPr>
+      <w:r>
+        <w:rPr>
+          <w:b/>
+          <w:bCs/>
+          <w:lang w:eastAsia="zh-CN"/>
+        </w:rPr>
+        <w:t xml:space="preserve">Router microarchitecture. </w:t>
+      </w:r>
+      <w:r>
+        <w:rPr>
+          <w:lang w:eastAsia="zh-CN"/>
+        </w:rPr>
+        <w:t xml:space="preserve">CMR combines input-port and output-port modules with a multiway-read buffer for continuous-time multicast forwarding [14]. Bertozzi et al. study flexible asynchronous interconnects for GALS systems [15], while Su et al. demonstrate a multicast-capable asynchronous switch [16]. Zhang et al. show how a standard-cell Click-based router can be synthesized using a reusable flow [17]. CHAMP builds on this circuit foundation while allocating multiple physical lanes at packet granularity and maintaining correct two-phase handshake state across lane changes.</w:t>
+      </w:r>
+      <w:r>
+        <w:rPr>
+          <w:i/>
+          <w:iCs/>
+          <w:lang w:eastAsia="zh-CN"/>
+        </w:rPr>
+        <w:t/>
+      </w:r>
+      <w:r>
+        <w:rPr>
+          <w:lang w:eastAsia="zh-CN"/>
+        </w:rPr>
+        <w:t xml:space="preserve"/>
+      </w:r>
+      <w:r>
+        <w:rPr>
+          <w:i/>
+          <w:iCs/>
+          <w:lang w:eastAsia="zh-CN"/>
+        </w:rPr>
+        <w:t/>
+      </w:r>
+      <w:r>
+        <w:rPr>
+          <w:lang w:eastAsia="zh-CN"/>
+        </w:rPr>
+        <w:t xml:space="preserve"/>
+      </w:r>
+      <w:r>
+        <w:rPr>
+          <w:i/>
+          <w:iCs/>
+          <w:lang w:eastAsia="zh-CN"/>
+        </w:rPr>
+        <w:t/>
+      </w:r>
+      <w:r>
+        <w:rPr>
+          <w:lang w:eastAsia="zh-CN"/>
+        </w:rPr>
+        <w:t xml:space="preserve"/>
+      </w:r>
+    </w:p>
+    <w:p>
+      <w:pPr>
+        <w:pStyle w:val="a3"/>
+        <w:rPr>
+          <w:rFonts w:hint="eastAsia"/>
+          <w:lang w:eastAsia="zh-CN"/>
+        </w:rPr>
+      </w:pPr>
+      <w:r>
+        <w:rPr>
+          <w:b/>
+          <w:bCs/>
+          <w:lang w:eastAsia="zh-CN"/>
+        </w:rPr>
+        <w:t xml:space="preserve">Multicast routing. </w:t>
+      </w:r>
+      <w:r>
+        <w:rPr>
+          <w:lang w:eastAsia="zh-CN"/>
+        </w:rPr>
+        <w:t xml:space="preserve">Virtual-circuit tree multicast establishes shared delivery paths for multiple destinations [18]. CMR replicates packets within an asynchronous router [14], while hierarchical destination encoding reduces address overhead [19]. PAICORE demonstrates coordinate-based multicast in a hierarchical network [13]. CHAMP's routing problem is to interpret one compact destination region in both the local tree and upper mesh, so that selective replication continues across their boundary.</w:t>
+      </w:r>
+      <w:r>
+        <w:rPr>
+          <w:i/>
+          <w:iCs/>
+          <w:lang w:eastAsia="zh-CN"/>
+        </w:rPr>
+        <w:t/>
+      </w:r>
+      <w:r>
+        <w:rPr>
+          <w:lang w:eastAsia="zh-CN"/>
+        </w:rPr>
+        <w:t xml:space="preserve"/>
+      </w:r>
+    </w:p>
+    <w:p>
+      <w:pPr>
+        <w:pStyle w:val="a3"/>
+        <w:rPr>
+          <w:lang w:val="en-US" w:eastAsia="zh-CN"/>
+        </w:rPr>
+      </w:pPr>
+      <w:r>
+        <w:rPr>
+          <w:lang w:val="en-US" w:eastAsia="zh-CN"/>
+        </w:rPr>
+        <w:t xml:space="preserve">Despite </w:t>
+      </w:r>
+      <w:r>
+        <w:rPr>
+          <w:rFonts w:hint="eastAsia"/>
+          <w:lang w:val="en-US" w:eastAsia="zh-CN"/>
+        </w:rPr>
+        <w:t>these advances</w:t>
+      </w:r>
+      <w:r>
+        <w:rPr>
+          <w:lang w:val="en-US" w:eastAsia="zh-CN"/>
+        </w:rPr>
+        <w:t xml:space="preserve">, existing </w:t>
       </w:r>
       <w:proofErr w:type="spellStart"/>
       <w:r>
@@ -501,26 +698,26 @@
           <w:bCs/>
           <w:lang w:val="en-US" w:eastAsia="zh-CN"/>
         </w:rPr>
-        <w:t>First,</w:t>
+        <w:t>First, in</w:t>
       </w:r>
       <w:r>
         <w:rPr>
           <w:lang w:val="en-US" w:eastAsia="zh-CN"/>
         </w:rPr>
-        <w:t xml:space="preserve"> </w:t>
+        <w:t xml:space="preserve"/>
       </w:r>
       <w:r>
         <w:rPr>
           <w:lang w:val="en-US" w:eastAsia="zh-CN"/>
         </w:rPr>
-        <w:t>a regular 2-D mesh, the average hop count grows proportionally to the square root of the network size, following</w:t>
+        <w:t> a regular 2-D mesh, the average hop count grows with the square root of network size, following </w:t>
       </w:r>
       <w:r>
         <w:rPr>
           <w:rFonts w:hint="eastAsia"/>
           <w:lang w:val="en-US" w:eastAsia="zh-CN"/>
         </w:rPr>
-        <w:t xml:space="preserve"> </w:t>
+        <w:t xml:space="preserve"/>
       </w:r>
       <m:oMath>
         <m:sSub>
@@ -649,7 +846,7 @@
         <w:rPr>
           <w:lang w:val="en-US" w:eastAsia="zh-CN"/>
         </w:rPr>
-        <w:t xml:space="preserve"> denotes the number of network nodes. This increasing path length contributes to higher communication latency, even with efficient individual routers.</w:t>
+        <w:t xml:space="preserve"> is the number of nodes. Even a fast individual router cannot remove this distance-dependent latency.</w:t>
       </w:r>
     </w:p>
     <w:p>
@@ -663,7 +860,7 @@
         <w:rPr>
           <w:lang w:val="en-US" w:eastAsia="zh-CN"/>
         </w:rPr>
-        <w:t xml:space="preserve"> </w:t>
+        <w:t xml:space="preserve">Second, a tree hierarchy shortens paths, but increasing upper-level connectivity also increases the number of ports and requests handled by a router. In Fig. 2(c), measured router latency rises from 0.66 to 1.29 ns/flit as the router widens. In the 64-PE unicast experiment, the conventional Fat-Tree reaches 145 Mflit/s/port, below the mesh's 215 Mflit/s/port. Shorter paths and additional links therefore do not guarantee higher delivered throughput.</w:t>
       </w:r>
       <w:r>
         <w:rPr>
@@ -671,114 +868,108 @@
           <w:bCs/>
           <w:lang w:val="en-US" w:eastAsia="zh-CN"/>
         </w:rPr>
-        <w:t>Second,</w:t>
+        <w:t/>
       </w:r>
       <w:r>
         <w:rPr>
           <w:lang w:val="en-US" w:eastAsia="zh-CN"/>
         </w:rPr>
-        <w:t xml:space="preserve"> </w:t>
+        <w:t xml:space="preserve"/>
       </w:r>
       <w:proofErr w:type="gramStart"/>
       <w:r>
         <w:rPr>
           <w:lang w:val="en-US" w:eastAsia="zh-CN"/>
         </w:rPr>
-        <w:t>Although</w:t>
+        <w:t/>
       </w:r>
       <w:proofErr w:type="gramEnd"/>
       <w:r>
         <w:rPr>
           <w:lang w:val="en-US" w:eastAsia="zh-CN"/>
         </w:rPr>
-        <w:t xml:space="preserve"> tree hierarchies reduce hop counts, fattening upper-level links increases the number of physical ports and competing requests handled by each router, resulting in more complex arbitration and longer per-hop delays. As shown in Fig. 2(</w:t>
+        <w:t xml:space="preserve"/>
       </w:r>
       <w:r>
         <w:rPr>
           <w:rFonts w:hint="eastAsia"/>
           <w:lang w:val="en-US" w:eastAsia="zh-CN"/>
         </w:rPr>
-        <w:t>c</w:t>
+        <w:t/>
       </w:r>
       <w:r>
         <w:rPr>
           <w:lang w:val="en-US" w:eastAsia="zh-CN"/>
         </w:rPr>
-        <w:t xml:space="preserve">), router latency nearly doubles from 0.66 to 1.29 ns/flit as the evaluated </w:t>
+        <w:t xml:space="preserve"/>
       </w:r>
       <w:r>
         <w:rPr>
           <w:rFonts w:hint="eastAsia"/>
           <w:lang w:val="en-US" w:eastAsia="zh-CN"/>
         </w:rPr>
-        <w:t>router</w:t>
+        <w:t/>
       </w:r>
       <w:r>
         <w:rPr>
           <w:lang w:val="en-US" w:eastAsia="zh-CN"/>
         </w:rPr>
-        <w:t xml:space="preserve"> widen</w:t>
+        <w:t xml:space="preserve"/>
       </w:r>
       <w:r>
         <w:rPr>
           <w:rFonts w:hint="eastAsia"/>
           <w:lang w:val="en-US" w:eastAsia="zh-CN"/>
         </w:rPr>
-        <w:t>s</w:t>
+        <w:t/>
       </w:r>
       <w:r>
         <w:rPr>
           <w:lang w:val="en-US" w:eastAsia="zh-CN"/>
         </w:rPr>
-        <w:t xml:space="preserve">, potentially offsetting the latency benefits of shorter paths. Moreover, the conventional fat-tree achieves only 145 </w:t>
+        <w:t xml:space="preserve"/>
       </w:r>
       <w:proofErr w:type="spellStart"/>
       <w:r>
         <w:rPr>
           <w:lang w:val="en-US" w:eastAsia="zh-CN"/>
         </w:rPr>
-        <w:t>Mflit</w:t>
+        <w:t/>
       </w:r>
       <w:proofErr w:type="spellEnd"/>
       <w:r>
         <w:rPr>
           <w:lang w:val="en-US" w:eastAsia="zh-CN"/>
         </w:rPr>
-        <w:t xml:space="preserve">/s/port, compared </w:t>
-      </w:r>
+        <w:t xml:space="preserve"/>
+      </w:r>
+      <w:proofErr w:type="spellStart"/>
       <w:r>
         <w:rPr>
           <w:lang w:val="en-US" w:eastAsia="zh-CN"/>
         </w:rPr>
-        <w:t xml:space="preserve">with 215 </w:t>
-      </w:r>
-      <w:proofErr w:type="spellStart"/>
+        <w:t/>
+      </w:r>
+      <w:proofErr w:type="spellEnd"/>
       <w:r>
         <w:rPr>
           <w:lang w:val="en-US" w:eastAsia="zh-CN"/>
         </w:rPr>
-        <w:t>Mflit</w:t>
-      </w:r>
-      <w:proofErr w:type="spellEnd"/>
-      <w:r>
+        <w:t/>
+      </w:r>
+    </w:p>
+    <w:p>
+      <w:pPr>
+        <w:pStyle w:val="a3"/>
         <w:rPr>
           <w:lang w:val="en-US" w:eastAsia="zh-CN"/>
         </w:rPr>
-        <w:t>/s/port for the flat mesh, indicating that additional physical links do not necessarily translate into higher network throughput.</w:t>
-      </w:r>
-    </w:p>
-    <w:p>
-      <w:pPr>
-        <w:pStyle w:val="a3"/>
+      </w:pPr>
+      <w:r>
         <w:rPr>
           <w:lang w:val="en-US" w:eastAsia="zh-CN"/>
         </w:rPr>
-      </w:pPr>
-      <w:r>
-        <w:rPr>
-          <w:lang w:val="en-US" w:eastAsia="zh-CN"/>
-        </w:rPr>
-        <w:t xml:space="preserve"> </w:t>
+        <w:t xml:space="preserve">Third, repeated unicast sends a separate packet to each multicast destination, consuming source-injection and shared-path capacity. Under the same 256-PE all-multicast workload, mean latency rises from 19.6 ns with native multicast to 573.0 ns with repeated unicast, as illustrated in Fig. 1(d).</w:t>
       </w:r>
       <w:r>
         <w:rPr>
@@ -786,13 +977,13 @@
           <w:bCs/>
           <w:lang w:val="en-US" w:eastAsia="zh-CN"/>
         </w:rPr>
-        <w:t>Third,</w:t>
+        <w:t/>
       </w:r>
       <w:r>
         <w:rPr>
           <w:lang w:val="en-US" w:eastAsia="zh-CN"/>
         </w:rPr>
-        <w:t xml:space="preserve"> repeated unicast amplifies traffic by sending separate packets to individual destinations. At 256 nodes, average packet latency increases from 57.2 to 573.0 ns as the workload changes from Multicast10 to All-Multicast. </w:t>
+        <w:t xml:space="preserve"/>
       </w:r>
     </w:p>
     <w:p>
@@ -820,7 +1011,14 @@
         <w:rPr>
           <w:lang w:val="en-US" w:eastAsia="zh-CN"/>
         </w:rPr>
-        <w:t xml:space="preserve"> (Click-based Hierarchical Asynchronous Multicast with Parallel Routers)</w:t>
+        <w:t xml:space="preserve"> (Click-based Hierarchical Asynchronous Multicast with Parallel </w:t>
+      </w:r>
+      <w:r>
+        <w:rPr>
+          <w:lang w:val="en-US" w:eastAsia="zh-CN"/>
+        </w:rPr>
+        <w:lastRenderedPageBreak/>
+        <w:t>Routers)</w:t>
       </w:r>
       <w:r>
         <w:rPr>
@@ -969,6 +1167,7 @@
       <w:pPr>
         <w:pStyle w:val="a3"/>
         <w:rPr>
+          <w:rFonts w:hint="eastAsia"/>
           <w:lang w:eastAsia="zh-CN"/>
         </w:rPr>
       </w:pPr>
@@ -1001,28 +1200,16 @@
     <w:p>
       <w:pPr>
         <w:pStyle w:val="1"/>
-      </w:pPr>
-      <w:r>
-        <w:rPr>
-          <w:rFonts w:hint="eastAsia"/>
-          <w:lang w:eastAsia="zh-CN"/>
-        </w:rPr>
-        <w:t>Background</w:t>
-      </w:r>
-    </w:p>
-    <w:p>
-      <w:pPr>
-        <w:ind w:firstLineChars="142" w:firstLine="14.20pt"/>
-        <w:jc w:val="both"/>
-        <w:rPr>
-          <w:lang w:eastAsia="zh-CN"/>
-        </w:rPr>
-      </w:pPr>
-      <w:r>
-        <w:rPr>
-          <w:lang w:eastAsia="zh-CN"/>
-        </w:rPr>
-        <w:t>This section reviews NoC topology, router bandwidth scaling, and multicast routing, focusing on their key architectural tradeoffs.</w:t>
+        <w:rPr>
+          <w:lang w:eastAsia="zh-CN"/>
+        </w:rPr>
+      </w:pPr>
+      <w:r>
+        <w:rPr>
+          <w:rFonts w:hint="eastAsia"/>
+          <w:lang w:eastAsia="zh-CN"/>
+        </w:rPr>
+        <w:t>NetWork Topology</w:t>
       </w:r>
     </w:p>
     <w:p>
@@ -1030,814 +1217,7 @@
         <w:pStyle w:val="2"/>
       </w:pPr>
       <w:r>
-        <w:t>Mesh Scaling and Hierarchical Connectivity</w:t>
-      </w:r>
-    </w:p>
-    <w:p>
-      <w:pPr>
-        <w:ind w:firstLineChars="142" w:firstLine="14.20pt"/>
-        <w:jc w:val="both"/>
-        <w:rPr>
-          <w:lang w:eastAsia="zh-CN"/>
-        </w:rPr>
-      </w:pPr>
-      <w:r>
-        <w:rPr>
-          <w:lang w:eastAsia="zh-CN"/>
-        </w:rPr>
-        <w:t xml:space="preserve">A 2-D Mesh is widely used in </w:t>
-      </w:r>
-      <w:proofErr w:type="spellStart"/>
-      <w:r>
-        <w:rPr>
-          <w:lang w:eastAsia="zh-CN"/>
-        </w:rPr>
-        <w:t>NoCs</w:t>
-      </w:r>
-      <w:proofErr w:type="spellEnd"/>
-      <w:r>
-        <w:rPr>
-          <w:lang w:eastAsia="zh-CN"/>
-        </w:rPr>
-        <w:t xml:space="preserve"> because each router connects only to its neighboring routers, keeping the number of connections per router small and simplifying physical layout [31].</w:t>
-      </w:r>
-      <w:r>
-        <w:rPr>
-          <w:rFonts w:hint="eastAsia"/>
-          <w:lang w:eastAsia="zh-CN"/>
-        </w:rPr>
-        <w:t xml:space="preserve"> </w:t>
-      </w:r>
-      <w:r>
-        <w:rPr>
-          <w:lang w:eastAsia="zh-CN"/>
-        </w:rPr>
-        <w:t xml:space="preserve">However, its communication distance increases with network size. For a square mesh with </w:t>
-      </w:r>
-      <m:oMath>
-        <m:r>
-          <w:rPr>
-            <w:rFonts w:ascii="Cambria Math" w:hAnsi="Cambria Math"/>
-          </w:rPr>
-          <m:t>N=</m:t>
-        </m:r>
-        <m:sSup>
-          <m:sSupPr>
-            <m:ctrlPr>
-              <w:rPr>
-                <w:rFonts w:ascii="Cambria Math" w:hAnsi="Cambria Math"/>
-              </w:rPr>
-            </m:ctrlPr>
-          </m:sSupPr>
-          <m:e>
-            <m:r>
-              <w:rPr>
-                <w:rFonts w:ascii="Cambria Math" w:hAnsi="Cambria Math"/>
-              </w:rPr>
-              <m:t>k</m:t>
-            </m:r>
-          </m:e>
-          <m:sup>
-            <m:r>
-              <w:rPr>
-                <w:rFonts w:ascii="Cambria Math" w:hAnsi="Cambria Math"/>
-              </w:rPr>
-              <m:t>2</m:t>
-            </m:r>
-          </m:sup>
-        </m:sSup>
-      </m:oMath>
-      <w:r>
-        <w:rPr>
-          <w:lang w:eastAsia="zh-CN"/>
-        </w:rPr>
-        <w:t xml:space="preserve"> nodes, the shortest-path hop count equals the Manhattan distance. For uniformly distributed distinct source–destination pairs, the average router-to-router hop count is</w:t>
-      </w:r>
-    </w:p>
-    <w:p>
-      <w:pPr>
-        <w:ind w:firstLineChars="500" w:firstLine="50pt"/>
-        <w:jc w:val="both"/>
-        <w:rPr>
-          <w:lang w:eastAsia="zh-CN"/>
-        </w:rPr>
-      </w:pPr>
-      <m:oMath>
-        <m:eqArr>
-          <m:eqArrPr>
-            <m:ctrlPr>
-              <w:rPr>
-                <w:rFonts w:ascii="Cambria Math" w:hAnsi="Cambria Math"/>
-              </w:rPr>
-            </m:ctrlPr>
-          </m:eqArrPr>
-          <m:e>
-            <m:sSub>
-              <m:sSubPr>
-                <m:ctrlPr>
-                  <w:rPr>
-                    <w:rFonts w:ascii="Cambria Math" w:hAnsi="Cambria Math"/>
-                  </w:rPr>
-                </m:ctrlPr>
-              </m:sSubPr>
-              <m:e>
-                <m:acc>
-                  <m:accPr>
-                    <m:chr m:val="̅"/>
-                    <m:ctrlPr>
-                      <w:rPr>
-                        <w:rFonts w:ascii="Cambria Math" w:hAnsi="Cambria Math"/>
-                      </w:rPr>
-                    </m:ctrlPr>
-                  </m:accPr>
-                  <m:e>
-                    <m:r>
-                      <m:rPr>
-                        <m:sty m:val="p"/>
-                      </m:rPr>
-                      <w:rPr>
-                        <w:rFonts w:ascii="Cambria Math" w:hAnsi="Cambria Math"/>
-                      </w:rPr>
-                      <m:t>H</m:t>
-                    </m:r>
-                  </m:e>
-                </m:acc>
-              </m:e>
-              <m:sub>
-                <m:r>
-                  <m:rPr>
-                    <m:sty m:val="p"/>
-                  </m:rPr>
-                  <w:rPr>
-                    <w:rFonts w:ascii="Cambria Math" w:hAnsi="Cambria Math"/>
-                  </w:rPr>
-                  <m:t>Mesh</m:t>
-                </m:r>
-              </m:sub>
-            </m:sSub>
-            <m:d>
-              <m:dPr>
-                <m:ctrlPr>
-                  <w:rPr>
-                    <w:rFonts w:ascii="Cambria Math" w:hAnsi="Cambria Math"/>
-                  </w:rPr>
-                </m:ctrlPr>
-              </m:dPr>
-              <m:e>
-                <m:r>
-                  <m:rPr>
-                    <m:sty m:val="p"/>
-                  </m:rPr>
-                  <w:rPr>
-                    <w:rFonts w:ascii="Cambria Math" w:hAnsi="Cambria Math"/>
-                  </w:rPr>
-                  <m:t>N</m:t>
-                </m:r>
-              </m:e>
-            </m:d>
-            <m:r>
-              <w:rPr>
-                <w:rFonts w:ascii="Cambria Math" w:hAnsi="Cambria Math"/>
-              </w:rPr>
-              <m:t>=</m:t>
-            </m:r>
-            <m:f>
-              <m:fPr>
-                <m:ctrlPr>
-                  <w:rPr>
-                    <w:rFonts w:ascii="Cambria Math" w:hAnsi="Cambria Math"/>
-                  </w:rPr>
-                </m:ctrlPr>
-              </m:fPr>
-              <m:num>
-                <m:r>
-                  <w:rPr>
-                    <w:rFonts w:ascii="Cambria Math" w:hAnsi="Cambria Math"/>
-                  </w:rPr>
-                  <m:t>4</m:t>
-                </m:r>
-                <m:sSup>
-                  <m:sSupPr>
-                    <m:ctrlPr>
-                      <w:rPr>
-                        <w:rFonts w:ascii="Cambria Math" w:hAnsi="Cambria Math"/>
-                      </w:rPr>
-                    </m:ctrlPr>
-                  </m:sSupPr>
-                  <m:e>
-                    <m:r>
-                      <m:rPr>
-                        <m:sty m:val="p"/>
-                      </m:rPr>
-                      <w:rPr>
-                        <w:rFonts w:ascii="Cambria Math" w:hAnsi="Cambria Math"/>
-                      </w:rPr>
-                      <m:t>k</m:t>
-                    </m:r>
-                  </m:e>
-                  <m:sup>
-                    <m:r>
-                      <w:rPr>
-                        <w:rFonts w:ascii="Cambria Math" w:hAnsi="Cambria Math"/>
-                      </w:rPr>
-                      <m:t>2</m:t>
-                    </m:r>
-                  </m:sup>
-                </m:sSup>
-                <m:nary>
-                  <m:naryPr>
-                    <m:chr m:val="∑"/>
-                    <m:limLoc m:val="undOvr"/>
-                    <m:ctrlPr>
-                      <w:rPr>
-                        <w:rFonts w:ascii="Cambria Math" w:hAnsi="Cambria Math"/>
-                      </w:rPr>
-                    </m:ctrlPr>
-                  </m:naryPr>
-                  <m:sub>
-                    <m:r>
-                      <m:rPr>
-                        <m:sty m:val="p"/>
-                      </m:rPr>
-                      <w:rPr>
-                        <w:rFonts w:ascii="Cambria Math" w:hAnsi="Cambria Math"/>
-                      </w:rPr>
-                      <m:t>d</m:t>
-                    </m:r>
-                    <m:r>
-                      <w:rPr>
-                        <w:rFonts w:ascii="Cambria Math" w:hAnsi="Cambria Math"/>
-                      </w:rPr>
-                      <m:t>=1</m:t>
-                    </m:r>
-                  </m:sub>
-                  <m:sup>
-                    <m:r>
-                      <m:rPr>
-                        <m:sty m:val="p"/>
-                      </m:rPr>
-                      <w:rPr>
-                        <w:rFonts w:ascii="Cambria Math" w:hAnsi="Cambria Math"/>
-                      </w:rPr>
-                      <m:t>k</m:t>
-                    </m:r>
-                    <m:r>
-                      <w:rPr>
-                        <w:rFonts w:ascii="Cambria Math" w:hAnsi="Cambria Math"/>
-                      </w:rPr>
-                      <m:t>-1</m:t>
-                    </m:r>
-                  </m:sup>
-                  <m:e>
-                    <m:r>
-                      <m:rPr>
-                        <m:sty m:val="p"/>
-                      </m:rPr>
-                      <w:rPr>
-                        <w:rFonts w:ascii="Cambria Math" w:hAnsi="Cambria Math"/>
-                      </w:rPr>
-                      <m:t>d</m:t>
-                    </m:r>
-                  </m:e>
-                </m:nary>
-                <m:d>
-                  <m:dPr>
-                    <m:ctrlPr>
-                      <w:rPr>
-                        <w:rFonts w:ascii="Cambria Math" w:hAnsi="Cambria Math"/>
-                      </w:rPr>
-                    </m:ctrlPr>
-                  </m:dPr>
-                  <m:e>
-                    <m:r>
-                      <m:rPr>
-                        <m:sty m:val="p"/>
-                      </m:rPr>
-                      <w:rPr>
-                        <w:rFonts w:ascii="Cambria Math" w:hAnsi="Cambria Math"/>
-                      </w:rPr>
-                      <m:t>k</m:t>
-                    </m:r>
-                    <m:r>
-                      <w:rPr>
-                        <w:rFonts w:ascii="Cambria Math" w:hAnsi="Cambria Math"/>
-                      </w:rPr>
-                      <m:t>-</m:t>
-                    </m:r>
-                    <m:r>
-                      <m:rPr>
-                        <m:sty m:val="p"/>
-                      </m:rPr>
-                      <w:rPr>
-                        <w:rFonts w:ascii="Cambria Math" w:hAnsi="Cambria Math"/>
-                      </w:rPr>
-                      <m:t>d</m:t>
-                    </m:r>
-                  </m:e>
-                </m:d>
-              </m:num>
-              <m:den>
-                <m:r>
-                  <m:rPr>
-                    <m:sty m:val="p"/>
-                  </m:rPr>
-                  <w:rPr>
-                    <w:rFonts w:ascii="Cambria Math" w:hAnsi="Cambria Math"/>
-                  </w:rPr>
-                  <m:t>N</m:t>
-                </m:r>
-                <m:d>
-                  <m:dPr>
-                    <m:ctrlPr>
-                      <w:rPr>
-                        <w:rFonts w:ascii="Cambria Math" w:hAnsi="Cambria Math"/>
-                      </w:rPr>
-                    </m:ctrlPr>
-                  </m:dPr>
-                  <m:e>
-                    <m:r>
-                      <m:rPr>
-                        <m:sty m:val="p"/>
-                      </m:rPr>
-                      <w:rPr>
-                        <w:rFonts w:ascii="Cambria Math" w:hAnsi="Cambria Math"/>
-                      </w:rPr>
-                      <m:t>N</m:t>
-                    </m:r>
-                    <m:r>
-                      <w:rPr>
-                        <w:rFonts w:ascii="Cambria Math" w:hAnsi="Cambria Math"/>
-                      </w:rPr>
-                      <m:t>-1</m:t>
-                    </m:r>
-                  </m:e>
-                </m:d>
-              </m:den>
-            </m:f>
-            <m:r>
-              <w:rPr>
-                <w:rFonts w:ascii="Cambria Math" w:hAnsi="Cambria Math"/>
-              </w:rPr>
-              <m:t>=</m:t>
-            </m:r>
-            <m:f>
-              <m:fPr>
-                <m:ctrlPr>
-                  <w:rPr>
-                    <w:rFonts w:ascii="Cambria Math" w:hAnsi="Cambria Math"/>
-                  </w:rPr>
-                </m:ctrlPr>
-              </m:fPr>
-              <m:num>
-                <m:r>
-                  <w:rPr>
-                    <w:rFonts w:ascii="Cambria Math" w:hAnsi="Cambria Math"/>
-                  </w:rPr>
-                  <m:t>2</m:t>
-                </m:r>
-              </m:num>
-              <m:den>
-                <m:r>
-                  <w:rPr>
-                    <w:rFonts w:ascii="Cambria Math" w:hAnsi="Cambria Math"/>
-                  </w:rPr>
-                  <m:t>3</m:t>
-                </m:r>
-              </m:den>
-            </m:f>
-            <m:rad>
-              <m:radPr>
-                <m:degHide m:val="1"/>
-                <m:ctrlPr>
-                  <w:rPr>
-                    <w:rFonts w:ascii="Cambria Math" w:hAnsi="Cambria Math"/>
-                  </w:rPr>
-                </m:ctrlPr>
-              </m:radPr>
-              <m:deg/>
-              <m:e>
-                <m:r>
-                  <m:rPr>
-                    <m:sty m:val="p"/>
-                  </m:rPr>
-                  <w:rPr>
-                    <w:rFonts w:ascii="Cambria Math" w:hAnsi="Cambria Math"/>
-                  </w:rPr>
-                  <m:t>N</m:t>
-                </m:r>
-              </m:e>
-            </m:rad>
-            <m:r>
-              <w:rPr>
-                <w:rFonts w:ascii="Cambria Math" w:hAnsi="Cambria Math"/>
-              </w:rPr>
-              <m:t>.</m:t>
-            </m:r>
-          </m:e>
-        </m:eqArr>
-      </m:oMath>
-      <w:r>
-        <w:rPr>
-          <w:rFonts w:hint="eastAsia"/>
-          <w:lang w:eastAsia="zh-CN"/>
-        </w:rPr>
-        <w:t xml:space="preserve">                 (2)</w:t>
-      </w:r>
-    </w:p>
-    <w:p>
-      <w:pPr>
-        <w:ind w:firstLineChars="142" w:firstLine="14.20pt"/>
-        <w:jc w:val="both"/>
-        <w:rPr>
-          <w:lang w:eastAsia="zh-CN"/>
-        </w:rPr>
-      </w:pPr>
-      <w:r>
-        <w:rPr>
-          <w:lang w:eastAsia="zh-CN"/>
-        </w:rPr>
-        <w:t>Consequently, under the delay model</w:t>
-      </w:r>
-      <w:r>
-        <w:rPr>
-          <w:rFonts w:hint="eastAsia"/>
-          <w:lang w:eastAsia="zh-CN"/>
-        </w:rPr>
-        <w:t xml:space="preserve"> (1)</w:t>
-      </w:r>
-      <w:r>
-        <w:rPr>
-          <w:lang w:eastAsia="zh-CN"/>
-        </w:rPr>
-        <w:t xml:space="preserve">, the hop-dependent latency grows with </w:t>
-      </w:r>
-      <m:oMath>
-        <m:rad>
-          <m:radPr>
-            <m:degHide m:val="1"/>
-            <m:ctrlPr>
-              <w:rPr>
-                <w:rFonts w:ascii="Cambria Math" w:hAnsi="Cambria Math"/>
-              </w:rPr>
-            </m:ctrlPr>
-          </m:radPr>
-          <m:deg/>
-          <m:e>
-            <m:r>
-              <m:rPr>
-                <m:sty m:val="p"/>
-              </m:rPr>
-              <w:rPr>
-                <w:rFonts w:ascii="Cambria Math" w:hAnsi="Cambria Math"/>
-              </w:rPr>
-              <m:t>N</m:t>
-            </m:r>
-          </m:e>
-        </m:rad>
-      </m:oMath>
-      <w:r>
-        <w:rPr>
-          <w:rFonts w:hint="eastAsia"/>
-          <w:lang w:eastAsia="zh-CN"/>
-        </w:rPr>
-        <w:t xml:space="preserve"> </w:t>
-      </w:r>
-      <w:r>
-        <w:rPr>
-          <w:lang w:eastAsia="zh-CN"/>
-        </w:rPr>
-        <w:t>when the per-hop delay remains</w:t>
-      </w:r>
-      <w:r>
-        <w:rPr>
-          <w:rFonts w:hint="eastAsia"/>
-          <w:lang w:eastAsia="zh-CN"/>
-        </w:rPr>
-        <w:t xml:space="preserve"> </w:t>
-      </w:r>
-      <w:r>
-        <w:rPr>
-          <w:noProof/>
-          <w:lang w:eastAsia="zh-CN"/>
-        </w:rPr>
-        <w:lastRenderedPageBreak/>
-        <w:drawing>
-          <wp:anchor distT="0" distB="0" distL="114300" distR="114300" simplePos="0" relativeHeight="251661312" behindDoc="0" locked="0" layoutInCell="1" allowOverlap="1" wp14:anchorId="7D913D89" wp14:editId="50AF25C2">
-            <wp:simplePos x="0" y="0"/>
-            <wp:positionH relativeFrom="margin">
-              <wp:align>right</wp:align>
-            </wp:positionH>
-            <wp:positionV relativeFrom="margin">
-              <wp:align>top</wp:align>
-            </wp:positionV>
-            <wp:extent cx="6426200" cy="4037330"/>
-            <wp:effectExtent l="0" t="0" r="0" b="1270"/>
-            <wp:wrapTopAndBottom/>
-            <wp:docPr id="13284158" name="图形 6"/>
-            <wp:cNvGraphicFramePr>
-              <a:graphicFrameLocks xmlns:a="http://purl.oclc.org/ooxml/drawingml/main" noChangeAspect="1"/>
-            </wp:cNvGraphicFramePr>
-            <a:graphic xmlns:a="http://purl.oclc.org/ooxml/drawingml/main">
-              <a:graphicData uri="http://purl.oclc.org/ooxml/drawingml/picture">
-                <pic:pic xmlns:pic="http://purl.oclc.org/ooxml/drawingml/picture">
-                  <pic:nvPicPr>
-                    <pic:cNvPr id="13284158" name="图形 13284158"/>
-                    <pic:cNvPicPr/>
-                  </pic:nvPicPr>
-                  <pic:blipFill>
-                    <a:blip r:embed="rId9">
-                      <a:extLst>
-                        <a:ext uri="{96DAC541-7B7A-43D3-8B79-37D633B846F1}">
-                          <asvg:svgBlip xmlns:asvg="http://schemas.microsoft.com/office/drawing/2016/SVG/main" r:embed="rId10"/>
-                        </a:ext>
-                      </a:extLst>
-                    </a:blip>
-                    <a:stretch>
-                      <a:fillRect/>
-                    </a:stretch>
-                  </pic:blipFill>
-                  <pic:spPr>
-                    <a:xfrm>
-                      <a:off x="0" y="0"/>
-                      <a:ext cx="6426200" cy="4037330"/>
-                    </a:xfrm>
-                    <a:prstGeom prst="rect">
-                      <a:avLst/>
-                    </a:prstGeom>
-                  </pic:spPr>
-                </pic:pic>
-              </a:graphicData>
-            </a:graphic>
-          </wp:anchor>
-        </w:drawing>
-      </w:r>
-      <w:r>
-        <w:rPr>
-          <w:noProof/>
-        </w:rPr>
-        <w:drawing>
-          <wp:anchor distT="0" distB="0" distL="114300" distR="114300" simplePos="0" relativeHeight="251660288" behindDoc="0" locked="0" layoutInCell="1" allowOverlap="1" wp14:anchorId="4B776C48" wp14:editId="2C4961AD">
-            <wp:simplePos x="0" y="0"/>
-            <wp:positionH relativeFrom="margin">
-              <wp:posOffset>-1159</wp:posOffset>
-            </wp:positionH>
-            <wp:positionV relativeFrom="paragraph">
-              <wp:posOffset>4075430</wp:posOffset>
-            </wp:positionV>
-            <wp:extent cx="6426200" cy="934720"/>
-            <wp:effectExtent l="0" t="0" r="0" b="0"/>
-            <wp:wrapTopAndBottom/>
-            <wp:docPr id="219141878" name="文本框 1"/>
-            <wp:cNvGraphicFramePr/>
-            <a:graphic xmlns:a="http://purl.oclc.org/ooxml/drawingml/main">
-              <a:graphicData uri="http://schemas.microsoft.com/office/word/2010/wordprocessingShape">
-                <wp:wsp>
-                  <wp:cNvSpPr txBox="1"/>
-                  <wp:spPr>
-                    <a:xfrm>
-                      <a:off x="0" y="0"/>
-                      <a:ext cx="6426200" cy="934720"/>
-                    </a:xfrm>
-                    <a:prstGeom prst="rect">
-                      <a:avLst/>
-                    </a:prstGeom>
-                    <a:solidFill>
-                      <a:prstClr val="white"/>
-                    </a:solidFill>
-                    <a:ln>
-                      <a:noFill/>
-                    </a:ln>
-                  </wp:spPr>
-                  <wp:txbx>
-                    <wne:txbxContent>
-                      <w:p>
-                        <w:pPr>
-                          <w:pStyle w:val="ab"/>
-                          <w:rPr>
-                            <w:rFonts w:ascii="Times New Roman" w:hAnsi="Times New Roman" w:cs="Times New Roman"/>
-                            <w:sz w:val="16"/>
-                            <w:szCs w:val="16"/>
-                            <w:lang w:eastAsia="zh-CN"/>
-                          </w:rPr>
-                        </w:pPr>
-                        <w:r>
-                          <w:rPr>
-                            <w:rFonts w:ascii="Times New Roman" w:hAnsi="Times New Roman" w:cs="Times New Roman"/>
-                            <w:sz w:val="16"/>
-                            <w:szCs w:val="16"/>
-                          </w:rPr>
-                          <w:t xml:space="preserve">Fig. </w:t>
-                        </w:r>
-                        <w:r>
-                          <w:rPr>
-                            <w:rFonts w:ascii="Times New Roman" w:hAnsi="Times New Roman" w:cs="Times New Roman"/>
-                            <w:sz w:val="16"/>
-                            <w:szCs w:val="16"/>
-                          </w:rPr>
-                          <w:fldChar w:fldCharType="begin"/>
-                        </w:r>
-                        <w:r>
-                          <w:rPr>
-                            <w:rFonts w:ascii="Times New Roman" w:hAnsi="Times New Roman" w:cs="Times New Roman"/>
-                            <w:sz w:val="16"/>
-                            <w:szCs w:val="16"/>
-                          </w:rPr>
-                          <w:instrText xml:space="preserve"> SEQ Fig. \* ARABIC </w:instrText>
-                        </w:r>
-                        <w:r>
-                          <w:rPr>
-                            <w:rFonts w:ascii="Times New Roman" w:hAnsi="Times New Roman" w:cs="Times New Roman"/>
-                            <w:sz w:val="16"/>
-                            <w:szCs w:val="16"/>
-                          </w:rPr>
-                          <w:fldChar w:fldCharType="separate"/>
-                        </w:r>
-                        <w:r>
-                          <w:rPr>
-                            <w:rFonts w:ascii="Times New Roman" w:hAnsi="Times New Roman" w:cs="Times New Roman"/>
-                            <w:noProof/>
-                            <w:sz w:val="16"/>
-                            <w:szCs w:val="16"/>
-                          </w:rPr>
-                          <w:t>1</w:t>
-                        </w:r>
-                        <w:r>
-                          <w:rPr>
-                            <w:rFonts w:ascii="Times New Roman" w:hAnsi="Times New Roman" w:cs="Times New Roman"/>
-                            <w:sz w:val="16"/>
-                            <w:szCs w:val="16"/>
-                          </w:rPr>
-                          <w:fldChar w:fldCharType="end"/>
-                        </w:r>
-                        <w:r>
-                          <w:rPr>
-                            <w:rFonts w:ascii="Times New Roman" w:hAnsi="Times New Roman" w:cs="Times New Roman"/>
-                            <w:sz w:val="16"/>
-                            <w:szCs w:val="16"/>
-                            <w:lang w:eastAsia="zh-CN"/>
-                          </w:rPr>
-                          <w:t xml:space="preserve"> </w:t>
-                        </w:r>
-                        <w:r>
-                          <w:rPr>
-                            <w:rFonts w:ascii="Times New Roman" w:hAnsi="Times New Roman" w:cs="Times New Roman"/>
-                            <w:b/>
-                            <w:bCs/>
-                            <w:sz w:val="16"/>
-                            <w:szCs w:val="16"/>
-                          </w:rPr>
-                          <w:t>Motivation for and overview of CHAMP</w:t>
-                        </w:r>
-                        <w:r>
-                          <w:rPr>
-                            <w:rFonts w:ascii="Times New Roman" w:hAnsi="Times New Roman" w:cs="Times New Roman"/>
-                            <w:sz w:val="16"/>
-                            <w:szCs w:val="16"/>
-                          </w:rPr>
-                          <w:t xml:space="preserve">. (a) Scaling trends across four computing domains: </w:t>
-                        </w:r>
-                        <w:proofErr w:type="spellStart"/>
-                        <w:r>
-                          <w:rPr>
-                            <w:rFonts w:ascii="Times New Roman" w:hAnsi="Times New Roman" w:cs="Times New Roman"/>
-                            <w:sz w:val="16"/>
-                            <w:szCs w:val="16"/>
-                          </w:rPr>
-                          <w:t>SambaNova</w:t>
-                        </w:r>
-                        <w:proofErr w:type="spellEnd"/>
-                        <w:r>
-                          <w:rPr>
-                            <w:rFonts w:ascii="Times New Roman" w:hAnsi="Times New Roman" w:cs="Times New Roman"/>
-                            <w:sz w:val="16"/>
-                            <w:szCs w:val="16"/>
-                          </w:rPr>
-                          <w:t xml:space="preserve"> SN40L (2023) to SN50 (2026) for AI accelerators; Intel Pohoiki Springs (2020) to Hala Point (2024) for neuromorphic systems; NVIDIA A100 (2020) to Rubin (2026) for GPUs; and AMD EPYC 7002 (2019) to EPYC 9006 (2026) for server CPUs. (b) Average hop count increases with network size in a flat 2-D mesh. (c) Fat-Tree bandwidth scaling increases router latency while delivering lower peak throughput than the flat mesh. (d) Repeated unicast amplifies network traffic and average packet latency as multicast intensity increases. (e) CHAMP combines hierarchical Tree–Mesh topology with parallel-router architecture, reducing hop count and network power while increasing peak delivered-copy throughput to 346 </w:t>
-                        </w:r>
-                        <w:proofErr w:type="spellStart"/>
-                        <w:r>
-                          <w:rPr>
-                            <w:rFonts w:ascii="Times New Roman" w:hAnsi="Times New Roman" w:cs="Times New Roman"/>
-                            <w:sz w:val="16"/>
-                            <w:szCs w:val="16"/>
-                          </w:rPr>
-                          <w:t>Mflit</w:t>
-                        </w:r>
-                        <w:proofErr w:type="spellEnd"/>
-                        <w:r>
-                          <w:rPr>
-                            <w:rFonts w:ascii="Times New Roman" w:hAnsi="Times New Roman" w:cs="Times New Roman"/>
-                            <w:sz w:val="16"/>
-                            <w:szCs w:val="16"/>
-                          </w:rPr>
-                          <w:t xml:space="preserve">/s/port, compared with 215 </w:t>
-                        </w:r>
-                        <w:proofErr w:type="spellStart"/>
-                        <w:r>
-                          <w:rPr>
-                            <w:rFonts w:ascii="Times New Roman" w:hAnsi="Times New Roman" w:cs="Times New Roman"/>
-                            <w:sz w:val="16"/>
-                            <w:szCs w:val="16"/>
-                          </w:rPr>
-                          <w:t>Mflit</w:t>
-                        </w:r>
-                        <w:proofErr w:type="spellEnd"/>
-                        <w:r>
-                          <w:rPr>
-                            <w:rFonts w:ascii="Times New Roman" w:hAnsi="Times New Roman" w:cs="Times New Roman"/>
-                            <w:sz w:val="16"/>
-                            <w:szCs w:val="16"/>
-                          </w:rPr>
-                          <w:t>/s/port for the mesh. (f) Native region-aware multicast limits the increase in average packet latency with network size and multicast intensity, achieving 11.0 ns at 64 nodes and 19.6 ns at 256 nodes under All-Multicast workloads.</w:t>
-                        </w:r>
-                      </w:p>
-                    </wne:txbxContent>
-                  </wp:txbx>
-                  <wp:bodyPr rot="0" spcFirstLastPara="0" vertOverflow="overflow" horzOverflow="overflow" vert="horz" wrap="square" lIns="0" tIns="0" rIns="0" bIns="0" numCol="1" spcCol="0" rtlCol="0" fromWordArt="0" anchor="t" anchorCtr="0" forceAA="0" compatLnSpc="1">
-                    <a:prstTxWarp prst="textNoShape">
-                      <a:avLst/>
-                    </a:prstTxWarp>
-                    <a:spAutoFit/>
-                  </wp:bodyPr>
-                </wp:wsp>
-              </a:graphicData>
-            </a:graphic>
-          </wp:anchor>
-        </w:drawing>
-      </w:r>
-      <w:r>
-        <w:rPr>
-          <w:lang w:eastAsia="zh-CN"/>
-        </w:rPr>
-        <w:t xml:space="preserve">constant. </w:t>
-      </w:r>
-      <w:r>
-        <w:rPr>
-          <w:lang w:eastAsia="zh-CN"/>
-        </w:rPr>
-        <w:t>Alternative NoC topologies can reduce hop count by providing shorter paths, but may require more router connections and more complex physical wiring [31], [32]</w:t>
-      </w:r>
-      <w:r>
-        <w:rPr>
-          <w:rFonts w:hint="eastAsia"/>
-          <w:lang w:eastAsia="zh-CN"/>
-        </w:rPr>
-        <w:t xml:space="preserve">. </w:t>
-      </w:r>
-      <w:r>
-        <w:rPr>
-          <w:lang w:eastAsia="zh-CN"/>
-        </w:rPr>
-        <w:t>Hierarchical connectivity offers an alternative way to organize local and long-distance communication, although its effectiveness also depends on how inter-router bandwidth is provisioned [20].</w:t>
-      </w:r>
-    </w:p>
-    <w:p>
-      <w:pPr>
-        <w:pStyle w:val="2"/>
-      </w:pPr>
-      <w:r>
-        <w:t>Bandwidth Scaling and Parallel-Router Organization</w:t>
-      </w:r>
-    </w:p>
-    <w:p>
-      <w:pPr>
-        <w:ind w:firstLineChars="142" w:firstLine="14.20pt"/>
-        <w:jc w:val="both"/>
-        <w:rPr>
-          <w:lang w:eastAsia="zh-CN"/>
-        </w:rPr>
-      </w:pPr>
-      <w:r>
-        <w:rPr>
-          <w:lang w:eastAsia="zh-CN"/>
-        </w:rPr>
-        <w:t xml:space="preserve">In hierarchical </w:t>
-      </w:r>
-      <w:proofErr w:type="spellStart"/>
-      <w:r>
-        <w:rPr>
-          <w:lang w:eastAsia="zh-CN"/>
-        </w:rPr>
-        <w:t>NoCs</w:t>
-      </w:r>
-      <w:proofErr w:type="spellEnd"/>
-      <w:r>
-        <w:rPr>
-          <w:lang w:eastAsia="zh-CN"/>
-        </w:rPr>
-        <w:t>, traffic from multiple lower-level routers converges toward upper levels, making these links potential bandwidth bottlenecks. Fat-Tree designs alleviate this bottleneck by adding parallel links at higher levels [33], [34]. However, concentrating these links at a single router increases the number of connections and competing requests that it must handle. The resulting crossbar and arbitration logic can increase area and power, while potentially increasing router latency and limiting the benefits of additional bandwidth [33], [34]. Prior work has explored router concentration and channel slicing to balance hardware cost and resource utilization [35]. Asynchronous channel slicing further allows subchannels to progress independently, although coordination remains necessary at shared routing stages [36]. These studies motivate examining how parallel communication resources can be distributed across routers and network levels, rather than scaling bandwidth solely by increasing the number of connections handled by individual routers.</w:t>
-      </w:r>
-    </w:p>
-    <w:p>
-      <w:pPr>
-        <w:pStyle w:val="2"/>
-        <w:rPr>
-          <w:b/>
-          <w:bCs/>
-        </w:rPr>
-      </w:pPr>
-      <w:r>
-        <w:t>Multicast Routing and Traffic Amplification</w:t>
+        <w:t>Hierarchical Tree–Mesh Organization</w:t>
       </w:r>
     </w:p>
     <w:p>
@@ -1852,44 +1232,59 @@
         <w:rPr>
           <w:lang w:eastAsia="zh-CN"/>
         </w:rPr>
-        <w:t xml:space="preserve">High-fanout communication makes routing decisions inseparable from destination representation. Without native multicast, repeated unicast duplicates packets along shared paths and consumes source injection bandwidth. Existing approaches reduce this cost through tree-based branching [3], virtual-circuit multicast [5], and continuous-time replication in asynchronous meshes [6]; hierarchical encodings reduce destination-address overhead [2]. PAICORE demonstrates coordinate-based multicast in a fat quadtree [13]. Other work explores two-tier </w:t>
-      </w:r>
-      <w:proofErr w:type="spellStart"/>
-      <w:r>
-        <w:rPr>
-          <w:lang w:eastAsia="zh-CN"/>
-        </w:rPr>
-        <w:t>NoCs</w:t>
-      </w:r>
-      <w:proofErr w:type="spellEnd"/>
-      <w:r>
-        <w:rPr>
-          <w:lang w:eastAsia="zh-CN"/>
-        </w:rPr>
-        <w:t>, Mesh-of-Trees, and hierarchical multicast [14], [15], [25]. These results establish multicast and hierarchical routing as mature techniques, but the design problem considered here is more specific: one rectangular destination region must remain interpretable across a local tree and an upper on-chip mesh. The routing decisions of both tiers must be coordinated so that the same multicast transaction crosses their boundary without being converted into separate unicast transfers for individual clusters.</w:t>
-      </w:r>
-    </w:p>
-    <w:p>
-      <w:pPr>
-        <w:pStyle w:val="1"/>
-        <w:rPr>
-          <w:lang w:eastAsia="zh-CN"/>
-        </w:rPr>
-      </w:pPr>
-      <w:r>
-        <w:rPr>
-          <w:rFonts w:hint="eastAsia"/>
-          <w:lang w:eastAsia="zh-CN"/>
-        </w:rPr>
-        <w:t>NetWork Topology</w:t>
-      </w:r>
-    </w:p>
-    <w:p>
-      <w:pPr>
-        <w:pStyle w:val="2"/>
-      </w:pPr>
-      <w:r>
-        <w:t>Hierarchical Tree–Mesh Organization</w:t>
+        <w:t>CHAMP employs a hierarchical Tree–Mesh topology to reduce communication distance, as illustrated in Fig. 2(a)–(</w:t>
+      </w:r>
+      <w:r>
+        <w:rPr>
+          <w:rFonts w:hint="eastAsia"/>
+          <w:lang w:eastAsia="zh-CN"/>
+        </w:rPr>
+        <w:t>c</w:t>
+      </w:r>
+      <w:r>
+        <w:rPr>
+          <w:lang w:eastAsia="zh-CN"/>
+        </w:rPr>
+        <w:t>). Each 64-PE cluster forms a three-level quadtree comprising 16 L1</w:t>
+      </w:r>
+      <w:r>
+        <w:rPr>
+          <w:rFonts w:hint="eastAsia"/>
+          <w:lang w:eastAsia="zh-CN"/>
+        </w:rPr>
+        <w:t xml:space="preserve"> groups</w:t>
+      </w:r>
+      <w:r>
+        <w:rPr>
+          <w:lang w:eastAsia="zh-CN"/>
+        </w:rPr>
+        <w:t>, four L2</w:t>
+      </w:r>
+      <w:r>
+        <w:rPr>
+          <w:rFonts w:hint="eastAsia"/>
+          <w:lang w:eastAsia="zh-CN"/>
+        </w:rPr>
+        <w:t xml:space="preserve"> groups</w:t>
+      </w:r>
+      <w:r>
+        <w:rPr>
+          <w:lang w:eastAsia="zh-CN"/>
+        </w:rPr>
+        <w:t>, and one L3 router</w:t>
+      </w:r>
+      <w:r>
+        <w:rPr>
+          <w:rFonts w:hint="eastAsia"/>
+          <w:lang w:eastAsia="zh-CN"/>
+        </w:rPr>
+        <w:t xml:space="preserve"> group</w:t>
+      </w:r>
+      <w:r>
+        <w:rPr>
+          <w:lang w:eastAsia="zh-CN"/>
+        </w:rPr>
+        <w:t>. The L3 routers connect to an upper-level 2-D mesh through mesh routers (MRs), enabling local communication within clusters and long-distance communication across clusters.</w:t>
       </w:r>
     </w:p>
     <w:p>
@@ -1902,284 +1297,29 @@
       </w:pPr>
       <w:r>
         <w:rPr>
-          <w:lang w:eastAsia="zh-CN"/>
-        </w:rPr>
-        <w:t>CHAMP employs a hierarchical Tree–Mesh topology to reduce communication distance, as illustrated in Fig. 2(a)–(</w:t>
-      </w:r>
-      <w:r>
-        <w:rPr>
-          <w:rFonts w:hint="eastAsia"/>
-          <w:lang w:eastAsia="zh-CN"/>
-        </w:rPr>
-        <w:t>c</w:t>
-      </w:r>
-      <w:r>
-        <w:rPr>
-          <w:lang w:eastAsia="zh-CN"/>
-        </w:rPr>
-        <w:t>). Each 64-PE cluster forms a three-level quadtree comprising 16 L1</w:t>
-      </w:r>
-      <w:r>
-        <w:rPr>
-          <w:rFonts w:hint="eastAsia"/>
-          <w:lang w:eastAsia="zh-CN"/>
-        </w:rPr>
-        <w:t xml:space="preserve"> groups</w:t>
-      </w:r>
-      <w:r>
-        <w:rPr>
-          <w:lang w:eastAsia="zh-CN"/>
-        </w:rPr>
-        <w:t>, four L2</w:t>
-      </w:r>
-      <w:r>
-        <w:rPr>
-          <w:rFonts w:hint="eastAsia"/>
-          <w:lang w:eastAsia="zh-CN"/>
-        </w:rPr>
-        <w:t xml:space="preserve"> groups</w:t>
-      </w:r>
-      <w:r>
-        <w:rPr>
-          <w:lang w:eastAsia="zh-CN"/>
-        </w:rPr>
-        <w:t>, and one L3 router</w:t>
-      </w:r>
-      <w:r>
-        <w:rPr>
-          <w:rFonts w:hint="eastAsia"/>
-          <w:lang w:eastAsia="zh-CN"/>
-        </w:rPr>
-        <w:t xml:space="preserve"> group</w:t>
-      </w:r>
-      <w:r>
-        <w:rPr>
-          <w:lang w:eastAsia="zh-CN"/>
-        </w:rPr>
-        <w:t xml:space="preserve">. The </w:t>
-      </w:r>
-      <w:r>
-        <w:rPr>
-          <w:lang w:eastAsia="zh-CN"/>
-        </w:rPr>
-        <w:lastRenderedPageBreak/>
-        <w:t xml:space="preserve">L3 routers connect to </w:t>
-      </w:r>
-      <w:r>
-        <w:rPr>
-          <w:noProof/>
-        </w:rPr>
-        <w:drawing>
-          <wp:anchor distT="0" distB="0" distL="114300" distR="114300" simplePos="0" relativeHeight="251664384" behindDoc="0" locked="0" layoutInCell="1" allowOverlap="1" wp14:anchorId="78DF54A4" wp14:editId="348B2534">
-            <wp:simplePos x="0" y="0"/>
-            <wp:positionH relativeFrom="column">
-              <wp:posOffset>2540</wp:posOffset>
-            </wp:positionH>
-            <wp:positionV relativeFrom="paragraph">
-              <wp:posOffset>2783205</wp:posOffset>
-            </wp:positionV>
-            <wp:extent cx="6426200" cy="635"/>
-            <wp:effectExtent l="0" t="0" r="0" b="0"/>
-            <wp:wrapTopAndBottom/>
-            <wp:docPr id="1149432697" name="文本框 1"/>
-            <wp:cNvGraphicFramePr/>
-            <a:graphic xmlns:a="http://purl.oclc.org/ooxml/drawingml/main">
-              <a:graphicData uri="http://schemas.microsoft.com/office/word/2010/wordprocessingShape">
-                <wp:wsp>
-                  <wp:cNvSpPr txBox="1"/>
-                  <wp:spPr>
-                    <a:xfrm>
-                      <a:off x="0" y="0"/>
-                      <a:ext cx="6426200" cy="635"/>
-                    </a:xfrm>
-                    <a:prstGeom prst="rect">
-                      <a:avLst/>
-                    </a:prstGeom>
-                    <a:solidFill>
-                      <a:prstClr val="white"/>
-                    </a:solidFill>
-                    <a:ln>
-                      <a:noFill/>
-                    </a:ln>
-                  </wp:spPr>
-                  <wp:txbx>
-                    <wne:txbxContent>
-                      <w:p>
-                        <w:pPr>
-                          <w:pStyle w:val="ab"/>
-                          <w:rPr>
-                            <w:rFonts w:ascii="Times New Roman" w:eastAsia="宋体" w:hAnsi="Times New Roman" w:cs="Times New Roman"/>
-                            <w:sz w:val="16"/>
-                            <w:szCs w:val="16"/>
-                          </w:rPr>
-                        </w:pPr>
-                        <w:r>
-                          <w:rPr>
-                            <w:rFonts w:ascii="Times New Roman" w:hAnsi="Times New Roman" w:cs="Times New Roman"/>
-                            <w:sz w:val="16"/>
-                            <w:szCs w:val="16"/>
-                          </w:rPr>
-                          <w:t xml:space="preserve">Fig. </w:t>
-                        </w:r>
-                        <w:r>
-                          <w:rPr>
-                            <w:rFonts w:ascii="Times New Roman" w:hAnsi="Times New Roman" w:cs="Times New Roman"/>
-                            <w:sz w:val="16"/>
-                            <w:szCs w:val="16"/>
-                          </w:rPr>
-                          <w:fldChar w:fldCharType="begin"/>
-                        </w:r>
-                        <w:r>
-                          <w:rPr>
-                            <w:rFonts w:ascii="Times New Roman" w:hAnsi="Times New Roman" w:cs="Times New Roman"/>
-                            <w:sz w:val="16"/>
-                            <w:szCs w:val="16"/>
-                          </w:rPr>
-                          <w:instrText xml:space="preserve"> SEQ Fig. \* ARABIC </w:instrText>
-                        </w:r>
-                        <w:r>
-                          <w:rPr>
-                            <w:rFonts w:ascii="Times New Roman" w:hAnsi="Times New Roman" w:cs="Times New Roman"/>
-                            <w:sz w:val="16"/>
-                            <w:szCs w:val="16"/>
-                          </w:rPr>
-                          <w:fldChar w:fldCharType="separate"/>
-                        </w:r>
-                        <w:r>
-                          <w:rPr>
-                            <w:rFonts w:ascii="Times New Roman" w:hAnsi="Times New Roman" w:cs="Times New Roman"/>
-                            <w:noProof/>
-                            <w:sz w:val="16"/>
-                            <w:szCs w:val="16"/>
-                          </w:rPr>
-                          <w:t>2</w:t>
-                        </w:r>
-                        <w:r>
-                          <w:rPr>
-                            <w:rFonts w:ascii="Times New Roman" w:hAnsi="Times New Roman" w:cs="Times New Roman"/>
-                            <w:sz w:val="16"/>
-                            <w:szCs w:val="16"/>
-                          </w:rPr>
-                          <w:fldChar w:fldCharType="end"/>
-                        </w:r>
-                        <w:r>
-                          <w:rPr>
-                            <w:rFonts w:ascii="Times New Roman" w:eastAsia="宋体" w:hAnsi="Times New Roman" w:cs="Times New Roman"/>
-                            <w:b/>
-                            <w:bCs/>
-                            <w:sz w:val="16"/>
-                            <w:szCs w:val="16"/>
-                          </w:rPr>
-                          <w:t xml:space="preserve"> </w:t>
-                        </w:r>
-                        <w:r>
-                          <w:rPr>
-                            <w:rFonts w:ascii="Times New Roman" w:hAnsi="Times New Roman" w:cs="Times New Roman"/>
-                            <w:b/>
-                            <w:bCs/>
-                            <w:sz w:val="16"/>
-                            <w:szCs w:val="16"/>
-                          </w:rPr>
-                          <w:t>Hierarchical Tree–Mesh topology and parallel-router organization of CHAMP.</w:t>
-                        </w:r>
-                        <w:r>
-                          <w:rPr>
-                            <w:rFonts w:ascii="Times New Roman" w:hAnsi="Times New Roman" w:cs="Times New Roman"/>
-                            <w:sz w:val="16"/>
-                            <w:szCs w:val="16"/>
-                          </w:rPr>
-                          <w:t xml:space="preserve"> (a) Top-level 2-D mesh connecting cluster mesh-router groups (MRs). (b) Three-level quadtree within a 64-PE cluster, comprising 16 L1 router groups, four L2 router groups, and one L3 router group. (c) Analytical average router-to-router hop count under uniformly distributed distinct source–destination PE pairs, excluding PE injection and ejection links. (d) PE–L1–L2 connectivity, with four parallel uplink lanes per L1 router and four physical router instances per L2 group. (e) Connectivity between four L2 groups and an L3 group containing 16 physical router instances. (f) Connectivity between the 16 L3 instances and the 16 physical mesh routers in an MR group. (g) Parallel directional connections between neighboring MR groups.</w:t>
-                        </w:r>
-                      </w:p>
-                    </wne:txbxContent>
-                  </wp:txbx>
-                  <wp:bodyPr rot="0" spcFirstLastPara="0" vertOverflow="overflow" horzOverflow="overflow" vert="horz" wrap="square" lIns="0" tIns="0" rIns="0" bIns="0" numCol="1" spcCol="0" rtlCol="0" fromWordArt="0" anchor="t" anchorCtr="0" forceAA="0" compatLnSpc="1">
-                    <a:prstTxWarp prst="textNoShape">
-                      <a:avLst/>
-                    </a:prstTxWarp>
-                    <a:spAutoFit/>
-                  </wp:bodyPr>
-                </wp:wsp>
-              </a:graphicData>
-            </a:graphic>
-          </wp:anchor>
-        </w:drawing>
-      </w:r>
-      <w:r>
-        <w:rPr>
-          <w:noProof/>
-          <w:lang w:eastAsia="zh-CN"/>
-        </w:rPr>
-        <w:drawing>
-          <wp:anchor distT="0" distB="0" distL="114300" distR="114300" simplePos="0" relativeHeight="251662336" behindDoc="0" locked="0" layoutInCell="1" allowOverlap="1" wp14:anchorId="7C3FF83A" wp14:editId="4F6F2EF7">
-            <wp:simplePos x="0" y="0"/>
-            <wp:positionH relativeFrom="column">
-              <wp:posOffset>2687</wp:posOffset>
-            </wp:positionH>
-            <wp:positionV relativeFrom="page">
-              <wp:posOffset>689317</wp:posOffset>
-            </wp:positionV>
-            <wp:extent cx="6426200" cy="2722880"/>
-            <wp:effectExtent l="0" t="0" r="0" b="1270"/>
-            <wp:wrapTopAndBottom/>
-            <wp:docPr id="1979273060" name="图形 7"/>
-            <wp:cNvGraphicFramePr>
-              <a:graphicFrameLocks xmlns:a="http://purl.oclc.org/ooxml/drawingml/main" noChangeAspect="1"/>
-            </wp:cNvGraphicFramePr>
-            <a:graphic xmlns:a="http://purl.oclc.org/ooxml/drawingml/main">
-              <a:graphicData uri="http://purl.oclc.org/ooxml/drawingml/picture">
-                <pic:pic xmlns:pic="http://purl.oclc.org/ooxml/drawingml/picture">
-                  <pic:nvPicPr>
-                    <pic:cNvPr id="1979273060" name="图形 1979273060"/>
-                    <pic:cNvPicPr/>
-                  </pic:nvPicPr>
-                  <pic:blipFill>
-                    <a:blip r:embed="rId11">
-                      <a:extLst>
-                        <a:ext uri="{96DAC541-7B7A-43D3-8B79-37D633B846F1}">
-                          <asvg:svgBlip xmlns:asvg="http://schemas.microsoft.com/office/drawing/2016/SVG/main" r:embed="rId12"/>
-                        </a:ext>
-                      </a:extLst>
-                    </a:blip>
-                    <a:stretch>
-                      <a:fillRect/>
-                    </a:stretch>
-                  </pic:blipFill>
-                  <pic:spPr>
-                    <a:xfrm>
-                      <a:off x="0" y="0"/>
-                      <a:ext cx="6426200" cy="2722880"/>
-                    </a:xfrm>
-                    <a:prstGeom prst="rect">
-                      <a:avLst/>
-                    </a:prstGeom>
-                  </pic:spPr>
-                </pic:pic>
-              </a:graphicData>
-            </a:graphic>
-          </wp:anchor>
-        </w:drawing>
-      </w:r>
-      <w:r>
-        <w:rPr>
-          <w:lang w:eastAsia="zh-CN"/>
-        </w:rPr>
-        <w:t>an upper-level 2-D mesh through mesh routers (MRs), enabling local communication within clusters and long-distance communication across clusters.</w:t>
-      </w:r>
-    </w:p>
-    <w:p>
-      <w:pPr>
-        <w:ind w:firstLine="14.20pt"/>
-        <w:jc w:val="both"/>
-        <w:rPr>
-          <w:lang w:eastAsia="zh-CN"/>
-        </w:rPr>
-      </w:pPr>
-      <w:r>
-        <w:rPr>
-          <w:lang w:eastAsia="zh-CN"/>
-        </w:rPr>
-        <w:t xml:space="preserve">We analytically derive the average router-to-router hop count for uniformly distributed distinct source–destination PE pairs, excluding PE injection and ejection links. Within each cluster, 3, 12, and 48 destinations require 0, 2, and 4 hops, respectively, yielding an average of </w:t>
+          <w:rFonts w:hint="eastAsia"/>
+          <w:lang w:eastAsia="zh-CN"/>
+        </w:rPr>
+        <w:t>CHAMP</w:t>
+      </w:r>
+      <w:r>
+        <w:rPr>
+          <w:lang w:eastAsia="zh-CN"/>
+        </w:rPr>
+        <w:t xml:space="preserve"> analytically derive</w:t>
+      </w:r>
+      <w:r>
+        <w:rPr>
+          <w:rFonts w:hint="eastAsia"/>
+          <w:lang w:eastAsia="zh-CN"/>
+        </w:rPr>
+        <w:t>s</w:t>
+      </w:r>
+      <w:r>
+        <w:rPr>
+          <w:lang w:eastAsia="zh-CN"/>
+        </w:rPr>
+        <w:t xml:space="preserve"> the average router-to-router hop count for uniformly distributed distinct source–destination PE pairs, excluding PE injection and ejection links. Within each cluster, 3, 12, and 48 destinations require 0, 2, and 4 hops, respectively, yielding an average of </w:t>
       </w:r>
       <m:oMath>
         <m:sSub>
@@ -3089,7 +2229,13 @@
         <w:rPr>
           <w:lang w:eastAsia="zh-CN"/>
         </w:rPr>
-        <w:t xml:space="preserve"> at 1024 nodes, compared with a flat 2-D mesh. These correspond to reductions of approximately 35.7%, 40.3%, and 60.9%, respectively.</w:t>
+        <w:t xml:space="preserve"> at </w:t>
+      </w:r>
+      <w:r>
+        <w:rPr>
+          <w:lang w:eastAsia="zh-CN"/>
+        </w:rPr>
+        <w:t>1024 nodes, compared with a flat 2-D mesh. These correspond to reductions of approximately 35.7%, 40.3%, and 60.9%, respectively.</w:t>
       </w:r>
       <w:r>
         <w:rPr>
@@ -3377,7 +2523,33 @@
         <w:rPr>
           <w:lang w:eastAsia="zh-CN"/>
         </w:rPr>
-        <w:t xml:space="preserve">To quantify the bandwidth scaling capability, we consider uniform-random unicast traffic in an </w:t>
+        <w:t xml:space="preserve">To quantify the bandwidth scaling capability, </w:t>
+      </w:r>
+      <w:r>
+        <w:rPr>
+          <w:rFonts w:hint="eastAsia"/>
+          <w:lang w:eastAsia="zh-CN"/>
+        </w:rPr>
+        <w:t>CHAMP</w:t>
+      </w:r>
+      <w:r>
+        <w:rPr>
+          <w:lang w:eastAsia="zh-CN"/>
+        </w:rPr>
+        <w:t xml:space="preserve"> consider</w:t>
+      </w:r>
+      <w:r>
+        <w:rPr>
+          <w:rFonts w:hint="eastAsia"/>
+          <w:lang w:eastAsia="zh-CN"/>
+        </w:rPr>
+        <w:t>s</w:t>
+      </w:r>
+      <w:r>
+        <w:rPr>
+          <w:lang w:eastAsia="zh-CN"/>
+        </w:rPr>
+        <w:t xml:space="preserve"> uniform-random unicast traffic in an </w:t>
       </w:r>
       <w:r>
         <w:rPr>
@@ -3607,6 +2779,7 @@
         <w:ind w:firstLine="14.20pt"/>
         <w:jc w:val="both"/>
         <w:rPr>
+          <w:rFonts w:hint="eastAsia"/>
           <w:lang w:eastAsia="zh-CN"/>
         </w:rPr>
       </w:pPr>
@@ -3758,12 +2931,278 @@
     </w:p>
     <w:p>
       <w:pPr>
+        <w:pStyle w:val="1"/>
+        <w:rPr>
+          <w:lang w:eastAsia="zh-CN"/>
+        </w:rPr>
+      </w:pPr>
+      <w:r>
+        <w:rPr>
+          <w:rFonts w:hint="eastAsia"/>
+          <w:lang w:eastAsia="zh-CN"/>
+        </w:rPr>
+        <w:t>Router Microarchitecture</w:t>
+      </w:r>
+    </w:p>
+    <w:p>
+      <w:pPr>
+        <w:ind w:firstLine="14.20pt"/>
         <w:jc w:val="both"/>
         <w:rPr>
           <w:rFonts w:hint="eastAsia"/>
           <w:lang w:eastAsia="zh-CN"/>
         </w:rPr>
       </w:pPr>
+      <w:r>
+        <w:rPr>
+          <w:lang w:eastAsia="zh-CN"/>
+        </w:rPr>
+        <w:t>CHAMP builds on the input port module (IPM)–output port module (OPM) organization and continuous-time multiway-read buffer of CMR [14]. It combines Click-based forwarding with dynamic lane allocation and handshake phase adaptation to support multicast over the parallel connections described in Section III.</w:t>
+      </w:r>
+    </w:p>
+    <w:p>
+      <w:pPr>
+        <w:pStyle w:val="2"/>
+      </w:pPr>
+      <w:r>
+        <w:rPr>
+          <w:lang w:eastAsia="zh-CN"/>
+        </w:rPr>
+        <w:t>Click-Based Multicast Forwarding</w:t>
+      </w:r>
+    </w:p>
+    <w:p>
+      <w:pPr>
+        <w:ind w:firstLine="14.40pt"/>
+        <w:jc w:val="both"/>
+        <w:rPr>
+          <w:lang w:eastAsia="zh-CN"/>
+        </w:rPr>
+      </w:pPr>
+      <w:r>
+        <w:rPr>
+          <w:lang w:eastAsia="zh-CN"/>
+        </w:rPr>
+        <w:t xml:space="preserve">CHAMP uses local Click control to coordinate route establishment, shared-buffer writes, and multicast forwarding. When a header arrives, the routing computation unit captures its destination information and enables the required output branches through packet-path-enable (PPE) signals (Fig. 4(c)). </w:t>
+      </w:r>
+      <w:r>
+        <w:rPr>
+          <w:lang w:eastAsia="zh-CN"/>
+        </w:rPr>
+        <w:lastRenderedPageBreak/>
+        <w:t xml:space="preserve">Each branch remains enabled until its </w:t>
+      </w:r>
+      <w:proofErr w:type="spellStart"/>
+      <w:r>
+        <w:rPr>
+          <w:i/>
+          <w:iCs/>
+          <w:lang w:eastAsia="zh-CN"/>
+        </w:rPr>
+        <w:t>TailPass</w:t>
+      </w:r>
+      <w:proofErr w:type="spellEnd"/>
+      <w:r>
+        <w:rPr>
+          <w:lang w:eastAsia="zh-CN"/>
+        </w:rPr>
+        <w:t xml:space="preserve"> feedback indicates completion. In parallel, the write interface selects a storage cell using the write pointer; a local </w:t>
+      </w:r>
+      <w:r>
+        <w:rPr>
+          <w:i/>
+          <w:iCs/>
+          <w:lang w:eastAsia="zh-CN"/>
+        </w:rPr>
+        <w:t>Fire</w:t>
+      </w:r>
+      <w:r>
+        <w:rPr>
+          <w:lang w:eastAsia="zh-CN"/>
+        </w:rPr>
+        <w:t xml:space="preserve"> event captures the incoming flit and updates its </w:t>
+      </w:r>
+      <w:proofErr w:type="spellStart"/>
+      <w:r>
+        <w:rPr>
+          <w:i/>
+          <w:iCs/>
+          <w:lang w:eastAsia="zh-CN"/>
+        </w:rPr>
+        <w:t>CellFull</w:t>
+      </w:r>
+      <w:proofErr w:type="spellEnd"/>
+      <w:r>
+        <w:rPr>
+          <w:lang w:eastAsia="zh-CN"/>
+        </w:rPr>
+        <w:t xml:space="preserve"> state (Fig. 4(b)). These operations use two-phase request–acknowledge signaling without a global clock.</w:t>
+      </w:r>
+    </w:p>
+    <w:p>
+      <w:pPr>
+        <w:ind w:firstLine="14.40pt"/>
+        <w:jc w:val="both"/>
+        <w:rPr>
+          <w:lang w:eastAsia="zh-CN"/>
+        </w:rPr>
+      </w:pPr>
+      <w:r>
+        <w:rPr>
+          <w:lang w:eastAsia="zh-CN"/>
+        </w:rPr>
+        <w:t xml:space="preserve">The stored flits are accessed through four independent read interfaces, corresponding to the legal output directions excluding the ingress direction (Fig. 3). Each interface maintains its own read pointer, generates requests according to data availability and branch enable, and advances upon acknowledgement (Fig. 4(a)). Thus, enabled multicast branches read the same packet at their respective rates. At each OPM, arbitration selects an eligible input, and Click control captures its flit when the output stage can accept another transfer. The output register retains the flit under downstream backpressure. Read-completion states are returned through </w:t>
+      </w:r>
+      <w:proofErr w:type="spellStart"/>
+      <w:r>
+        <w:rPr>
+          <w:i/>
+          <w:iCs/>
+          <w:lang w:eastAsia="zh-CN"/>
+        </w:rPr>
+        <w:t>CellEmpty</w:t>
+      </w:r>
+      <w:proofErr w:type="spellEnd"/>
+      <w:r>
+        <w:rPr>
+          <w:lang w:eastAsia="zh-CN"/>
+        </w:rPr>
+        <w:t xml:space="preserve"> signals, and the write interface withholds the tail-flit acknowledgement until all required reads complete. This completion condition prevents admission of the next packet before the current multicast packet has been consumed by all enabled branches.</w:t>
+      </w:r>
+    </w:p>
+    <w:p>
+      <w:pPr>
+        <w:pStyle w:val="2"/>
+      </w:pPr>
+      <w:r>
+        <w:t>Dynamic Lane Allocation and Phase Adaptation</w:t>
+      </w:r>
+    </w:p>
+    <w:p>
+      <w:pPr>
+        <w:ind w:firstLine="14.40pt"/>
+        <w:jc w:val="both"/>
+        <w:rPr>
+          <w:lang w:eastAsia="zh-CN"/>
+        </w:rPr>
+      </w:pPr>
+      <w:r>
+        <w:rPr>
+          <w:lang w:eastAsia="zh-CN"/>
+        </w:rPr>
+        <w:t xml:space="preserve">CHAMP uses two-level arbitration to allocate parallel output lanes. At the first level, each requesting input independently arbitrates among available lanes within an enabled output direction, producing a one-hot </w:t>
+      </w:r>
+      <w:proofErr w:type="spellStart"/>
+      <w:r>
+        <w:rPr>
+          <w:i/>
+          <w:iCs/>
+          <w:lang w:eastAsia="zh-CN"/>
+        </w:rPr>
+        <w:t>LaneSelect</w:t>
+      </w:r>
+      <w:proofErr w:type="spellEnd"/>
+      <w:r>
+        <w:rPr>
+          <w:lang w:eastAsia="zh-CN"/>
+        </w:rPr>
+        <w:t xml:space="preserve"> (Fig. 4(d)). At the second level, each OPM arbitrates among the inputs that selected its lane and grants access to one winner. If multiple inputs select the same lane concurrently, the losing inputs retain their lane selections and wait for access rather than restarting lane arbitration. Once selected, the lane is held until the branch completes its packet transfer. This separates lane selection within a direction from input arbitration at a physical output, while maintaining a stable path for each packet.</w:t>
+      </w:r>
+    </w:p>
+    <w:p>
+      <w:pPr>
+        <w:ind w:firstLine="14.40pt"/>
+        <w:jc w:val="both"/>
+        <w:rPr>
+          <w:lang w:eastAsia="zh-CN"/>
+        </w:rPr>
+      </w:pPr>
+      <w:r>
+        <w:rPr>
+          <w:lang w:eastAsia="zh-CN"/>
+        </w:rPr>
+        <w:t xml:space="preserve">Selecting different lanes across packets requires handshake phase adaptation because each physical lane maintains an independent two-phase state. Directly switching the branch request between lanes could create an unintended transition or suppress a required one. The adapter in Fig. 4(e) maintains a request phase for each candidate lane and updates only the selected lane when a branch transfer is pending. It returns a branch-level acknowledgement only after that lane has entered the pending state and subsequently acknowledged the transfer. This preserves the request–acknowledge sequence across lane changes. The selected lane’s </w:t>
+      </w:r>
+      <w:proofErr w:type="spellStart"/>
+      <w:r>
+        <w:rPr>
+          <w:i/>
+          <w:iCs/>
+          <w:lang w:eastAsia="zh-CN"/>
+        </w:rPr>
+        <w:t>TailPass</w:t>
+      </w:r>
+      <w:proofErr w:type="spellEnd"/>
+      <w:r>
+        <w:rPr>
+          <w:lang w:eastAsia="zh-CN"/>
+        </w:rPr>
+        <w:t xml:space="preserve"> feedback then clears the branch enable and releases the lane selection for the next packet.</w:t>
+      </w:r>
+    </w:p>
+    <w:p>
+      <w:pPr>
+        <w:pStyle w:val="2"/>
+        <w:rPr>
+          <w:rFonts w:hint="eastAsia"/>
+        </w:rPr>
+      </w:pPr>
+      <w:r>
+        <w:rPr>
+          <w:lang w:eastAsia="zh-CN"/>
+        </w:rPr>
+        <w:t>Synthesis and Timing Closur</w:t>
+      </w:r>
+      <w:r>
+        <w:rPr>
+          <w:rFonts w:hint="eastAsia"/>
+          <w:lang w:eastAsia="zh-CN"/>
+        </w:rPr>
+        <w:t>e</w:t>
+      </w:r>
+    </w:p>
+    <w:p>
+      <w:pPr>
+        <w:ind w:firstLine="14.40pt"/>
+        <w:jc w:val="both"/>
+        <w:rPr>
+          <w:rFonts w:hint="eastAsia"/>
+          <w:lang w:eastAsia="zh-CN"/>
+        </w:rPr>
+      </w:pPr>
+      <w:r>
+        <w:rPr>
+          <w:lang w:eastAsia="zh-CN"/>
+        </w:rPr>
+        <w:t xml:space="preserve">Click-based control captures data in standard edge-triggered flip-flops using locally generated Fire signals. These registers provide explicit timing endpoints and avoid </w:t>
+      </w:r>
+      <w:proofErr w:type="spellStart"/>
+      <w:r>
+        <w:rPr>
+          <w:lang w:eastAsia="zh-CN"/>
+        </w:rPr>
+        <w:t>datapath</w:t>
+      </w:r>
+      <w:proofErr w:type="spellEnd"/>
+      <w:r>
+        <w:rPr>
+          <w:lang w:eastAsia="zh-CN"/>
+        </w:rPr>
+        <w:t xml:space="preserve"> transparency, simplifying integration with conventional synthesis and static timing analysis (STA) tools [17]. As illustrated in Fig. 5, CHAMP uses a semi-automated delay-matching flow. Local Fire signals are defined as clocks for timing analysis, and STA checks the relative timing constraints re</w:t>
+      </w:r>
+      <w:r>
+        <w:rPr>
+          <w:lang w:eastAsia="zh-CN"/>
+        </w:rPr>
+        <w:t>quired for correct data capture and handshake operation. Delay cells are inserted or adjusted on the relevant control paths, followed by re-synthesis and timing checks. This flow combines event-driven operation with standard-cell implementation while explicitly enforcing asynchronous timing requirements</w:t>
+      </w:r>
+      <w:r>
+        <w:rPr>
+          <w:rFonts w:hint="eastAsia"/>
+          <w:lang w:eastAsia="zh-CN"/>
+        </w:rPr>
+        <w:t>.</w:t>
+      </w:r>
     </w:p>
     <w:p>
       <w:pPr>
@@ -3773,20 +3212,355 @@
         </w:rPr>
       </w:pPr>
       <w:r>
-        <w:lastRenderedPageBreak/>
+        <w:rPr>
+          <w:rFonts w:hint="eastAsia"/>
+          <w:lang w:eastAsia="zh-CN"/>
+        </w:rPr>
+        <w:t>Region-aware multicast routing</w:t>
+      </w:r>
+    </w:p>
+    <w:p>
+      <w:pPr>
+        <w:ind w:firstLine="14.40pt"/>
+        <w:jc w:val="both"/>
+        <w:rPr>
+          <w:lang w:eastAsia="zh-CN"/>
+        </w:rPr>
+      </w:pPr>
+      <w:r>
+        <w:rPr>
+          <w:lang w:eastAsia="zh-CN"/>
+        </w:rPr>
+        <w:t xml:space="preserve">CHAMP represents a destination region using two opposite corners, </w:t>
+      </w:r>
+      <m:oMath>
+        <m:d>
+          <m:dPr>
+            <m:ctrlPr>
+              <w:rPr>
+                <w:rFonts w:ascii="Cambria Math" w:hAnsi="Cambria Math"/>
+              </w:rPr>
+            </m:ctrlPr>
+          </m:dPr>
+          <m:e>
+            <m:sSub>
+              <m:sSubPr>
+                <m:ctrlPr>
+                  <w:rPr>
+                    <w:rFonts w:ascii="Cambria Math" w:hAnsi="Cambria Math"/>
+                  </w:rPr>
+                </m:ctrlPr>
+              </m:sSubPr>
+              <m:e>
+                <m:r>
+                  <w:rPr>
+                    <w:rFonts w:ascii="Cambria Math" w:hAnsi="Cambria Math"/>
+                  </w:rPr>
+                  <m:t>x</m:t>
+                </m:r>
+              </m:e>
+              <m:sub>
+                <m:r>
+                  <w:rPr>
+                    <w:rFonts w:ascii="Cambria Math" w:hAnsi="Cambria Math"/>
+                  </w:rPr>
+                  <m:t>0</m:t>
+                </m:r>
+              </m:sub>
+            </m:sSub>
+            <m:r>
+              <w:rPr>
+                <w:rFonts w:ascii="Cambria Math" w:hAnsi="Cambria Math"/>
+              </w:rPr>
+              <m:t>,</m:t>
+            </m:r>
+            <m:sSub>
+              <m:sSubPr>
+                <m:ctrlPr>
+                  <w:rPr>
+                    <w:rFonts w:ascii="Cambria Math" w:hAnsi="Cambria Math"/>
+                  </w:rPr>
+                </m:ctrlPr>
+              </m:sSubPr>
+              <m:e>
+                <m:r>
+                  <w:rPr>
+                    <w:rFonts w:ascii="Cambria Math" w:hAnsi="Cambria Math"/>
+                  </w:rPr>
+                  <m:t>y</m:t>
+                </m:r>
+              </m:e>
+              <m:sub>
+                <m:r>
+                  <w:rPr>
+                    <w:rFonts w:ascii="Cambria Math" w:hAnsi="Cambria Math"/>
+                  </w:rPr>
+                  <m:t>0</m:t>
+                </m:r>
+              </m:sub>
+            </m:sSub>
+          </m:e>
+        </m:d>
+        <m:r>
+          <w:rPr>
+            <w:rFonts w:ascii="Cambria Math" w:hAnsi="Cambria Math"/>
+          </w:rPr>
+          <m:t xml:space="preserve"> </m:t>
+        </m:r>
+      </m:oMath>
+      <w:r>
+        <w:rPr>
+          <w:lang w:eastAsia="zh-CN"/>
+        </w:rPr>
+        <w:t>and</w:t>
+      </w:r>
+      <w:r>
+        <w:rPr>
+          <w:rFonts w:hint="eastAsia"/>
+          <w:lang w:eastAsia="zh-CN"/>
+        </w:rPr>
+        <w:t xml:space="preserve"> </w:t>
+      </w:r>
+      <m:oMath>
+        <m:d>
+          <m:dPr>
+            <m:ctrlPr>
+              <w:rPr>
+                <w:rFonts w:ascii="Cambria Math" w:hAnsi="Cambria Math"/>
+              </w:rPr>
+            </m:ctrlPr>
+          </m:dPr>
+          <m:e>
+            <m:sSub>
+              <m:sSubPr>
+                <m:ctrlPr>
+                  <w:rPr>
+                    <w:rFonts w:ascii="Cambria Math" w:hAnsi="Cambria Math"/>
+                  </w:rPr>
+                </m:ctrlPr>
+              </m:sSubPr>
+              <m:e>
+                <m:r>
+                  <w:rPr>
+                    <w:rFonts w:ascii="Cambria Math" w:hAnsi="Cambria Math"/>
+                  </w:rPr>
+                  <m:t>x</m:t>
+                </m:r>
+              </m:e>
+              <m:sub>
+                <m:r>
+                  <w:rPr>
+                    <w:rFonts w:ascii="Cambria Math" w:hAnsi="Cambria Math"/>
+                  </w:rPr>
+                  <m:t>1</m:t>
+                </m:r>
+              </m:sub>
+            </m:sSub>
+            <m:r>
+              <w:rPr>
+                <w:rFonts w:ascii="Cambria Math" w:hAnsi="Cambria Math"/>
+              </w:rPr>
+              <m:t>,</m:t>
+            </m:r>
+            <m:sSub>
+              <m:sSubPr>
+                <m:ctrlPr>
+                  <w:rPr>
+                    <w:rFonts w:ascii="Cambria Math" w:hAnsi="Cambria Math"/>
+                  </w:rPr>
+                </m:ctrlPr>
+              </m:sSubPr>
+              <m:e>
+                <m:r>
+                  <w:rPr>
+                    <w:rFonts w:ascii="Cambria Math" w:hAnsi="Cambria Math"/>
+                  </w:rPr>
+                  <m:t>y</m:t>
+                </m:r>
+              </m:e>
+              <m:sub>
+                <m:r>
+                  <w:rPr>
+                    <w:rFonts w:ascii="Cambria Math" w:hAnsi="Cambria Math"/>
+                  </w:rPr>
+                  <m:t>1</m:t>
+                </m:r>
+              </m:sub>
+            </m:sSub>
+          </m:e>
+        </m:d>
+      </m:oMath>
+      <w:r>
+        <w:rPr>
+          <w:lang w:eastAsia="zh-CN"/>
+        </w:rPr>
+        <w:t>, in global PE coordinates. The same representation is interpreted throughout the tree–mesh hierarchy. A single-point region specifies unicast, while a larger rectangle selects all PEs within its bounds</w:t>
+      </w:r>
+      <w:r>
+        <w:rPr>
+          <w:rFonts w:hint="eastAsia"/>
+          <w:lang w:eastAsia="zh-CN"/>
+        </w:rPr>
+        <w:t xml:space="preserve">. </w:t>
+      </w:r>
+      <w:r>
+        <w:rPr>
+          <w:lang w:eastAsia="zh-CN"/>
+        </w:rPr>
+        <w:t>The architecture allows inter-chip extension at the mesh boundaries, while the current implementation targets intra-chip communication.</w:t>
+      </w:r>
+    </w:p>
+    <w:p>
+      <w:pPr>
+        <w:ind w:firstLine="14.40pt"/>
+        <w:jc w:val="both"/>
+        <w:rPr>
+          <w:rFonts w:hint="eastAsia"/>
+          <w:lang w:eastAsia="zh-CN"/>
+        </w:rPr>
+      </w:pPr>
+      <w:r>
+        <w:rPr>
+          <w:lang w:eastAsia="zh-CN"/>
+        </w:rPr>
+        <w:t>At each tree router, routing compares the destination rectangle with the spatial regions covered by its children. A child direction is enabled if its region intersects the destination rectangle, excluding the ingress direction. If the rectangle extends beyond the current subtree, the parent direction is also enabled, provided the packet did not arrive from that direction. These tests produce an output-direction mask, allowing local delivery and upward forwarding to occur concurrently, as illustrated in Fig. 6(a).</w:t>
+      </w:r>
+      <w:r>
+        <w:t xml:space="preserve"> </w:t>
+      </w:r>
+      <w:r>
+        <w:rPr>
+          <w:lang w:eastAsia="zh-CN"/>
+        </w:rPr>
+        <w:t>The architecture also allows inter-chip extension at the mesh boundaries, as indicated in Fig. 2(a)</w:t>
+      </w:r>
+      <w:r>
+        <w:rPr>
+          <w:rFonts w:hint="eastAsia"/>
+          <w:lang w:eastAsia="zh-CN"/>
+        </w:rPr>
+        <w:t>,</w:t>
+      </w:r>
+      <w:r>
+        <w:t xml:space="preserve"> </w:t>
+      </w:r>
+      <w:r>
+        <w:rPr>
+          <w:lang w:eastAsia="zh-CN"/>
+        </w:rPr>
+        <w:t>while the current</w:t>
+      </w:r>
+      <w:r>
+        <w:rPr>
+          <w:rFonts w:hint="eastAsia"/>
+          <w:lang w:eastAsia="zh-CN"/>
+        </w:rPr>
+        <w:t xml:space="preserve"> study </w:t>
+      </w:r>
+      <w:r>
+        <w:rPr>
+          <w:lang w:eastAsia="zh-CN"/>
+        </w:rPr>
+        <w:t>focus</w:t>
+      </w:r>
+      <w:r>
+        <w:rPr>
+          <w:rFonts w:hint="eastAsia"/>
+          <w:lang w:eastAsia="zh-CN"/>
+        </w:rPr>
+        <w:t>es</w:t>
+      </w:r>
+      <w:r>
+        <w:rPr>
+          <w:lang w:eastAsia="zh-CN"/>
+        </w:rPr>
+        <w:t xml:space="preserve"> on intra-chip communication</w:t>
+      </w:r>
+      <w:r>
+        <w:rPr>
+          <w:rFonts w:hint="eastAsia"/>
+          <w:lang w:eastAsia="zh-CN"/>
+        </w:rPr>
+        <w:t>.</w:t>
+      </w:r>
+    </w:p>
+    <w:p>
+      <w:pPr>
+        <w:pStyle w:val="1"/>
+        <w:rPr>
+          <w:lang w:eastAsia="zh-CN"/>
+        </w:rPr>
+      </w:pPr>
+      <w:r>
+        <w:rPr>
+          <w:rFonts w:hint="eastAsia"/>
+          <w:lang w:eastAsia="zh-CN"/>
+        </w:rPr>
+        <w:t>Evaluation</w:t>
+      </w:r>
+    </w:p>
+    <w:p>
+      <w:pPr>
+        <w:ind w:firstLine="14.40pt"/>
+        <w:jc w:val="both"/>
+        <w:rPr>
+          <w:lang w:eastAsia="zh-CN"/>
+        </w:rPr>
+      </w:pPr>
+      <w:r>
+        <w:rPr>
+          <w:lang w:eastAsia="zh-CN"/>
+        </w:rPr>
+        <w:t xml:space="preserve">All designs are synthesized using Synopsys Design Compiler with a 28-nm standard-cell library at the TT corner, 0.8 V, and 25 °C. Gate-level simulations use Synopsys VCS with back-annotated SDF delays, and power is estimated using </w:t>
+      </w:r>
+      <w:proofErr w:type="spellStart"/>
+      <w:r>
+        <w:rPr>
+          <w:lang w:eastAsia="zh-CN"/>
+        </w:rPr>
+        <w:t>PrimeTime</w:t>
+      </w:r>
+      <w:proofErr w:type="spellEnd"/>
+      <w:r>
+        <w:rPr>
+          <w:lang w:eastAsia="zh-CN"/>
+        </w:rPr>
+        <w:t xml:space="preserve"> PX with simulation-generated switching activity. Packets comprise five 28-bit flits. Reported area, latency, and power results are obtained at the post-synthesis level</w:t>
+      </w:r>
+    </w:p>
+    <w:p>
+      <w:pPr>
+        <w:pStyle w:val="2"/>
+      </w:pPr>
+      <w:r>
+        <w:t>Router-Level Evaluation</w:t>
+      </w:r>
+    </w:p>
+    <w:p>
+      <w:pPr>
+        <w:ind w:firstLine="14.40pt"/>
+        <w:jc w:val="both"/>
+        <w:rPr>
+          <w:lang w:eastAsia="zh-CN"/>
+        </w:rPr>
+      </w:pPr>
+      <w:r>
+        <w:rPr>
+          <w:noProof/>
+        </w:rPr>
         <w:drawing>
-          <wp:anchor distT="0" distB="0" distL="114300" distR="114300" simplePos="0" relativeHeight="251667456" behindDoc="0" locked="0" layoutInCell="1" allowOverlap="1" wp14:anchorId="398A1289" wp14:editId="6A428885">
+          <wp:anchor distT="0" distB="0" distL="114300" distR="114300" simplePos="0" relativeHeight="251694080" behindDoc="0" locked="0" layoutInCell="1" allowOverlap="1" wp14:anchorId="309D6332" wp14:editId="18B1FC08">
             <wp:simplePos x="0" y="0"/>
             <wp:positionH relativeFrom="column">
-              <wp:posOffset>0</wp:posOffset>
+              <wp:posOffset>-3312160</wp:posOffset>
             </wp:positionH>
-            <wp:positionV relativeFrom="paragraph">
-              <wp:posOffset>2776855</wp:posOffset>
+            <wp:positionV relativeFrom="page">
+              <wp:posOffset>7589325</wp:posOffset>
             </wp:positionV>
-            <wp:extent cx="6426200" cy="635"/>
+            <wp:extent cx="3111500" cy="233680"/>
             <wp:effectExtent l="0" t="0" r="0" b="0"/>
             <wp:wrapTopAndBottom/>
-            <wp:docPr id="1192396582" name="文本框 1"/>
+            <wp:docPr id="126899879" name="文本框 1"/>
             <wp:cNvGraphicFramePr/>
             <a:graphic xmlns:a="http://purl.oclc.org/ooxml/drawingml/main">
               <a:graphicData uri="http://schemas.microsoft.com/office/word/2010/wordprocessingShape">
@@ -3795,7 +3569,7 @@
                   <wp:spPr>
                     <a:xfrm>
                       <a:off x="0" y="0"/>
-                      <a:ext cx="6426200" cy="635"/>
+                      <a:ext cx="3111500" cy="233680"/>
                     </a:xfrm>
                     <a:prstGeom prst="rect">
                       <a:avLst/>
@@ -3814,10 +3588,7 @@
                           <w:pStyle w:val="ab"/>
                           <w:rPr>
                             <w:rFonts w:ascii="Times New Roman" w:eastAsia="宋体" w:hAnsi="Times New Roman" w:cs="Times New Roman"/>
-                            <w:smallCaps/>
                             <w:noProof/>
-                            <w:sz w:val="16"/>
-                            <w:szCs w:val="16"/>
                           </w:rPr>
                         </w:pPr>
                         <w:r>
@@ -3859,7 +3630,7 @@
                             <w:sz w:val="16"/>
                             <w:szCs w:val="16"/>
                           </w:rPr>
-                          <w:t>3</w:t>
+                          <w:t>5</w:t>
                         </w:r>
                         <w:r>
                           <w:rPr>
@@ -3872,23 +3643,11 @@
                         <w:r>
                           <w:rPr>
                             <w:rFonts w:ascii="Times New Roman" w:hAnsi="Times New Roman" w:cs="Times New Roman"/>
-                            <w:b/>
-                            <w:bCs/>
-                            <w:sz w:val="16"/>
-                            <w:szCs w:val="16"/>
-                          </w:rPr>
-                          <w:t xml:space="preserve"> CHAMP router microarchitecture</w:t>
-                        </w:r>
-                        <w:r>
-                          <w:rPr>
-                            <w:rFonts w:ascii="Times New Roman" w:hAnsi="Times New Roman" w:cs="Times New Roman" w:hint="eastAsia"/>
-                            <w:b/>
-                            <w:bCs/>
                             <w:sz w:val="16"/>
                             <w:szCs w:val="16"/>
                             <w:lang w:eastAsia="zh-CN"/>
                           </w:rPr>
-                          <w:t xml:space="preserve"> for the c1p4 configuration</w:t>
+                          <w:t xml:space="preserve"> </w:t>
                         </w:r>
                         <w:r>
                           <w:rPr>
@@ -3898,37 +3657,7 @@
                             <w:sz w:val="16"/>
                             <w:szCs w:val="16"/>
                           </w:rPr>
-                          <w:t>.</w:t>
-                        </w:r>
-                        <w:r>
-                          <w:rPr>
-                            <w:rFonts w:ascii="Times New Roman" w:hAnsi="Times New Roman" w:cs="Times New Roman"/>
-                            <w:sz w:val="16"/>
-                            <w:szCs w:val="16"/>
-                          </w:rPr>
-                          <w:t xml:space="preserve"> Each input port module (IPM) combines route computation with packet storage and independent read interfaces for multicast forwarding. Lane selectors and phase adapters connect multi-lane output directions to their physical output port modules (OPMs).</w:t>
-                        </w:r>
-                        <w:r>
-                          <w:rPr>
-                            <w:rFonts w:ascii="Times New Roman" w:eastAsia="宋体" w:hAnsi="Times New Roman" w:cs="Times New Roman"/>
-                          </w:rPr>
-                          <w:t xml:space="preserve"> </w:t>
-                        </w:r>
-                        <w:r>
-                          <w:rPr>
-                            <w:rFonts w:ascii="Times New Roman" w:hAnsi="Times New Roman" w:cs="Times New Roman"/>
-                            <w:sz w:val="16"/>
-                            <w:szCs w:val="16"/>
-                          </w:rPr>
-                          <w:t>Each Dir0–3 OPM uses 7-way arbitration over three inputs from the other single-lane directions and four Dir4 inputs. Each Dir4 OPM uses 4-way arbitration over the four Dir0–3 inputs. Connections within the same direction are excluded. Click-based control governs flit forwarding.</w:t>
-                        </w:r>
-                        <w:r>
-                          <w:rPr>
-                            <w:rFonts w:ascii="Times New Roman" w:hAnsi="Times New Roman" w:cs="Times New Roman"/>
-                            <w:sz w:val="16"/>
-                            <w:szCs w:val="16"/>
-                          </w:rPr>
-                          <w:t xml:space="preserve"> </w:t>
+                          <w:t>Semi-automated synthesis and delay-matching flow for the Click-based router.</w:t>
                         </w:r>
                       </w:p>
                     </wne:txbxContent>
@@ -3947,755 +3676,171 @@
       </w:r>
       <w:r>
         <w:rPr>
-          <w:rFonts w:hint="eastAsia"/>
-          <w:lang w:eastAsia="zh-CN"/>
-        </w:rPr>
-        <w:drawing>
-          <wp:anchor distT="0" distB="0" distL="114300" distR="114300" simplePos="0" relativeHeight="251665408" behindDoc="0" locked="0" layoutInCell="1" allowOverlap="1" wp14:anchorId="433245D8" wp14:editId="43BFFF99">
-            <wp:simplePos x="0" y="0"/>
-            <wp:positionH relativeFrom="margin">
-              <wp:align>right</wp:align>
-            </wp:positionH>
-            <wp:positionV relativeFrom="margin">
-              <wp:align>top</wp:align>
-            </wp:positionV>
-            <wp:extent cx="6426200" cy="2719705"/>
-            <wp:effectExtent l="0" t="0" r="0" b="4445"/>
-            <wp:wrapTopAndBottom/>
-            <wp:docPr id="899161886" name="图形 5"/>
-            <wp:cNvGraphicFramePr>
-              <a:graphicFrameLocks xmlns:a="http://purl.oclc.org/ooxml/drawingml/main" noChangeAspect="1"/>
-            </wp:cNvGraphicFramePr>
-            <a:graphic xmlns:a="http://purl.oclc.org/ooxml/drawingml/main">
-              <a:graphicData uri="http://purl.oclc.org/ooxml/drawingml/picture">
-                <pic:pic xmlns:pic="http://purl.oclc.org/ooxml/drawingml/picture">
-                  <pic:nvPicPr>
-                    <pic:cNvPr id="899161886" name="图形 899161886"/>
-                    <pic:cNvPicPr/>
-                  </pic:nvPicPr>
-                  <pic:blipFill>
-                    <a:blip r:embed="rId13">
-                      <a:extLst>
-                        <a:ext uri="{96DAC541-7B7A-43D3-8B79-37D633B846F1}">
-                          <asvg:svgBlip xmlns:asvg="http://schemas.microsoft.com/office/drawing/2016/SVG/main" r:embed="rId14"/>
-                        </a:ext>
-                      </a:extLst>
-                    </a:blip>
-                    <a:stretch>
-                      <a:fillRect/>
-                    </a:stretch>
-                  </pic:blipFill>
-                  <pic:spPr>
-                    <a:xfrm>
-                      <a:off x="0" y="0"/>
-                      <a:ext cx="6426200" cy="2719705"/>
-                    </a:xfrm>
-                    <a:prstGeom prst="rect">
-                      <a:avLst/>
-                    </a:prstGeom>
-                  </pic:spPr>
-                </pic:pic>
-              </a:graphicData>
-            </a:graphic>
-          </wp:anchor>
-        </w:drawing>
-      </w:r>
-      <w:r>
-        <w:rPr>
-          <w:rFonts w:hint="eastAsia"/>
-          <w:lang w:eastAsia="zh-CN"/>
-        </w:rPr>
-        <w:t>Router Microarchitecture</w:t>
-      </w:r>
-    </w:p>
-    <w:p>
-      <w:pPr>
-        <w:ind w:firstLine="14.20pt"/>
+          <w:lang w:eastAsia="zh-CN"/>
+        </w:rPr>
+        <w:t>Table</w:t>
+      </w:r>
+      <w:r>
+        <w:rPr>
+          <w:rFonts w:hint="eastAsia"/>
+          <w:lang w:eastAsia="zh-CN"/>
+        </w:rPr>
+        <w:t xml:space="preserve">.1 </w:t>
+      </w:r>
+      <w:r>
+        <w:rPr>
+          <w:lang w:eastAsia="zh-CN"/>
+        </w:rPr>
+        <w:t xml:space="preserve">compares the </w:t>
+      </w:r>
+      <w:proofErr w:type="gramStart"/>
+      <w:r>
+        <w:rPr>
+          <w:lang w:eastAsia="zh-CN"/>
+        </w:rPr>
+        <w:t>Thin</w:t>
+      </w:r>
+      <w:proofErr w:type="gramEnd"/>
+      <w:r>
+        <w:rPr>
+          <w:lang w:eastAsia="zh-CN"/>
+        </w:rPr>
+        <w:t xml:space="preserve"> router with representative asynchronous NoC designs. It achieves an average flit latency of 0.656 ns and an energy cost of 0.056 </w:t>
+      </w:r>
+      <w:proofErr w:type="spellStart"/>
+      <w:r>
+        <w:rPr>
+          <w:lang w:eastAsia="zh-CN"/>
+        </w:rPr>
+        <w:t>pJ</w:t>
+      </w:r>
+      <w:proofErr w:type="spellEnd"/>
+      <w:r>
+        <w:rPr>
+          <w:lang w:eastAsia="zh-CN"/>
+        </w:rPr>
+        <w:t xml:space="preserve"> per transferred bit, demonstrating competitive performance among the reported designs. In particular, its latency places it among the fastest entries in the comparison while retaining native multicast support. These results establish a low-latency router foundation for CHAMP’s hierarchical architecture.</w:t>
+      </w:r>
+    </w:p>
+    <w:p>
+      <w:pPr>
+        <w:ind w:firstLine="14.40pt"/>
         <w:jc w:val="both"/>
         <w:rPr>
-          <w:lang w:eastAsia="zh-CN"/>
-        </w:rPr>
-      </w:pPr>
-      <w:r>
-        <w:rPr>
-          <w:lang w:eastAsia="zh-CN"/>
-        </w:rPr>
-        <w:t>CHAMP builds on the input port module (IPM)–output port module (OPM) organization and continuous-time multiway-read buffer of CMR [ref]. It combines Click-based forwarding with dynamic lane allocation and handshake phase adaptation to support multicast over the parallel connections described in Section III.</w:t>
-      </w:r>
-    </w:p>
-    <w:p>
-      <w:pPr>
+          <w:rFonts w:hint="eastAsia"/>
+          <w:lang w:eastAsia="zh-CN"/>
+        </w:rPr>
+      </w:pPr>
+      <w:r>
+        <w:rPr>
+          <w:lang w:eastAsia="zh-CN"/>
+        </w:rPr>
+        <w:t>To isolate the effect of asynchronous control, Table</w:t>
+      </w:r>
+      <w:r>
+        <w:rPr>
+          <w:rFonts w:hint="eastAsia"/>
+          <w:lang w:eastAsia="zh-CN"/>
+        </w:rPr>
+        <w:t>.2</w:t>
+      </w:r>
+      <w:r>
+        <w:rPr>
+          <w:lang w:eastAsia="zh-CN"/>
+        </w:rPr>
+        <w:t xml:space="preserve"> compares c1p4 routers with the same architecture and functionality, implemented using Click-based asynchronous control and clock-gated synchronous control. The asynchronous router reduces isolated-flit latency from 1.000 to 0.792 ns (20.8%) and power from 1.963 to 1.659 </w:t>
+      </w:r>
+      <w:proofErr w:type="spellStart"/>
+      <w:r>
+        <w:rPr>
+          <w:lang w:eastAsia="zh-CN"/>
+        </w:rPr>
+        <w:t>mW</w:t>
+      </w:r>
+      <w:proofErr w:type="spellEnd"/>
+      <w:r>
+        <w:rPr>
+          <w:lang w:eastAsia="zh-CN"/>
+        </w:rPr>
+        <w:t xml:space="preserve"> (15.5%</w:t>
+      </w:r>
+      <w:proofErr w:type="gramStart"/>
+      <w:r>
+        <w:rPr>
+          <w:lang w:eastAsia="zh-CN"/>
+        </w:rPr>
+        <w:t>).</w:t>
+      </w:r>
+      <w:r>
+        <w:rPr>
+          <w:lang w:eastAsia="zh-CN"/>
+        </w:rPr>
+        <w:t>Fig.</w:t>
+      </w:r>
+      <w:proofErr w:type="gramEnd"/>
+      <w:r>
+        <w:rPr>
+          <w:lang w:eastAsia="zh-CN"/>
+        </w:rPr>
+        <w:t xml:space="preserve"> 7 shows how synthesized cell area and </w:t>
+      </w:r>
+      <w:r>
+        <w:rPr>
+          <w:rFonts w:hint="eastAsia"/>
+          <w:lang w:eastAsia="zh-CN"/>
+        </w:rPr>
+        <w:t>single</w:t>
+      </w:r>
+      <w:r>
+        <w:rPr>
+          <w:lang w:eastAsia="zh-CN"/>
+        </w:rPr>
+        <w:t>-flit latency change with router configuration. From Thin to c4p8, area rises from 9,990 to 77,434 μm², while latency rises from 0.656 to 1.287 ns. This cost of widening an individual router motivates CHAMP’s use of multiple lightweight router instances to provide parallel connectivity.</w:t>
+      </w:r>
+    </w:p>
+    <w:p>
+      <w:pPr>
+        <w:pStyle w:val="2"/>
+      </w:pPr>
+      <w:r>
+        <w:rPr>
+          <w:rFonts w:hint="eastAsia"/>
+          <w:lang w:eastAsia="zh-CN"/>
+        </w:rPr>
+        <w:lastRenderedPageBreak/>
+        <w:t>Network</w:t>
+      </w:r>
+      <w:r>
+        <w:t>-Level Evaluation</w:t>
+      </w:r>
+    </w:p>
+    <w:p>
+      <w:pPr>
+        <w:ind w:firstLine="14.40pt"/>
         <w:jc w:val="both"/>
         <w:rPr>
-          <w:rFonts w:hint="eastAsia"/>
-          <w:lang w:eastAsia="zh-CN"/>
-        </w:rPr>
-      </w:pPr>
-    </w:p>
-    <w:p>
-      <w:pPr>
-        <w:keepNext/>
-        <w:jc w:val="both"/>
-      </w:pPr>
-      <w:r>
-        <w:rPr>
-          <w:noProof/>
-        </w:rPr>
-        <w:drawing>
-          <wp:inline distT="0" distB="0" distL="0" distR="0" wp14:anchorId="0D977D77" wp14:editId="43BFCF32">
-            <wp:extent cx="3111500" cy="3459480"/>
-            <wp:effectExtent l="0" t="0" r="0" b="7620"/>
-            <wp:docPr id="564025419" name="图形 7"/>
-            <wp:cNvGraphicFramePr>
-              <a:graphicFrameLocks xmlns:a="http://purl.oclc.org/ooxml/drawingml/main" noChangeAspect="1"/>
-            </wp:cNvGraphicFramePr>
-            <a:graphic xmlns:a="http://purl.oclc.org/ooxml/drawingml/main">
-              <a:graphicData uri="http://purl.oclc.org/ooxml/drawingml/picture">
-                <pic:pic xmlns:pic="http://purl.oclc.org/ooxml/drawingml/picture">
-                  <pic:nvPicPr>
-                    <pic:cNvPr id="564025419" name="图形 564025419"/>
-                    <pic:cNvPicPr/>
-                  </pic:nvPicPr>
-                  <pic:blipFill>
-                    <a:blip r:embed="rId15">
-                      <a:extLst>
-                        <a:ext uri="{96DAC541-7B7A-43D3-8B79-37D633B846F1}">
-                          <asvg:svgBlip xmlns:asvg="http://schemas.microsoft.com/office/drawing/2016/SVG/main" r:embed="rId16"/>
-                        </a:ext>
-                      </a:extLst>
-                    </a:blip>
-                    <a:stretch>
-                      <a:fillRect/>
-                    </a:stretch>
-                  </pic:blipFill>
-                  <pic:spPr>
-                    <a:xfrm>
-                      <a:off x="0" y="0"/>
-                      <a:ext cx="3111500" cy="3459480"/>
-                    </a:xfrm>
-                    <a:prstGeom prst="rect">
-                      <a:avLst/>
-                    </a:prstGeom>
-                  </pic:spPr>
-                </pic:pic>
-              </a:graphicData>
-            </a:graphic>
-          </wp:inline>
-        </w:drawing>
-      </w:r>
-    </w:p>
-    <w:p>
-      <w:pPr>
-        <w:pStyle w:val="ab"/>
-        <w:jc w:val="both"/>
-        <w:rPr>
-          <w:rFonts w:ascii="Times New Roman" w:hAnsi="Times New Roman" w:cs="Times New Roman" w:hint="eastAsia"/>
-          <w:sz w:val="16"/>
-          <w:szCs w:val="16"/>
-          <w:lang w:eastAsia="zh-CN"/>
-        </w:rPr>
-      </w:pPr>
-      <w:r>
-        <w:rPr>
-          <w:rFonts w:ascii="Times New Roman" w:hAnsi="Times New Roman" w:cs="Times New Roman"/>
-          <w:sz w:val="16"/>
-          <w:szCs w:val="16"/>
-        </w:rPr>
-        <w:t xml:space="preserve">Fig. </w:t>
-      </w:r>
-      <w:r>
-        <w:rPr>
-          <w:rFonts w:ascii="Times New Roman" w:hAnsi="Times New Roman" w:cs="Times New Roman"/>
-          <w:sz w:val="16"/>
-          <w:szCs w:val="16"/>
-        </w:rPr>
-        <w:fldChar w:fldCharType="begin"/>
-      </w:r>
-      <w:r>
-        <w:rPr>
-          <w:rFonts w:ascii="Times New Roman" w:hAnsi="Times New Roman" w:cs="Times New Roman"/>
-          <w:sz w:val="16"/>
-          <w:szCs w:val="16"/>
-        </w:rPr>
-        <w:instrText xml:space="preserve"> SEQ Fig. \* ARABIC </w:instrText>
-      </w:r>
-      <w:r>
-        <w:rPr>
-          <w:rFonts w:ascii="Times New Roman" w:hAnsi="Times New Roman" w:cs="Times New Roman"/>
-          <w:sz w:val="16"/>
-          <w:szCs w:val="16"/>
-        </w:rPr>
-        <w:fldChar w:fldCharType="separate"/>
-      </w:r>
-      <w:r>
-        <w:rPr>
-          <w:rFonts w:ascii="Times New Roman" w:hAnsi="Times New Roman" w:cs="Times New Roman"/>
-          <w:noProof/>
-          <w:sz w:val="16"/>
-          <w:szCs w:val="16"/>
-        </w:rPr>
-        <w:t>4</w:t>
-      </w:r>
-      <w:r>
-        <w:rPr>
-          <w:rFonts w:ascii="Times New Roman" w:hAnsi="Times New Roman" w:cs="Times New Roman"/>
-          <w:sz w:val="16"/>
-          <w:szCs w:val="16"/>
-        </w:rPr>
-        <w:fldChar w:fldCharType="end"/>
-      </w:r>
-      <w:r>
-        <w:rPr>
-          <w:rFonts w:ascii="Times New Roman" w:hAnsi="Times New Roman" w:cs="Times New Roman" w:hint="eastAsia"/>
-          <w:sz w:val="16"/>
-          <w:szCs w:val="16"/>
-          <w:lang w:eastAsia="zh-CN"/>
-        </w:rPr>
-        <w:t xml:space="preserve"> </w:t>
-      </w:r>
-      <w:r>
-        <w:rPr>
-          <w:rFonts w:ascii="Times New Roman" w:hAnsi="Times New Roman" w:cs="Times New Roman"/>
-          <w:b/>
-          <w:bCs/>
-          <w:sz w:val="16"/>
-          <w:szCs w:val="16"/>
-        </w:rPr>
-        <w:t>Control circuits for Click-based multicast forwarding and multi-lane operation.</w:t>
-      </w:r>
-      <w:r>
-        <w:rPr>
-          <w:rFonts w:ascii="Times New Roman" w:hAnsi="Times New Roman" w:cs="Times New Roman"/>
-          <w:sz w:val="16"/>
-          <w:szCs w:val="16"/>
-        </w:rPr>
-        <w:t xml:space="preserve"> (a) Read interface control with an independent read pointer and completion feedback. (b) Write interface control for shared storage and tail-flit acknowledgement. (c) Routing computation unit for header capture and branch-enable control. (d) </w:t>
-      </w:r>
-      <w:proofErr w:type="gramStart"/>
-      <w:r>
-        <w:rPr>
-          <w:rFonts w:ascii="Times New Roman" w:hAnsi="Times New Roman" w:cs="Times New Roman"/>
-          <w:sz w:val="16"/>
-          <w:szCs w:val="16"/>
-        </w:rPr>
-        <w:t>Packet-level lane</w:t>
-      </w:r>
-      <w:proofErr w:type="gramEnd"/>
-      <w:r>
-        <w:rPr>
-          <w:rFonts w:ascii="Times New Roman" w:hAnsi="Times New Roman" w:cs="Times New Roman"/>
-          <w:sz w:val="16"/>
-          <w:szCs w:val="16"/>
-        </w:rPr>
-        <w:t xml:space="preserve"> selector. (e) Phase adapter connecting a branch-level handshake to the selected physical lane</w:t>
-      </w:r>
-      <w:r>
-        <w:rPr>
-          <w:rFonts w:ascii="Times New Roman" w:hAnsi="Times New Roman" w:cs="Times New Roman" w:hint="eastAsia"/>
-          <w:sz w:val="16"/>
-          <w:szCs w:val="16"/>
-          <w:lang w:eastAsia="zh-CN"/>
-        </w:rPr>
-        <w:t xml:space="preserve">. </w:t>
-      </w:r>
-      <w:r>
-        <w:rPr>
-          <w:rFonts w:ascii="Times New Roman" w:hAnsi="Times New Roman" w:cs="Times New Roman"/>
-          <w:sz w:val="16"/>
-          <w:szCs w:val="16"/>
-        </w:rPr>
-        <w:t xml:space="preserve">Candidate lanes in (d)–(e) are indexed from 0 to </w:t>
-      </w:r>
-      <w:r>
-        <w:rPr>
-          <w:rFonts w:ascii="Times New Roman" w:hAnsi="Times New Roman" w:cs="Times New Roman" w:hint="eastAsia"/>
-          <w:sz w:val="16"/>
-          <w:szCs w:val="16"/>
-          <w:lang w:eastAsia="zh-CN"/>
-        </w:rPr>
-        <w:t>M</w:t>
-      </w:r>
-      <w:r>
-        <w:rPr>
-          <w:rFonts w:ascii="Times New Roman" w:hAnsi="Times New Roman" w:cs="Times New Roman"/>
-          <w:sz w:val="16"/>
-          <w:szCs w:val="16"/>
-        </w:rPr>
-        <w:t xml:space="preserve">, giving </w:t>
-      </w:r>
-      <m:oMath>
-        <m:r>
-          <m:rPr>
-            <m:sty m:val="p"/>
-          </m:rPr>
-          <w:rPr>
-            <w:rFonts w:ascii="Cambria Math" w:hAnsi="Cambria Math" w:cs="Times New Roman"/>
-            <w:sz w:val="16"/>
-            <w:szCs w:val="16"/>
-          </w:rPr>
-          <m:t>M</m:t>
-        </m:r>
-        <m:r>
-          <w:rPr>
-            <w:rFonts w:ascii="Cambria Math" w:hAnsi="Cambria Math" w:cs="Times New Roman"/>
-            <w:sz w:val="16"/>
-            <w:szCs w:val="16"/>
-          </w:rPr>
-          <m:t>+1</m:t>
-        </m:r>
-      </m:oMath>
-      <w:r>
-        <w:rPr>
-          <w:rFonts w:ascii="Times New Roman" w:hAnsi="Times New Roman" w:cs="Times New Roman"/>
-          <w:sz w:val="16"/>
-          <w:szCs w:val="16"/>
-        </w:rPr>
-        <w:t xml:space="preserve"> lanes; </w:t>
+          <w:lang w:eastAsia="zh-CN"/>
+        </w:rPr>
+      </w:pPr>
+      <w:r>
+        <w:rPr>
+          <w:lang w:eastAsia="zh-CN"/>
+        </w:rPr>
+        <w:t xml:space="preserve">We use uniform-random (UR), bit-complement (BC), hotspot (H10), and multicast workloads. For an </w:t>
       </w:r>
       <m:oMath>
         <m:r>
           <w:rPr>
-            <w:rFonts w:ascii="Cambria Math" w:hAnsi="Cambria Math" w:cs="Times New Roman"/>
-            <w:sz w:val="16"/>
-            <w:szCs w:val="16"/>
+            <w:rFonts w:ascii="Cambria Math" w:hAnsi="Cambria Math"/>
           </w:rPr>
-          <m:t>M=3</m:t>
+          <m:t>L×L</m:t>
         </m:r>
       </m:oMath>
       <w:r>
         <w:rPr>
-          <w:rFonts w:ascii="Times New Roman" w:hAnsi="Times New Roman" w:cs="Times New Roman" w:hint="eastAsia"/>
-          <w:sz w:val="16"/>
-          <w:szCs w:val="16"/>
-          <w:lang w:eastAsia="zh-CN"/>
-        </w:rPr>
-        <w:t xml:space="preserve"> </w:t>
-      </w:r>
-      <w:r>
-        <w:rPr>
-          <w:rFonts w:ascii="Times New Roman" w:hAnsi="Times New Roman" w:cs="Times New Roman"/>
-          <w:sz w:val="16"/>
-          <w:szCs w:val="16"/>
-        </w:rPr>
-        <w:t>for the four-lane direction in c1p4</w:t>
-      </w:r>
-      <w:r>
-        <w:rPr>
-          <w:rFonts w:ascii="Times New Roman" w:hAnsi="Times New Roman" w:cs="Times New Roman" w:hint="eastAsia"/>
-          <w:sz w:val="16"/>
-          <w:szCs w:val="16"/>
-          <w:lang w:eastAsia="zh-CN"/>
-        </w:rPr>
-        <w:t>.</w:t>
-      </w:r>
-    </w:p>
-    <w:p>
-      <w:pPr>
-        <w:pStyle w:val="2"/>
-      </w:pPr>
-      <w:r>
-        <w:rPr>
-          <w:lang w:eastAsia="zh-CN"/>
-        </w:rPr>
-        <w:t>Click-Based Multicast Forwarding</w:t>
-      </w:r>
-    </w:p>
-    <w:p>
-      <w:pPr>
-        <w:ind w:firstLine="14.40pt"/>
-        <w:jc w:val="both"/>
-        <w:rPr>
-          <w:lang w:eastAsia="zh-CN"/>
-        </w:rPr>
-      </w:pPr>
-      <w:r>
-        <w:rPr>
-          <w:lang w:eastAsia="zh-CN"/>
-        </w:rPr>
-        <w:t xml:space="preserve">CHAMP uses local Click control to coordinate route establishment, shared-buffer writes, and multicast forwarding. When a header arrives, the routing computation unit captures its destination information and enables the required output branches through packet-path-enable (PPE) signals (Fig. 4(c)). Each branch remains enabled until its </w:t>
-      </w:r>
-      <w:proofErr w:type="spellStart"/>
-      <w:r>
-        <w:rPr>
-          <w:i/>
-          <w:iCs/>
-          <w:lang w:eastAsia="zh-CN"/>
-        </w:rPr>
-        <w:t>TailPass</w:t>
-      </w:r>
-      <w:proofErr w:type="spellEnd"/>
-      <w:r>
-        <w:rPr>
-          <w:lang w:eastAsia="zh-CN"/>
-        </w:rPr>
-        <w:t xml:space="preserve"> feedback indicates completion. In parallel, the write interface selects a storage cell using the write pointer; a local </w:t>
-      </w:r>
-      <w:r>
-        <w:rPr>
-          <w:i/>
-          <w:iCs/>
-          <w:lang w:eastAsia="zh-CN"/>
-        </w:rPr>
-        <w:t>Fire</w:t>
-      </w:r>
-      <w:r>
-        <w:rPr>
-          <w:lang w:eastAsia="zh-CN"/>
-        </w:rPr>
-        <w:t xml:space="preserve"> event captures the incoming flit and updates its </w:t>
-      </w:r>
-      <w:proofErr w:type="spellStart"/>
-      <w:r>
-        <w:rPr>
-          <w:i/>
-          <w:iCs/>
-          <w:lang w:eastAsia="zh-CN"/>
-        </w:rPr>
-        <w:t>CellFull</w:t>
-      </w:r>
-      <w:proofErr w:type="spellEnd"/>
-      <w:r>
-        <w:rPr>
-          <w:lang w:eastAsia="zh-CN"/>
-        </w:rPr>
-        <w:t xml:space="preserve"> state (Fig. 4(b)). These operations use two-phase request–acknowledge signaling without a global clock.</w:t>
-      </w:r>
-    </w:p>
-    <w:p>
-      <w:pPr>
-        <w:ind w:firstLine="14.40pt"/>
-        <w:jc w:val="both"/>
-        <w:rPr>
-          <w:lang w:eastAsia="zh-CN"/>
-        </w:rPr>
-      </w:pPr>
-      <w:r>
-        <w:rPr>
-          <w:lang w:eastAsia="zh-CN"/>
-        </w:rPr>
-        <w:t xml:space="preserve">The stored flits are accessed through four independent read interfaces, corresponding to the legal output directions excluding the ingress direction (Fig. 3). Each interface maintains its own read pointer, generates requests according to data availability and branch enable, and advances upon acknowledgement (Fig. 4(a)). Thus, enabled multicast branches read the same packet at their respective rates. At each OPM, arbitration selects an eligible input, and Click control captures its flit when the output stage can accept another transfer. The output register retains the flit under downstream backpressure. Read-completion states are returned through </w:t>
-      </w:r>
-      <w:proofErr w:type="spellStart"/>
-      <w:r>
-        <w:rPr>
-          <w:i/>
-          <w:iCs/>
-          <w:lang w:eastAsia="zh-CN"/>
-        </w:rPr>
-        <w:t>CellEmpty</w:t>
-      </w:r>
-      <w:proofErr w:type="spellEnd"/>
-      <w:r>
-        <w:rPr>
-          <w:lang w:eastAsia="zh-CN"/>
-        </w:rPr>
-        <w:t xml:space="preserve"> signals, and the write interface withholds the tail-flit acknowledgement until all required reads complete. This completion condition prevents admission of the next packet before the current multicast packet has been consumed by all enabled branches.</w:t>
-      </w:r>
-    </w:p>
-    <w:p>
-      <w:pPr>
-        <w:pStyle w:val="2"/>
-      </w:pPr>
-      <w:r>
-        <w:t>Dynamic Lane Allocation and Phase Adaptation</w:t>
-      </w:r>
-    </w:p>
-    <w:p>
-      <w:pPr>
-        <w:ind w:firstLine="14.40pt"/>
-        <w:jc w:val="both"/>
-        <w:rPr>
-          <w:lang w:eastAsia="zh-CN"/>
-        </w:rPr>
-      </w:pPr>
-      <w:r>
-        <w:rPr>
-          <w:lang w:eastAsia="zh-CN"/>
-        </w:rPr>
-        <w:t xml:space="preserve">CHAMP uses two-level arbitration to allocate parallel output lanes. At the first level, each requesting input independently arbitrates among available lanes within an enabled output direction, producing a one-hot </w:t>
-      </w:r>
-      <w:proofErr w:type="spellStart"/>
-      <w:r>
-        <w:rPr>
-          <w:i/>
-          <w:iCs/>
-          <w:lang w:eastAsia="zh-CN"/>
-        </w:rPr>
-        <w:t>LaneSelect</w:t>
-      </w:r>
-      <w:proofErr w:type="spellEnd"/>
-      <w:r>
-        <w:rPr>
-          <w:lang w:eastAsia="zh-CN"/>
-        </w:rPr>
-        <w:t xml:space="preserve"> (Fig. 4(d)). At the second level, each OPM arbitrates among the inputs that selected its lane and grants access to one winner. If multiple inputs select the same lane concurrently, the losing inputs retain their lane selections and wait for access rather than restarting lane arbitration. Once selected, the lane is held until </w:t>
-      </w:r>
-      <w:r>
-        <w:rPr>
-          <w:lang w:eastAsia="zh-CN"/>
-        </w:rPr>
-        <w:lastRenderedPageBreak/>
-        <w:t>the branch completes its packet transfer. This separates lane selection within a direction from input arbitration at a physical output, while maintaining a stable path for each packet.</w:t>
-      </w:r>
-    </w:p>
-    <w:p>
-      <w:pPr>
-        <w:ind w:firstLine="14.40pt"/>
-        <w:jc w:val="both"/>
-        <w:rPr>
-          <w:lang w:eastAsia="zh-CN"/>
-        </w:rPr>
-      </w:pPr>
-      <w:r>
-        <w:rPr>
-          <w:lang w:eastAsia="zh-CN"/>
-        </w:rPr>
-        <w:t xml:space="preserve">Selecting different lanes across packets requires handshake phase adaptation because each physical lane maintains an independent two-phase state. Directly switching the branch request between lanes could create an unintended transition or suppress a required one. The adapter in Fig. 4(e) maintains a request phase for each candidate lane and updates only the selected lane when a branch transfer is pending. It returns a branch-level acknowledgement only after that lane has entered the pending state and subsequently acknowledged the transfer. This preserves the request–acknowledge sequence across lane changes. The selected lane’s </w:t>
-      </w:r>
-      <w:proofErr w:type="spellStart"/>
-      <w:r>
-        <w:rPr>
-          <w:i/>
-          <w:iCs/>
-          <w:lang w:eastAsia="zh-CN"/>
-        </w:rPr>
-        <w:t>TailPass</w:t>
-      </w:r>
-      <w:proofErr w:type="spellEnd"/>
-      <w:r>
-        <w:rPr>
-          <w:lang w:eastAsia="zh-CN"/>
-        </w:rPr>
-        <w:t xml:space="preserve"> feedback then clears the branch enable and releases the lane selection for the next packet.</w:t>
-      </w:r>
-    </w:p>
-    <w:p>
-      <w:pPr>
-        <w:pStyle w:val="2"/>
-        <w:rPr>
-          <w:rFonts w:hint="eastAsia"/>
-        </w:rPr>
-      </w:pPr>
-      <w:r>
-        <w:rPr>
-          <w:lang w:eastAsia="zh-CN"/>
-        </w:rPr>
-        <w:t>Synthesis and Timing Closur</w:t>
-      </w:r>
-      <w:r>
-        <w:rPr>
-          <w:rFonts w:hint="eastAsia"/>
-          <w:lang w:eastAsia="zh-CN"/>
-        </w:rPr>
-        <w:t>e</w:t>
-      </w:r>
-    </w:p>
-    <w:p>
-      <w:pPr>
-        <w:ind w:firstLine="14.40pt"/>
-        <w:jc w:val="both"/>
-        <w:rPr>
-          <w:rFonts w:hint="eastAsia"/>
-          <w:lang w:eastAsia="zh-CN"/>
-        </w:rPr>
-      </w:pPr>
-      <w:r>
-        <w:rPr>
-          <w:lang w:eastAsia="zh-CN"/>
-        </w:rPr>
-        <w:t xml:space="preserve">Click-based control captures data in standard edge-triggered flip-flops using locally generated Fire signals. These registers provide explicit timing endpoints and avoid </w:t>
-      </w:r>
-      <w:proofErr w:type="spellStart"/>
-      <w:r>
-        <w:rPr>
-          <w:lang w:eastAsia="zh-CN"/>
-        </w:rPr>
-        <w:t>datapath</w:t>
-      </w:r>
-      <w:proofErr w:type="spellEnd"/>
-      <w:r>
-        <w:rPr>
-          <w:lang w:eastAsia="zh-CN"/>
-        </w:rPr>
-        <w:t xml:space="preserve"> transparency, simplifying integration with conventional synthesis and static timing analysis (STA) tools [ref]. As illustrated in Fig. 5, CHAMP uses a semi-automated delay-matching flow. Local Fire signals are defined as clocks for timing analysis, and STA checks the relative timing constraints required for correct data capture and handshake operation. Delay cells are inserted or adjusted on the relevant control paths, followed by re-synthesis and timing checks. This flow combines event-driven operation with standard-cell implementation while explicitly enforcing asynchronous timing requirements</w:t>
-      </w:r>
-      <w:r>
-        <w:rPr>
-          <w:rFonts w:hint="eastAsia"/>
-          <w:lang w:eastAsia="zh-CN"/>
-        </w:rPr>
-        <w:t>.</w:t>
-      </w:r>
-    </w:p>
-    <w:p>
-      <w:pPr>
-        <w:keepNext/>
-        <w:jc w:val="both"/>
-      </w:pPr>
-      <w:r>
-        <w:rPr>
-          <w:rFonts w:hint="eastAsia"/>
-          <w:noProof/>
-          <w:lang w:eastAsia="zh-CN"/>
-        </w:rPr>
-        <w:drawing>
-          <wp:anchor distT="0" distB="0" distL="114300" distR="114300" simplePos="0" relativeHeight="251669504" behindDoc="0" locked="0" layoutInCell="1" allowOverlap="1" wp14:anchorId="0876797C" wp14:editId="50A523DF">
-            <wp:simplePos x="0" y="0"/>
-            <wp:positionH relativeFrom="column">
-              <wp:align>right</wp:align>
-            </wp:positionH>
-            <wp:positionV relativeFrom="page">
-              <wp:posOffset>5511165</wp:posOffset>
-            </wp:positionV>
-            <wp:extent cx="3111500" cy="1410970"/>
-            <wp:effectExtent l="0" t="0" r="0" b="0"/>
-            <wp:wrapTopAndBottom/>
-            <wp:docPr id="1477217430" name="图形 8"/>
-            <wp:cNvGraphicFramePr>
-              <a:graphicFrameLocks xmlns:a="http://purl.oclc.org/ooxml/drawingml/main" noChangeAspect="1"/>
-            </wp:cNvGraphicFramePr>
-            <a:graphic xmlns:a="http://purl.oclc.org/ooxml/drawingml/main">
-              <a:graphicData uri="http://purl.oclc.org/ooxml/drawingml/picture">
-                <pic:pic xmlns:pic="http://purl.oclc.org/ooxml/drawingml/picture">
-                  <pic:nvPicPr>
-                    <pic:cNvPr id="1477217430" name="图形 1477217430"/>
-                    <pic:cNvPicPr/>
-                  </pic:nvPicPr>
-                  <pic:blipFill>
-                    <a:blip r:embed="rId17">
-                      <a:extLst>
-                        <a:ext uri="{96DAC541-7B7A-43D3-8B79-37D633B846F1}">
-                          <asvg:svgBlip xmlns:asvg="http://schemas.microsoft.com/office/drawing/2016/SVG/main" r:embed="rId18"/>
-                        </a:ext>
-                      </a:extLst>
-                    </a:blip>
-                    <a:stretch>
-                      <a:fillRect/>
-                    </a:stretch>
-                  </pic:blipFill>
-                  <pic:spPr>
-                    <a:xfrm>
-                      <a:off x="0" y="0"/>
-                      <a:ext cx="3111500" cy="1410970"/>
-                    </a:xfrm>
-                    <a:prstGeom prst="rect">
-                      <a:avLst/>
-                    </a:prstGeom>
-                  </pic:spPr>
-                </pic:pic>
-              </a:graphicData>
-            </a:graphic>
-          </wp:anchor>
-        </w:drawing>
-      </w:r>
-    </w:p>
-    <w:p>
-      <w:pPr>
-        <w:pStyle w:val="ab"/>
-        <w:jc w:val="both"/>
-        <w:rPr>
-          <w:rFonts w:ascii="Times New Roman" w:hAnsi="Times New Roman" w:cs="Times New Roman"/>
-          <w:sz w:val="16"/>
-          <w:szCs w:val="16"/>
-        </w:rPr>
-      </w:pPr>
-      <w:r>
-        <w:rPr>
-          <w:rFonts w:ascii="Times New Roman" w:hAnsi="Times New Roman" w:cs="Times New Roman"/>
-          <w:sz w:val="16"/>
-          <w:szCs w:val="16"/>
-        </w:rPr>
-        <w:t xml:space="preserve">Fig. </w:t>
-      </w:r>
-      <w:r>
-        <w:rPr>
-          <w:rFonts w:ascii="Times New Roman" w:hAnsi="Times New Roman" w:cs="Times New Roman"/>
-          <w:sz w:val="16"/>
-          <w:szCs w:val="16"/>
-        </w:rPr>
-        <w:fldChar w:fldCharType="begin"/>
-      </w:r>
-      <w:r>
-        <w:rPr>
-          <w:rFonts w:ascii="Times New Roman" w:hAnsi="Times New Roman" w:cs="Times New Roman"/>
-          <w:sz w:val="16"/>
-          <w:szCs w:val="16"/>
-        </w:rPr>
-        <w:instrText xml:space="preserve"> SEQ Fig. \* ARABIC </w:instrText>
-      </w:r>
-      <w:r>
-        <w:rPr>
-          <w:rFonts w:ascii="Times New Roman" w:hAnsi="Times New Roman" w:cs="Times New Roman"/>
-          <w:sz w:val="16"/>
-          <w:szCs w:val="16"/>
-        </w:rPr>
-        <w:fldChar w:fldCharType="separate"/>
-      </w:r>
-      <w:r>
-        <w:rPr>
-          <w:rFonts w:ascii="Times New Roman" w:hAnsi="Times New Roman" w:cs="Times New Roman"/>
-          <w:noProof/>
-          <w:sz w:val="16"/>
-          <w:szCs w:val="16"/>
-        </w:rPr>
-        <w:t>5</w:t>
-      </w:r>
-      <w:r>
-        <w:rPr>
-          <w:rFonts w:ascii="Times New Roman" w:hAnsi="Times New Roman" w:cs="Times New Roman"/>
-          <w:sz w:val="16"/>
-          <w:szCs w:val="16"/>
-        </w:rPr>
-        <w:fldChar w:fldCharType="end"/>
-      </w:r>
-      <w:r>
-        <w:rPr>
-          <w:rFonts w:ascii="Times New Roman" w:hAnsi="Times New Roman" w:cs="Times New Roman"/>
-          <w:sz w:val="16"/>
-          <w:szCs w:val="16"/>
-          <w:lang w:eastAsia="zh-CN"/>
-        </w:rPr>
-        <w:t xml:space="preserve"> </w:t>
-      </w:r>
-      <w:r>
-        <w:rPr>
-          <w:rFonts w:ascii="Times New Roman" w:hAnsi="Times New Roman" w:cs="Times New Roman"/>
-          <w:b/>
-          <w:bCs/>
-          <w:sz w:val="16"/>
-          <w:szCs w:val="16"/>
-        </w:rPr>
-        <w:t>Semi-automated synthesis and delay-matching flow for the Click-based router.</w:t>
-      </w:r>
-    </w:p>
-    <w:p>
-      <w:pPr>
-        <w:pStyle w:val="1"/>
-        <w:rPr>
-          <w:lang w:eastAsia="zh-CN"/>
-        </w:rPr>
-      </w:pPr>
-      <w:r>
-        <w:rPr>
-          <w:rFonts w:hint="eastAsia"/>
-          <w:lang w:eastAsia="zh-CN"/>
-        </w:rPr>
-        <w:t>Region-aware multicast routing</w:t>
-      </w:r>
-    </w:p>
-    <w:p>
-      <w:pPr>
-        <w:ind w:firstLine="14.40pt"/>
-        <w:jc w:val="both"/>
-        <w:rPr>
-          <w:lang w:eastAsia="zh-CN"/>
-        </w:rPr>
-      </w:pPr>
-      <w:r>
-        <w:rPr>
-          <w:lang w:eastAsia="zh-CN"/>
-        </w:rPr>
-        <w:t xml:space="preserve">CHAMP represents a destination region using two opposite corners, </w:t>
+          <w:lang w:eastAsia="zh-CN"/>
+        </w:rPr>
+        <w:t xml:space="preserve"> network, sources are selected uniformly among all PEs. UR selects a destination uniformly among all other PEs, while BC maps </w:t>
       </w:r>
       <m:oMath>
         <m:d>
@@ -4707,76 +3852,20 @@
             </m:ctrlPr>
           </m:dPr>
           <m:e>
-            <m:sSub>
-              <m:sSubPr>
-                <m:ctrlPr>
-                  <w:rPr>
-                    <w:rFonts w:ascii="Cambria Math" w:hAnsi="Cambria Math"/>
-                  </w:rPr>
-                </m:ctrlPr>
-              </m:sSubPr>
-              <m:e>
-                <m:r>
-                  <w:rPr>
-                    <w:rFonts w:ascii="Cambria Math" w:hAnsi="Cambria Math"/>
-                  </w:rPr>
-                  <m:t>x</m:t>
-                </m:r>
-              </m:e>
-              <m:sub>
-                <m:r>
-                  <w:rPr>
-                    <w:rFonts w:ascii="Cambria Math" w:hAnsi="Cambria Math"/>
-                  </w:rPr>
-                  <m:t>0</m:t>
-                </m:r>
-              </m:sub>
-            </m:sSub>
             <m:r>
               <w:rPr>
                 <w:rFonts w:ascii="Cambria Math" w:hAnsi="Cambria Math"/>
               </w:rPr>
-              <m:t>,</m:t>
+              <m:t>x,y</m:t>
             </m:r>
-            <m:sSub>
-              <m:sSubPr>
-                <m:ctrlPr>
-                  <w:rPr>
-                    <w:rFonts w:ascii="Cambria Math" w:hAnsi="Cambria Math"/>
-                  </w:rPr>
-                </m:ctrlPr>
-              </m:sSubPr>
-              <m:e>
-                <m:r>
-                  <w:rPr>
-                    <w:rFonts w:ascii="Cambria Math" w:hAnsi="Cambria Math"/>
-                  </w:rPr>
-                  <m:t>y</m:t>
-                </m:r>
-              </m:e>
-              <m:sub>
-                <m:r>
-                  <w:rPr>
-                    <w:rFonts w:ascii="Cambria Math" w:hAnsi="Cambria Math"/>
-                  </w:rPr>
-                  <m:t>0</m:t>
-                </m:r>
-              </m:sub>
-            </m:sSub>
           </m:e>
         </m:d>
-        <m:r>
-          <w:rPr>
-            <w:rFonts w:ascii="Cambria Math" w:hAnsi="Cambria Math"/>
-          </w:rPr>
-          <m:t xml:space="preserve"> </m:t>
-        </m:r>
       </m:oMath>
       <w:r>
         <w:rPr>
           <w:lang w:eastAsia="zh-CN"/>
         </w:rPr>
-        <w:t>and</w:t>
+        <w:t xml:space="preserve"> to</w:t>
       </w:r>
       <w:r>
         <w:rPr>
@@ -4795,62 +3884,12 @@
             </m:ctrlPr>
           </m:dPr>
           <m:e>
-            <m:sSub>
-              <m:sSubPr>
-                <m:ctrlPr>
-                  <w:rPr>
-                    <w:rFonts w:ascii="Cambria Math" w:hAnsi="Cambria Math"/>
-                  </w:rPr>
-                </m:ctrlPr>
-              </m:sSubPr>
-              <m:e>
-                <m:r>
-                  <w:rPr>
-                    <w:rFonts w:ascii="Cambria Math" w:hAnsi="Cambria Math"/>
-                  </w:rPr>
-                  <m:t>x</m:t>
-                </m:r>
-              </m:e>
-              <m:sub>
-                <m:r>
-                  <w:rPr>
-                    <w:rFonts w:ascii="Cambria Math" w:hAnsi="Cambria Math"/>
-                  </w:rPr>
-                  <m:t>1</m:t>
-                </m:r>
-              </m:sub>
-            </m:sSub>
             <m:r>
               <w:rPr>
                 <w:rFonts w:ascii="Cambria Math" w:hAnsi="Cambria Math"/>
               </w:rPr>
-              <m:t>,</m:t>
+              <m:t>L-1-x,L-1-y</m:t>
             </m:r>
-            <m:sSub>
-              <m:sSubPr>
-                <m:ctrlPr>
-                  <w:rPr>
-                    <w:rFonts w:ascii="Cambria Math" w:hAnsi="Cambria Math"/>
-                  </w:rPr>
-                </m:ctrlPr>
-              </m:sSubPr>
-              <m:e>
-                <m:r>
-                  <w:rPr>
-                    <w:rFonts w:ascii="Cambria Math" w:hAnsi="Cambria Math"/>
-                  </w:rPr>
-                  <m:t>y</m:t>
-                </m:r>
-              </m:e>
-              <m:sub>
-                <m:r>
-                  <w:rPr>
-                    <w:rFonts w:ascii="Cambria Math" w:hAnsi="Cambria Math"/>
-                  </w:rPr>
-                  <m:t>1</m:t>
-                </m:r>
-              </m:sub>
-            </m:sSub>
           </m:e>
         </m:d>
       </m:oMath>
@@ -4858,20 +3897,52 @@
         <w:rPr>
           <w:lang w:eastAsia="zh-CN"/>
         </w:rPr>
-        <w:t>, in global PE coordinates. The same representation is interpreted throughout the tree–mesh hierarchy. A single-point region specifies unicast, while a larger rectangle selects all PEs within its bounds</w:t>
-      </w:r>
-      <w:r>
-        <w:rPr>
-          <w:rFonts w:hint="eastAsia"/>
-          <w:lang w:eastAsia="zh-CN"/>
-        </w:rPr>
-        <w:t xml:space="preserve">. </w:t>
-      </w:r>
-      <w:r>
-        <w:rPr>
-          <w:lang w:eastAsia="zh-CN"/>
-        </w:rPr>
-        <w:t>The architecture allows inter-chip extension at the mesh boundaries, while the current implementation targets intra-chip communication.</w:t>
+        <w:t xml:space="preserve">. H10 assigns destination-selection weights of 1.1 to the four central PEs and 1.0 to other PEs, excluding the source before normalization. M5/M10 make 5%/10% of packets multicast; remaining packets follow UR. Multicast fanout is selected </w:t>
+      </w:r>
+      <w:r>
+        <w:rPr>
+          <w:rFonts w:hint="eastAsia"/>
+          <w:lang w:eastAsia="zh-CN"/>
+        </w:rPr>
+        <w:t xml:space="preserve">with equal </w:t>
+      </w:r>
+      <w:r>
+        <w:rPr>
+          <w:lang w:eastAsia="zh-CN"/>
+        </w:rPr>
+        <w:t>probab</w:t>
+      </w:r>
+      <w:r>
+        <w:rPr>
+          <w:rFonts w:hint="eastAsia"/>
+          <w:lang w:eastAsia="zh-CN"/>
+        </w:rPr>
+        <w:t>ility</w:t>
+      </w:r>
+      <w:r>
+        <w:rPr>
+          <w:lang w:eastAsia="zh-CN"/>
+        </w:rPr>
+        <w:t xml:space="preserve"> from 2, 4, 8, and 16, with destinations forming a randomly placed rectangle that excludes the source. MS fixes one multicast-generating source per 2×2 PE block, while other sources generate UR traffic; AM makes every packet multicast. Packet-generation intervals are exponentially distributed, and compared designs share identical traffic traces. All workloads are evaluated at 64 nodes; UR, M10, and AM are additionally evaluated at 256 and 1024 nodes.</w:t>
+      </w:r>
+    </w:p>
+    <w:p>
+      <w:pPr>
+        <w:jc w:val="both"/>
+        <w:rPr>
+          <w:rFonts w:hint="eastAsia"/>
+          <w:i/>
+          <w:iCs/>
+          <w:lang w:eastAsia="zh-CN"/>
+        </w:rPr>
+      </w:pPr>
+      <w:r>
+        <w:rPr>
+          <w:i/>
+          <w:iCs/>
+          <w:lang w:eastAsia="zh-CN"/>
+        </w:rPr>
+        <w:t>1) 64-Node Architectural Comparisons:</w:t>
       </w:r>
     </w:p>
     <w:p>
@@ -4879,240 +3950,496 @@
         <w:ind w:firstLine="14.40pt"/>
         <w:jc w:val="both"/>
         <w:rPr>
-          <w:rFonts w:hint="eastAsia"/>
-          <w:lang w:eastAsia="zh-CN"/>
-        </w:rPr>
-      </w:pPr>
-      <w:r>
-        <w:rPr>
-          <w:lang w:eastAsia="zh-CN"/>
-        </w:rPr>
-        <w:t xml:space="preserve">At each tree router, routing compares the destination rectangle with the spatial regions covered by its children. A child direction is enabled if its region intersects the destination rectangle, excluding the ingress direction. If the rectangle extends beyond the current subtree, the parent direction is also enabled, provided the packet did not arrive from that direction. These tests produce an output-direction mask, allowing local </w:t>
-      </w:r>
-      <w:r>
-        <w:rPr>
-          <w:lang w:eastAsia="zh-CN"/>
-        </w:rPr>
-        <w:t>delivery and upward forwarding to occur concurrently, as illustrated in Fig. 6(a).</w:t>
-      </w:r>
-      <w:r>
+          <w:lang w:eastAsia="zh-CN"/>
+        </w:rPr>
+      </w:pPr>
+      <w:r>
+        <w:rPr>
+          <w:lang w:eastAsia="zh-CN"/>
+        </w:rPr>
+        <w:t xml:space="preserve">Fig. 8(a), (b), and (e) compare CHAMP with the mesh and conventional Fat-Tree under identical 64-PE traffic traces. CHAMP achieves the highest measured peak delivered-copy throughput across UR, BC, H10, M5, M10, and MS. Under UR, it reaches 346.5 </w:t>
+      </w:r>
+      <w:proofErr w:type="spellStart"/>
+      <w:r>
+        <w:rPr>
+          <w:lang w:eastAsia="zh-CN"/>
+        </w:rPr>
+        <w:t>Mflit</w:t>
+      </w:r>
+      <w:proofErr w:type="spellEnd"/>
+      <w:r>
+        <w:rPr>
+          <w:lang w:eastAsia="zh-CN"/>
+        </w:rPr>
+        <w:t xml:space="preserve">/s/PE, versus 215.0 for the mesh and 145.3 for the Fat-Tree; under BC, the corresponding values are 487.1, 139.7, and 132.2 </w:t>
+      </w:r>
+      <w:proofErr w:type="spellStart"/>
+      <w:r>
+        <w:rPr>
+          <w:lang w:eastAsia="zh-CN"/>
+        </w:rPr>
+        <w:t>Mflit</w:t>
+      </w:r>
+      <w:proofErr w:type="spellEnd"/>
+      <w:r>
+        <w:rPr>
+          <w:lang w:eastAsia="zh-CN"/>
+        </w:rPr>
+        <w:t>/s/PE. The latency curves show that CHAMP also sustains higher offered loads, consistent with its distributed multi-lane connectivity.</w:t>
+      </w:r>
+    </w:p>
+    <w:p>
+      <w:pPr>
+        <w:ind w:firstLine="14.40pt"/>
+        <w:jc w:val="both"/>
+        <w:rPr>
+          <w:lang w:eastAsia="zh-CN"/>
+        </w:rPr>
+      </w:pPr>
+      <w:r>
+        <w:rPr>
+          <w:lang w:eastAsia="zh-CN"/>
+        </w:rPr>
+        <w:t>Fig. 9 compares native multicast with repeated unicast on the same CHAMP network using identical destination sets. At 64 PEs, native multicast reduces mean latency from 30.0 to 10.9 ns under M10 and from 59.3 to 11.0 ns under AM, reductions of 64% and 81%, respectively. The larger AM benefit reflects the cost of injecting a separate packet for every destination</w:t>
+      </w:r>
+    </w:p>
+    <w:p>
+      <w:pPr>
+        <w:keepNext/>
+        <w:ind w:firstLine="14.40pt"/>
+        <w:jc w:val="both"/>
+      </w:pPr>
+      <w:r>
+        <w:rPr>
+          <w:lang w:eastAsia="zh-CN"/>
+        </w:rPr>
+        <w:t>Fig. 10 compares total 64-PE network power at matched offered loads. Asynchronous CHAMP consumes 60–84% less power than the clock-gated synchronous implementation of the same architecture and less power than the asynchronous mesh in every workload. Together, Fig. 8–10 show the throughput benefit of the topology, the latency benefit of native multicast, and the power benefit of asynchronous control.</w:t>
+      </w:r>
+    </w:p>
+    <w:p>
+      <w:pPr>
+        <w:jc w:val="both"/>
+        <w:rPr>
+          <w:rFonts w:hint="eastAsia"/>
+          <w:i/>
+          <w:iCs/>
+          <w:lang w:eastAsia="zh-CN"/>
+        </w:rPr>
+      </w:pPr>
+      <w:r>
+        <w:rPr>
+          <w:i/>
+          <w:iCs/>
+          <w:lang w:eastAsia="zh-CN"/>
+        </w:rPr>
+        <w:t>2) Scalability to 256 and 1024 Nodes</w:t>
+      </w:r>
+    </w:p>
+    <w:p>
+      <w:pPr>
+        <w:ind w:firstLine="14.40pt"/>
+        <w:jc w:val="both"/>
+        <w:rPr>
+          <w:lang w:eastAsia="zh-CN"/>
+        </w:rPr>
+      </w:pPr>
+      <w:r>
+        <w:rPr>
+          <w:lang w:eastAsia="zh-CN"/>
+        </w:rPr>
+        <w:t xml:space="preserve">Fig. 8(c)–(e) extends the CHAMP–mesh comparison to 256 and 1024 PEs under UR, M10, and AM traffic. At 256 PEs, CHAMP achieves peak throughputs of 159.6, 228.2, and 358.5 </w:t>
+      </w:r>
+      <w:proofErr w:type="spellStart"/>
+      <w:r>
+        <w:rPr>
+          <w:lang w:eastAsia="zh-CN"/>
+        </w:rPr>
+        <w:t>Mflit</w:t>
+      </w:r>
+      <w:proofErr w:type="spellEnd"/>
+      <w:r>
+        <w:rPr>
+          <w:lang w:eastAsia="zh-CN"/>
+        </w:rPr>
+        <w:t xml:space="preserve">/s/PE, versus 105.2, 147.8, and 224.6 </w:t>
+      </w:r>
+      <w:proofErr w:type="spellStart"/>
+      <w:r>
+        <w:rPr>
+          <w:lang w:eastAsia="zh-CN"/>
+        </w:rPr>
+        <w:t>Mflit</w:t>
+      </w:r>
+      <w:proofErr w:type="spellEnd"/>
+      <w:r>
+        <w:rPr>
+          <w:lang w:eastAsia="zh-CN"/>
+        </w:rPr>
+        <w:t xml:space="preserve">/s/PE for the mesh. At 1024 PEs, its M10 and AM throughputs reach 138.6 and 303.3 </w:t>
+      </w:r>
+      <w:proofErr w:type="spellStart"/>
+      <w:r>
+        <w:rPr>
+          <w:lang w:eastAsia="zh-CN"/>
+        </w:rPr>
+        <w:t>Mflit</w:t>
+      </w:r>
+      <w:proofErr w:type="spellEnd"/>
+      <w:r>
+        <w:rPr>
+          <w:lang w:eastAsia="zh-CN"/>
+        </w:rPr>
+        <w:t>/s/PE, exceeding the mesh by 1.75× and 2.19×. The latency curves likewise show that CHAMP sustains higher offered loads. Its throughput advantage persists as the network grows from 256 to 1024 PEs, indicating that adding clusters does not negate the benefit of the hierarchical, parallel-lane organization.</w:t>
+      </w:r>
+    </w:p>
+    <w:p>
+      <w:pPr>
+        <w:ind w:firstLine="14.40pt"/>
+        <w:jc w:val="both"/>
+        <w:rPr>
+          <w:lang w:eastAsia="zh-CN"/>
+        </w:rPr>
+      </w:pPr>
+      <w:r>
+        <w:rPr>
+          <w:lang w:eastAsia="zh-CN"/>
+        </w:rPr>
+        <w:t xml:space="preserve">Fig. 9 shows that native multicast also remains effective at larger scales. Under M10, mean latency falls from 57.2 to 19.2 ns at 256 PEs and from 89.4 to 32.7 ns at 1024 PEs compared with repeated unicast. Under AM, it falls from 573.0 to 19.6 ns and from 725.8 to 31.2 ns, respectively. By replicating packets along shared routes rather than injecting one unicast </w:t>
+      </w:r>
+      <w:r>
+        <w:rPr>
+          <w:lang w:eastAsia="zh-CN"/>
+        </w:rPr>
+        <w:t>per destination, CHAMP retains a substantial multicast advantage even at 1024 PEs. Together, these results support the scalability of its topology and multicast mechanism across the evaluated network sizes</w:t>
+      </w:r>
+      <w:r>
+        <w:rPr>
+          <w:rFonts w:hint="eastAsia"/>
+          <w:lang w:eastAsia="zh-CN"/>
+        </w:rPr>
+        <w:t>.</w:t>
+      </w:r>
+    </w:p>
+    <w:p>
+      <w:pPr>
+        <w:pStyle w:val="1"/>
+        <w:rPr>
+          <w:rFonts w:hint="eastAsia"/>
+          <w:lang w:eastAsia="zh-CN"/>
+        </w:rPr>
+      </w:pPr>
+      <w:r>
+        <w:rPr>
+          <w:rFonts w:hint="eastAsia"/>
+          <w:lang w:eastAsia="zh-CN"/>
+        </w:rPr>
+        <w:t>conclusion</w:t>
+      </w:r>
+    </w:p>
+    <w:p>
+      <w:pPr>
+        <w:ind w:firstLine="14.40pt"/>
+        <w:jc w:val="both"/>
+        <w:rPr>
+          <w:lang w:eastAsia="zh-CN"/>
+        </w:rPr>
+      </w:pPr>
+      <w:r>
+        <w:rPr>
+          <w:lang w:eastAsia="zh-CN"/>
+        </w:rPr>
+        <w:t>We presented CHAMP, a click-based asynchronous NoC that combines a hierarchical tree–mesh topology, parallel</w:t>
+      </w:r>
+      <w:r>
+        <w:rPr>
+          <w:rFonts w:hint="eastAsia"/>
+          <w:lang w:eastAsia="zh-CN"/>
+        </w:rPr>
         <w:t xml:space="preserve"> </w:t>
       </w:r>
       <w:r>
         <w:rPr>
           <w:lang w:eastAsia="zh-CN"/>
         </w:rPr>
-        <w:t>The architecture also allows inter-chip extension at the mesh boundaries, as indicated in Fig. 2(a)</w:t>
-      </w:r>
-      <w:r>
-        <w:rPr>
-          <w:rFonts w:hint="eastAsia"/>
-          <w:lang w:eastAsia="zh-CN"/>
-        </w:rPr>
-        <w:t>,</w:t>
-      </w:r>
-      <w:r>
-        <w:t xml:space="preserve"> </w:t>
-      </w:r>
-      <w:r>
-        <w:rPr>
-          <w:lang w:eastAsia="zh-CN"/>
-        </w:rPr>
-        <w:t>while the current</w:t>
-      </w:r>
-      <w:r>
-        <w:rPr>
-          <w:rFonts w:hint="eastAsia"/>
-          <w:lang w:eastAsia="zh-CN"/>
-        </w:rPr>
-        <w:t xml:space="preserve"> study </w:t>
-      </w:r>
-      <w:r>
-        <w:rPr>
-          <w:lang w:eastAsia="zh-CN"/>
-        </w:rPr>
-        <w:t>focus</w:t>
-      </w:r>
-      <w:r>
-        <w:rPr>
-          <w:rFonts w:hint="eastAsia"/>
-          <w:lang w:eastAsia="zh-CN"/>
-        </w:rPr>
-        <w:t>es</w:t>
-      </w:r>
-      <w:r>
-        <w:rPr>
-          <w:lang w:eastAsia="zh-CN"/>
-        </w:rPr>
-        <w:t xml:space="preserve"> on intra-chip communication</w:t>
-      </w:r>
-      <w:r>
-        <w:rPr>
-          <w:rFonts w:hint="eastAsia"/>
-          <w:lang w:eastAsia="zh-CN"/>
-        </w:rPr>
-        <w:t>.</w:t>
-      </w:r>
-    </w:p>
-    <w:p>
-      <w:pPr>
-        <w:keepNext/>
+        <w:t>routers, and native region-aware multicast. Across 64-, 256-, and 1024-PE evaluations, CHAMP sustains higher peak throughput than the evaluated mesh, while native multicast substantially reduces latency relative to repeated unicast. At 64 PEs, asynchronous control also reduces network power relative to a clock-gated synchronous implementation of the same architecture. These results demonstrate that the three design choices remain effective as the network scales</w:t>
+      </w:r>
+    </w:p>
+    <w:p>
+      <w:pPr>
         <w:jc w:val="both"/>
         <w:rPr>
           <w:rFonts w:hint="eastAsia"/>
           <w:lang w:eastAsia="zh-CN"/>
         </w:rPr>
       </w:pPr>
-      <w:r>
-        <w:rPr>
-          <w:rFonts w:hint="eastAsia"/>
-          <w:noProof/>
-          <w:lang w:eastAsia="zh-CN"/>
-        </w:rPr>
-        <w:drawing>
-          <wp:anchor distT="0" distB="0" distL="114300" distR="114300" simplePos="0" relativeHeight="251668480" behindDoc="0" locked="0" layoutInCell="1" allowOverlap="1" wp14:anchorId="7B5F4D72" wp14:editId="514FF269">
-            <wp:simplePos x="0" y="0"/>
-            <wp:positionH relativeFrom="column">
-              <wp:align>right</wp:align>
-            </wp:positionH>
-            <wp:positionV relativeFrom="page">
-              <wp:posOffset>1448988</wp:posOffset>
-            </wp:positionV>
-            <wp:extent cx="3111500" cy="1287145"/>
-            <wp:effectExtent l="0" t="0" r="0" b="8255"/>
-            <wp:wrapTopAndBottom/>
-            <wp:docPr id="765702537" name="图形 10"/>
-            <wp:cNvGraphicFramePr>
-              <a:graphicFrameLocks xmlns:a="http://purl.oclc.org/ooxml/drawingml/main" noChangeAspect="1"/>
-            </wp:cNvGraphicFramePr>
-            <a:graphic xmlns:a="http://purl.oclc.org/ooxml/drawingml/main">
-              <a:graphicData uri="http://purl.oclc.org/ooxml/drawingml/picture">
-                <pic:pic xmlns:pic="http://purl.oclc.org/ooxml/drawingml/picture">
-                  <pic:nvPicPr>
-                    <pic:cNvPr id="765702537" name="图形 765702537"/>
-                    <pic:cNvPicPr/>
-                  </pic:nvPicPr>
-                  <pic:blipFill>
-                    <a:blip r:embed="rId19">
-                      <a:extLst>
-                        <a:ext uri="{96DAC541-7B7A-43D3-8B79-37D633B846F1}">
-                          <asvg:svgBlip xmlns:asvg="http://schemas.microsoft.com/office/drawing/2016/SVG/main" r:embed="rId20"/>
-                        </a:ext>
-                      </a:extLst>
-                    </a:blip>
-                    <a:stretch>
-                      <a:fillRect/>
-                    </a:stretch>
-                  </pic:blipFill>
-                  <pic:spPr>
-                    <a:xfrm>
-                      <a:off x="0" y="0"/>
-                      <a:ext cx="3111500" cy="1287145"/>
-                    </a:xfrm>
-                    <a:prstGeom prst="rect">
-                      <a:avLst/>
-                    </a:prstGeom>
-                  </pic:spPr>
-                </pic:pic>
-              </a:graphicData>
-            </a:graphic>
-          </wp:anchor>
-        </w:drawing>
-      </w:r>
-    </w:p>
-    <w:p>
-      <w:pPr>
-        <w:pStyle w:val="ab"/>
+    </w:p>
+    <w:p>
+      <w:pPr>
         <w:jc w:val="both"/>
         <w:rPr>
-          <w:rFonts w:ascii="Times New Roman" w:hAnsi="Times New Roman" w:cs="Times New Roman"/>
+          <w:rFonts w:hint="eastAsia"/>
+          <w:lang w:eastAsia="zh-CN"/>
+        </w:rPr>
+      </w:pPr>
+    </w:p>
+    <w:p>
+      <w:pPr>
+        <w:spacing w:after="0" w:line="200" w:lineRule="auto"/>
+      </w:pPr>
+      <w:r>
+        <w:rPr>
+          <w:rFonts w:ascii="Times New Roman" w:hAnsi="Times New Roman"/>
+          <w:b/>
           <w:sz w:val="16"/>
-          <w:szCs w:val="16"/>
-          <w:lang w:eastAsia="zh-CN"/>
-        </w:rPr>
-      </w:pPr>
-      <w:r>
-        <w:rPr>
-          <w:rFonts w:ascii="Times New Roman" w:hAnsi="Times New Roman" w:cs="Times New Roman"/>
+        </w:rPr>
+        <w:t>References</w:t>
+      </w:r>
+    </w:p>
+    <w:p>
+      <w:pPr>
+        <w:ind w:left="360" w:hanging="360"/>
+        <w:spacing w:after="0" w:line="200" w:lineRule="auto"/>
+      </w:pPr>
+      <w:r>
+        <w:rPr>
+          <w:rFonts w:ascii="Times New Roman" w:hAnsi="Times New Roman"/>
           <w:sz w:val="16"/>
-          <w:szCs w:val="16"/>
-        </w:rPr>
-        <w:t xml:space="preserve">Fig. </w:t>
-      </w:r>
-      <w:r>
-        <w:rPr>
-          <w:rFonts w:ascii="Times New Roman" w:hAnsi="Times New Roman" w:cs="Times New Roman"/>
+        </w:rPr>
+        <w:t>[1] Advanced Micro Devices, Inc., “AMD EPYC 7002 Series Processors,” 2019. [Online]. Available: https://www.amd.com/en/products/processors/server/epyc/7002-series.html</w:t>
+      </w:r>
+    </w:p>
+    <w:p>
+      <w:pPr>
+        <w:ind w:left="360" w:hanging="360"/>
+        <w:spacing w:after="0" w:line="200" w:lineRule="auto"/>
+      </w:pPr>
+      <w:r>
+        <w:rPr>
+          <w:rFonts w:ascii="Times New Roman" w:hAnsi="Times New Roman"/>
           <w:sz w:val="16"/>
-          <w:szCs w:val="16"/>
-        </w:rPr>
-        <w:fldChar w:fldCharType="begin"/>
-      </w:r>
-      <w:r>
-        <w:rPr>
-          <w:rFonts w:ascii="Times New Roman" w:hAnsi="Times New Roman" w:cs="Times New Roman"/>
+        </w:rPr>
+        <w:t>[2] Advanced Micro Devices, Inc., “AMD EPYC 9006 Server CPUs for AI-First Data Centers,” 2026. [Online]. Available: https://www.amd.com/en/products/processors/server/epyc/9006-series.html</w:t>
+      </w:r>
+    </w:p>
+    <w:p>
+      <w:pPr>
+        <w:ind w:left="360" w:hanging="360"/>
+        <w:spacing w:after="0" w:line="200" w:lineRule="auto"/>
+      </w:pPr>
+      <w:r>
+        <w:rPr>
+          <w:rFonts w:ascii="Times New Roman" w:hAnsi="Times New Roman"/>
           <w:sz w:val="16"/>
-          <w:szCs w:val="16"/>
-        </w:rPr>
-        <w:instrText xml:space="preserve"> SEQ Fig. \* ARABIC </w:instrText>
-      </w:r>
-      <w:r>
-        <w:rPr>
-          <w:rFonts w:ascii="Times New Roman" w:hAnsi="Times New Roman" w:cs="Times New Roman"/>
+        </w:rPr>
+        <w:t>[3] NVIDIA, “NVIDIA A100 Tensor Core GPU,” Datasheet, 2020. [Online]. Available: https://www.nvidia.com/content/dam/en-zz/Solutions/Data-Center/a100/pdf/a100-80gb-datasheet-update-a4-nvidia-1485612-r12-web.pdf</w:t>
+      </w:r>
+    </w:p>
+    <w:p>
+      <w:pPr>
+        <w:ind w:left="360" w:hanging="360"/>
+        <w:spacing w:after="0" w:line="200" w:lineRule="auto"/>
+      </w:pPr>
+      <w:r>
+        <w:rPr>
+          <w:rFonts w:ascii="Times New Roman" w:hAnsi="Times New Roman"/>
           <w:sz w:val="16"/>
-          <w:szCs w:val="16"/>
-        </w:rPr>
-        <w:fldChar w:fldCharType="separate"/>
-      </w:r>
-      <w:r>
-        <w:rPr>
-          <w:rFonts w:ascii="Times New Roman" w:hAnsi="Times New Roman" w:cs="Times New Roman"/>
-          <w:noProof/>
+        </w:rPr>
+        <w:t>[4] NVIDIA, “NVIDIA Kicks Off the Next Generation of AI With Rubin,” Jan. 2026. [Online]. Available: https://investor.nvidia.com/news/press-release-details/2026/NVIDIA-Kicks-Off-the-Next-Generation-of-AI-With-Rubin--Six-New-Chips-One-Incredible-AI-Supercomputer/default.aspx</w:t>
+      </w:r>
+    </w:p>
+    <w:p>
+      <w:pPr>
+        <w:ind w:left="360" w:hanging="360"/>
+        <w:spacing w:after="0" w:line="200" w:lineRule="auto"/>
+      </w:pPr>
+      <w:r>
+        <w:rPr>
+          <w:rFonts w:ascii="Times New Roman" w:hAnsi="Times New Roman"/>
           <w:sz w:val="16"/>
-          <w:szCs w:val="16"/>
-        </w:rPr>
-        <w:t>6</w:t>
-      </w:r>
-      <w:r>
-        <w:rPr>
-          <w:rFonts w:ascii="Times New Roman" w:hAnsi="Times New Roman" w:cs="Times New Roman"/>
+        </w:rPr>
+        <w:t>[5] Cerebras Systems, “Cerebras Systems Unveils the Industry’s First Trillion Transistor Chip,” Aug. 2019. [Online]. Available: https://www.cerebras.ai/press-release/cerebras-systems-unveils-the-industrys-first-trillion-transistor-chip</w:t>
+      </w:r>
+    </w:p>
+    <w:p>
+      <w:pPr>
+        <w:ind w:left="360" w:hanging="360"/>
+        <w:spacing w:after="0" w:line="200" w:lineRule="auto"/>
+      </w:pPr>
+      <w:r>
+        <w:rPr>
+          <w:rFonts w:ascii="Times New Roman" w:hAnsi="Times New Roman"/>
           <w:sz w:val="16"/>
-          <w:szCs w:val="16"/>
-        </w:rPr>
-        <w:fldChar w:fldCharType="end"/>
-      </w:r>
-      <w:r>
-        <w:rPr>
-          <w:rFonts w:ascii="Times New Roman" w:hAnsi="Times New Roman" w:cs="Times New Roman"/>
+        </w:rPr>
+        <w:t>[6] Cerebras Systems, “Cerebras Systems Unveils World’s Fastest AI Chip with Whopping 4 Trillion Transistors,” Mar. 2024. [Online]. Available: https://www.cerebras.ai/press-release/cerebras-announces-third-generation-wafer-scale-engine</w:t>
+      </w:r>
+    </w:p>
+    <w:p>
+      <w:pPr>
+        <w:ind w:left="360" w:hanging="360"/>
+        <w:spacing w:after="0" w:line="200" w:lineRule="auto"/>
+      </w:pPr>
+      <w:r>
+        <w:rPr>
+          <w:rFonts w:ascii="Times New Roman" w:hAnsi="Times New Roman"/>
           <w:sz w:val="16"/>
-          <w:szCs w:val="16"/>
-          <w:lang w:eastAsia="zh-CN"/>
-        </w:rPr>
-        <w:t xml:space="preserve"> </w:t>
-      </w:r>
-      <w:r>
-        <w:rPr>
-          <w:rFonts w:ascii="Times New Roman" w:hAnsi="Times New Roman" w:cs="Times New Roman"/>
+        </w:rPr>
+        <w:t>[7] Intel Corporation, “Intel Builds World’s Largest Neuromorphic System to Enable More Sustainable AI,” Apr. 2024. [Online]. Available: https://www.intel.com/content/www/us/en/newsroom/news/intel-builds-worlds-largest-neuromorphic-system.html</w:t>
+      </w:r>
+    </w:p>
+    <w:p>
+      <w:pPr>
+        <w:ind w:left="360" w:hanging="360"/>
+        <w:spacing w:after="0" w:line="200" w:lineRule="auto"/>
+      </w:pPr>
+      <w:r>
+        <w:rPr>
+          <w:rFonts w:ascii="Times New Roman" w:hAnsi="Times New Roman"/>
           <w:sz w:val="16"/>
-          <w:szCs w:val="16"/>
-          <w:lang w:eastAsia="zh-CN"/>
-        </w:rPr>
-        <w:t>(a) Tree-level routing: unicast selects one child, selective-child multicast selects a subset, and all-child multicast selects all four. Parent–child multicast enables both selected child outputs and the parent output when the destination region extends beyond the current subtree. At L1, children correspond to individual PEs. (b) Tree-based multicast forwarding across clusters in the upper mesh.</w:t>
-      </w:r>
-    </w:p>
-    <w:p>
-      <w:pPr>
-        <w:pStyle w:val="1"/>
-        <w:rPr>
-          <w:rFonts w:hint="eastAsia"/>
-          <w:lang w:eastAsia="zh-CN"/>
-        </w:rPr>
-      </w:pPr>
-      <w:r>
-        <w:rPr>
-          <w:rFonts w:hint="eastAsia"/>
-          <w:lang w:eastAsia="zh-CN"/>
-        </w:rPr>
-        <w:t>Evaluation</w:t>
+        </w:rPr>
+        <w:t>[8] SambaNova Systems, “SambaNova Unveils New AI Chip, the SN40L,” Sep. 2023. [Online]. Available: https://sambanova.ai/press/sambanova-unveils-new-chip-the-sn40l</w:t>
+      </w:r>
+    </w:p>
+    <w:p>
+      <w:pPr>
+        <w:ind w:left="360" w:hanging="360"/>
+        <w:spacing w:after="0" w:line="200" w:lineRule="auto"/>
+      </w:pPr>
+      <w:r>
+        <w:rPr>
+          <w:rFonts w:ascii="Times New Roman" w:hAnsi="Times New Roman"/>
+          <w:sz w:val="16"/>
+        </w:rPr>
+        <w:t>[9] SambaNova Systems, “Introducing the SN50 RDU: Purpose-Built for Agentic Inference,” 2026. [Online]. Available: https://sambanova.ai/blog/introducing-the-sn50-rdu-purpose-built-for-agentic-inference</w:t>
+      </w:r>
+    </w:p>
+    <w:p>
+      <w:pPr>
+        <w:ind w:left="360" w:hanging="360"/>
+        <w:spacing w:after="0" w:line="200" w:lineRule="auto"/>
+      </w:pPr>
+      <w:r>
+        <w:rPr>
+          <w:rFonts w:ascii="Times New Roman" w:hAnsi="Times New Roman"/>
+          <w:sz w:val="16"/>
+        </w:rPr>
+        <w:t>[10] W. J. Dally and B. Towles, Principles and Practices of Interconnection Networks. San Francisco, CA, USA: Morgan Kaufmann, 2004.</w:t>
+      </w:r>
+    </w:p>
+    <w:p>
+      <w:pPr>
+        <w:ind w:left="360" w:hanging="360"/>
+        <w:spacing w:after="0" w:line="200" w:lineRule="auto"/>
+      </w:pPr>
+      <w:r>
+        <w:rPr>
+          <w:rFonts w:ascii="Times New Roman" w:hAnsi="Times New Roman"/>
+          <w:sz w:val="16"/>
+        </w:rPr>
+        <w:t>[11] J. Kim, J. Balfour, and W. J. Dally, “Flattened butterfly topology for on-chip networks,” IEEE Computer Architecture Letters, vol. 6, no. 2, pp. 37–40, 2007.</w:t>
+      </w:r>
+    </w:p>
+    <w:p>
+      <w:pPr>
+        <w:ind w:left="360" w:hanging="360"/>
+        <w:spacing w:after="0" w:line="200" w:lineRule="auto"/>
+      </w:pPr>
+      <w:r>
+        <w:rPr>
+          <w:rFonts w:ascii="Times New Roman" w:hAnsi="Times New Roman"/>
+          <w:sz w:val="16"/>
+        </w:rPr>
+        <w:t>[12] T. Fischer, M. Rogenmoser, T. Benz, F. K. Gürkaynak, and L. Benini, “FlooNoC: A 645-Gb/s/link 0.15-pJ/b/hop open-source NoC with wide physical links and end-to-end AXI4 parallel multistream support,” IEEE Transactions on Very Large Scale Integration (VLSI) Systems, vol. 33, no. 4, pp. 1094–1107, 2025.</w:t>
+      </w:r>
+    </w:p>
+    <w:p>
+      <w:pPr>
+        <w:ind w:left="360" w:hanging="360"/>
+        <w:spacing w:after="0" w:line="200" w:lineRule="auto"/>
+      </w:pPr>
+      <w:r>
+        <w:rPr>
+          <w:rFonts w:ascii="Times New Roman" w:hAnsi="Times New Roman"/>
+          <w:sz w:val="16"/>
+        </w:rPr>
+        <w:t>[13] Y. Zhong et al., “PAICORE: A 1.9-million-neuron 5.181-TSOPS/W digital neuromorphic processor with unified SNN-ANN and on-chip learning paradigm,” IEEE Journal of Solid-State Circuits, vol. 60, no. 2, pp. 651–671, 2025, doi: 10.1109/JSSC.2024.3426319.</w:t>
+      </w:r>
+    </w:p>
+    <w:p>
+      <w:pPr>
+        <w:ind w:left="360" w:hanging="360"/>
+        <w:spacing w:after="0" w:line="200" w:lineRule="auto"/>
+      </w:pPr>
+      <w:r>
+        <w:rPr>
+          <w:rFonts w:ascii="Times New Roman" w:hAnsi="Times New Roman"/>
+          <w:sz w:val="16"/>
+        </w:rPr>
+        <w:t>[14] K. Bhardwaj and S. M. Nowick, “A continuous-time replication strategy for efficient multicast in asynchronous NoCs,” IEEE Transactions on Very Large Scale Integration (VLSI) Systems, vol. 27, no. 2, pp. 350–363, 2019, doi: 10.1109/TVLSI.2018.2876856.</w:t>
+      </w:r>
+    </w:p>
+    <w:p>
+      <w:pPr>
+        <w:ind w:left="360" w:hanging="360"/>
+        <w:spacing w:after="0" w:line="200" w:lineRule="auto"/>
+      </w:pPr>
+      <w:r>
+        <w:rPr>
+          <w:rFonts w:ascii="Times New Roman" w:hAnsi="Times New Roman"/>
+          <w:sz w:val="16"/>
+        </w:rPr>
+        <w:t>[15] D. Bertozzi et al., “Cost-effective and flexible asynchronous interconnect technology for GALS systems,” IEEE Micro, vol. 41, no. 1, pp. 69–81, 2021, doi: 10.1109/MM.2020.3002790.</w:t>
+      </w:r>
+    </w:p>
+    <w:p>
+      <w:pPr>
+        <w:ind w:left="360" w:hanging="360"/>
+        <w:spacing w:after="0" w:line="200" w:lineRule="auto"/>
+      </w:pPr>
+      <w:r>
+        <w:rPr>
+          <w:rFonts w:ascii="Times New Roman" w:hAnsi="Times New Roman"/>
+          <w:sz w:val="16"/>
+        </w:rPr>
+        <w:t>[16] Z. Su et al., “An ultra-low cost and multicast-enabled asynchronous NoC for neuromorphic edge computing,” IEEE Journal on Emerging and Selected Topics in Circuits and Systems, vol. 14, no. 3, pp. 409–424, 2024, doi: 10.1109/JETCAS.2024.3433427.</w:t>
+      </w:r>
+    </w:p>
+    <w:p>
+      <w:pPr>
+        <w:ind w:left="360" w:hanging="360"/>
+        <w:spacing w:after="0" w:line="200" w:lineRule="auto"/>
+      </w:pPr>
+      <w:r>
+        <w:rPr>
+          <w:rFonts w:ascii="Times New Roman" w:hAnsi="Times New Roman"/>
+          <w:sz w:val="16"/>
+        </w:rPr>
+        <w:t>[17] C. Zhang, Y. Hu, and Y. Kang, “A reusable methodology for high-performance interconnects using a standard-cell based asynchronous NoC router,” in Proc. DATE, 2026, pp. 1–7, doi: 10.23919/DATE69613.2026.11539657.</w:t>
+      </w:r>
+    </w:p>
+    <w:p>
+      <w:pPr>
+        <w:ind w:left="360" w:hanging="360"/>
+        <w:spacing w:after="0" w:line="200" w:lineRule="auto"/>
+      </w:pPr>
+      <w:r>
+        <w:rPr>
+          <w:rFonts w:ascii="Times New Roman" w:hAnsi="Times New Roman"/>
+          <w:sz w:val="16"/>
+        </w:rPr>
+        <w:t>[18] N. Enright Jerger, L.-S. Peh, and M. H. Lipasti, “Virtual circuit tree multicasting: A case for on-chip hardware multicast support,” in Proc. ISCA, 2008, pp. 229–240, doi: 10.1109/ISCA.2008.12.</w:t>
+      </w:r>
+    </w:p>
+    <w:p>
+      <w:pPr>
+        <w:ind w:left="360" w:hanging="360"/>
+        <w:spacing w:after="0" w:line="200" w:lineRule="auto"/>
+      </w:pPr>
+      <w:r>
+        <w:rPr>
+          <w:rFonts w:ascii="Times New Roman" w:hAnsi="Times New Roman"/>
+          <w:sz w:val="16"/>
+        </w:rPr>
+        <w:t>[19] Z. Su, A. Bencsik, G. Indiveri, and D. Bertozzi, “An efficient multicast addressing encoding scheme for multi-core neuromorphic processors,” in Proc. ISCAS, 2025, doi: 10.1109/ISCAS56072.2025.11043591.</w:t>
       </w:r>
     </w:p>
     <w:sectPr>
@@ -7252,7 +6579,7 @@
   <w:style w:type="paragraph" w:default="1" w:styleId="a">
     <w:name w:val="Normal"/>
     <w:qFormat/>
-    <w:rsid w:val="00041879"/>
+    <w:rsid w:val="00237BBE"/>
     <w:pPr>
       <w:jc w:val="center"/>
     </w:pPr>

</xml_diff>